<commit_message>
Working on paper; finishing results
</commit_message>
<xml_diff>
--- a/manuscript/wen-li-2024-geointerv.docx
+++ b/manuscript/wen-li-2024-geointerv.docx
@@ -667,7 +667,19 @@
         <w:rPr>
           <w:lang w:val="en"/>
         </w:rPr>
-        <w:t xml:space="preserve">. These interventions are </w:t>
+        <w:t xml:space="preserve">. </w:t>
+      </w:r>
+      <w:r>
+        <w:rPr>
+          <w:lang w:val="en"/>
+        </w:rPr>
+        <w:t>In this paper, t</w:t>
+      </w:r>
+      <w:r>
+        <w:rPr>
+          <w:lang w:val="en"/>
+        </w:rPr>
+        <w:t xml:space="preserve">hese interventions are </w:t>
       </w:r>
       <w:r>
         <w:rPr>
@@ -1274,37 +1286,73 @@
         <w:rPr>
           <w:lang w:val="en"/>
         </w:rPr>
-        <w:t xml:space="preserve"> In addition, these studies only</w:t>
-      </w:r>
-      <w:r>
-        <w:rPr>
-          <w:lang w:val="en"/>
-        </w:rPr>
-        <w:t xml:space="preserve"> automatically</w:t>
-      </w:r>
-      <w:r>
-        <w:rPr>
-          <w:lang w:val="en"/>
-        </w:rPr>
-        <w:t xml:space="preserve"> identify where to implement geo-interventions and what the effects of implementing geo-interventions are, but to the best of our knowledge, do not</w:t>
-      </w:r>
-      <w:r>
-        <w:rPr>
-          <w:lang w:val="en"/>
-        </w:rPr>
-        <w:t xml:space="preserve"> directly generate the geo-interventions themselves to</w:t>
-      </w:r>
-      <w:r>
-        <w:rPr>
-          <w:lang w:val="en"/>
-        </w:rPr>
-        <w:t xml:space="preserve"> automatically</w:t>
-      </w:r>
-      <w:r>
-        <w:rPr>
-          <w:lang w:val="en"/>
-        </w:rPr>
-        <w:t xml:space="preserve"> identify </w:t>
+        <w:t xml:space="preserve"> In addition, these studies </w:t>
+      </w:r>
+      <w:r>
+        <w:rPr>
+          <w:lang w:val="en"/>
+        </w:rPr>
+        <w:t xml:space="preserve">often </w:t>
+      </w:r>
+      <w:r>
+        <w:rPr>
+          <w:lang w:val="en"/>
+        </w:rPr>
+        <w:t>only identify where to implement geo-interventions and what the effects of implementing geo-interventions are</w:t>
+      </w:r>
+      <w:r>
+        <w:rPr>
+          <w:lang w:val="en"/>
+        </w:rPr>
+        <w:t xml:space="preserve"> with computer models</w:t>
+      </w:r>
+      <w:r>
+        <w:rPr>
+          <w:lang w:val="en"/>
+        </w:rPr>
+        <w:t>, but to the best of our knowledge, do not</w:t>
+      </w:r>
+      <w:r>
+        <w:rPr>
+          <w:lang w:val="en"/>
+        </w:rPr>
+        <w:t xml:space="preserve"> directly</w:t>
+      </w:r>
+      <w:r>
+        <w:rPr>
+          <w:lang w:val="en"/>
+        </w:rPr>
+        <w:t xml:space="preserve"> use the models to</w:t>
+      </w:r>
+      <w:r>
+        <w:rPr>
+          <w:lang w:val="en"/>
+        </w:rPr>
+        <w:t xml:space="preserve"> generate the geo-interventions themselves</w:t>
+      </w:r>
+      <w:r>
+        <w:rPr>
+          <w:lang w:val="en"/>
+        </w:rPr>
+        <w:t xml:space="preserve">, </w:t>
+      </w:r>
+      <w:r>
+        <w:rPr>
+          <w:lang w:val="en"/>
+        </w:rPr>
+        <w:t>identify</w:t>
+      </w:r>
+      <w:r>
+        <w:rPr>
+          <w:lang w:val="en"/>
+        </w:rPr>
+        <w:t>ing</w:t>
+      </w:r>
+      <w:r>
+        <w:rPr>
+          <w:lang w:val="en"/>
+        </w:rPr>
+        <w:t xml:space="preserve"> </w:t>
       </w:r>
       <w:r>
         <w:rPr>
@@ -1369,7 +1417,19 @@
         <w:rPr>
           <w:lang w:val="en"/>
         </w:rPr>
-        <w:t xml:space="preserve"> spatial clustering techniques can be used to</w:t>
+        <w:t xml:space="preserve"> spatial clustering techniques </w:t>
+      </w:r>
+      <w:r>
+        <w:rPr>
+          <w:lang w:val="en"/>
+        </w:rPr>
+        <w:t>are</w:t>
+      </w:r>
+      <w:r>
+        <w:rPr>
+          <w:lang w:val="en"/>
+        </w:rPr>
+        <w:t xml:space="preserve"> used to</w:t>
       </w:r>
       <w:r>
         <w:rPr>
@@ -1411,14 +1471,14 @@
         <w:rPr>
           <w:lang w:val="en"/>
         </w:rPr>
-        <w:t xml:space="preserve"> (e.g., deploying </w:t>
+        <w:t xml:space="preserve"> (e.g., </w:t>
       </w:r>
       <w:r>
         <w:rPr>
           <w:lang w:val="en"/>
         </w:rPr>
         <w:lastRenderedPageBreak/>
-        <w:t>traffic enforcement devices, reducing road widths)</w:t>
+        <w:t>deploying traffic enforcement devices, reducing road widths)</w:t>
       </w:r>
       <w:r>
         <w:rPr>
@@ -24265,10 +24325,19 @@
     </w:p>
     <w:p>
       <w:pPr>
-        <w:pStyle w:val="MDPI21heading1"/>
+        <w:pStyle w:val="MDPI23heading3"/>
+        <w:rPr>
+          <w:lang w:val="en"/>
+        </w:rPr>
       </w:pPr>
       <w:r>
-        <w:t>4. Discussion</w:t>
+        <w:t xml:space="preserve">3.2.1. </w:t>
+      </w:r>
+      <w:r>
+        <w:t xml:space="preserve">Model </w:t>
+      </w:r>
+      <w:r>
+        <w:t>Performance</w:t>
       </w:r>
     </w:p>
     <w:p>
@@ -24276,17 +24345,98 @@
         <w:pStyle w:val="MDPI31text"/>
       </w:pPr>
       <w:r>
+        <w:rPr>
+          <w:lang w:val="en"/>
+        </w:rPr>
+        <w:t>x.</w:t>
+      </w:r>
+    </w:p>
+    <w:p>
+      <w:pPr>
+        <w:pStyle w:val="MDPI23heading3"/>
+        <w:rPr>
+          <w:lang w:val="en"/>
+        </w:rPr>
+      </w:pPr>
+      <w:r>
+        <w:t>3.2.</w:t>
+      </w:r>
+      <w:r>
+        <w:t>2</w:t>
+      </w:r>
+      <w:r>
+        <w:t xml:space="preserve">. </w:t>
+      </w:r>
+      <w:r>
+        <w:t xml:space="preserve">Optimization </w:t>
+      </w:r>
+      <w:r>
+        <w:t>Constraint</w:t>
+      </w:r>
+      <w:r>
+        <w:t>s</w:t>
+      </w:r>
+    </w:p>
+    <w:p>
+      <w:pPr>
+        <w:pStyle w:val="MDPI31text"/>
+        <w:rPr>
+          <w:lang w:val="en"/>
+        </w:rPr>
+      </w:pPr>
+      <w:r>
+        <w:rPr>
+          <w:lang w:val="en"/>
+        </w:rPr>
+        <w:t>x.</w:t>
+      </w:r>
+    </w:p>
+    <w:p>
+      <w:pPr>
+        <w:pStyle w:val="MDPI23heading3"/>
+        <w:rPr>
+          <w:lang w:val="en"/>
+        </w:rPr>
+      </w:pPr>
+      <w:r>
+        <w:lastRenderedPageBreak/>
+        <w:t xml:space="preserve">3.2.1. </w:t>
+      </w:r>
+      <w:r>
+        <w:t>Geo-intervention Scenarios</w:t>
+      </w:r>
+    </w:p>
+    <w:p>
+      <w:pPr>
+        <w:pStyle w:val="MDPI31text"/>
+      </w:pPr>
+      <w:r>
+        <w:rPr>
+          <w:lang w:val="en"/>
+        </w:rPr>
+        <w:t>x.</w:t>
+      </w:r>
+    </w:p>
+    <w:p>
+      <w:pPr>
+        <w:pStyle w:val="MDPI21heading1"/>
+      </w:pPr>
+      <w:r>
+        <w:t>4. Discussion</w:t>
+      </w:r>
+    </w:p>
+    <w:p>
+      <w:pPr>
+        <w:pStyle w:val="MDPI31text"/>
+      </w:pPr>
+      <w:r>
         <w:t xml:space="preserve">Authors should discuss the results and how they can be </w:t>
       </w:r>
       <w:r>
         <w:t xml:space="preserve">interpreted from the perspective </w:t>
       </w:r>
       <w:r>
-        <w:t xml:space="preserve">of previous studies and of the working hypotheses. The findings and their </w:t>
-      </w:r>
-      <w:r>
-        <w:lastRenderedPageBreak/>
-        <w:t>implications should be discussed in the broadest context possible. Future research directions may also be highlighted.</w:t>
+        <w:t>of previous studies and of the working hypotheses. The findings and their implications should be discussed in the broadest context possible. Future research directions may also be highlighted.</w:t>
       </w:r>
     </w:p>
     <w:p>
@@ -25146,6 +25296,7 @@
         <w:rPr>
           <w:color w:val="auto"/>
         </w:rPr>
+        <w:lastRenderedPageBreak/>
         <w:t xml:space="preserve">11. </w:t>
       </w:r>
       <w:r>
@@ -25299,7 +25450,6 @@
         <w:rPr>
           <w:color w:val="auto"/>
         </w:rPr>
-        <w:lastRenderedPageBreak/>
         <w:t xml:space="preserve">13. </w:t>
       </w:r>
       <w:r>
@@ -26505,6 +26655,7 @@
         <w:rPr>
           <w:color w:val="auto"/>
         </w:rPr>
+        <w:lastRenderedPageBreak/>
         <w:t xml:space="preserve">28. </w:t>
       </w:r>
       <w:r>
@@ -26666,14 +26817,7 @@
         <w:rPr>
           <w:color w:val="auto"/>
         </w:rPr>
-        <w:t xml:space="preserve">; Reddy, G.P.O., Singh, S.K., Eds.; </w:t>
-      </w:r>
-      <w:r>
-        <w:rPr>
-          <w:color w:val="auto"/>
-        </w:rPr>
-        <w:lastRenderedPageBreak/>
-        <w:t>Geotechnologies and the Environment; Springer International Publishing: Cham, 2018; Vol. 21, pp. 127–142 ISBN 978-3-319-78710-7.</w:t>
+        <w:t>; Reddy, G.P.O., Singh, S.K., Eds.; Geotechnologies and the Environment; Springer International Publishing: Cham, 2018; Vol. 21, pp. 127–142 ISBN 978-3-319-78710-7.</w:t>
       </w:r>
     </w:p>
     <w:p>
@@ -27851,6 +27995,7 @@
         <w:rPr>
           <w:color w:val="auto"/>
         </w:rPr>
+        <w:lastRenderedPageBreak/>
         <w:t xml:space="preserve">45. </w:t>
       </w:r>
       <w:r>
@@ -28039,7 +28184,6 @@
         <w:rPr>
           <w:color w:val="auto"/>
         </w:rPr>
-        <w:lastRenderedPageBreak/>
         <w:t xml:space="preserve">48. </w:t>
       </w:r>
       <w:r>
@@ -29035,6 +29179,7 @@
         <w:rPr>
           <w:color w:val="auto"/>
         </w:rPr>
+        <w:lastRenderedPageBreak/>
         <w:t xml:space="preserve">65. </w:t>
       </w:r>
       <w:r>
@@ -29119,7 +29264,6 @@
         <w:rPr>
           <w:color w:val="auto"/>
         </w:rPr>
-        <w:lastRenderedPageBreak/>
         <w:t xml:space="preserve">69. </w:t>
       </w:r>
       <w:r>
@@ -29623,6 +29767,7 @@
         <w:rPr>
           <w:color w:val="auto"/>
         </w:rPr>
+        <w:lastRenderedPageBreak/>
         <w:t xml:space="preserve">85. </w:t>
       </w:r>
       <w:r>
@@ -29880,7 +30025,6 @@
         <w:rPr>
           <w:color w:val="auto"/>
         </w:rPr>
-        <w:lastRenderedPageBreak/>
         <w:t xml:space="preserve">88. </w:t>
       </w:r>
       <w:r>

</xml_diff>

<commit_message>
Working on simple example
</commit_message>
<xml_diff>
--- a/manuscript/wen-li-2024-geointerv.docx
+++ b/manuscript/wen-li-2024-geointerv.docx
@@ -44,13 +44,8 @@
         <w:t xml:space="preserve"> </w:t>
       </w:r>
       <w:r>
-        <w:t xml:space="preserve">Wen and </w:t>
-      </w:r>
-      <w:proofErr w:type="spellStart"/>
-      <w:r>
-        <w:t>Songnian</w:t>
-      </w:r>
-      <w:proofErr w:type="spellEnd"/>
+        <w:t>Wen and Songnian</w:t>
+      </w:r>
       <w:r>
         <w:t xml:space="preserve"> L</w:t>
       </w:r>
@@ -111,21 +106,8 @@
               <w:spacing w:after="120"/>
             </w:pPr>
             <w:r>
-              <w:t xml:space="preserve">Academic Editor: </w:t>
-            </w:r>
-            <w:proofErr w:type="spellStart"/>
-            <w:r>
-              <w:t>Firstname</w:t>
-            </w:r>
-            <w:proofErr w:type="spellEnd"/>
-            <w:r>
-              <w:t xml:space="preserve"> </w:t>
-            </w:r>
-            <w:proofErr w:type="spellStart"/>
-            <w:r>
-              <w:t>Lastname</w:t>
-            </w:r>
-            <w:proofErr w:type="spellEnd"/>
+              <w:t>Academic Editor: Firstname Lastname</w:t>
+            </w:r>
           </w:p>
           <w:p>
             <w:pPr>
@@ -392,21 +374,7 @@
         <w:rPr>
           <w:szCs w:val="18"/>
         </w:rPr>
-        <w:t xml:space="preserve">stract should be an objective representation of the </w:t>
-      </w:r>
-      <w:proofErr w:type="gramStart"/>
-      <w:r>
-        <w:rPr>
-          <w:szCs w:val="18"/>
-        </w:rPr>
-        <w:t>article</w:t>
-      </w:r>
-      <w:proofErr w:type="gramEnd"/>
-      <w:r>
-        <w:rPr>
-          <w:szCs w:val="18"/>
-        </w:rPr>
-        <w:t xml:space="preserve"> and it must not contain results that are not presented and substantiated in the main text and should not exaggerate the main conclusions.</w:t>
+        <w:t>stract should be an objective representation of the article and it must not contain results that are not presented and substantiated in the main text and should not exaggerate the main conclusions.</w:t>
       </w:r>
     </w:p>
     <w:p>
@@ -8587,21 +8555,7 @@
         <w:rPr>
           <w:lang w:val="en"/>
         </w:rPr>
-        <w:t xml:space="preserve"> </w:t>
-      </w:r>
-      <w:proofErr w:type="gramStart"/>
-      <w:r>
-        <w:rPr>
-          <w:lang w:val="en"/>
-        </w:rPr>
-        <w:t>3-5 meter</w:t>
-      </w:r>
-      <w:proofErr w:type="gramEnd"/>
-      <w:r>
-        <w:rPr>
-          <w:lang w:val="en"/>
-        </w:rPr>
-        <w:t xml:space="preserve"> road width reduction</w:t>
+        <w:t xml:space="preserve"> 3-5 meter road width reduction</w:t>
       </w:r>
       <w:r>
         <w:rPr>
@@ -9367,14 +9321,12 @@
               <w:spacing w:line="240" w:lineRule="auto"/>
               <w:jc w:val="left"/>
             </w:pPr>
-            <w:proofErr w:type="spellStart"/>
             <w:r>
               <w:t>Raster</w:t>
             </w:r>
             <w:r>
               <w:t>s</w:t>
             </w:r>
-            <w:proofErr w:type="spellEnd"/>
             <w:r>
               <w:t>*</w:t>
             </w:r>
@@ -12576,11 +12528,7 @@
         <w:fldChar w:fldCharType="end"/>
       </w:r>
       <w:r>
-        <w:t xml:space="preserve">. The </w:t>
-      </w:r>
-      <w:proofErr w:type="gramStart"/>
-      <w:r>
-        <w:t>mo</w:t>
+        <w:t>. The mo</w:t>
       </w:r>
       <w:r>
         <w:t>d</w:t>
@@ -12591,7 +12539,6 @@
       <w:r>
         <w:t>s</w:t>
       </w:r>
-      <w:proofErr w:type="gramEnd"/>
       <w:r>
         <w:t xml:space="preserve"> sub-component</w:t>
       </w:r>
@@ -14769,19 +14716,11 @@
         </w:rPr>
         <w:t xml:space="preserve">, where all datasets were of point geometry, except for </w:t>
       </w:r>
-      <w:proofErr w:type="spellStart"/>
-      <w:r>
-        <w:rPr>
-          <w:lang w:val="en"/>
-        </w:rPr>
-        <w:t>centrelines</w:t>
-      </w:r>
-      <w:proofErr w:type="spellEnd"/>
-      <w:r>
-        <w:rPr>
-          <w:lang w:val="en"/>
-        </w:rPr>
-        <w:t>.</w:t>
+      <w:r>
+        <w:rPr>
+          <w:lang w:val="en"/>
+        </w:rPr>
+        <w:t>centrelines.</w:t>
       </w:r>
     </w:p>
     <w:p>
@@ -15017,11 +14956,9 @@
             <w:pPr>
               <w:pStyle w:val="MDPI42tablebody"/>
             </w:pPr>
-            <w:proofErr w:type="spellStart"/>
             <w:r>
               <w:t>Centrelines</w:t>
             </w:r>
-            <w:proofErr w:type="spellEnd"/>
             <w:r>
               <w:t xml:space="preserve"> </w:t>
             </w:r>
@@ -17618,15 +17555,7 @@
               <w:jc w:val="left"/>
             </w:pPr>
             <w:r>
-              <w:t xml:space="preserve">Religious locations such as churches, synagogues, temples, ashrams, mosques, </w:t>
-            </w:r>
-            <w:proofErr w:type="spellStart"/>
-            <w:r>
-              <w:t>etc</w:t>
-            </w:r>
-            <w:proofErr w:type="spellEnd"/>
-            <w:r>
-              <w:t xml:space="preserve"> (one-off capture as of 2006)</w:t>
+              <w:t>Religious locations such as churches, synagogues, temples, ashrams, mosques, etc (one-off capture as of 2006)</w:t>
             </w:r>
           </w:p>
         </w:tc>
@@ -18285,21 +18214,7 @@
         <w:rPr>
           <w:lang w:val="en"/>
         </w:rPr>
-        <w:t>For the case study, we applied Automated Machine Learning (</w:t>
-      </w:r>
-      <w:proofErr w:type="spellStart"/>
-      <w:r>
-        <w:rPr>
-          <w:lang w:val="en"/>
-        </w:rPr>
-        <w:t>AutoML</w:t>
-      </w:r>
-      <w:proofErr w:type="spellEnd"/>
-      <w:r>
-        <w:rPr>
-          <w:lang w:val="en"/>
-        </w:rPr>
-        <w:t xml:space="preserve">) for the outcome modelling component </w:t>
+        <w:t xml:space="preserve">For the case study, we applied Automated Machine Learning (AutoML) for the outcome modelling component </w:t>
       </w:r>
       <w:r>
         <w:rPr>
@@ -18420,21 +18335,7 @@
         <w:rPr>
           <w:lang w:val="en"/>
         </w:rPr>
-        <w:t xml:space="preserve"> two python packages for </w:t>
-      </w:r>
-      <w:proofErr w:type="spellStart"/>
-      <w:r>
-        <w:rPr>
-          <w:lang w:val="en"/>
-        </w:rPr>
-        <w:t>AutoML</w:t>
-      </w:r>
-      <w:proofErr w:type="spellEnd"/>
-      <w:r>
-        <w:rPr>
-          <w:lang w:val="en"/>
-        </w:rPr>
-        <w:t xml:space="preserve">: </w:t>
+        <w:t xml:space="preserve"> two python packages for AutoML: </w:t>
       </w:r>
       <w:r>
         <w:rPr>
@@ -18442,39 +18343,250 @@
           <w:iCs/>
           <w:lang w:val="en"/>
         </w:rPr>
-        <w:t>auto-</w:t>
-      </w:r>
-      <w:proofErr w:type="spellStart"/>
+        <w:t>auto-sklearn</w:t>
+      </w:r>
+      <w:r>
+        <w:rPr>
+          <w:lang w:val="en"/>
+        </w:rPr>
+        <w:t xml:space="preserve"> and </w:t>
+      </w:r>
       <w:r>
         <w:rPr>
           <w:i/>
           <w:iCs/>
           <w:lang w:val="en"/>
         </w:rPr>
-        <w:t>sklearn</w:t>
-      </w:r>
-      <w:proofErr w:type="spellEnd"/>
-      <w:r>
-        <w:rPr>
-          <w:lang w:val="en"/>
-        </w:rPr>
-        <w:t xml:space="preserve"> and </w:t>
-      </w:r>
-      <w:proofErr w:type="spellStart"/>
+        <w:t>tpot</w:t>
+      </w:r>
+      <w:r>
+        <w:rPr>
+          <w:lang w:val="en"/>
+        </w:rPr>
+        <w:t xml:space="preserve">. The package </w:t>
+      </w:r>
       <w:r>
         <w:rPr>
           <w:i/>
           <w:iCs/>
           <w:lang w:val="en"/>
         </w:rPr>
-        <w:t>tpot</w:t>
-      </w:r>
-      <w:proofErr w:type="spellEnd"/>
-      <w:r>
-        <w:rPr>
-          <w:lang w:val="en"/>
-        </w:rPr>
-        <w:t xml:space="preserve">. The package </w:t>
+        <w:t>auto-sklearn</w:t>
+      </w:r>
+      <w:r>
+        <w:rPr>
+          <w:lang w:val="en"/>
+        </w:rPr>
+        <w:t xml:space="preserve"> use</w:t>
+      </w:r>
+      <w:r>
+        <w:rPr>
+          <w:lang w:val="en"/>
+        </w:rPr>
+        <w:t>s</w:t>
+      </w:r>
+      <w:r>
+        <w:rPr>
+          <w:lang w:val="en"/>
+        </w:rPr>
+        <w:t xml:space="preserve"> </w:t>
+      </w:r>
+      <w:r>
+        <w:rPr>
+          <w:lang w:val="en"/>
+        </w:rPr>
+        <w:t>Bayesian</w:t>
+      </w:r>
+      <w:r>
+        <w:rPr>
+          <w:lang w:val="en"/>
+        </w:rPr>
+        <w:t xml:space="preserve"> optimization</w:t>
+      </w:r>
+      <w:r>
+        <w:rPr>
+          <w:lang w:val="en"/>
+        </w:rPr>
+        <w:t xml:space="preserve"> </w:t>
+      </w:r>
+      <w:r>
+        <w:rPr>
+          <w:lang w:val="en"/>
+        </w:rPr>
+        <w:fldChar w:fldCharType="begin"/>
+      </w:r>
+      <w:r>
+        <w:rPr>
+          <w:lang w:val="en"/>
+        </w:rPr>
+        <w:instrText xml:space="preserve"> ADDIN ZOTERO_ITEM CSL_CITATION {"citationID":"tnmdlVZN","properties":{"formattedCitation":"[87]","plainCitation":"[87]","noteIndex":0},"citationItems":[{"id":800,"uris":["http://zotero.org/users/6749620/items/YS8IMQNU"],"itemData":{"id":800,"type":"chapter","container-title":"Advances in Neural Information Processing Systems 25","page":"2951–2959","publisher":"Curran Associates, Inc.","source":"Neural Information Processing Systems","title":"Practical Bayesian Optimization of Machine Learning Algorithms","author":[{"family":"Snoek","given":"Jasper"},{"family":"Larochelle","given":"Hugo"},{"family":"Adams","given":"Ryan P"}],"editor":[{"family":"Pereira","given":"F."},{"family":"Burges","given":"C. J. C."},{"family":"Bottou","given":"L."},{"family":"Weinberger","given":"K. Q."}],"accessed":{"date-parts":[["2020",9,26]]},"issued":{"date-parts":[["2012"]]},"citation-key":"snoekPracticalBayesianOptimization2012"}}],"schema":"https://github.com/citation-style-language/schema/raw/master/csl-citation.json"} </w:instrText>
+      </w:r>
+      <w:r>
+        <w:rPr>
+          <w:lang w:val="en"/>
+        </w:rPr>
+        <w:fldChar w:fldCharType="separate"/>
+      </w:r>
+      <w:r>
+        <w:rPr>
+          <w:noProof/>
+          <w:lang w:val="en"/>
+        </w:rPr>
+        <w:t>[87]</w:t>
+      </w:r>
+      <w:r>
+        <w:rPr>
+          <w:lang w:val="en"/>
+        </w:rPr>
+        <w:fldChar w:fldCharType="end"/>
+      </w:r>
+      <w:r>
+        <w:rPr>
+          <w:lang w:val="en"/>
+        </w:rPr>
+        <w:t>, meta-learning</w:t>
+      </w:r>
+      <w:r>
+        <w:rPr>
+          <w:lang w:val="en"/>
+        </w:rPr>
+        <w:t xml:space="preserve"> </w:t>
+      </w:r>
+      <w:r>
+        <w:rPr>
+          <w:lang w:val="en"/>
+        </w:rPr>
+        <w:fldChar w:fldCharType="begin"/>
+      </w:r>
+      <w:r>
+        <w:rPr>
+          <w:lang w:val="en"/>
+        </w:rPr>
+        <w:instrText xml:space="preserve"> ADDIN ZOTERO_ITEM CSL_CITATION {"citationID":"U1uW3KD2","properties":{"formattedCitation":"[88]","plainCitation":"[88]","noteIndex":0},"citationItems":[{"id":1986,"uris":["http://zotero.org/users/6749620/items/7VRJ7XM6"],"itemData":{"id":1986,"type":"article-journal","abstract":"Different researchers hold different views of what the term meta-learning exactlymeans. The first part of this paper provides our own perspective view in which the goal isto build self-adaptive learners (i.e. learning algorithms that improve their bias dynamicallythrough experience by accumulating meta-knowledge). The second part provides a survey ofmeta-learning as reported by the machine-learning literature. We find that, despite differentviews and research lines, a question remains constant: how can we exploit knowledge aboutlearning (i.e. meta-knowledge) to improve the performance of learning algorithms? Clearlythe answer to this question is key to the advancement of the field and continues being thesubject of intensive research.","container-title":"Artificial Intelligence Review","DOI":"10.1023/A:1019956318069","ISSN":"1573-7462","issue":"2","journalAbbreviation":"Artificial Intelligence Review","language":"en","page":"77-95","source":"Springer Link","title":"A Perspective View and Survey of Meta-Learning","volume":"18","author":[{"family":"Vilalta","given":"Ricardo"},{"family":"Drissi","given":"Youssef"}],"issued":{"date-parts":[["2002",6,1]]},"citation-key":"vilaltaPerspectiveViewSurvey2002"}}],"schema":"https://github.com/citation-style-language/schema/raw/master/csl-citation.json"} </w:instrText>
+      </w:r>
+      <w:r>
+        <w:rPr>
+          <w:lang w:val="en"/>
+        </w:rPr>
+        <w:fldChar w:fldCharType="separate"/>
+      </w:r>
+      <w:r>
+        <w:rPr>
+          <w:noProof/>
+          <w:lang w:val="en"/>
+        </w:rPr>
+        <w:t>[88]</w:t>
+      </w:r>
+      <w:r>
+        <w:rPr>
+          <w:lang w:val="en"/>
+        </w:rPr>
+        <w:fldChar w:fldCharType="end"/>
+      </w:r>
+      <w:r>
+        <w:rPr>
+          <w:lang w:val="en"/>
+        </w:rPr>
+        <w:t xml:space="preserve">, and ensemble </w:t>
+      </w:r>
+      <w:r>
+        <w:rPr>
+          <w:lang w:val="en"/>
+        </w:rPr>
+        <w:lastRenderedPageBreak/>
+        <w:t>construction</w:t>
+      </w:r>
+      <w:r>
+        <w:rPr>
+          <w:lang w:val="en"/>
+        </w:rPr>
+        <w:t xml:space="preserve"> </w:t>
+      </w:r>
+      <w:r>
+        <w:rPr>
+          <w:lang w:val="en"/>
+        </w:rPr>
+        <w:fldChar w:fldCharType="begin"/>
+      </w:r>
+      <w:r>
+        <w:rPr>
+          <w:lang w:val="en"/>
+        </w:rPr>
+        <w:instrText xml:space="preserve"> ADDIN ZOTERO_ITEM CSL_CITATION {"citationID":"nQvZjUXy","properties":{"formattedCitation":"[89]","plainCitation":"[89]","noteIndex":0},"citationItems":[{"id":1163,"uris":["http://zotero.org/users/6749620/items/D9TSECMD"],"itemData":{"id":1163,"type":"paper-conference","abstract":"We present a method for constructing ensembles from libraries of thousands of models. Model libraries are generated using different learning algorithms and parameter settings. Forward stepwise selection is used to add to the ensemble the models that maximize its performance. Ensemble selection allows ensembles to be optimized to performance metric such as accuracy, cross entropy, mean precision, or ROC Area. Experiments with seven test problems and ten metrics demonstrate the benefit of ensemble selection.","collection-title":"ICML '04","container-title":"Proceedings of the twenty-first international conference on Machine learning","DOI":"10.1145/1015330.1015432","event-place":"New York, NY, USA","ISBN":"978-1-58113-838-2","page":"18","publisher":"Association for Computing Machinery","publisher-place":"New York, NY, USA","source":"ACM Digital Library","title":"Ensemble selection from libraries of models","URL":"https://doi.org/10.1145/1015330.1015432","author":[{"family":"Caruana","given":"Rich"},{"family":"Niculescu-Mizil","given":"Alexandru"},{"family":"Crew","given":"Geoff"},{"family":"Ksikes","given":"Alex"}],"accessed":{"date-parts":[["2021",2,1]]},"issued":{"date-parts":[["2004",7,4]]},"citation-key":"caruanaEnsembleSelectionLibraries2004"}}],"schema":"https://github.com/citation-style-language/schema/raw/master/csl-citation.json"} </w:instrText>
+      </w:r>
+      <w:r>
+        <w:rPr>
+          <w:lang w:val="en"/>
+        </w:rPr>
+        <w:fldChar w:fldCharType="separate"/>
+      </w:r>
+      <w:r>
+        <w:rPr>
+          <w:noProof/>
+          <w:lang w:val="en"/>
+        </w:rPr>
+        <w:t>[89]</w:t>
+      </w:r>
+      <w:r>
+        <w:rPr>
+          <w:lang w:val="en"/>
+        </w:rPr>
+        <w:fldChar w:fldCharType="end"/>
+      </w:r>
+      <w:r>
+        <w:rPr>
+          <w:lang w:val="en"/>
+        </w:rPr>
+        <w:t xml:space="preserve"> to automatically select the best model from a test of several models and parameters</w:t>
+      </w:r>
+      <w:r>
+        <w:rPr>
+          <w:lang w:val="en"/>
+        </w:rPr>
+        <w:t xml:space="preserve"> </w:t>
+      </w:r>
+      <w:r>
+        <w:rPr>
+          <w:lang w:val="en"/>
+        </w:rPr>
+        <w:fldChar w:fldCharType="begin"/>
+      </w:r>
+      <w:r>
+        <w:rPr>
+          <w:lang w:val="en"/>
+        </w:rPr>
+        <w:instrText xml:space="preserve"> ADDIN ZOTERO_ITEM CSL_CITATION {"citationID":"TA6HuCNJ","properties":{"formattedCitation":"[90,91]","plainCitation":"[90,91]","noteIndex":0},"citationItems":[{"id":1838,"uris":["http://zotero.org/users/6749620/items/MPZ8F3N3"],"itemData":{"id":1838,"type":"article-journal","container-title":"Advances in neural information processing systems","source":"Google Scholar","title":"Efficient and robust automated machine learning","volume":"28","author":[{"family":"Feurer","given":"Matthias"},{"family":"Klein","given":"Aaron"},{"family":"Eggensperger","given":"Katharina"},{"family":"Springenberg","given":"Jost"},{"family":"Blum","given":"Manuel"},{"family":"Hutter","given":"Frank"}],"issued":{"date-parts":[["2015"]]},"citation-key":"feurerEfficientRobustAutomated2015"}},{"id":1180,"uris":["http://zotero.org/users/6749620/items/HHNIN4WU"],"itemData":{"id":1180,"type":"chapter","abstract":"The success of machine learning in a broad range of applications has led to an ever-growing demand for machine learning systems that can be used oﬀ the shelf by non-experts. To be eﬀective in practice, such systems need to automatically choose a good algorithm and feature preprocessing steps for a new dataset at hand, and also set their respective hyperparameters. Recent work has started to tackle this automated machine learning (AutoML) problem with the help of eﬃcient Bayesian optimization methods. Building on this, we introduce a robust new AutoML system based on the Python machine learning package scikit-learn (using 15 classiﬁers, 14 feature preprocessing methods, and 4 data preprocessing methods, giving rise to a structured hypothesis space with 110 hyperparameters). This system, which we dub Auto-sklearn, improves on existing AutoML methods by automatically taking into account past performance on similar datasets, and by constructing ensembles from the models evaluated during the optimization. Our system won six out of ten phases of the ﬁrst ChaLearn AutoML challenge, and our comprehensive analysis on over 100 diverse datasets shows that it substantially outperforms the previous state of the art in AutoML. We also demonstrate the performance gains due to each of our contributions and derive insights into the eﬀectiveness of the individual components of Auto-sklearn.","container-title":"Automated Machine Learning","event-place":"Cham","ISBN":"978-3-030-05317-8","language":"en","note":"collection-title: The Springer Series on Challenges in Machine Learning\nDOI: 10.1007/978-3-030-05318-5_6","page":"113-134","publisher":"Springer International Publishing","publisher-place":"Cham","source":"DOI.org (Crossref)","title":"Auto-sklearn: Efficient and Robust Automated Machine Learning","title-short":"Auto-sklearn","URL":"http://link.springer.com/10.1007/978-3-030-05318-5_6","editor":[{"family":"Hutter","given":"Frank"},{"family":"Kotthoff","given":"Lars"},{"family":"Vanschoren","given":"Joaquin"}],"author":[{"family":"Feurer","given":"Matthias"},{"family":"Klein","given":"Aaron"},{"family":"Eggensperger","given":"Katharina"},{"family":"Springenberg","given":"Jost Tobias"},{"family":"Blum","given":"Manuel"},{"family":"Hutter","given":"Frank"}],"accessed":{"date-parts":[["2021",2,7]]},"issued":{"date-parts":[["2019"]]},"citation-key":"feurerAutosklearnEfficientRobust2019"}}],"schema":"https://github.com/citation-style-language/schema/raw/master/csl-citation.json"} </w:instrText>
+      </w:r>
+      <w:r>
+        <w:rPr>
+          <w:lang w:val="en"/>
+        </w:rPr>
+        <w:fldChar w:fldCharType="separate"/>
+      </w:r>
+      <w:r>
+        <w:rPr>
+          <w:noProof/>
+          <w:lang w:val="en"/>
+        </w:rPr>
+        <w:t>[90,91]</w:t>
+      </w:r>
+      <w:r>
+        <w:rPr>
+          <w:lang w:val="en"/>
+        </w:rPr>
+        <w:fldChar w:fldCharType="end"/>
+      </w:r>
+      <w:r>
+        <w:rPr>
+          <w:lang w:val="en"/>
+        </w:rPr>
+        <w:t>.</w:t>
+      </w:r>
+      <w:r>
+        <w:rPr>
+          <w:lang w:val="en"/>
+        </w:rPr>
+        <w:t xml:space="preserve"> The package </w:t>
       </w:r>
       <w:r>
         <w:rPr>
@@ -18482,234 +18594,180 @@
           <w:iCs/>
           <w:lang w:val="en"/>
         </w:rPr>
-        <w:t>auto-</w:t>
-      </w:r>
-      <w:proofErr w:type="spellStart"/>
+        <w:t>tpot</w:t>
+      </w:r>
+      <w:r>
+        <w:rPr>
+          <w:lang w:val="en"/>
+        </w:rPr>
+        <w:t xml:space="preserve"> uses genetic </w:t>
+      </w:r>
+      <w:r>
+        <w:rPr>
+          <w:lang w:val="en"/>
+        </w:rPr>
+        <w:t>programming</w:t>
+      </w:r>
+      <w:r>
+        <w:rPr>
+          <w:lang w:val="en"/>
+        </w:rPr>
+        <w:t xml:space="preserve"> </w:t>
+      </w:r>
+      <w:r>
+        <w:rPr>
+          <w:lang w:val="en"/>
+        </w:rPr>
+        <w:fldChar w:fldCharType="begin"/>
+      </w:r>
+      <w:r>
+        <w:rPr>
+          <w:lang w:val="en"/>
+        </w:rPr>
+        <w:instrText xml:space="preserve"> ADDIN ZOTERO_ITEM CSL_CITATION {"citationID":"RGP9X19Z","properties":{"formattedCitation":"[92]","plainCitation":"[92]","noteIndex":0},"citationItems":[{"id":2292,"uris":["http://zotero.org/users/6749620/items/W7NQNMJL"],"itemData":{"id":2292,"type":"book","abstract":"Genetic programming (GP), one of the most advanced forms of evolutionary computation, has been highly successful as a technique for getting computers to automatically solve problems without having to tell them explicitly how. Since its inceptions more than ten years ago, GP has been used to solve practical problems in a variety of application fields. Along with this ad-hoc engineering approaches interest increased in how and why GP works. This book provides a coherent consolidation of recent work on the theoretical foundations of GP. A concise introduction to GP and genetic algorithms (GA) is followed by a discussion of fitness landscapes and other theoretical approaches to natural and artificial evolution. Having surveyed early approaches to GP theory it presents new exact schema analysis, showing that it applies to GP as well as to the simpler GAs. New results on the potentially infinite number of possible programs are followed by two chapters applying these new techniques.","ISBN":"978-3-662-04726-2","language":"en","note":"Google-Books-ID: zsaqCAAAQBAJ","number-of-pages":"265","publisher":"Springer Science &amp; Business Media","source":"Google Books","title":"Foundations of Genetic Programming","author":[{"family":"Langdon","given":"William B."},{"family":"Poli","given":"Riccardo"}],"issued":{"date-parts":[["2013",3,9]]},"citation-key":"langdonFoundationsGeneticProgramming2013"}}],"schema":"https://github.com/citation-style-language/schema/raw/master/csl-citation.json"} </w:instrText>
+      </w:r>
+      <w:r>
+        <w:rPr>
+          <w:lang w:val="en"/>
+        </w:rPr>
+        <w:fldChar w:fldCharType="separate"/>
+      </w:r>
+      <w:r>
+        <w:rPr>
+          <w:noProof/>
+          <w:lang w:val="en"/>
+        </w:rPr>
+        <w:t>[92]</w:t>
+      </w:r>
+      <w:r>
+        <w:rPr>
+          <w:lang w:val="en"/>
+        </w:rPr>
+        <w:fldChar w:fldCharType="end"/>
+      </w:r>
+      <w:r>
+        <w:rPr>
+          <w:lang w:val="en"/>
+        </w:rPr>
+        <w:t xml:space="preserve"> to automatically </w:t>
+      </w:r>
+      <w:r>
+        <w:rPr>
+          <w:lang w:val="en"/>
+        </w:rPr>
+        <w:t>optimize and design</w:t>
+      </w:r>
+      <w:r>
+        <w:rPr>
+          <w:lang w:val="en"/>
+        </w:rPr>
+        <w:t xml:space="preserve"> machine learning pipelines</w:t>
+      </w:r>
+      <w:r>
+        <w:rPr>
+          <w:lang w:val="en"/>
+        </w:rPr>
+        <w:t xml:space="preserve"> through pipeline operators</w:t>
+      </w:r>
+      <w:r>
+        <w:rPr>
+          <w:lang w:val="en"/>
+        </w:rPr>
+        <w:t xml:space="preserve">, including the </w:t>
+      </w:r>
+      <w:r>
+        <w:rPr>
+          <w:lang w:val="en"/>
+        </w:rPr>
+        <w:t>operations</w:t>
+      </w:r>
+      <w:r>
+        <w:rPr>
+          <w:lang w:val="en"/>
+        </w:rPr>
+        <w:t xml:space="preserve"> of feature engineering, model selection, and parameter tuning</w:t>
+      </w:r>
+      <w:r>
+        <w:rPr>
+          <w:lang w:val="en"/>
+        </w:rPr>
+        <w:t xml:space="preserve"> </w:t>
+      </w:r>
+      <w:r>
+        <w:rPr>
+          <w:lang w:val="en"/>
+        </w:rPr>
+        <w:fldChar w:fldCharType="begin"/>
+      </w:r>
+      <w:r>
+        <w:rPr>
+          <w:lang w:val="en"/>
+        </w:rPr>
+        <w:instrText xml:space="preserve"> ADDIN ZOTERO_ITEM CSL_CITATION {"citationID":"NKqpimaY","properties":{"formattedCitation":"[93,93]","plainCitation":"[93,93]","noteIndex":0},"citationItems":[{"id":1136,"uris":["http://zotero.org/users/6749620/items/87X5S4X6"],"itemData":{"id":1136,"type":"paper-conference","abstract":"As data science becomes more mainstream, there will be an ever-growing demand for data science tools that are more accessible, flexible, and scalable. In response to this demand, automated machine ...","container-title":"Workshop on Automatic Machine Learning","event-title":"Workshop on Automatic Machine Learning","language":"en","note":"ISSN: 1938-7228","page":"66-74","publisher":"PMLR","source":"proceedings.mlr.press","title":"TPOT: A Tree-based Pipeline Optimization Tool for Automating Machine Learning","title-short":"TPOT","URL":"http://proceedings.mlr.press/v64/olson_tpot_2016.html","author":[{"family":"Olson","given":"Randal S."},{"family":"Moore","given":"Jason H."}],"accessed":{"date-parts":[["2021",1,22]]},"issued":{"date-parts":[["2016",12,4]]},"citation-key":"olsonTPOTTreebasedPipeline2016"}},{"id":1136,"uris":["http://zotero.org/users/6749620/items/87X5S4X6"],"itemData":{"id":1136,"type":"paper-conference","abstract":"As data science becomes more mainstream, there will be an ever-growing demand for data science tools that are more accessible, flexible, and scalable. In response to this demand, automated machine ...","container-title":"Workshop on Automatic Machine Learning","event-title":"Workshop on Automatic Machine Learning","language":"en","note":"ISSN: 1938-7228","page":"66-74","publisher":"PMLR","source":"proceedings.mlr.press","title":"TPOT: A Tree-based Pipeline Optimization Tool for Automating Machine Learning","title-short":"TPOT","URL":"http://proceedings.mlr.press/v64/olson_tpot_2016.html","author":[{"family":"Olson","given":"Randal S."},{"family":"Moore","given":"Jason H."}],"accessed":{"date-parts":[["2021",1,22]]},"issued":{"date-parts":[["2016",12,4]]},"citation-key":"olsonTPOTTreebasedPipeline2016"}}],"schema":"https://github.com/citation-style-language/schema/raw/master/csl-citation.json"} </w:instrText>
+      </w:r>
+      <w:r>
+        <w:rPr>
+          <w:lang w:val="en"/>
+        </w:rPr>
+        <w:fldChar w:fldCharType="separate"/>
+      </w:r>
+      <w:r>
+        <w:rPr>
+          <w:noProof/>
+          <w:lang w:val="en"/>
+        </w:rPr>
+        <w:t>[93,93]</w:t>
+      </w:r>
+      <w:r>
+        <w:rPr>
+          <w:lang w:val="en"/>
+        </w:rPr>
+        <w:fldChar w:fldCharType="end"/>
+      </w:r>
+      <w:r>
+        <w:rPr>
+          <w:lang w:val="en"/>
+        </w:rPr>
+        <w:t>.</w:t>
+      </w:r>
+      <w:r>
+        <w:rPr>
+          <w:lang w:val="en"/>
+        </w:rPr>
+        <w:t xml:space="preserve"> For the variables sub-component, the output of the </w:t>
+      </w:r>
+      <w:r>
+        <w:rPr>
+          <w:lang w:val="en"/>
+        </w:rPr>
+        <w:t xml:space="preserve">spatial feature engineering </w:t>
+      </w:r>
+      <w:r>
+        <w:rPr>
+          <w:lang w:val="en"/>
+        </w:rPr>
+        <w:t>sub-component from the spatial data component was used</w:t>
+      </w:r>
+      <w:r>
+        <w:rPr>
+          <w:lang w:val="en"/>
+        </w:rPr>
+        <w:t xml:space="preserve">, while the models sub-component contained both </w:t>
+      </w:r>
       <w:r>
         <w:rPr>
           <w:i/>
           <w:iCs/>
           <w:lang w:val="en"/>
         </w:rPr>
-        <w:t>sklearn</w:t>
-      </w:r>
-      <w:proofErr w:type="spellEnd"/>
-      <w:r>
-        <w:rPr>
-          <w:lang w:val="en"/>
-        </w:rPr>
-        <w:t xml:space="preserve"> use</w:t>
-      </w:r>
-      <w:r>
-        <w:rPr>
-          <w:lang w:val="en"/>
-        </w:rPr>
-        <w:t>s</w:t>
-      </w:r>
-      <w:r>
-        <w:rPr>
-          <w:lang w:val="en"/>
-        </w:rPr>
-        <w:t xml:space="preserve"> </w:t>
-      </w:r>
-      <w:r>
-        <w:rPr>
-          <w:lang w:val="en"/>
-        </w:rPr>
-        <w:t>Bayesian</w:t>
-      </w:r>
-      <w:r>
-        <w:rPr>
-          <w:lang w:val="en"/>
-        </w:rPr>
-        <w:t xml:space="preserve"> optimization</w:t>
-      </w:r>
-      <w:r>
-        <w:rPr>
-          <w:lang w:val="en"/>
-        </w:rPr>
-        <w:t xml:space="preserve"> </w:t>
-      </w:r>
-      <w:r>
-        <w:rPr>
-          <w:lang w:val="en"/>
-        </w:rPr>
-        <w:fldChar w:fldCharType="begin"/>
-      </w:r>
-      <w:r>
-        <w:rPr>
-          <w:lang w:val="en"/>
-        </w:rPr>
-        <w:instrText xml:space="preserve"> ADDIN ZOTERO_ITEM CSL_CITATION {"citationID":"tnmdlVZN","properties":{"formattedCitation":"[87]","plainCitation":"[87]","noteIndex":0},"citationItems":[{"id":800,"uris":["http://zotero.org/users/6749620/items/YS8IMQNU"],"itemData":{"id":800,"type":"chapter","container-title":"Advances in Neural Information Processing Systems 25","page":"2951–2959","publisher":"Curran Associates, Inc.","source":"Neural Information Processing Systems","title":"Practical Bayesian Optimization of Machine Learning Algorithms","author":[{"family":"Snoek","given":"Jasper"},{"family":"Larochelle","given":"Hugo"},{"family":"Adams","given":"Ryan P"}],"editor":[{"family":"Pereira","given":"F."},{"family":"Burges","given":"C. J. C."},{"family":"Bottou","given":"L."},{"family":"Weinberger","given":"K. Q."}],"accessed":{"date-parts":[["2020",9,26]]},"issued":{"date-parts":[["2012"]]},"citation-key":"snoekPracticalBayesianOptimization2012"}}],"schema":"https://github.com/citation-style-language/schema/raw/master/csl-citation.json"} </w:instrText>
-      </w:r>
-      <w:r>
-        <w:rPr>
-          <w:lang w:val="en"/>
-        </w:rPr>
-        <w:fldChar w:fldCharType="separate"/>
-      </w:r>
-      <w:r>
-        <w:rPr>
-          <w:noProof/>
-          <w:lang w:val="en"/>
-        </w:rPr>
-        <w:t>[87]</w:t>
-      </w:r>
-      <w:r>
-        <w:rPr>
-          <w:lang w:val="en"/>
-        </w:rPr>
-        <w:fldChar w:fldCharType="end"/>
-      </w:r>
-      <w:r>
-        <w:rPr>
-          <w:lang w:val="en"/>
-        </w:rPr>
-        <w:t>, meta-learning</w:t>
-      </w:r>
-      <w:r>
-        <w:rPr>
-          <w:lang w:val="en"/>
-        </w:rPr>
-        <w:t xml:space="preserve"> </w:t>
-      </w:r>
-      <w:r>
-        <w:rPr>
-          <w:lang w:val="en"/>
-        </w:rPr>
-        <w:fldChar w:fldCharType="begin"/>
-      </w:r>
-      <w:r>
-        <w:rPr>
-          <w:lang w:val="en"/>
-        </w:rPr>
-        <w:instrText xml:space="preserve"> ADDIN ZOTERO_ITEM CSL_CITATION {"citationID":"U1uW3KD2","properties":{"formattedCitation":"[88]","plainCitation":"[88]","noteIndex":0},"citationItems":[{"id":1986,"uris":["http://zotero.org/users/6749620/items/7VRJ7XM6"],"itemData":{"id":1986,"type":"article-journal","abstract":"Different researchers hold different views of what the term meta-learning exactlymeans. The first part of this paper provides our own perspective view in which the goal isto build self-adaptive learners (i.e. learning algorithms that improve their bias dynamicallythrough experience by accumulating meta-knowledge). The second part provides a survey ofmeta-learning as reported by the machine-learning literature. We find that, despite differentviews and research lines, a question remains constant: how can we exploit knowledge aboutlearning (i.e. meta-knowledge) to improve the performance of learning algorithms? Clearlythe answer to this question is key to the advancement of the field and continues being thesubject of intensive research.","container-title":"Artificial Intelligence Review","DOI":"10.1023/A:1019956318069","ISSN":"1573-7462","issue":"2","journalAbbreviation":"Artificial Intelligence Review","language":"en","page":"77-95","source":"Springer Link","title":"A Perspective View and Survey of Meta-Learning","volume":"18","author":[{"family":"Vilalta","given":"Ricardo"},{"family":"Drissi","given":"Youssef"}],"issued":{"date-parts":[["2002",6,1]]},"citation-key":"vilaltaPerspectiveViewSurvey2002"}}],"schema":"https://github.com/citation-style-language/schema/raw/master/csl-citation.json"} </w:instrText>
-      </w:r>
-      <w:r>
-        <w:rPr>
-          <w:lang w:val="en"/>
-        </w:rPr>
-        <w:fldChar w:fldCharType="separate"/>
-      </w:r>
-      <w:r>
-        <w:rPr>
-          <w:noProof/>
-          <w:lang w:val="en"/>
-        </w:rPr>
-        <w:t>[88]</w:t>
-      </w:r>
-      <w:r>
-        <w:rPr>
-          <w:lang w:val="en"/>
-        </w:rPr>
-        <w:fldChar w:fldCharType="end"/>
-      </w:r>
-      <w:r>
-        <w:rPr>
-          <w:lang w:val="en"/>
-        </w:rPr>
-        <w:t xml:space="preserve">, and ensemble </w:t>
-      </w:r>
-      <w:r>
-        <w:rPr>
-          <w:lang w:val="en"/>
-        </w:rPr>
-        <w:lastRenderedPageBreak/>
-        <w:t>construction</w:t>
-      </w:r>
-      <w:r>
-        <w:rPr>
-          <w:lang w:val="en"/>
-        </w:rPr>
-        <w:t xml:space="preserve"> </w:t>
-      </w:r>
-      <w:r>
-        <w:rPr>
-          <w:lang w:val="en"/>
-        </w:rPr>
-        <w:fldChar w:fldCharType="begin"/>
-      </w:r>
-      <w:r>
-        <w:rPr>
-          <w:lang w:val="en"/>
-        </w:rPr>
-        <w:instrText xml:space="preserve"> ADDIN ZOTERO_ITEM CSL_CITATION {"citationID":"nQvZjUXy","properties":{"formattedCitation":"[89]","plainCitation":"[89]","noteIndex":0},"citationItems":[{"id":1163,"uris":["http://zotero.org/users/6749620/items/D9TSECMD"],"itemData":{"id":1163,"type":"paper-conference","abstract":"We present a method for constructing ensembles from libraries of thousands of models. Model libraries are generated using different learning algorithms and parameter settings. Forward stepwise selection is used to add to the ensemble the models that maximize its performance. Ensemble selection allows ensembles to be optimized to performance metric such as accuracy, cross entropy, mean precision, or ROC Area. Experiments with seven test problems and ten metrics demonstrate the benefit of ensemble selection.","collection-title":"ICML '04","container-title":"Proceedings of the twenty-first international conference on Machine learning","DOI":"10.1145/1015330.1015432","event-place":"New York, NY, USA","ISBN":"978-1-58113-838-2","page":"18","publisher":"Association for Computing Machinery","publisher-place":"New York, NY, USA","source":"ACM Digital Library","title":"Ensemble selection from libraries of models","URL":"https://doi.org/10.1145/1015330.1015432","author":[{"family":"Caruana","given":"Rich"},{"family":"Niculescu-Mizil","given":"Alexandru"},{"family":"Crew","given":"Geoff"},{"family":"Ksikes","given":"Alex"}],"accessed":{"date-parts":[["2021",2,1]]},"issued":{"date-parts":[["2004",7,4]]},"citation-key":"caruanaEnsembleSelectionLibraries2004"}}],"schema":"https://github.com/citation-style-language/schema/raw/master/csl-citation.json"} </w:instrText>
-      </w:r>
-      <w:r>
-        <w:rPr>
-          <w:lang w:val="en"/>
-        </w:rPr>
-        <w:fldChar w:fldCharType="separate"/>
-      </w:r>
-      <w:r>
-        <w:rPr>
-          <w:noProof/>
-          <w:lang w:val="en"/>
-        </w:rPr>
-        <w:t>[89]</w:t>
-      </w:r>
-      <w:r>
-        <w:rPr>
-          <w:lang w:val="en"/>
-        </w:rPr>
-        <w:fldChar w:fldCharType="end"/>
-      </w:r>
-      <w:r>
-        <w:rPr>
-          <w:lang w:val="en"/>
-        </w:rPr>
-        <w:t xml:space="preserve"> to automatically select the best model from a test of several models and parameters</w:t>
-      </w:r>
-      <w:r>
-        <w:rPr>
-          <w:lang w:val="en"/>
-        </w:rPr>
-        <w:t xml:space="preserve"> </w:t>
-      </w:r>
-      <w:r>
-        <w:rPr>
-          <w:lang w:val="en"/>
-        </w:rPr>
-        <w:fldChar w:fldCharType="begin"/>
-      </w:r>
-      <w:r>
-        <w:rPr>
-          <w:lang w:val="en"/>
-        </w:rPr>
-        <w:instrText xml:space="preserve"> ADDIN ZOTERO_ITEM CSL_CITATION {"citationID":"TA6HuCNJ","properties":{"formattedCitation":"[90,91]","plainCitation":"[90,91]","noteIndex":0},"citationItems":[{"id":1838,"uris":["http://zotero.org/users/6749620/items/MPZ8F3N3"],"itemData":{"id":1838,"type":"article-journal","container-title":"Advances in neural information processing systems","source":"Google Scholar","title":"Efficient and robust automated machine learning","volume":"28","author":[{"family":"Feurer","given":"Matthias"},{"family":"Klein","given":"Aaron"},{"family":"Eggensperger","given":"Katharina"},{"family":"Springenberg","given":"Jost"},{"family":"Blum","given":"Manuel"},{"family":"Hutter","given":"Frank"}],"issued":{"date-parts":[["2015"]]},"citation-key":"feurerEfficientRobustAutomated2015"}},{"id":1180,"uris":["http://zotero.org/users/6749620/items/HHNIN4WU"],"itemData":{"id":1180,"type":"chapter","abstract":"The success of machine learning in a broad range of applications has led to an ever-growing demand for machine learning systems that can be used oﬀ the shelf by non-experts. To be eﬀective in practice, such systems need to automatically choose a good algorithm and feature preprocessing steps for a new dataset at hand, and also set their respective hyperparameters. Recent work has started to tackle this automated machine learning (AutoML) problem with the help of eﬃcient Bayesian optimization methods. Building on this, we introduce a robust new AutoML system based on the Python machine learning package scikit-learn (using 15 classiﬁers, 14 feature preprocessing methods, and 4 data preprocessing methods, giving rise to a structured hypothesis space with 110 hyperparameters). This system, which we dub Auto-sklearn, improves on existing AutoML methods by automatically taking into account past performance on similar datasets, and by constructing ensembles from the models evaluated during the optimization. Our system won six out of ten phases of the ﬁrst ChaLearn AutoML challenge, and our comprehensive analysis on over 100 diverse datasets shows that it substantially outperforms the previous state of the art in AutoML. We also demonstrate the performance gains due to each of our contributions and derive insights into the eﬀectiveness of the individual components of Auto-sklearn.","container-title":"Automated Machine Learning","event-place":"Cham","ISBN":"978-3-030-05317-8","language":"en","note":"collection-title: The Springer Series on Challenges in Machine Learning\nDOI: 10.1007/978-3-030-05318-5_6","page":"113-134","publisher":"Springer International Publishing","publisher-place":"Cham","source":"DOI.org (Crossref)","title":"Auto-sklearn: Efficient and Robust Automated Machine Learning","title-short":"Auto-sklearn","URL":"http://link.springer.com/10.1007/978-3-030-05318-5_6","editor":[{"family":"Hutter","given":"Frank"},{"family":"Kotthoff","given":"Lars"},{"family":"Vanschoren","given":"Joaquin"}],"author":[{"family":"Feurer","given":"Matthias"},{"family":"Klein","given":"Aaron"},{"family":"Eggensperger","given":"Katharina"},{"family":"Springenberg","given":"Jost Tobias"},{"family":"Blum","given":"Manuel"},{"family":"Hutter","given":"Frank"}],"accessed":{"date-parts":[["2021",2,7]]},"issued":{"date-parts":[["2019"]]},"citation-key":"feurerAutosklearnEfficientRobust2019"}}],"schema":"https://github.com/citation-style-language/schema/raw/master/csl-citation.json"} </w:instrText>
-      </w:r>
-      <w:r>
-        <w:rPr>
-          <w:lang w:val="en"/>
-        </w:rPr>
-        <w:fldChar w:fldCharType="separate"/>
-      </w:r>
-      <w:r>
-        <w:rPr>
-          <w:noProof/>
-          <w:lang w:val="en"/>
-        </w:rPr>
-        <w:t>[90,91]</w:t>
-      </w:r>
-      <w:r>
-        <w:rPr>
-          <w:lang w:val="en"/>
-        </w:rPr>
-        <w:fldChar w:fldCharType="end"/>
-      </w:r>
-      <w:r>
-        <w:rPr>
-          <w:lang w:val="en"/>
-        </w:rPr>
-        <w:t>.</w:t>
-      </w:r>
-      <w:r>
-        <w:rPr>
-          <w:lang w:val="en"/>
-        </w:rPr>
-        <w:t xml:space="preserve"> The package </w:t>
-      </w:r>
-      <w:proofErr w:type="spellStart"/>
+        <w:t>auto-sklearn</w:t>
+      </w:r>
+      <w:r>
+        <w:rPr>
+          <w:lang w:val="en"/>
+        </w:rPr>
+        <w:t xml:space="preserve"> and </w:t>
+      </w:r>
       <w:r>
         <w:rPr>
           <w:i/>
@@ -18718,19 +18776,6 @@
         </w:rPr>
         <w:t>tpot</w:t>
       </w:r>
-      <w:proofErr w:type="spellEnd"/>
-      <w:r>
-        <w:rPr>
-          <w:lang w:val="en"/>
-        </w:rPr>
-        <w:t xml:space="preserve"> uses genetic </w:t>
-      </w:r>
-      <w:r>
-        <w:rPr>
-          <w:lang w:val="en"/>
-        </w:rPr>
-        <w:t>programming</w:t>
-      </w:r>
       <w:r>
         <w:rPr>
           <w:lang w:val="en"/>
@@ -18741,13 +18786,67 @@
         <w:rPr>
           <w:lang w:val="en"/>
         </w:rPr>
+        <w:t>models</w:t>
+      </w:r>
+      <w:r>
+        <w:rPr>
+          <w:lang w:val="en"/>
+        </w:rPr>
+        <w:t xml:space="preserve">, </w:t>
+      </w:r>
+      <w:r>
+        <w:rPr>
+          <w:lang w:val="en"/>
+        </w:rPr>
+        <w:t>which automated the parameters and model selection sub-components</w:t>
+      </w:r>
+      <w:r>
+        <w:rPr>
+          <w:lang w:val="en"/>
+        </w:rPr>
+        <w:t xml:space="preserve"> given a minute </w:t>
+      </w:r>
+      <w:r>
+        <w:rPr>
+          <w:lang w:val="en"/>
+        </w:rPr>
+        <w:t>to build models</w:t>
+      </w:r>
+      <w:r>
+        <w:rPr>
+          <w:lang w:val="en"/>
+        </w:rPr>
+        <w:t xml:space="preserve"> each</w:t>
+      </w:r>
+      <w:r>
+        <w:rPr>
+          <w:lang w:val="en"/>
+        </w:rPr>
+        <w:t>.</w:t>
+      </w:r>
+      <w:r>
+        <w:rPr>
+          <w:lang w:val="en"/>
+        </w:rPr>
+        <w:t xml:space="preserve"> For the metrics sub-component, we used Mean Absolute Error (MAE)</w:t>
+      </w:r>
+      <w:r>
+        <w:rPr>
+          <w:lang w:val="en"/>
+        </w:rPr>
+        <w:t xml:space="preserve"> </w:t>
+      </w:r>
+      <w:r>
+        <w:rPr>
+          <w:lang w:val="en"/>
+        </w:rPr>
         <w:fldChar w:fldCharType="begin"/>
       </w:r>
       <w:r>
         <w:rPr>
           <w:lang w:val="en"/>
         </w:rPr>
-        <w:instrText xml:space="preserve"> ADDIN ZOTERO_ITEM CSL_CITATION {"citationID":"RGP9X19Z","properties":{"formattedCitation":"[92]","plainCitation":"[92]","noteIndex":0},"citationItems":[{"id":2292,"uris":["http://zotero.org/users/6749620/items/W7NQNMJL"],"itemData":{"id":2292,"type":"book","abstract":"Genetic programming (GP), one of the most advanced forms of evolutionary computation, has been highly successful as a technique for getting computers to automatically solve problems without having to tell them explicitly how. Since its inceptions more than ten years ago, GP has been used to solve practical problems in a variety of application fields. Along with this ad-hoc engineering approaches interest increased in how and why GP works. This book provides a coherent consolidation of recent work on the theoretical foundations of GP. A concise introduction to GP and genetic algorithms (GA) is followed by a discussion of fitness landscapes and other theoretical approaches to natural and artificial evolution. Having surveyed early approaches to GP theory it presents new exact schema analysis, showing that it applies to GP as well as to the simpler GAs. New results on the potentially infinite number of possible programs are followed by two chapters applying these new techniques.","ISBN":"978-3-662-04726-2","language":"en","note":"Google-Books-ID: zsaqCAAAQBAJ","number-of-pages":"265","publisher":"Springer Science &amp; Business Media","source":"Google Books","title":"Foundations of Genetic Programming","author":[{"family":"Langdon","given":"William B."},{"family":"Poli","given":"Riccardo"}],"issued":{"date-parts":[["2013",3,9]]},"citation-key":"langdonFoundationsGeneticProgramming2013"}}],"schema":"https://github.com/citation-style-language/schema/raw/master/csl-citation.json"} </w:instrText>
+        <w:instrText xml:space="preserve"> ADDIN ZOTERO_ITEM CSL_CITATION {"citationID":"fgE8Qzq8","properties":{"formattedCitation":"[94]","plainCitation":"[94]","noteIndex":0},"citationItems":[{"id":2311,"uris":["http://zotero.org/users/6749620/items/6UJ3QDST"],"itemData":{"id":2311,"type":"article-journal","container-title":"Climate research","issue":"1","page":"79–82","source":"Google Scholar","title":"Advantages of the mean absolute error (MAE) over the root mean square error (RMSE) in assessing average model performance","volume":"30","author":[{"family":"Willmott","given":"Cort J."},{"family":"Matsuura","given":"Kenji"}],"issued":{"date-parts":[["2005"]]},"citation-key":"willmottAdvantagesMeanAbsolute2005"}}],"schema":"https://github.com/citation-style-language/schema/raw/master/csl-citation.json"} </w:instrText>
       </w:r>
       <w:r>
         <w:rPr>
@@ -18760,7 +18859,7 @@
           <w:noProof/>
           <w:lang w:val="en"/>
         </w:rPr>
-        <w:t>[92]</w:t>
+        <w:t>[94]</w:t>
       </w:r>
       <w:r>
         <w:rPr>
@@ -18772,80 +18871,25 @@
         <w:rPr>
           <w:lang w:val="en"/>
         </w:rPr>
-        <w:t xml:space="preserve"> to automatically </w:t>
-      </w:r>
-      <w:r>
-        <w:rPr>
-          <w:lang w:val="en"/>
-        </w:rPr>
-        <w:t>optimize and design</w:t>
-      </w:r>
-      <w:r>
-        <w:rPr>
-          <w:lang w:val="en"/>
-        </w:rPr>
-        <w:t xml:space="preserve"> machine learning pipelines</w:t>
-      </w:r>
-      <w:r>
-        <w:rPr>
-          <w:lang w:val="en"/>
-        </w:rPr>
-        <w:t xml:space="preserve"> through pipeline operators</w:t>
-      </w:r>
-      <w:r>
-        <w:rPr>
-          <w:lang w:val="en"/>
-        </w:rPr>
-        <w:t xml:space="preserve">, including the </w:t>
-      </w:r>
-      <w:r>
-        <w:rPr>
-          <w:lang w:val="en"/>
-        </w:rPr>
-        <w:t>operations</w:t>
-      </w:r>
-      <w:r>
-        <w:rPr>
-          <w:lang w:val="en"/>
-        </w:rPr>
-        <w:t xml:space="preserve"> of feature engineering, model selection, and parameter tuning</w:t>
-      </w:r>
-      <w:r>
-        <w:rPr>
-          <w:lang w:val="en"/>
-        </w:rPr>
-        <w:t xml:space="preserve"> </w:t>
-      </w:r>
-      <w:r>
-        <w:rPr>
-          <w:lang w:val="en"/>
-        </w:rPr>
-        <w:fldChar w:fldCharType="begin"/>
-      </w:r>
-      <w:r>
-        <w:rPr>
-          <w:lang w:val="en"/>
-        </w:rPr>
-        <w:instrText xml:space="preserve"> ADDIN ZOTERO_ITEM CSL_CITATION {"citationID":"NKqpimaY","properties":{"formattedCitation":"[93,93]","plainCitation":"[93,93]","noteIndex":0},"citationItems":[{"id":1136,"uris":["http://zotero.org/users/6749620/items/87X5S4X6"],"itemData":{"id":1136,"type":"paper-conference","abstract":"As data science becomes more mainstream, there will be an ever-growing demand for data science tools that are more accessible, flexible, and scalable. In response to this demand, automated machine ...","container-title":"Workshop on Automatic Machine Learning","event-title":"Workshop on Automatic Machine Learning","language":"en","note":"ISSN: 1938-7228","page":"66-74","publisher":"PMLR","source":"proceedings.mlr.press","title":"TPOT: A Tree-based Pipeline Optimization Tool for Automating Machine Learning","title-short":"TPOT","URL":"http://proceedings.mlr.press/v64/olson_tpot_2016.html","author":[{"family":"Olson","given":"Randal S."},{"family":"Moore","given":"Jason H."}],"accessed":{"date-parts":[["2021",1,22]]},"issued":{"date-parts":[["2016",12,4]]},"citation-key":"olsonTPOTTreebasedPipeline2016"}},{"id":1136,"uris":["http://zotero.org/users/6749620/items/87X5S4X6"],"itemData":{"id":1136,"type":"paper-conference","abstract":"As data science becomes more mainstream, there will be an ever-growing demand for data science tools that are more accessible, flexible, and scalable. In response to this demand, automated machine ...","container-title":"Workshop on Automatic Machine Learning","event-title":"Workshop on Automatic Machine Learning","language":"en","note":"ISSN: 1938-7228","page":"66-74","publisher":"PMLR","source":"proceedings.mlr.press","title":"TPOT: A Tree-based Pipeline Optimization Tool for Automating Machine Learning","title-short":"TPOT","URL":"http://proceedings.mlr.press/v64/olson_tpot_2016.html","author":[{"family":"Olson","given":"Randal S."},{"family":"Moore","given":"Jason H."}],"accessed":{"date-parts":[["2021",1,22]]},"issued":{"date-parts":[["2016",12,4]]},"citation-key":"olsonTPOTTreebasedPipeline2016"}}],"schema":"https://github.com/citation-style-language/schema/raw/master/csl-citation.json"} </w:instrText>
-      </w:r>
-      <w:r>
-        <w:rPr>
-          <w:lang w:val="en"/>
-        </w:rPr>
-        <w:fldChar w:fldCharType="separate"/>
-      </w:r>
-      <w:r>
-        <w:rPr>
-          <w:noProof/>
-          <w:lang w:val="en"/>
-        </w:rPr>
-        <w:t>[93,93]</w:t>
-      </w:r>
-      <w:r>
-        <w:rPr>
-          <w:lang w:val="en"/>
-        </w:rPr>
-        <w:fldChar w:fldCharType="end"/>
+        <w:t>, an aggregate measure of the errors between the actual and predicted</w:t>
+      </w:r>
+      <w:r>
+        <w:rPr>
+          <w:lang w:val="en"/>
+        </w:rPr>
+        <w:t xml:space="preserve"> outcomes, representing the</w:t>
+      </w:r>
+      <w:r>
+        <w:rPr>
+          <w:lang w:val="en"/>
+        </w:rPr>
+        <w:t xml:space="preserve"> MVC</w:t>
+      </w:r>
+      <w:r>
+        <w:rPr>
+          <w:lang w:val="en"/>
+        </w:rPr>
+        <w:t>s</w:t>
       </w:r>
       <w:r>
         <w:rPr>
@@ -18857,39 +18901,7 @@
         <w:rPr>
           <w:lang w:val="en"/>
         </w:rPr>
-        <w:t xml:space="preserve"> For the variables sub-component, the output of the </w:t>
-      </w:r>
-      <w:r>
-        <w:rPr>
-          <w:lang w:val="en"/>
-        </w:rPr>
-        <w:t xml:space="preserve">spatial feature engineering </w:t>
-      </w:r>
-      <w:r>
-        <w:rPr>
-          <w:lang w:val="en"/>
-        </w:rPr>
-        <w:t>sub-component from the spatial data component was used</w:t>
-      </w:r>
-      <w:r>
-        <w:rPr>
-          <w:lang w:val="en"/>
-        </w:rPr>
-        <w:t xml:space="preserve">, while the </w:t>
-      </w:r>
-      <w:proofErr w:type="gramStart"/>
-      <w:r>
-        <w:rPr>
-          <w:lang w:val="en"/>
-        </w:rPr>
-        <w:t>models</w:t>
-      </w:r>
-      <w:proofErr w:type="gramEnd"/>
-      <w:r>
-        <w:rPr>
-          <w:lang w:val="en"/>
-        </w:rPr>
-        <w:t xml:space="preserve"> sub-component contained both </w:t>
+        <w:t xml:space="preserve"> Thus, the best model sub-component was determined by the </w:t>
       </w:r>
       <w:r>
         <w:rPr>
@@ -18897,195 +18909,22 @@
           <w:iCs/>
           <w:lang w:val="en"/>
         </w:rPr>
-        <w:t>auto-</w:t>
-      </w:r>
-      <w:proofErr w:type="spellStart"/>
+        <w:t>auto-sklearn</w:t>
+      </w:r>
+      <w:r>
+        <w:rPr>
+          <w:lang w:val="en"/>
+        </w:rPr>
+        <w:t xml:space="preserve"> and </w:t>
+      </w:r>
       <w:r>
         <w:rPr>
           <w:i/>
           <w:iCs/>
           <w:lang w:val="en"/>
         </w:rPr>
-        <w:t>sklearn</w:t>
-      </w:r>
-      <w:proofErr w:type="spellEnd"/>
-      <w:r>
-        <w:rPr>
-          <w:lang w:val="en"/>
-        </w:rPr>
-        <w:t xml:space="preserve"> and </w:t>
-      </w:r>
-      <w:proofErr w:type="spellStart"/>
-      <w:r>
-        <w:rPr>
-          <w:i/>
-          <w:iCs/>
-          <w:lang w:val="en"/>
-        </w:rPr>
         <w:t>tpot</w:t>
       </w:r>
-      <w:proofErr w:type="spellEnd"/>
-      <w:r>
-        <w:rPr>
-          <w:lang w:val="en"/>
-        </w:rPr>
-        <w:t xml:space="preserve"> </w:t>
-      </w:r>
-      <w:r>
-        <w:rPr>
-          <w:lang w:val="en"/>
-        </w:rPr>
-        <w:t>models</w:t>
-      </w:r>
-      <w:r>
-        <w:rPr>
-          <w:lang w:val="en"/>
-        </w:rPr>
-        <w:t xml:space="preserve">, </w:t>
-      </w:r>
-      <w:r>
-        <w:rPr>
-          <w:lang w:val="en"/>
-        </w:rPr>
-        <w:t>which automated the parameters and model selection sub-components</w:t>
-      </w:r>
-      <w:r>
-        <w:rPr>
-          <w:lang w:val="en"/>
-        </w:rPr>
-        <w:t xml:space="preserve"> given a minute </w:t>
-      </w:r>
-      <w:r>
-        <w:rPr>
-          <w:lang w:val="en"/>
-        </w:rPr>
-        <w:t>to build models</w:t>
-      </w:r>
-      <w:r>
-        <w:rPr>
-          <w:lang w:val="en"/>
-        </w:rPr>
-        <w:t xml:space="preserve"> each</w:t>
-      </w:r>
-      <w:r>
-        <w:rPr>
-          <w:lang w:val="en"/>
-        </w:rPr>
-        <w:t>.</w:t>
-      </w:r>
-      <w:r>
-        <w:rPr>
-          <w:lang w:val="en"/>
-        </w:rPr>
-        <w:t xml:space="preserve"> For the metrics sub-component, we used Mean Absolute Error (MAE)</w:t>
-      </w:r>
-      <w:r>
-        <w:rPr>
-          <w:lang w:val="en"/>
-        </w:rPr>
-        <w:t xml:space="preserve"> </w:t>
-      </w:r>
-      <w:r>
-        <w:rPr>
-          <w:lang w:val="en"/>
-        </w:rPr>
-        <w:fldChar w:fldCharType="begin"/>
-      </w:r>
-      <w:r>
-        <w:rPr>
-          <w:lang w:val="en"/>
-        </w:rPr>
-        <w:instrText xml:space="preserve"> ADDIN ZOTERO_ITEM CSL_CITATION {"citationID":"fgE8Qzq8","properties":{"formattedCitation":"[94]","plainCitation":"[94]","noteIndex":0},"citationItems":[{"id":2311,"uris":["http://zotero.org/users/6749620/items/6UJ3QDST"],"itemData":{"id":2311,"type":"article-journal","container-title":"Climate research","issue":"1","page":"79–82","source":"Google Scholar","title":"Advantages of the mean absolute error (MAE) over the root mean square error (RMSE) in assessing average model performance","volume":"30","author":[{"family":"Willmott","given":"Cort J."},{"family":"Matsuura","given":"Kenji"}],"issued":{"date-parts":[["2005"]]},"citation-key":"willmottAdvantagesMeanAbsolute2005"}}],"schema":"https://github.com/citation-style-language/schema/raw/master/csl-citation.json"} </w:instrText>
-      </w:r>
-      <w:r>
-        <w:rPr>
-          <w:lang w:val="en"/>
-        </w:rPr>
-        <w:fldChar w:fldCharType="separate"/>
-      </w:r>
-      <w:r>
-        <w:rPr>
-          <w:noProof/>
-          <w:lang w:val="en"/>
-        </w:rPr>
-        <w:t>[94]</w:t>
-      </w:r>
-      <w:r>
-        <w:rPr>
-          <w:lang w:val="en"/>
-        </w:rPr>
-        <w:fldChar w:fldCharType="end"/>
-      </w:r>
-      <w:r>
-        <w:rPr>
-          <w:lang w:val="en"/>
-        </w:rPr>
-        <w:t>, an aggregate measure of the errors between the actual and predicted</w:t>
-      </w:r>
-      <w:r>
-        <w:rPr>
-          <w:lang w:val="en"/>
-        </w:rPr>
-        <w:t xml:space="preserve"> outcomes, representing the</w:t>
-      </w:r>
-      <w:r>
-        <w:rPr>
-          <w:lang w:val="en"/>
-        </w:rPr>
-        <w:t xml:space="preserve"> MVC</w:t>
-      </w:r>
-      <w:r>
-        <w:rPr>
-          <w:lang w:val="en"/>
-        </w:rPr>
-        <w:t>s</w:t>
-      </w:r>
-      <w:r>
-        <w:rPr>
-          <w:lang w:val="en"/>
-        </w:rPr>
-        <w:t>.</w:t>
-      </w:r>
-      <w:r>
-        <w:rPr>
-          <w:lang w:val="en"/>
-        </w:rPr>
-        <w:t xml:space="preserve"> Thus, the best model sub-component was determined by the </w:t>
-      </w:r>
-      <w:r>
-        <w:rPr>
-          <w:i/>
-          <w:iCs/>
-          <w:lang w:val="en"/>
-        </w:rPr>
-        <w:t>auto-</w:t>
-      </w:r>
-      <w:proofErr w:type="spellStart"/>
-      <w:r>
-        <w:rPr>
-          <w:i/>
-          <w:iCs/>
-          <w:lang w:val="en"/>
-        </w:rPr>
-        <w:t>sklearn</w:t>
-      </w:r>
-      <w:proofErr w:type="spellEnd"/>
-      <w:r>
-        <w:rPr>
-          <w:lang w:val="en"/>
-        </w:rPr>
-        <w:t xml:space="preserve"> and </w:t>
-      </w:r>
-      <w:proofErr w:type="spellStart"/>
-      <w:r>
-        <w:rPr>
-          <w:i/>
-          <w:iCs/>
-          <w:lang w:val="en"/>
-        </w:rPr>
-        <w:t>tpot</w:t>
-      </w:r>
-      <w:proofErr w:type="spellEnd"/>
       <w:r>
         <w:rPr>
           <w:lang w:val="en"/>
@@ -20098,7 +19937,6 @@
       <w:r>
         <w:t xml:space="preserve"> </w:t>
       </w:r>
-      <w:proofErr w:type="spellStart"/>
       <w:r>
         <w:t>Nearest</w:t>
       </w:r>
@@ -20108,79 +19946,62 @@
         </w:rPr>
         <w:t>i</w:t>
       </w:r>
-      <w:proofErr w:type="spellEnd"/>
       <w:r>
         <w:t>,</w:t>
       </w:r>
       <w:r>
+        <w:t xml:space="preserve"> Length(L</w:t>
+      </w:r>
+      <w:r>
+        <w:rPr>
+          <w:vertAlign w:val="subscript"/>
+        </w:rPr>
+        <w:t>i</w:t>
+      </w:r>
+      <w:r>
+        <w:t>), and Type(Li)</w:t>
+      </w:r>
+      <w:r>
         <w:t xml:space="preserve"> </w:t>
       </w:r>
-      <w:proofErr w:type="gramStart"/>
-      <w:r>
-        <w:t>Length(</w:t>
-      </w:r>
-      <w:proofErr w:type="gramEnd"/>
-      <w:r>
-        <w:t>L</w:t>
+      <w:r>
+        <w:t>are</w:t>
+      </w:r>
+      <w:r>
+        <w:t xml:space="preserve"> additional variable</w:t>
+      </w:r>
+      <w:r>
+        <w:t>s</w:t>
+      </w:r>
+      <w:r>
+        <w:t xml:space="preserve"> </w:t>
+      </w:r>
+      <w:r>
+        <w:t xml:space="preserve">from </w:t>
+      </w:r>
+      <w:r>
+        <w:t>spatial feature engineering</w:t>
+      </w:r>
+      <w:r>
+        <w:t>, representing the sum of X</w:t>
       </w:r>
       <w:r>
         <w:rPr>
           <w:vertAlign w:val="subscript"/>
         </w:rPr>
-        <w:t>i</w:t>
-      </w:r>
-      <w:r>
-        <w:t>), and Type(Li)</w:t>
-      </w:r>
-      <w:r>
-        <w:t xml:space="preserve"> </w:t>
-      </w:r>
-      <w:r>
-        <w:t>are</w:t>
-      </w:r>
-      <w:r>
-        <w:t xml:space="preserve"> additional variable</w:t>
-      </w:r>
-      <w:r>
-        <w:t>s</w:t>
-      </w:r>
-      <w:r>
-        <w:t xml:space="preserve"> </w:t>
-      </w:r>
-      <w:r>
-        <w:t xml:space="preserve">from </w:t>
-      </w:r>
-      <w:r>
-        <w:t>spatial feature engineering</w:t>
-      </w:r>
-      <w:r>
-        <w:t>, representing the sum of X</w:t>
+        <w:t>1</w:t>
+      </w:r>
+      <w:r>
+        <w:t xml:space="preserve"> and X</w:t>
       </w:r>
       <w:r>
         <w:rPr>
           <w:vertAlign w:val="subscript"/>
         </w:rPr>
-        <w:t>1</w:t>
-      </w:r>
-      <w:r>
-        <w:t xml:space="preserve"> and X</w:t>
-      </w:r>
-      <w:r>
-        <w:rPr>
-          <w:vertAlign w:val="subscript"/>
-        </w:rPr>
         <w:t>2</w:t>
       </w:r>
       <w:r>
-        <w:t xml:space="preserve">, the index </w:t>
-      </w:r>
-      <w:proofErr w:type="spellStart"/>
-      <w:r>
-        <w:t>i</w:t>
-      </w:r>
-      <w:proofErr w:type="spellEnd"/>
-      <w:r>
-        <w:t xml:space="preserve"> of the nearest location, the length of the location entity, and the type of the location entity respectively</w:t>
+        <w:t>, the index i of the nearest location, the length of the location entity, and the type of the location entity respectively</w:t>
       </w:r>
       <w:r>
         <w:t>.</w:t>
@@ -20311,7 +20132,6 @@
                 <w:snapToGrid/>
               </w:rPr>
             </w:pPr>
-            <w:proofErr w:type="spellStart"/>
             <w:r>
               <w:rPr>
                 <w:b/>
@@ -20320,7 +20140,6 @@
               <w:lastRenderedPageBreak/>
               <w:t>i</w:t>
             </w:r>
-            <w:proofErr w:type="spellEnd"/>
           </w:p>
         </w:tc>
         <w:tc>
@@ -20495,7 +20314,6 @@
                 <w:snapToGrid/>
               </w:rPr>
             </w:pPr>
-            <w:proofErr w:type="spellStart"/>
             <w:r>
               <w:rPr>
                 <w:b/>
@@ -20511,7 +20329,6 @@
               </w:rPr>
               <w:t>i</w:t>
             </w:r>
-            <w:proofErr w:type="spellEnd"/>
           </w:p>
         </w:tc>
         <w:tc>
@@ -20530,7 +20347,6 @@
                 <w:snapToGrid/>
               </w:rPr>
             </w:pPr>
-            <w:proofErr w:type="gramStart"/>
             <w:r>
               <w:rPr>
                 <w:b/>
@@ -20538,7 +20354,6 @@
               </w:rPr>
               <w:t>Length(</w:t>
             </w:r>
-            <w:proofErr w:type="gramEnd"/>
             <w:r>
               <w:rPr>
                 <w:b/>
@@ -20580,7 +20395,6 @@
                 <w:snapToGrid/>
               </w:rPr>
             </w:pPr>
-            <w:proofErr w:type="gramStart"/>
             <w:r>
               <w:rPr>
                 <w:b/>
@@ -20588,7 +20402,6 @@
               </w:rPr>
               <w:t>Type(</w:t>
             </w:r>
-            <w:proofErr w:type="gramEnd"/>
             <w:r>
               <w:rPr>
                 <w:b/>
@@ -21066,7 +20879,19 @@
               <w:rPr>
                 <w:lang w:val="en"/>
               </w:rPr>
-              <w:t>(43, -79) (44, -78)</w:t>
+              <w:t>(45, -79)</w:t>
+            </w:r>
+            <w:r>
+              <w:rPr>
+                <w:lang w:val="en"/>
+              </w:rPr>
+              <w:t xml:space="preserve"> </w:t>
+            </w:r>
+            <w:r>
+              <w:rPr>
+                <w:lang w:val="en"/>
+              </w:rPr>
+              <w:t>(44, -78)</w:t>
             </w:r>
           </w:p>
         </w:tc>
@@ -21209,7 +21034,7 @@
               <w:rPr>
                 <w:lang w:val="en"/>
               </w:rPr>
-              <w:t>1</w:t>
+              <w:t>2</w:t>
             </w:r>
           </w:p>
         </w:tc>
@@ -21281,7 +21106,7 @@
               <w:rPr>
                 <w:lang w:val="en"/>
               </w:rPr>
-              <w:t>(43, -79) (44, -78) (45, -77)</w:t>
+              <w:t>(46, -77) (47, -80) (48, -75)</w:t>
             </w:r>
           </w:p>
         </w:tc>
@@ -21370,21 +21195,7 @@
         <w:rPr>
           <w:lang w:val="en"/>
         </w:rPr>
-        <w:t xml:space="preserve"> For the </w:t>
-      </w:r>
-      <w:proofErr w:type="gramStart"/>
-      <w:r>
-        <w:rPr>
-          <w:lang w:val="en"/>
-        </w:rPr>
-        <w:t>models</w:t>
-      </w:r>
-      <w:proofErr w:type="gramEnd"/>
-      <w:r>
-        <w:rPr>
-          <w:lang w:val="en"/>
-        </w:rPr>
-        <w:t xml:space="preserve"> sub-component</w:t>
+        <w:t xml:space="preserve"> For the models sub-component</w:t>
       </w:r>
       <w:r>
         <w:rPr>
@@ -21444,21 +21255,7 @@
         <w:rPr>
           <w:lang w:val="en"/>
         </w:rPr>
-        <w:t xml:space="preserve"> The </w:t>
-      </w:r>
-      <w:proofErr w:type="gramStart"/>
-      <w:r>
-        <w:rPr>
-          <w:lang w:val="en"/>
-        </w:rPr>
-        <w:t>models</w:t>
-      </w:r>
-      <w:proofErr w:type="gramEnd"/>
-      <w:r>
-        <w:rPr>
-          <w:lang w:val="en"/>
-        </w:rPr>
-        <w:t xml:space="preserve"> sub-component’s objective </w:t>
+        <w:t xml:space="preserve"> The models sub-component’s objective </w:t>
       </w:r>
       <w:r>
         <w:rPr>
@@ -21682,14 +21479,7 @@
         <w:rPr>
           <w:snapToGrid/>
         </w:rPr>
-        <w:t xml:space="preserve">, </w:t>
-      </w:r>
-      <w:proofErr w:type="spellStart"/>
-      <w:r>
-        <w:rPr>
-          <w:snapToGrid/>
-        </w:rPr>
-        <w:t>Nearest</w:t>
+        <w:t>, Nearest</w:t>
       </w:r>
       <w:r>
         <w:rPr>
@@ -21698,26 +21488,11 @@
         </w:rPr>
         <w:t>i</w:t>
       </w:r>
-      <w:proofErr w:type="spellEnd"/>
       <w:r>
         <w:rPr>
           <w:snapToGrid/>
         </w:rPr>
-        <w:t xml:space="preserve">, </w:t>
-      </w:r>
-      <w:proofErr w:type="gramStart"/>
-      <w:r>
-        <w:rPr>
-          <w:snapToGrid/>
-        </w:rPr>
-        <w:t>Length(</w:t>
-      </w:r>
-      <w:proofErr w:type="gramEnd"/>
-      <w:r>
-        <w:rPr>
-          <w:snapToGrid/>
-        </w:rPr>
-        <w:t>L</w:t>
+        <w:t>, Length(L</w:t>
       </w:r>
       <w:r>
         <w:rPr>
@@ -21819,7 +21594,6 @@
         </w:rPr>
         <w:t xml:space="preserve">with errors </w:t>
       </w:r>
-      <w:proofErr w:type="spellStart"/>
       <w:r>
         <w:rPr>
           <w:bCs/>
@@ -21835,7 +21609,6 @@
         </w:rPr>
         <w:t>i</w:t>
       </w:r>
-      <w:proofErr w:type="spellEnd"/>
       <w:r>
         <w:rPr>
           <w:bCs/>
@@ -21848,23 +21621,7 @@
           <w:bCs/>
           <w:snapToGrid/>
         </w:rPr>
-        <w:t xml:space="preserve"> Here, the predicted outcomes </w:t>
-      </w:r>
-      <w:proofErr w:type="gramStart"/>
-      <w:r>
-        <w:rPr>
-          <w:bCs/>
-          <w:snapToGrid/>
-        </w:rPr>
-        <w:t>was</w:t>
-      </w:r>
-      <w:proofErr w:type="gramEnd"/>
-      <w:r>
-        <w:rPr>
-          <w:bCs/>
-          <w:snapToGrid/>
-        </w:rPr>
-        <w:t xml:space="preserve"> selected as variable X</w:t>
+        <w:t xml:space="preserve"> Here, the predicted outcomes was selected as variable X</w:t>
       </w:r>
       <w:r>
         <w:rPr>
@@ -21900,23 +21657,7 @@
           <w:bCs/>
           <w:snapToGrid/>
         </w:rPr>
-        <w:t xml:space="preserve">, while </w:t>
-      </w:r>
-      <w:proofErr w:type="spellStart"/>
-      <w:r>
-        <w:rPr>
-          <w:bCs/>
-          <w:snapToGrid/>
-        </w:rPr>
-        <w:t>i</w:t>
-      </w:r>
-      <w:proofErr w:type="spellEnd"/>
-      <w:r>
-        <w:rPr>
-          <w:bCs/>
-          <w:snapToGrid/>
-        </w:rPr>
-        <w:t xml:space="preserve"> </w:t>
+        <w:t xml:space="preserve">, while i </w:t>
       </w:r>
       <w:r>
         <w:rPr>
@@ -22041,7 +21782,6 @@
                 <w:snapToGrid/>
               </w:rPr>
             </w:pPr>
-            <w:proofErr w:type="spellStart"/>
             <w:r>
               <w:rPr>
                 <w:b/>
@@ -22049,7 +21789,6 @@
               </w:rPr>
               <w:t>i</w:t>
             </w:r>
-            <w:proofErr w:type="spellEnd"/>
           </w:p>
         </w:tc>
         <w:tc>
@@ -22184,7 +21923,6 @@
                 <w:snapToGrid/>
               </w:rPr>
             </w:pPr>
-            <w:proofErr w:type="spellStart"/>
             <w:r>
               <w:rPr>
                 <w:b/>
@@ -22200,7 +21938,6 @@
               </w:rPr>
               <w:t>i</w:t>
             </w:r>
-            <w:proofErr w:type="spellEnd"/>
           </w:p>
         </w:tc>
         <w:tc>
@@ -22219,21 +21956,12 @@
                 <w:snapToGrid/>
               </w:rPr>
             </w:pPr>
-            <w:proofErr w:type="gramStart"/>
             <w:r>
               <w:rPr>
                 <w:b/>
                 <w:snapToGrid/>
               </w:rPr>
-              <w:t>Length(</w:t>
-            </w:r>
-            <w:proofErr w:type="gramEnd"/>
-            <w:r>
-              <w:rPr>
-                <w:b/>
-                <w:snapToGrid/>
-              </w:rPr>
-              <w:t>L</w:t>
+              <w:t>Length(L</w:t>
             </w:r>
             <w:r>
               <w:rPr>
@@ -22268,21 +21996,12 @@
                 <w:snapToGrid/>
               </w:rPr>
             </w:pPr>
-            <w:proofErr w:type="gramStart"/>
             <w:r>
               <w:rPr>
                 <w:b/>
                 <w:snapToGrid/>
               </w:rPr>
-              <w:t>Type(</w:t>
-            </w:r>
-            <w:proofErr w:type="gramEnd"/>
-            <w:r>
-              <w:rPr>
-                <w:b/>
-                <w:snapToGrid/>
-              </w:rPr>
-              <w:t>L</w:t>
+              <w:t>Type(L</w:t>
             </w:r>
             <w:r>
               <w:rPr>
@@ -22432,7 +22151,6 @@
               </w:rPr>
               <w:t xml:space="preserve">= </w:t>
             </w:r>
-            <w:proofErr w:type="gramStart"/>
             <w:r>
               <w:rPr>
                 <w:b/>
@@ -22449,7 +22167,6 @@
               </w:rPr>
               <w:t>(</w:t>
             </w:r>
-            <w:proofErr w:type="gramEnd"/>
             <w:r>
               <w:rPr>
                 <w:b/>
@@ -22526,7 +22243,6 @@
                 <w:snapToGrid/>
               </w:rPr>
             </w:pPr>
-            <w:proofErr w:type="spellStart"/>
             <w:r>
               <w:rPr>
                 <w:b/>
@@ -22542,7 +22258,6 @@
               </w:rPr>
               <w:t>i</w:t>
             </w:r>
-            <w:proofErr w:type="spellEnd"/>
             <w:r>
               <w:rPr>
                 <w:b/>
@@ -23179,7 +22894,7 @@
               <w:rPr>
                 <w:lang w:val="en"/>
               </w:rPr>
-              <w:t>1</w:t>
+              <w:t>2</w:t>
             </w:r>
           </w:p>
         </w:tc>
@@ -23530,21 +23245,12 @@
         </w:rPr>
         <w:t xml:space="preserve"> and </w:t>
       </w:r>
-      <w:proofErr w:type="gramStart"/>
       <w:r>
         <w:rPr>
           <w:bCs/>
           <w:snapToGrid/>
         </w:rPr>
-        <w:t>Length(</w:t>
-      </w:r>
-      <w:proofErr w:type="gramEnd"/>
-      <w:r>
-        <w:rPr>
-          <w:bCs/>
-          <w:snapToGrid/>
-        </w:rPr>
-        <w:t>L</w:t>
+        <w:t>Length(L</w:t>
       </w:r>
       <w:r>
         <w:rPr>
@@ -23753,21 +23459,12 @@
         </w:rPr>
         <w:t xml:space="preserve"> and </w:t>
       </w:r>
-      <w:proofErr w:type="gramStart"/>
       <w:r>
         <w:rPr>
           <w:bCs/>
           <w:snapToGrid/>
         </w:rPr>
-        <w:t>Length(</w:t>
-      </w:r>
-      <w:proofErr w:type="gramEnd"/>
-      <w:r>
-        <w:rPr>
-          <w:bCs/>
-          <w:snapToGrid/>
-        </w:rPr>
-        <w:t>L</w:t>
+        <w:t>Length(L</w:t>
       </w:r>
       <w:r>
         <w:rPr>
@@ -24411,7 +24108,6 @@
                 <w:snapToGrid/>
               </w:rPr>
             </w:pPr>
-            <w:proofErr w:type="spellStart"/>
             <w:r>
               <w:rPr>
                 <w:b/>
@@ -24419,7 +24115,6 @@
               </w:rPr>
               <w:t>i</w:t>
             </w:r>
-            <w:proofErr w:type="spellEnd"/>
           </w:p>
         </w:tc>
         <w:tc>
@@ -24471,21 +24166,12 @@
                 <w:snapToGrid/>
               </w:rPr>
             </w:pPr>
-            <w:proofErr w:type="gramStart"/>
             <w:r>
               <w:rPr>
                 <w:b/>
                 <w:snapToGrid/>
               </w:rPr>
-              <w:t>Length(</w:t>
-            </w:r>
-            <w:proofErr w:type="gramEnd"/>
-            <w:r>
-              <w:rPr>
-                <w:b/>
-                <w:snapToGrid/>
-              </w:rPr>
-              <w:t>L</w:t>
+              <w:t>Length(L</w:t>
             </w:r>
             <w:r>
               <w:rPr>
@@ -24763,21 +24449,12 @@
               </w:rPr>
               <w:t xml:space="preserve">= </w:t>
             </w:r>
-            <w:proofErr w:type="gramStart"/>
             <w:r>
               <w:rPr>
                 <w:b/>
                 <w:snapToGrid/>
               </w:rPr>
-              <w:t>Length(</w:t>
-            </w:r>
-            <w:proofErr w:type="gramEnd"/>
-            <w:r>
-              <w:rPr>
-                <w:b/>
-                <w:snapToGrid/>
-              </w:rPr>
-              <w:t>L</w:t>
+              <w:t>Length(L</w:t>
             </w:r>
             <w:r>
               <w:rPr>
@@ -24894,7 +24571,6 @@
               </w:rPr>
               <w:t xml:space="preserve">= </w:t>
             </w:r>
-            <w:proofErr w:type="gramStart"/>
             <w:r>
               <w:rPr>
                 <w:b/>
@@ -24911,7 +24587,6 @@
               </w:rPr>
               <w:t>(</w:t>
             </w:r>
-            <w:proofErr w:type="gramEnd"/>
             <w:r>
               <w:rPr>
                 <w:b/>
@@ -25363,15 +25038,7 @@
         <w:t xml:space="preserve"> grids of data were </w:t>
       </w:r>
       <w:r>
-        <w:t xml:space="preserve">used for outcome modelling, in which two </w:t>
-      </w:r>
-      <w:proofErr w:type="spellStart"/>
-      <w:r>
-        <w:t>AutoML</w:t>
-      </w:r>
-      <w:proofErr w:type="spellEnd"/>
-      <w:r>
-        <w:t xml:space="preserve"> regression models were built to predict the number of MVCs in each grid cell.</w:t>
+        <w:t>used for outcome modelling, in which two AutoML regression models were built to predict the number of MVCs in each grid cell.</w:t>
       </w:r>
       <w:r>
         <w:t xml:space="preserve"> </w:t>
@@ -25621,136 +25288,89 @@
         <w:pStyle w:val="MDPI31text"/>
       </w:pPr>
       <w:r>
-        <w:t xml:space="preserve">Regression-based </w:t>
-      </w:r>
-      <w:proofErr w:type="spellStart"/>
-      <w:r>
-        <w:t>AutoML</w:t>
-      </w:r>
-      <w:proofErr w:type="spellEnd"/>
-      <w:r>
-        <w:t xml:space="preserve"> models </w:t>
+        <w:t xml:space="preserve">Regression-based AutoML models </w:t>
       </w:r>
       <w:r>
         <w:rPr>
           <w:i/>
           <w:iCs/>
         </w:rPr>
-        <w:t>auto-</w:t>
-      </w:r>
-      <w:proofErr w:type="spellStart"/>
+        <w:t>auto-sklearn</w:t>
+      </w:r>
+      <w:r>
+        <w:t xml:space="preserve"> and </w:t>
+      </w:r>
       <w:r>
         <w:rPr>
           <w:i/>
           <w:iCs/>
         </w:rPr>
-        <w:t>sklearn</w:t>
-      </w:r>
-      <w:proofErr w:type="spellEnd"/>
-      <w:r>
-        <w:t xml:space="preserve"> and </w:t>
-      </w:r>
-      <w:proofErr w:type="spellStart"/>
+        <w:t>tpot</w:t>
+      </w:r>
+      <w:r>
+        <w:t xml:space="preserve"> were built for each of the three set of standardized grids, which produced six models (two for each 10 by 10, 40 by 40, and 80 by 80 grid).</w:t>
+      </w:r>
+      <w:r>
+        <w:t xml:space="preserve"> </w:t>
+      </w:r>
+      <w:r>
+        <w:t>Out of the six models,</w:t>
+      </w:r>
+      <w:r>
+        <w:t xml:space="preserve"> the</w:t>
+      </w:r>
+      <w:r>
+        <w:t xml:space="preserve"> 80 by 80 cell </w:t>
+      </w:r>
       <w:r>
         <w:rPr>
           <w:i/>
           <w:iCs/>
         </w:rPr>
-        <w:t>tpot</w:t>
-      </w:r>
-      <w:proofErr w:type="spellEnd"/>
-      <w:r>
-        <w:t xml:space="preserve"> were built for each of the three set of standardized grids, which produced six models (two for each 10 by 10, 40 by 40, and 80 by 80 grid).</w:t>
-      </w:r>
-      <w:r>
-        <w:t xml:space="preserve"> </w:t>
-      </w:r>
-      <w:r>
-        <w:t>Out of the six models,</w:t>
-      </w:r>
-      <w:r>
-        <w:t xml:space="preserve"> the</w:t>
-      </w:r>
-      <w:r>
-        <w:t xml:space="preserve"> 80 by 80 cell </w:t>
+        <w:t>auto-sklearn</w:t>
+      </w:r>
+      <w:r>
+        <w:t xml:space="preserve"> model had the best performance with the lowest MAE of 117.68 (an average difference of 117.68 between actual and predicted traffic collisions across all cells), while the 10 by 10 cell </w:t>
       </w:r>
       <w:r>
         <w:rPr>
           <w:i/>
           <w:iCs/>
         </w:rPr>
-        <w:t>auto-</w:t>
-      </w:r>
-      <w:proofErr w:type="spellStart"/>
+        <w:t>tpot</w:t>
+      </w:r>
+      <w:r>
+        <w:t xml:space="preserve"> model had the worst performance with the highest MAE of 630.08.</w:t>
+      </w:r>
+      <w:r>
+        <w:t xml:space="preserve"> </w:t>
+      </w:r>
+      <w:r>
+        <w:t>The performance of the six models is seen in</w:t>
+      </w:r>
+      <w:r>
+        <w:t xml:space="preserve"> Figure 5</w:t>
+      </w:r>
+      <w:r>
+        <w:t xml:space="preserve">, where the first part before the underscore indicates the AutoML model algorithm, and the second part after the underscore indicates the grid size (e.g., </w:t>
+      </w:r>
       <w:r>
         <w:rPr>
           <w:i/>
           <w:iCs/>
         </w:rPr>
-        <w:t>sklearn</w:t>
-      </w:r>
-      <w:proofErr w:type="spellEnd"/>
-      <w:r>
-        <w:t xml:space="preserve"> model had the best performance with the lowest MAE of 117.68 (an average difference of 117.68 between actual and predicted traffic collisions across all cells), while the 10 by 10 cell </w:t>
-      </w:r>
-      <w:proofErr w:type="spellStart"/>
+        <w:t>autosklearn_80</w:t>
+      </w:r>
+      <w:r>
+        <w:t xml:space="preserve"> is the 80 by 80 cell </w:t>
+      </w:r>
       <w:r>
         <w:rPr>
           <w:i/>
           <w:iCs/>
         </w:rPr>
-        <w:t>tpot</w:t>
-      </w:r>
-      <w:proofErr w:type="spellEnd"/>
-      <w:r>
-        <w:t xml:space="preserve"> model had the worst performance with the highest MAE of 630.08.</w:t>
-      </w:r>
-      <w:r>
-        <w:t xml:space="preserve"> </w:t>
-      </w:r>
-      <w:r>
-        <w:t>The performance of the six models is seen in</w:t>
-      </w:r>
-      <w:r>
-        <w:t xml:space="preserve"> Figure 5</w:t>
-      </w:r>
-      <w:r>
-        <w:t xml:space="preserve">, where the first part before the underscore indicates the </w:t>
-      </w:r>
-      <w:proofErr w:type="spellStart"/>
-      <w:r>
-        <w:t>AutoML</w:t>
-      </w:r>
-      <w:proofErr w:type="spellEnd"/>
-      <w:r>
-        <w:t xml:space="preserve"> model algorithm, and the second part after the underscore indicates the grid size (e.g., </w:t>
-      </w:r>
-      <w:r>
-        <w:rPr>
-          <w:i/>
-          <w:iCs/>
-        </w:rPr>
-        <w:t>autosklearn_80</w:t>
-      </w:r>
-      <w:r>
-        <w:t xml:space="preserve"> is the 80 by 80 cell </w:t>
-      </w:r>
-      <w:r>
-        <w:rPr>
-          <w:i/>
-          <w:iCs/>
-        </w:rPr>
-        <w:t>auto-</w:t>
-      </w:r>
-      <w:proofErr w:type="spellStart"/>
-      <w:r>
-        <w:rPr>
-          <w:i/>
-          <w:iCs/>
-        </w:rPr>
-        <w:t>sklearn</w:t>
-      </w:r>
-      <w:proofErr w:type="spellEnd"/>
+        <w:t>auto-sklearn</w:t>
+      </w:r>
       <w:r>
         <w:t xml:space="preserve"> model).</w:t>
       </w:r>
@@ -25994,43 +25614,19 @@
         <w:t xml:space="preserve">s: </w:t>
       </w:r>
       <w:r>
-        <w:t xml:space="preserve">Conceptualization, Richard Wen; methodology, Richard Wen, </w:t>
-      </w:r>
-      <w:proofErr w:type="spellStart"/>
-      <w:r>
-        <w:t>Songnian</w:t>
-      </w:r>
-      <w:proofErr w:type="spellEnd"/>
-      <w:r>
-        <w:t xml:space="preserve"> Li; Investigation, data curation, software, writing—original draft preparation, Richard Wen; superv</w:t>
+        <w:t>Conceptualization, Richard Wen; methodology, Richard Wen, Songnian Li; Investigation, data curation, software, writing—original draft preparation, Richard Wen; superv</w:t>
       </w:r>
       <w:r>
         <w:t>i</w:t>
       </w:r>
       <w:r>
-        <w:t xml:space="preserve">sion, funding acquisition, resources, project administration, </w:t>
-      </w:r>
-      <w:proofErr w:type="spellStart"/>
-      <w:r>
-        <w:t>Songnian</w:t>
-      </w:r>
-      <w:proofErr w:type="spellEnd"/>
-      <w:r>
-        <w:t xml:space="preserve"> Li; writing—review and e</w:t>
+        <w:t>sion, funding acquisition, resources, project administration, Songnian Li; writing—review and e</w:t>
       </w:r>
       <w:r>
         <w:t>d</w:t>
       </w:r>
       <w:r>
-        <w:t xml:space="preserve">iting, Richard Wen, </w:t>
-      </w:r>
-      <w:proofErr w:type="spellStart"/>
-      <w:r>
-        <w:t>Songnian</w:t>
-      </w:r>
-      <w:proofErr w:type="spellEnd"/>
-      <w:r>
-        <w:t xml:space="preserve"> Li. All authors have read and agreed to the published version of the manuscript.</w:t>
+        <w:t>iting, Richard Wen, Songnian Li. All authors have read and agreed to the published version of the manuscript.</w:t>
       </w:r>
     </w:p>
     <w:p>
@@ -26176,16 +25772,8 @@
         <w:rPr>
           <w:color w:val="auto"/>
         </w:rPr>
-        <w:t xml:space="preserve">; Geneva, </w:t>
-      </w:r>
-      <w:proofErr w:type="gramStart"/>
-      <w:r>
-        <w:rPr>
-          <w:color w:val="auto"/>
-        </w:rPr>
-        <w:t>2018;</w:t>
-      </w:r>
-      <w:proofErr w:type="gramEnd"/>
+        <w:t>; Geneva, 2018;</w:t>
+      </w:r>
     </w:p>
     <w:p>
       <w:pPr>
@@ -26219,16 +25807,8 @@
         <w:rPr>
           <w:color w:val="auto"/>
         </w:rPr>
-        <w:t xml:space="preserve">; Vienna, </w:t>
-      </w:r>
-      <w:proofErr w:type="gramStart"/>
-      <w:r>
-        <w:rPr>
-          <w:color w:val="auto"/>
-        </w:rPr>
-        <w:t>2019;</w:t>
-      </w:r>
-      <w:proofErr w:type="gramEnd"/>
+        <w:t>; Vienna, 2019;</w:t>
+      </w:r>
     </w:p>
     <w:p>
       <w:pPr>
@@ -26374,21 +25954,7 @@
           <w:color w:val="auto"/>
         </w:rPr>
         <w:tab/>
-        <w:t xml:space="preserve">Richard Wen Generative Design of Geospatial Interventions </w:t>
-      </w:r>
-      <w:proofErr w:type="gramStart"/>
-      <w:r>
-        <w:rPr>
-          <w:color w:val="auto"/>
-        </w:rPr>
-        <w:t>With</w:t>
-      </w:r>
-      <w:proofErr w:type="gramEnd"/>
-      <w:r>
-        <w:rPr>
-          <w:color w:val="auto"/>
-        </w:rPr>
-        <w:t xml:space="preserve"> Automated Machine Learning and Bayesian Optimization, Toronto Metropolitan University: Toronto, 2023.</w:t>
+        <w:t>Richard Wen Generative Design of Geospatial Interventions With Automated Machine Learning and Bayesian Optimization, Toronto Metropolitan University: Toronto, 2023.</w:t>
       </w:r>
     </w:p>
     <w:p>
@@ -26409,35 +25975,7 @@
           <w:color w:val="auto"/>
         </w:rPr>
         <w:tab/>
-        <w:t xml:space="preserve">Bonnet, E.; </w:t>
-      </w:r>
-      <w:proofErr w:type="spellStart"/>
-      <w:r>
-        <w:rPr>
-          <w:color w:val="auto"/>
-        </w:rPr>
-        <w:t>Lechat</w:t>
-      </w:r>
-      <w:proofErr w:type="spellEnd"/>
-      <w:r>
-        <w:rPr>
-          <w:color w:val="auto"/>
-        </w:rPr>
-        <w:t xml:space="preserve">, L.; </w:t>
-      </w:r>
-      <w:proofErr w:type="spellStart"/>
-      <w:r>
-        <w:rPr>
-          <w:color w:val="auto"/>
-        </w:rPr>
-        <w:t>Ridde</w:t>
-      </w:r>
-      <w:proofErr w:type="spellEnd"/>
-      <w:r>
-        <w:rPr>
-          <w:color w:val="auto"/>
-        </w:rPr>
-        <w:t xml:space="preserve">, V. What Interventions Are Required to Reduce Road Traffic Injuries in Africa? A Scoping Review of the Literature. </w:t>
+        <w:t xml:space="preserve">Bonnet, E.; Lechat, L.; Ridde, V. What Interventions Are Required to Reduce Road Traffic Injuries in Africa? A Scoping Review of the Literature. </w:t>
       </w:r>
       <w:r>
         <w:rPr>
@@ -26479,21 +26017,7 @@
         <w:rPr>
           <w:color w:val="auto"/>
         </w:rPr>
-        <w:t xml:space="preserve">, e0208195, </w:t>
-      </w:r>
-      <w:proofErr w:type="gramStart"/>
-      <w:r>
-        <w:rPr>
-          <w:color w:val="auto"/>
-        </w:rPr>
-        <w:t>doi:10.1371/journal.pone</w:t>
-      </w:r>
-      <w:proofErr w:type="gramEnd"/>
-      <w:r>
-        <w:rPr>
-          <w:color w:val="auto"/>
-        </w:rPr>
-        <w:t>.0208195.</w:t>
+        <w:t>, e0208195, doi:10.1371/journal.pone.0208195.</w:t>
       </w:r>
     </w:p>
     <w:p>
@@ -26648,18 +26172,8 @@
           <w:iCs/>
           <w:color w:val="auto"/>
         </w:rPr>
-        <w:t xml:space="preserve">Int J Health </w:t>
-      </w:r>
-      <w:proofErr w:type="spellStart"/>
-      <w:r>
-        <w:rPr>
-          <w:i/>
-          <w:iCs/>
-          <w:color w:val="auto"/>
-        </w:rPr>
-        <w:t>Geogr</w:t>
-      </w:r>
-      <w:proofErr w:type="spellEnd"/>
+        <w:t>Int J Health Geogr</w:t>
+      </w:r>
       <w:r>
         <w:rPr>
           <w:color w:val="auto"/>
@@ -26713,20 +26227,7 @@
           <w:color w:val="auto"/>
         </w:rPr>
         <w:tab/>
-      </w:r>
-      <w:proofErr w:type="spellStart"/>
-      <w:r>
-        <w:rPr>
-          <w:color w:val="auto"/>
-        </w:rPr>
-        <w:t>Nykiforuk</w:t>
-      </w:r>
-      <w:proofErr w:type="spellEnd"/>
-      <w:r>
-        <w:rPr>
-          <w:color w:val="auto"/>
-        </w:rPr>
-        <w:t xml:space="preserve">, C.I.J.; Flaman, L.M. Geographic Information Systems (GIS) for Health Promotion and Public Health: A Review. </w:t>
+        <w:t xml:space="preserve">Nykiforuk, C.I.J.; Flaman, L.M. Geographic Information Systems (GIS) for Health Promotion and Public Health: A Review. </w:t>
       </w:r>
       <w:r>
         <w:rPr>
@@ -26831,21 +26332,7 @@
         <w:rPr>
           <w:color w:val="auto"/>
         </w:rPr>
-        <w:t xml:space="preserve">, 100474, </w:t>
-      </w:r>
-      <w:proofErr w:type="gramStart"/>
-      <w:r>
-        <w:rPr>
-          <w:color w:val="auto"/>
-        </w:rPr>
-        <w:t>doi:10.1016/j.rsase</w:t>
-      </w:r>
-      <w:proofErr w:type="gramEnd"/>
-      <w:r>
-        <w:rPr>
-          <w:color w:val="auto"/>
-        </w:rPr>
-        <w:t>.2021.100474.</w:t>
+        <w:t>, 100474, doi:10.1016/j.rsase.2021.100474.</w:t>
       </w:r>
     </w:p>
     <w:p>
@@ -26866,62 +26353,7 @@
           <w:color w:val="auto"/>
         </w:rPr>
         <w:tab/>
-      </w:r>
-      <w:proofErr w:type="spellStart"/>
-      <w:r>
-        <w:rPr>
-          <w:color w:val="auto"/>
-        </w:rPr>
-        <w:t>Elsahlamy</w:t>
-      </w:r>
-      <w:proofErr w:type="spellEnd"/>
-      <w:r>
-        <w:rPr>
-          <w:color w:val="auto"/>
-        </w:rPr>
-        <w:t xml:space="preserve">, E.; </w:t>
-      </w:r>
-      <w:proofErr w:type="spellStart"/>
-      <w:r>
-        <w:rPr>
-          <w:color w:val="auto"/>
-        </w:rPr>
-        <w:t>Eshra</w:t>
-      </w:r>
-      <w:proofErr w:type="spellEnd"/>
-      <w:r>
-        <w:rPr>
-          <w:color w:val="auto"/>
-        </w:rPr>
-        <w:t xml:space="preserve">, A.; </w:t>
-      </w:r>
-      <w:proofErr w:type="spellStart"/>
-      <w:r>
-        <w:rPr>
-          <w:color w:val="auto"/>
-        </w:rPr>
-        <w:t>Eshra</w:t>
-      </w:r>
-      <w:proofErr w:type="spellEnd"/>
-      <w:r>
-        <w:rPr>
-          <w:color w:val="auto"/>
-        </w:rPr>
-        <w:t>, N.; El-</w:t>
-      </w:r>
-      <w:proofErr w:type="spellStart"/>
-      <w:r>
-        <w:rPr>
-          <w:color w:val="auto"/>
-        </w:rPr>
-        <w:t>Fishawy</w:t>
-      </w:r>
-      <w:proofErr w:type="spellEnd"/>
-      <w:r>
-        <w:rPr>
-          <w:color w:val="auto"/>
-        </w:rPr>
-        <w:t>, N. Empowering GIS with Big Data: A Review of Recent Advances. In Proceedings of the 2021 International Conference on Electronic Engineering (ICEEM); July 2021; pp. 1–7.</w:t>
+        <w:t>Elsahlamy, E.; Eshra, A.; Eshra, N.; El-Fishawy, N. Empowering GIS with Big Data: A Review of Recent Advances. In Proceedings of the 2021 International Conference on Electronic Engineering (ICEEM); July 2021; pp. 1–7.</w:t>
       </w:r>
     </w:p>
     <w:p>
@@ -26984,21 +26416,7 @@
         <w:rPr>
           <w:color w:val="auto"/>
         </w:rPr>
-        <w:t xml:space="preserve">, 300–309, </w:t>
-      </w:r>
-      <w:proofErr w:type="gramStart"/>
-      <w:r>
-        <w:rPr>
-          <w:color w:val="auto"/>
-        </w:rPr>
-        <w:t>doi:10.1016/j.ijgo</w:t>
-      </w:r>
-      <w:proofErr w:type="gramEnd"/>
-      <w:r>
-        <w:rPr>
-          <w:color w:val="auto"/>
-        </w:rPr>
-        <w:t>.2011.09.004.</w:t>
+        <w:t>, 300–309, doi:10.1016/j.ijgo.2011.09.004.</w:t>
       </w:r>
     </w:p>
     <w:p>
@@ -27019,21 +26437,7 @@
           <w:color w:val="auto"/>
         </w:rPr>
         <w:tab/>
-        <w:t xml:space="preserve">Franch-Pardo, I.; Napoletano, B.M.; </w:t>
-      </w:r>
-      <w:proofErr w:type="spellStart"/>
-      <w:r>
-        <w:rPr>
-          <w:color w:val="auto"/>
-        </w:rPr>
-        <w:t>Rosete</w:t>
-      </w:r>
-      <w:proofErr w:type="spellEnd"/>
-      <w:r>
-        <w:rPr>
-          <w:color w:val="auto"/>
-        </w:rPr>
-        <w:t xml:space="preserve">-Verges, F.; Billa, L. Spatial Analysis and GIS in the Study of COVID-19. A Review. </w:t>
+        <w:t xml:space="preserve">Franch-Pardo, I.; Napoletano, B.M.; Rosete-Verges, F.; Billa, L. Spatial Analysis and GIS in the Study of COVID-19. A Review. </w:t>
       </w:r>
       <w:r>
         <w:rPr>
@@ -27075,21 +26479,7 @@
         <w:rPr>
           <w:color w:val="auto"/>
         </w:rPr>
-        <w:t xml:space="preserve">, 140033, </w:t>
-      </w:r>
-      <w:proofErr w:type="gramStart"/>
-      <w:r>
-        <w:rPr>
-          <w:color w:val="auto"/>
-        </w:rPr>
-        <w:t>doi:10.1016/j.scitotenv</w:t>
-      </w:r>
-      <w:proofErr w:type="gramEnd"/>
-      <w:r>
-        <w:rPr>
-          <w:color w:val="auto"/>
-        </w:rPr>
-        <w:t>.2020.140033.</w:t>
+        <w:t>, 140033, doi:10.1016/j.scitotenv.2020.140033.</w:t>
       </w:r>
     </w:p>
     <w:p>
@@ -27111,90 +26501,7 @@
           <w:color w:val="auto"/>
         </w:rPr>
         <w:tab/>
-      </w:r>
-      <w:proofErr w:type="spellStart"/>
-      <w:r>
-        <w:rPr>
-          <w:color w:val="auto"/>
-        </w:rPr>
-        <w:t>Ištoka</w:t>
-      </w:r>
-      <w:proofErr w:type="spellEnd"/>
-      <w:r>
-        <w:rPr>
-          <w:color w:val="auto"/>
-        </w:rPr>
-        <w:t xml:space="preserve"> </w:t>
-      </w:r>
-      <w:proofErr w:type="spellStart"/>
-      <w:r>
-        <w:rPr>
-          <w:color w:val="auto"/>
-        </w:rPr>
-        <w:t>Otković</w:t>
-      </w:r>
-      <w:proofErr w:type="spellEnd"/>
-      <w:r>
-        <w:rPr>
-          <w:color w:val="auto"/>
-        </w:rPr>
-        <w:t xml:space="preserve">, I.; </w:t>
-      </w:r>
-      <w:proofErr w:type="spellStart"/>
-      <w:r>
-        <w:rPr>
-          <w:color w:val="auto"/>
-        </w:rPr>
-        <w:t>Karleuša</w:t>
-      </w:r>
-      <w:proofErr w:type="spellEnd"/>
-      <w:r>
-        <w:rPr>
-          <w:color w:val="auto"/>
-        </w:rPr>
-        <w:t xml:space="preserve">, B.; </w:t>
-      </w:r>
-      <w:proofErr w:type="spellStart"/>
-      <w:r>
-        <w:rPr>
-          <w:color w:val="auto"/>
-        </w:rPr>
-        <w:t>Deluka-Tibljaš</w:t>
-      </w:r>
-      <w:proofErr w:type="spellEnd"/>
-      <w:r>
-        <w:rPr>
-          <w:color w:val="auto"/>
-        </w:rPr>
-        <w:t xml:space="preserve">, A.; </w:t>
-      </w:r>
-      <w:proofErr w:type="spellStart"/>
-      <w:r>
-        <w:rPr>
-          <w:color w:val="auto"/>
-        </w:rPr>
-        <w:t>Šurdonja</w:t>
-      </w:r>
-      <w:proofErr w:type="spellEnd"/>
-      <w:r>
-        <w:rPr>
-          <w:color w:val="auto"/>
-        </w:rPr>
-        <w:t xml:space="preserve">, S.; </w:t>
-      </w:r>
-      <w:proofErr w:type="spellStart"/>
-      <w:r>
-        <w:rPr>
-          <w:color w:val="auto"/>
-        </w:rPr>
-        <w:t>Marušić</w:t>
-      </w:r>
-      <w:proofErr w:type="spellEnd"/>
-      <w:r>
-        <w:rPr>
-          <w:color w:val="auto"/>
-        </w:rPr>
-        <w:t xml:space="preserve">, M. Combining Traffic Microsimulation Modeling and Multi-Criteria Analysis for Sustainable Spatial-Traffic Planning. </w:t>
+        <w:t xml:space="preserve">Ištoka Otković, I.; Karleuša, B.; Deluka-Tibljaš, A.; Šurdonja, S.; Marušić, M. Combining Traffic Microsimulation Modeling and Multi-Criteria Analysis for Sustainable Spatial-Traffic Planning. </w:t>
       </w:r>
       <w:r>
         <w:rPr>
@@ -27259,23 +26566,13 @@
         <w:tab/>
         <w:t xml:space="preserve">Piza, E.L.; Kennedy, L.W.; Caplan, J.M. Facilitators and Impediments to Designing, Implementing, and Evaluating Risk-Based Policing Strategies Using Risk Terrain Modeling: Insights from a Multi-City Evaluation in the United States. </w:t>
       </w:r>
-      <w:proofErr w:type="spellStart"/>
       <w:r>
         <w:rPr>
           <w:i/>
           <w:iCs/>
           <w:color w:val="auto"/>
         </w:rPr>
-        <w:t>Eur</w:t>
-      </w:r>
-      <w:proofErr w:type="spellEnd"/>
-      <w:r>
-        <w:rPr>
-          <w:i/>
-          <w:iCs/>
-          <w:color w:val="auto"/>
-        </w:rPr>
-        <w:t xml:space="preserve"> J Crim Policy Res</w:t>
+        <w:t>Eur J Crim Policy Res</w:t>
       </w:r>
       <w:r>
         <w:rPr>
@@ -27456,34 +26753,7 @@
           <w:color w:val="auto"/>
         </w:rPr>
         <w:tab/>
-      </w:r>
-      <w:proofErr w:type="spellStart"/>
-      <w:r>
-        <w:rPr>
-          <w:color w:val="auto"/>
-        </w:rPr>
-        <w:t>Mortaheb</w:t>
-      </w:r>
-      <w:proofErr w:type="spellEnd"/>
-      <w:r>
-        <w:rPr>
-          <w:color w:val="auto"/>
-        </w:rPr>
-        <w:t xml:space="preserve">, R.; Jankowski, P. Smart City Re-Imagined: City Planning and </w:t>
-      </w:r>
-      <w:proofErr w:type="spellStart"/>
-      <w:r>
-        <w:rPr>
-          <w:color w:val="auto"/>
-        </w:rPr>
-        <w:t>GeoAI</w:t>
-      </w:r>
-      <w:proofErr w:type="spellEnd"/>
-      <w:r>
-        <w:rPr>
-          <w:color w:val="auto"/>
-        </w:rPr>
-        <w:t xml:space="preserve"> in the Age of Big Data. </w:t>
+        <w:t xml:space="preserve">Mortaheb, R.; Jankowski, P. Smart City Re-Imagined: City Planning and GeoAI in the Age of Big Data. </w:t>
       </w:r>
       <w:r>
         <w:rPr>
@@ -27546,35 +26816,7 @@
           <w:color w:val="auto"/>
         </w:rPr>
         <w:tab/>
-        <w:t xml:space="preserve">Chen, M.; </w:t>
-      </w:r>
-      <w:proofErr w:type="spellStart"/>
-      <w:r>
-        <w:rPr>
-          <w:color w:val="auto"/>
-        </w:rPr>
-        <w:t>Claramunt</w:t>
-      </w:r>
-      <w:proofErr w:type="spellEnd"/>
-      <w:r>
-        <w:rPr>
-          <w:color w:val="auto"/>
-        </w:rPr>
-        <w:t xml:space="preserve">, C.; </w:t>
-      </w:r>
-      <w:proofErr w:type="spellStart"/>
-      <w:r>
-        <w:rPr>
-          <w:color w:val="auto"/>
-        </w:rPr>
-        <w:t>Çöltekin</w:t>
-      </w:r>
-      <w:proofErr w:type="spellEnd"/>
-      <w:r>
-        <w:rPr>
-          <w:color w:val="auto"/>
-        </w:rPr>
-        <w:t xml:space="preserve">, A.; Liu, X.; Peng, P.; Robinson, A.C.; Wang, D.; Strobl, J.; Wilson, J.P.; Batty, M. Artificial Intelligence and Visual Analytics in Geographical Space and Cyberspace: Research Opportunities and Challenges. </w:t>
+        <w:t xml:space="preserve">Chen, M.; Claramunt, C.; Çöltekin, A.; Liu, X.; Peng, P.; Robinson, A.C.; Wang, D.; Strobl, J.; Wilson, J.P.; Batty, M. Artificial Intelligence and Visual Analytics in Geographical Space and Cyberspace: Research Opportunities and Challenges. </w:t>
       </w:r>
       <w:r>
         <w:rPr>
@@ -27637,49 +26879,7 @@
           <w:color w:val="auto"/>
         </w:rPr>
         <w:tab/>
-        <w:t xml:space="preserve">Biu, P.W.; </w:t>
-      </w:r>
-      <w:proofErr w:type="spellStart"/>
-      <w:r>
-        <w:rPr>
-          <w:color w:val="auto"/>
-        </w:rPr>
-        <w:t>Nwasike</w:t>
-      </w:r>
-      <w:proofErr w:type="spellEnd"/>
-      <w:r>
-        <w:rPr>
-          <w:color w:val="auto"/>
-        </w:rPr>
-        <w:t xml:space="preserve">, C.N.; Tula, O.A.; </w:t>
-      </w:r>
-      <w:proofErr w:type="spellStart"/>
-      <w:r>
-        <w:rPr>
-          <w:color w:val="auto"/>
-        </w:rPr>
-        <w:t>Ezeigweneme</w:t>
-      </w:r>
-      <w:proofErr w:type="spellEnd"/>
-      <w:r>
-        <w:rPr>
-          <w:color w:val="auto"/>
-        </w:rPr>
-        <w:t xml:space="preserve">, C.A.; </w:t>
-      </w:r>
-      <w:proofErr w:type="spellStart"/>
-      <w:r>
-        <w:rPr>
-          <w:color w:val="auto"/>
-        </w:rPr>
-        <w:t>Gidiagba</w:t>
-      </w:r>
-      <w:proofErr w:type="spellEnd"/>
-      <w:r>
-        <w:rPr>
-          <w:color w:val="auto"/>
-        </w:rPr>
-        <w:t xml:space="preserve">, J.O. A Review of GIS Applications in Public Health Surveillance. </w:t>
+        <w:t xml:space="preserve">Biu, P.W.; Nwasike, C.N.; Tula, O.A.; Ezeigweneme, C.A.; Gidiagba, J.O. A Review of GIS Applications in Public Health Surveillance. </w:t>
       </w:r>
       <w:r>
         <w:rPr>
@@ -27742,76 +26942,7 @@
           <w:color w:val="auto"/>
         </w:rPr>
         <w:tab/>
-      </w:r>
-      <w:proofErr w:type="spellStart"/>
-      <w:r>
-        <w:rPr>
-          <w:color w:val="auto"/>
-        </w:rPr>
-        <w:t>Fradelos</w:t>
-      </w:r>
-      <w:proofErr w:type="spellEnd"/>
-      <w:r>
-        <w:rPr>
-          <w:color w:val="auto"/>
-        </w:rPr>
-        <w:t xml:space="preserve">, E.C.; </w:t>
-      </w:r>
-      <w:proofErr w:type="spellStart"/>
-      <w:r>
-        <w:rPr>
-          <w:color w:val="auto"/>
-        </w:rPr>
-        <w:t>Papathanasiou</w:t>
-      </w:r>
-      <w:proofErr w:type="spellEnd"/>
-      <w:r>
-        <w:rPr>
-          <w:color w:val="auto"/>
-        </w:rPr>
-        <w:t xml:space="preserve">, I.V.; Mitsi, D.; </w:t>
-      </w:r>
-      <w:proofErr w:type="spellStart"/>
-      <w:r>
-        <w:rPr>
-          <w:color w:val="auto"/>
-        </w:rPr>
-        <w:t>Tsaras</w:t>
-      </w:r>
-      <w:proofErr w:type="spellEnd"/>
-      <w:r>
-        <w:rPr>
-          <w:color w:val="auto"/>
-        </w:rPr>
-        <w:t xml:space="preserve">, K.; </w:t>
-      </w:r>
-      <w:proofErr w:type="spellStart"/>
-      <w:r>
-        <w:rPr>
-          <w:color w:val="auto"/>
-        </w:rPr>
-        <w:t>Kleisiaris</w:t>
-      </w:r>
-      <w:proofErr w:type="spellEnd"/>
-      <w:r>
-        <w:rPr>
-          <w:color w:val="auto"/>
-        </w:rPr>
-        <w:t xml:space="preserve">, C.F.; </w:t>
-      </w:r>
-      <w:proofErr w:type="spellStart"/>
-      <w:r>
-        <w:rPr>
-          <w:color w:val="auto"/>
-        </w:rPr>
-        <w:t>Kourkouta</w:t>
-      </w:r>
-      <w:proofErr w:type="spellEnd"/>
-      <w:r>
-        <w:rPr>
-          <w:color w:val="auto"/>
-        </w:rPr>
-        <w:t xml:space="preserve">, L. Health Based Geographic Information Systems (GIS) and Their Applications. </w:t>
+        <w:t xml:space="preserve">Fradelos, E.C.; Papathanasiou, I.V.; Mitsi, D.; Tsaras, K.; Kleisiaris, C.F.; Kourkouta, L. Health Based Geographic Information Systems (GIS) and Their Applications. </w:t>
       </w:r>
       <w:r>
         <w:rPr>
@@ -27874,21 +27005,7 @@
           <w:color w:val="auto"/>
         </w:rPr>
         <w:tab/>
-        <w:t>Wen, R.; Li, S. Generative Design for Precision Geo-Interventions. In Proceedings of the ISPRS Annals of the Photogrammetry, Remote Sensing and Spatial Information Sciences; Copernicus GmbH, October 27</w:t>
-      </w:r>
-      <w:proofErr w:type="gramStart"/>
-      <w:r>
-        <w:rPr>
-          <w:color w:val="auto"/>
-        </w:rPr>
-        <w:t xml:space="preserve"> 2022</w:t>
-      </w:r>
-      <w:proofErr w:type="gramEnd"/>
-      <w:r>
-        <w:rPr>
-          <w:color w:val="auto"/>
-        </w:rPr>
-        <w:t>; Vol. X-3-W2-2022, pp. 37–42.</w:t>
+        <w:t>Wen, R.; Li, S. Generative Design for Precision Geo-Interventions. In Proceedings of the ISPRS Annals of the Photogrammetry, Remote Sensing and Spatial Information Sciences; Copernicus GmbH, October 27 2022; Vol. X-3-W2-2022, pp. 37–42.</w:t>
       </w:r>
     </w:p>
     <w:p>
@@ -27909,35 +27026,7 @@
           <w:color w:val="auto"/>
         </w:rPr>
         <w:tab/>
-        <w:t xml:space="preserve">Blaschke, T.; </w:t>
-      </w:r>
-      <w:proofErr w:type="spellStart"/>
-      <w:r>
-        <w:rPr>
-          <w:color w:val="auto"/>
-        </w:rPr>
-        <w:t>Merschdorf</w:t>
-      </w:r>
-      <w:proofErr w:type="spellEnd"/>
-      <w:r>
-        <w:rPr>
-          <w:color w:val="auto"/>
-        </w:rPr>
-        <w:t>, H.; Cabrera-Barona, P.; Gao, S.; Papadakis, E.; Kovacs-</w:t>
-      </w:r>
-      <w:proofErr w:type="spellStart"/>
-      <w:r>
-        <w:rPr>
-          <w:color w:val="auto"/>
-        </w:rPr>
-        <w:t>Györi</w:t>
-      </w:r>
-      <w:proofErr w:type="spellEnd"/>
-      <w:r>
-        <w:rPr>
-          <w:color w:val="auto"/>
-        </w:rPr>
-        <w:t xml:space="preserve">, A. Place versus Space: From Points, Lines and Polygons in GIS to Place-Based Representations Reflecting Language and Culture. </w:t>
+        <w:t xml:space="preserve">Blaschke, T.; Merschdorf, H.; Cabrera-Barona, P.; Gao, S.; Papadakis, E.; Kovacs-Györi, A. Place versus Space: From Points, Lines and Polygons in GIS to Place-Based Representations Reflecting Language and Culture. </w:t>
       </w:r>
       <w:r>
         <w:rPr>
@@ -28000,20 +27089,7 @@
           <w:color w:val="auto"/>
         </w:rPr>
         <w:tab/>
-      </w:r>
-      <w:proofErr w:type="spellStart"/>
-      <w:r>
-        <w:rPr>
-          <w:color w:val="auto"/>
-        </w:rPr>
-        <w:t>Verbyla</w:t>
-      </w:r>
-      <w:proofErr w:type="spellEnd"/>
-      <w:r>
-        <w:rPr>
-          <w:color w:val="auto"/>
-        </w:rPr>
-        <w:t xml:space="preserve">, D.L. </w:t>
+        <w:t xml:space="preserve">Verbyla, D.L. </w:t>
       </w:r>
       <w:r>
         <w:rPr>
@@ -28027,16 +27103,8 @@
         <w:rPr>
           <w:color w:val="auto"/>
         </w:rPr>
-        <w:t xml:space="preserve">; CRC press, </w:t>
-      </w:r>
-      <w:proofErr w:type="gramStart"/>
-      <w:r>
-        <w:rPr>
-          <w:color w:val="auto"/>
-        </w:rPr>
-        <w:t>2002;</w:t>
-      </w:r>
-      <w:proofErr w:type="gramEnd"/>
+        <w:t>; CRC press, 2002;</w:t>
+      </w:r>
     </w:p>
     <w:p>
       <w:pPr>
@@ -28077,35 +27145,7 @@
           <w:color w:val="auto"/>
         </w:rPr>
         <w:tab/>
-        <w:t xml:space="preserve">Horst, R.; </w:t>
-      </w:r>
-      <w:proofErr w:type="spellStart"/>
-      <w:r>
-        <w:rPr>
-          <w:color w:val="auto"/>
-        </w:rPr>
-        <w:t>Pardalos</w:t>
-      </w:r>
-      <w:proofErr w:type="spellEnd"/>
-      <w:r>
-        <w:rPr>
-          <w:color w:val="auto"/>
-        </w:rPr>
-        <w:t xml:space="preserve">, P.M.; Van </w:t>
-      </w:r>
-      <w:proofErr w:type="spellStart"/>
-      <w:r>
-        <w:rPr>
-          <w:color w:val="auto"/>
-        </w:rPr>
-        <w:t>Thoai</w:t>
-      </w:r>
-      <w:proofErr w:type="spellEnd"/>
-      <w:r>
-        <w:rPr>
-          <w:color w:val="auto"/>
-        </w:rPr>
-        <w:t xml:space="preserve">, N. </w:t>
+        <w:t xml:space="preserve">Horst, R.; Pardalos, P.M.; Van Thoai, N. </w:t>
       </w:r>
       <w:r>
         <w:rPr>
@@ -28119,16 +27159,8 @@
         <w:rPr>
           <w:color w:val="auto"/>
         </w:rPr>
-        <w:t xml:space="preserve">; Springer Science &amp; Business Media, </w:t>
-      </w:r>
-      <w:proofErr w:type="gramStart"/>
-      <w:r>
-        <w:rPr>
-          <w:color w:val="auto"/>
-        </w:rPr>
-        <w:t>2000;</w:t>
-      </w:r>
-      <w:proofErr w:type="gramEnd"/>
+        <w:t>; Springer Science &amp; Business Media, 2000;</w:t>
+      </w:r>
     </w:p>
     <w:p>
       <w:pPr>
@@ -28211,21 +27243,7 @@
           <w:color w:val="auto"/>
         </w:rPr>
         <w:tab/>
-        <w:t xml:space="preserve">Ho, Y.C.; </w:t>
-      </w:r>
-      <w:proofErr w:type="spellStart"/>
-      <w:r>
-        <w:rPr>
-          <w:color w:val="auto"/>
-        </w:rPr>
-        <w:t>Pepyne</w:t>
-      </w:r>
-      <w:proofErr w:type="spellEnd"/>
-      <w:r>
-        <w:rPr>
-          <w:color w:val="auto"/>
-        </w:rPr>
-        <w:t xml:space="preserve">, D.L. Simple Explanation of the No-Free-Lunch Theorem and Its Implications. </w:t>
+        <w:t xml:space="preserve">Ho, Y.C.; Pepyne, D.L. Simple Explanation of the No-Free-Lunch Theorem and Its Implications. </w:t>
       </w:r>
       <w:r>
         <w:rPr>
@@ -28365,16 +27383,8 @@
         <w:rPr>
           <w:color w:val="auto"/>
         </w:rPr>
-        <w:t>, 246–264, doi:10.1111/j.1461-0248.2009.</w:t>
-      </w:r>
-      <w:proofErr w:type="gramStart"/>
-      <w:r>
-        <w:rPr>
-          <w:color w:val="auto"/>
-        </w:rPr>
-        <w:t>01422.x.</w:t>
-      </w:r>
-      <w:proofErr w:type="gramEnd"/>
+        <w:t>, 246–264, doi:10.1111/j.1461-0248.2009.01422.x.</w:t>
+      </w:r>
     </w:p>
     <w:p>
       <w:pPr>
@@ -28395,20 +27405,7 @@
           <w:color w:val="auto"/>
         </w:rPr>
         <w:tab/>
-      </w:r>
-      <w:proofErr w:type="spellStart"/>
-      <w:r>
-        <w:rPr>
-          <w:color w:val="auto"/>
-        </w:rPr>
-        <w:t>Maffini</w:t>
-      </w:r>
-      <w:proofErr w:type="spellEnd"/>
-      <w:r>
-        <w:rPr>
-          <w:color w:val="auto"/>
-        </w:rPr>
-        <w:t xml:space="preserve">, G. Raster versus Vector Data Encoding and Handling: A Commentary. </w:t>
+        <w:t xml:space="preserve">Maffini, G. Raster versus Vector Data Encoding and Handling: A Commentary. </w:t>
       </w:r>
       <w:r>
         <w:rPr>
@@ -28471,20 +27468,7 @@
           <w:color w:val="auto"/>
         </w:rPr>
         <w:tab/>
-      </w:r>
-      <w:proofErr w:type="spellStart"/>
-      <w:r>
-        <w:rPr>
-          <w:color w:val="auto"/>
-        </w:rPr>
-        <w:t>Congalton</w:t>
-      </w:r>
-      <w:proofErr w:type="spellEnd"/>
-      <w:r>
-        <w:rPr>
-          <w:color w:val="auto"/>
-        </w:rPr>
-        <w:t xml:space="preserve">, R.G. Exploring and Evaluating the Consequences of Vector-to-Raster and Raster-to-Vector Conversion. </w:t>
+        <w:t xml:space="preserve">Congalton, R.G. Exploring and Evaluating the Consequences of Vector-to-Raster and Raster-to-Vector Conversion. </w:t>
       </w:r>
       <w:r>
         <w:rPr>
@@ -28610,76 +27594,7 @@
           <w:color w:val="auto"/>
         </w:rPr>
         <w:tab/>
-      </w:r>
-      <w:proofErr w:type="spellStart"/>
-      <w:r>
-        <w:rPr>
-          <w:color w:val="auto"/>
-        </w:rPr>
-        <w:t>Adegun</w:t>
-      </w:r>
-      <w:proofErr w:type="spellEnd"/>
-      <w:r>
-        <w:rPr>
-          <w:color w:val="auto"/>
-        </w:rPr>
-        <w:t xml:space="preserve">, A.A.; </w:t>
-      </w:r>
-      <w:proofErr w:type="spellStart"/>
-      <w:r>
-        <w:rPr>
-          <w:color w:val="auto"/>
-        </w:rPr>
-        <w:t>Fonou</w:t>
-      </w:r>
-      <w:proofErr w:type="spellEnd"/>
-      <w:r>
-        <w:rPr>
-          <w:color w:val="auto"/>
-        </w:rPr>
-        <w:t xml:space="preserve"> </w:t>
-      </w:r>
-      <w:proofErr w:type="spellStart"/>
-      <w:r>
-        <w:rPr>
-          <w:color w:val="auto"/>
-        </w:rPr>
-        <w:t>Dombeu</w:t>
-      </w:r>
-      <w:proofErr w:type="spellEnd"/>
-      <w:r>
-        <w:rPr>
-          <w:color w:val="auto"/>
-        </w:rPr>
-        <w:t xml:space="preserve">, J.V.; </w:t>
-      </w:r>
-      <w:proofErr w:type="spellStart"/>
-      <w:r>
-        <w:rPr>
-          <w:color w:val="auto"/>
-        </w:rPr>
-        <w:t>Viriri</w:t>
-      </w:r>
-      <w:proofErr w:type="spellEnd"/>
-      <w:r>
-        <w:rPr>
-          <w:color w:val="auto"/>
-        </w:rPr>
-        <w:t xml:space="preserve">, S.; </w:t>
-      </w:r>
-      <w:proofErr w:type="spellStart"/>
-      <w:r>
-        <w:rPr>
-          <w:color w:val="auto"/>
-        </w:rPr>
-        <w:t>Odindi</w:t>
-      </w:r>
-      <w:proofErr w:type="spellEnd"/>
-      <w:r>
-        <w:rPr>
-          <w:color w:val="auto"/>
-        </w:rPr>
-        <w:t xml:space="preserve">, J. State-of-the-Art Deep Learning Methods for Objects Detection in Remote Sensing Satellite Images. </w:t>
+        <w:t xml:space="preserve">Adegun, A.A.; Fonou Dombeu, J.V.; Viriri, S.; Odindi, J. State-of-the-Art Deep Learning Methods for Objects Detection in Remote Sensing Satellite Images. </w:t>
       </w:r>
       <w:r>
         <w:rPr>
@@ -28763,76 +27678,7 @@
           <w:color w:val="auto"/>
         </w:rPr>
         <w:tab/>
-      </w:r>
-      <w:proofErr w:type="spellStart"/>
-      <w:r>
-        <w:rPr>
-          <w:color w:val="auto"/>
-        </w:rPr>
-        <w:t>Verdonck</w:t>
-      </w:r>
-      <w:proofErr w:type="spellEnd"/>
-      <w:r>
-        <w:rPr>
-          <w:color w:val="auto"/>
-        </w:rPr>
-        <w:t xml:space="preserve">, T.; </w:t>
-      </w:r>
-      <w:proofErr w:type="spellStart"/>
-      <w:r>
-        <w:rPr>
-          <w:color w:val="auto"/>
-        </w:rPr>
-        <w:t>Baesens</w:t>
-      </w:r>
-      <w:proofErr w:type="spellEnd"/>
-      <w:r>
-        <w:rPr>
-          <w:color w:val="auto"/>
-        </w:rPr>
-        <w:t xml:space="preserve">, B.; </w:t>
-      </w:r>
-      <w:proofErr w:type="spellStart"/>
-      <w:r>
-        <w:rPr>
-          <w:color w:val="auto"/>
-        </w:rPr>
-        <w:t>Óskarsdóttir</w:t>
-      </w:r>
-      <w:proofErr w:type="spellEnd"/>
-      <w:r>
-        <w:rPr>
-          <w:color w:val="auto"/>
-        </w:rPr>
-        <w:t xml:space="preserve">, M.; </w:t>
-      </w:r>
-      <w:proofErr w:type="spellStart"/>
-      <w:r>
-        <w:rPr>
-          <w:color w:val="auto"/>
-        </w:rPr>
-        <w:t>vanden</w:t>
-      </w:r>
-      <w:proofErr w:type="spellEnd"/>
-      <w:r>
-        <w:rPr>
-          <w:color w:val="auto"/>
-        </w:rPr>
-        <w:t xml:space="preserve"> </w:t>
-      </w:r>
-      <w:proofErr w:type="spellStart"/>
-      <w:r>
-        <w:rPr>
-          <w:color w:val="auto"/>
-        </w:rPr>
-        <w:t>Broucke</w:t>
-      </w:r>
-      <w:proofErr w:type="spellEnd"/>
-      <w:r>
-        <w:rPr>
-          <w:color w:val="auto"/>
-        </w:rPr>
-        <w:t xml:space="preserve">, S. Special Issue on Feature Engineering Editorial. </w:t>
+        <w:t xml:space="preserve">Verdonck, T.; Baesens, B.; Óskarsdóttir, M.; vanden Broucke, S. Special Issue on Feature Engineering Editorial. </w:t>
       </w:r>
       <w:r>
         <w:rPr>
@@ -28895,20 +27741,7 @@
           <w:color w:val="auto"/>
         </w:rPr>
         <w:tab/>
-      </w:r>
-      <w:proofErr w:type="spellStart"/>
-      <w:r>
-        <w:rPr>
-          <w:color w:val="auto"/>
-        </w:rPr>
-        <w:t>MacQuillan</w:t>
-      </w:r>
-      <w:proofErr w:type="spellEnd"/>
-      <w:r>
-        <w:rPr>
-          <w:color w:val="auto"/>
-        </w:rPr>
-        <w:t xml:space="preserve">, E.L.; Curtis, A.B.; Baker, K.M.; Paul, R.; Back, Y.O. Using GIS Mapping to Target Public Health Interventions: Examining Birth Outcomes Across GIS Techniques. </w:t>
+        <w:t xml:space="preserve">MacQuillan, E.L.; Curtis, A.B.; Baker, K.M.; Paul, R.; Back, Y.O. Using GIS Mapping to Target Public Health Interventions: Examining Birth Outcomes Across GIS Techniques. </w:t>
       </w:r>
       <w:r>
         <w:rPr>
@@ -28971,35 +27804,7 @@
           <w:color w:val="auto"/>
         </w:rPr>
         <w:tab/>
-        <w:t xml:space="preserve">Almeida, C.M.D.; Monteiro, A.M.V.; </w:t>
-      </w:r>
-      <w:proofErr w:type="spellStart"/>
-      <w:r>
-        <w:rPr>
-          <w:color w:val="auto"/>
-        </w:rPr>
-        <w:t>Câmara</w:t>
-      </w:r>
-      <w:proofErr w:type="spellEnd"/>
-      <w:r>
-        <w:rPr>
-          <w:color w:val="auto"/>
-        </w:rPr>
-        <w:t xml:space="preserve">, G.; Soares‐Filho, B.S.; Cerqueira, G.C.; </w:t>
-      </w:r>
-      <w:proofErr w:type="spellStart"/>
-      <w:r>
-        <w:rPr>
-          <w:color w:val="auto"/>
-        </w:rPr>
-        <w:t>Pennachin</w:t>
-      </w:r>
-      <w:proofErr w:type="spellEnd"/>
-      <w:r>
-        <w:rPr>
-          <w:color w:val="auto"/>
-        </w:rPr>
-        <w:t xml:space="preserve">, C.L.; Batty, M. GIS and Remote Sensing as Tools for the Simulation of Urban Land‐use Change. </w:t>
+        <w:t xml:space="preserve">Almeida, C.M.D.; Monteiro, A.M.V.; Câmara, G.; Soares‐Filho, B.S.; Cerqueira, G.C.; Pennachin, C.L.; Batty, M. GIS and Remote Sensing as Tools for the Simulation of Urban Land‐use Change. </w:t>
       </w:r>
       <w:r>
         <w:rPr>
@@ -29062,49 +27867,7 @@
           <w:color w:val="auto"/>
         </w:rPr>
         <w:tab/>
-        <w:t xml:space="preserve">Gómez, L.; </w:t>
-      </w:r>
-      <w:proofErr w:type="spellStart"/>
-      <w:r>
-        <w:rPr>
-          <w:color w:val="auto"/>
-        </w:rPr>
-        <w:t>Haesevoets</w:t>
-      </w:r>
-      <w:proofErr w:type="spellEnd"/>
-      <w:r>
-        <w:rPr>
-          <w:color w:val="auto"/>
-        </w:rPr>
-        <w:t xml:space="preserve">, S.; </w:t>
-      </w:r>
-      <w:proofErr w:type="spellStart"/>
-      <w:r>
-        <w:rPr>
-          <w:color w:val="auto"/>
-        </w:rPr>
-        <w:t>Kuijpers</w:t>
-      </w:r>
-      <w:proofErr w:type="spellEnd"/>
-      <w:r>
-        <w:rPr>
-          <w:color w:val="auto"/>
-        </w:rPr>
-        <w:t xml:space="preserve">, B.; </w:t>
-      </w:r>
-      <w:proofErr w:type="spellStart"/>
-      <w:r>
-        <w:rPr>
-          <w:color w:val="auto"/>
-        </w:rPr>
-        <w:t>Vaisman</w:t>
-      </w:r>
-      <w:proofErr w:type="spellEnd"/>
-      <w:r>
-        <w:rPr>
-          <w:color w:val="auto"/>
-        </w:rPr>
-        <w:t xml:space="preserve">, A.A. Spatial Aggregation: Data Model and Implementation. </w:t>
+        <w:t xml:space="preserve">Gómez, L.; Haesevoets, S.; Kuijpers, B.; Vaisman, A.A. Spatial Aggregation: Data Model and Implementation. </w:t>
       </w:r>
       <w:r>
         <w:rPr>
@@ -29230,34 +27993,7 @@
           <w:color w:val="auto"/>
         </w:rPr>
         <w:tab/>
-      </w:r>
-      <w:proofErr w:type="spellStart"/>
-      <w:r>
-        <w:rPr>
-          <w:color w:val="auto"/>
-        </w:rPr>
-        <w:t>Getis</w:t>
-      </w:r>
-      <w:proofErr w:type="spellEnd"/>
-      <w:r>
-        <w:rPr>
-          <w:color w:val="auto"/>
-        </w:rPr>
-        <w:t xml:space="preserve">, A.; </w:t>
-      </w:r>
-      <w:proofErr w:type="spellStart"/>
-      <w:r>
-        <w:rPr>
-          <w:color w:val="auto"/>
-        </w:rPr>
-        <w:t>Aldstadt</w:t>
-      </w:r>
-      <w:proofErr w:type="spellEnd"/>
-      <w:r>
-        <w:rPr>
-          <w:color w:val="auto"/>
-        </w:rPr>
-        <w:t xml:space="preserve">, J. Constructing the Spatial Weights Matrix Using a Local Statistic. </w:t>
+        <w:t xml:space="preserve">Getis, A.; Aldstadt, J. Constructing the Spatial Weights Matrix Using a Local Statistic. </w:t>
       </w:r>
       <w:r>
         <w:rPr>
@@ -29299,21 +28035,7 @@
         <w:rPr>
           <w:color w:val="auto"/>
         </w:rPr>
-        <w:t>, 90–104, doi:10.1111/j.1538-</w:t>
-      </w:r>
-      <w:proofErr w:type="gramStart"/>
-      <w:r>
-        <w:rPr>
-          <w:color w:val="auto"/>
-        </w:rPr>
-        <w:t>4632.2004.tb</w:t>
-      </w:r>
-      <w:proofErr w:type="gramEnd"/>
-      <w:r>
-        <w:rPr>
-          <w:color w:val="auto"/>
-        </w:rPr>
-        <w:t>01127.x.</w:t>
+        <w:t>, 90–104, doi:10.1111/j.1538-4632.2004.tb01127.x.</w:t>
       </w:r>
     </w:p>
     <w:p>
@@ -29334,21 +28056,7 @@
           <w:color w:val="auto"/>
         </w:rPr>
         <w:tab/>
-        <w:t xml:space="preserve">Roberts, S. Applying Efficient Techniques for Finding Nearest </w:t>
-      </w:r>
-      <w:proofErr w:type="spellStart"/>
-      <w:r>
-        <w:rPr>
-          <w:color w:val="auto"/>
-        </w:rPr>
-        <w:t>Neighbours</w:t>
-      </w:r>
-      <w:proofErr w:type="spellEnd"/>
-      <w:r>
-        <w:rPr>
-          <w:color w:val="auto"/>
-        </w:rPr>
-        <w:t xml:space="preserve"> in GIS Applications. In </w:t>
+        <w:t xml:space="preserve">Roberts, S. Applying Efficient Techniques for Finding Nearest Neighbours in GIS Applications. In </w:t>
       </w:r>
       <w:r>
         <w:rPr>
@@ -29383,35 +28091,7 @@
           <w:color w:val="auto"/>
         </w:rPr>
         <w:tab/>
-        <w:t xml:space="preserve">García-García, F.; Corral, A.; Iribarne, L.; </w:t>
-      </w:r>
-      <w:proofErr w:type="spellStart"/>
-      <w:r>
-        <w:rPr>
-          <w:color w:val="auto"/>
-        </w:rPr>
-        <w:t>Vassilakopoulos</w:t>
-      </w:r>
-      <w:proofErr w:type="spellEnd"/>
-      <w:r>
-        <w:rPr>
-          <w:color w:val="auto"/>
-        </w:rPr>
-        <w:t xml:space="preserve">, M.; </w:t>
-      </w:r>
-      <w:proofErr w:type="spellStart"/>
-      <w:r>
-        <w:rPr>
-          <w:color w:val="auto"/>
-        </w:rPr>
-        <w:t>Manolopoulos</w:t>
-      </w:r>
-      <w:proofErr w:type="spellEnd"/>
-      <w:r>
-        <w:rPr>
-          <w:color w:val="auto"/>
-        </w:rPr>
-        <w:t xml:space="preserve">, Y. Efficient Distance Join Query Processing in Distributed Spatial Data Management Systems. </w:t>
+        <w:t xml:space="preserve">García-García, F.; Corral, A.; Iribarne, L.; Vassilakopoulos, M.; Manolopoulos, Y. Efficient Distance Join Query Processing in Distributed Spatial Data Management Systems. </w:t>
       </w:r>
       <w:r>
         <w:rPr>
@@ -29453,21 +28133,7 @@
         <w:rPr>
           <w:color w:val="auto"/>
         </w:rPr>
-        <w:t xml:space="preserve">, 985–1008, </w:t>
-      </w:r>
-      <w:proofErr w:type="gramStart"/>
-      <w:r>
-        <w:rPr>
-          <w:color w:val="auto"/>
-        </w:rPr>
-        <w:t>doi:10.1016/j.ins</w:t>
-      </w:r>
-      <w:proofErr w:type="gramEnd"/>
-      <w:r>
-        <w:rPr>
-          <w:color w:val="auto"/>
-        </w:rPr>
-        <w:t>.2019.10.030.</w:t>
+        <w:t>, 985–1008, doi:10.1016/j.ins.2019.10.030.</w:t>
       </w:r>
     </w:p>
     <w:p>
@@ -29488,20 +28154,7 @@
           <w:color w:val="auto"/>
         </w:rPr>
         <w:tab/>
-      </w:r>
-      <w:proofErr w:type="spellStart"/>
-      <w:r>
-        <w:rPr>
-          <w:color w:val="auto"/>
-        </w:rPr>
-        <w:t>Steyerberg</w:t>
-      </w:r>
-      <w:proofErr w:type="spellEnd"/>
-      <w:r>
-        <w:rPr>
-          <w:color w:val="auto"/>
-        </w:rPr>
-        <w:t xml:space="preserve">, E.W. Applications of Prediction Models. In </w:t>
+        <w:t xml:space="preserve">Steyerberg, E.W. Applications of Prediction Models. In </w:t>
       </w:r>
       <w:r>
         <w:rPr>
@@ -29515,21 +28168,7 @@
         <w:rPr>
           <w:color w:val="auto"/>
         </w:rPr>
-        <w:t xml:space="preserve">; </w:t>
-      </w:r>
-      <w:proofErr w:type="spellStart"/>
-      <w:r>
-        <w:rPr>
-          <w:color w:val="auto"/>
-        </w:rPr>
-        <w:t>Steyerberg</w:t>
-      </w:r>
-      <w:proofErr w:type="spellEnd"/>
-      <w:r>
-        <w:rPr>
-          <w:color w:val="auto"/>
-        </w:rPr>
-        <w:t>, E.W., Ed.; Springer: New York, NY, 2009; pp. 11–31 ISBN 978-0-387-77244-8.</w:t>
+        <w:t>; Steyerberg, E.W., Ed.; Springer: New York, NY, 2009; pp. 11–31 ISBN 978-0-387-77244-8.</w:t>
       </w:r>
     </w:p>
     <w:p>
@@ -29550,21 +28189,7 @@
           <w:color w:val="auto"/>
         </w:rPr>
         <w:tab/>
-        <w:t>Ray, S. A Quick Review of Machine Learning Algorithms. In Proceedings of the 2019 International conference on machine learning, big data, cloud and parallel computing (</w:t>
-      </w:r>
-      <w:proofErr w:type="spellStart"/>
-      <w:r>
-        <w:rPr>
-          <w:color w:val="auto"/>
-        </w:rPr>
-        <w:t>COMITCon</w:t>
-      </w:r>
-      <w:proofErr w:type="spellEnd"/>
-      <w:r>
-        <w:rPr>
-          <w:color w:val="auto"/>
-        </w:rPr>
-        <w:t>); IEEE, 2019; pp. 35–39.</w:t>
+        <w:t>Ray, S. A Quick Review of Machine Learning Algorithms. In Proceedings of the 2019 International conference on machine learning, big data, cloud and parallel computing (COMITCon); IEEE, 2019; pp. 35–39.</w:t>
       </w:r>
     </w:p>
     <w:p>
@@ -29585,21 +28210,7 @@
           <w:color w:val="auto"/>
         </w:rPr>
         <w:tab/>
-        <w:t xml:space="preserve">Muñoz, J.; </w:t>
-      </w:r>
-      <w:proofErr w:type="spellStart"/>
-      <w:r>
-        <w:rPr>
-          <w:color w:val="auto"/>
-        </w:rPr>
-        <w:t>Felicísimo</w:t>
-      </w:r>
-      <w:proofErr w:type="spellEnd"/>
-      <w:r>
-        <w:rPr>
-          <w:color w:val="auto"/>
-        </w:rPr>
-        <w:t xml:space="preserve">, Á.M. Comparison of Statistical Methods Commonly Used in Predictive Modelling. </w:t>
+        <w:t xml:space="preserve">Muñoz, J.; Felicísimo, Á.M. Comparison of Statistical Methods Commonly Used in Predictive Modelling. </w:t>
       </w:r>
       <w:r>
         <w:rPr>
@@ -29641,21 +28252,7 @@
         <w:rPr>
           <w:color w:val="auto"/>
         </w:rPr>
-        <w:t>, 285–292, doi:10.1111/j.1654-</w:t>
-      </w:r>
-      <w:proofErr w:type="gramStart"/>
-      <w:r>
-        <w:rPr>
-          <w:color w:val="auto"/>
-        </w:rPr>
-        <w:t>1103.2004.tb</w:t>
-      </w:r>
-      <w:proofErr w:type="gramEnd"/>
-      <w:r>
-        <w:rPr>
-          <w:color w:val="auto"/>
-        </w:rPr>
-        <w:t>02263.x.</w:t>
+        <w:t>, 285–292, doi:10.1111/j.1654-1103.2004.tb02263.x.</w:t>
       </w:r>
     </w:p>
     <w:p>
@@ -29718,29 +28315,7 @@
         <w:rPr>
           <w:color w:val="auto"/>
         </w:rPr>
-        <w:t xml:space="preserve">, 553–578, </w:t>
-      </w:r>
-      <w:proofErr w:type="spellStart"/>
-      <w:proofErr w:type="gramStart"/>
-      <w:r>
-        <w:rPr>
-          <w:color w:val="auto"/>
-        </w:rPr>
-        <w:t>doi:https</w:t>
-      </w:r>
-      <w:proofErr w:type="spellEnd"/>
-      <w:r>
-        <w:rPr>
-          <w:color w:val="auto"/>
-        </w:rPr>
-        <w:t>://doi.org/10.1111/0272-4332.00039</w:t>
-      </w:r>
-      <w:proofErr w:type="gramEnd"/>
-      <w:r>
-        <w:rPr>
-          <w:color w:val="auto"/>
-        </w:rPr>
-        <w:t>.</w:t>
+        <w:t>, 553–578, doi:https://doi.org/10.1111/0272-4332.00039.</w:t>
       </w:r>
     </w:p>
     <w:p>
@@ -29761,21 +28336,7 @@
           <w:color w:val="auto"/>
         </w:rPr>
         <w:tab/>
-        <w:t xml:space="preserve">Ingalls, B. Sensitivity Analysis: From Model Parameters to System </w:t>
-      </w:r>
-      <w:proofErr w:type="spellStart"/>
-      <w:r>
-        <w:rPr>
-          <w:color w:val="auto"/>
-        </w:rPr>
-        <w:t>Behaviour</w:t>
-      </w:r>
-      <w:proofErr w:type="spellEnd"/>
-      <w:r>
-        <w:rPr>
-          <w:color w:val="auto"/>
-        </w:rPr>
-        <w:t xml:space="preserve">. </w:t>
+        <w:t xml:space="preserve">Ingalls, B. Sensitivity Analysis: From Model Parameters to System Behaviour. </w:t>
       </w:r>
       <w:r>
         <w:rPr>
@@ -29847,25 +28408,7 @@
           <w:iCs/>
           <w:color w:val="auto"/>
         </w:rPr>
-        <w:t xml:space="preserve">Environ </w:t>
-      </w:r>
-      <w:proofErr w:type="spellStart"/>
-      <w:r>
-        <w:rPr>
-          <w:i/>
-          <w:iCs/>
-          <w:color w:val="auto"/>
-        </w:rPr>
-        <w:t>Monit</w:t>
-      </w:r>
-      <w:proofErr w:type="spellEnd"/>
-      <w:r>
-        <w:rPr>
-          <w:i/>
-          <w:iCs/>
-          <w:color w:val="auto"/>
-        </w:rPr>
-        <w:t xml:space="preserve"> Assess</w:t>
+        <w:t>Environ Monit Assess</w:t>
       </w:r>
       <w:r>
         <w:rPr>
@@ -29928,25 +28471,7 @@
           <w:iCs/>
           <w:color w:val="auto"/>
         </w:rPr>
-        <w:t xml:space="preserve">J. Chem. Inf. </w:t>
-      </w:r>
-      <w:proofErr w:type="spellStart"/>
-      <w:r>
-        <w:rPr>
-          <w:i/>
-          <w:iCs/>
-          <w:color w:val="auto"/>
-        </w:rPr>
-        <w:t>Comput</w:t>
-      </w:r>
-      <w:proofErr w:type="spellEnd"/>
-      <w:r>
-        <w:rPr>
-          <w:i/>
-          <w:iCs/>
-          <w:color w:val="auto"/>
-        </w:rPr>
-        <w:t>. Sci.</w:t>
+        <w:t>J. Chem. Inf. Comput. Sci.</w:t>
       </w:r>
       <w:r>
         <w:rPr>
@@ -30001,21 +28526,7 @@
           <w:color w:val="auto"/>
         </w:rPr>
         <w:tab/>
-        <w:t xml:space="preserve">Ding, J.; </w:t>
-      </w:r>
-      <w:proofErr w:type="spellStart"/>
-      <w:r>
-        <w:rPr>
-          <w:color w:val="auto"/>
-        </w:rPr>
-        <w:t>Tarokh</w:t>
-      </w:r>
-      <w:proofErr w:type="spellEnd"/>
-      <w:r>
-        <w:rPr>
-          <w:color w:val="auto"/>
-        </w:rPr>
-        <w:t xml:space="preserve">, V.; Yang, Y. Model Selection Techniques: An Overview. </w:t>
+        <w:t xml:space="preserve">Ding, J.; Tarokh, V.; Yang, Y. Model Selection Techniques: An Overview. </w:t>
       </w:r>
       <w:r>
         <w:rPr>
@@ -30078,20 +28589,7 @@
           <w:color w:val="auto"/>
         </w:rPr>
         <w:tab/>
-      </w:r>
-      <w:proofErr w:type="spellStart"/>
-      <w:r>
-        <w:rPr>
-          <w:color w:val="auto"/>
-        </w:rPr>
-        <w:t>Berrar</w:t>
-      </w:r>
-      <w:proofErr w:type="spellEnd"/>
-      <w:r>
-        <w:rPr>
-          <w:color w:val="auto"/>
-        </w:rPr>
-        <w:t xml:space="preserve">, D. Cross-Validation. In </w:t>
+        <w:t xml:space="preserve">Berrar, D. Cross-Validation. In </w:t>
       </w:r>
       <w:r>
         <w:rPr>
@@ -30105,35 +28603,7 @@
         <w:rPr>
           <w:color w:val="auto"/>
         </w:rPr>
-        <w:t xml:space="preserve">; Ranganathan, S., </w:t>
-      </w:r>
-      <w:proofErr w:type="spellStart"/>
-      <w:r>
-        <w:rPr>
-          <w:color w:val="auto"/>
-        </w:rPr>
-        <w:t>Gribskov</w:t>
-      </w:r>
-      <w:proofErr w:type="spellEnd"/>
-      <w:r>
-        <w:rPr>
-          <w:color w:val="auto"/>
-        </w:rPr>
-        <w:t xml:space="preserve">, M., Nakai, K., </w:t>
-      </w:r>
-      <w:proofErr w:type="spellStart"/>
-      <w:r>
-        <w:rPr>
-          <w:color w:val="auto"/>
-        </w:rPr>
-        <w:t>Schönbach</w:t>
-      </w:r>
-      <w:proofErr w:type="spellEnd"/>
-      <w:r>
-        <w:rPr>
-          <w:color w:val="auto"/>
-        </w:rPr>
-        <w:t>, C., Eds.; Academic Press: Oxford, 2019; pp. 542–545 ISBN 978-0-12-811432-2.</w:t>
+        <w:t>; Ranganathan, S., Gribskov, M., Nakai, K., Schönbach, C., Eds.; Academic Press: Oxford, 2019; pp. 542–545 ISBN 978-0-12-811432-2.</w:t>
       </w:r>
     </w:p>
     <w:p>
@@ -30217,21 +28687,7 @@
           <w:color w:val="auto"/>
         </w:rPr>
         <w:tab/>
-        <w:t xml:space="preserve">Nguyen, D.C.H.; Dandy, G.C.; Maier, H.R.; </w:t>
-      </w:r>
-      <w:proofErr w:type="spellStart"/>
-      <w:r>
-        <w:rPr>
-          <w:color w:val="auto"/>
-        </w:rPr>
-        <w:t>Ascough</w:t>
-      </w:r>
-      <w:proofErr w:type="spellEnd"/>
-      <w:r>
-        <w:rPr>
-          <w:color w:val="auto"/>
-        </w:rPr>
-        <w:t xml:space="preserve">, J.C. Improved Ant Colony Optimization for Optimal Crop and Irrigation Water Allocation by Incorporating Domain Knowledge. </w:t>
+        <w:t xml:space="preserve">Nguyen, D.C.H.; Dandy, G.C.; Maier, H.R.; Ascough, J.C. Improved Ant Colony Optimization for Optimal Crop and Irrigation Water Allocation by Incorporating Domain Knowledge. </w:t>
       </w:r>
       <w:r>
         <w:rPr>
@@ -30239,43 +28695,7 @@
           <w:iCs/>
           <w:color w:val="auto"/>
         </w:rPr>
-        <w:t xml:space="preserve">J. Water </w:t>
-      </w:r>
-      <w:proofErr w:type="spellStart"/>
-      <w:r>
-        <w:rPr>
-          <w:i/>
-          <w:iCs/>
-          <w:color w:val="auto"/>
-        </w:rPr>
-        <w:t>Resour</w:t>
-      </w:r>
-      <w:proofErr w:type="spellEnd"/>
-      <w:r>
-        <w:rPr>
-          <w:i/>
-          <w:iCs/>
-          <w:color w:val="auto"/>
-        </w:rPr>
-        <w:t xml:space="preserve">. </w:t>
-      </w:r>
-      <w:proofErr w:type="spellStart"/>
-      <w:r>
-        <w:rPr>
-          <w:i/>
-          <w:iCs/>
-          <w:color w:val="auto"/>
-        </w:rPr>
-        <w:t>Plann</w:t>
-      </w:r>
-      <w:proofErr w:type="spellEnd"/>
-      <w:r>
-        <w:rPr>
-          <w:i/>
-          <w:iCs/>
-          <w:color w:val="auto"/>
-        </w:rPr>
-        <w:t>. Manage.</w:t>
+        <w:t>J. Water Resour. Plann. Manage.</w:t>
       </w:r>
       <w:r>
         <w:rPr>
@@ -30372,21 +28792,7 @@
         <w:rPr>
           <w:color w:val="auto"/>
         </w:rPr>
-        <w:t xml:space="preserve">, 399–432, </w:t>
-      </w:r>
-      <w:proofErr w:type="gramStart"/>
-      <w:r>
-        <w:rPr>
-          <w:color w:val="auto"/>
-        </w:rPr>
-        <w:t>doi:10.1016/j.ress</w:t>
-      </w:r>
-      <w:proofErr w:type="gramEnd"/>
-      <w:r>
-        <w:rPr>
-          <w:color w:val="auto"/>
-        </w:rPr>
-        <w:t>.2015.05.018.</w:t>
+        <w:t>, 399–432, doi:10.1016/j.ress.2015.05.018.</w:t>
       </w:r>
     </w:p>
     <w:p>
@@ -30407,34 +28813,7 @@
           <w:color w:val="auto"/>
         </w:rPr>
         <w:tab/>
-      </w:r>
-      <w:proofErr w:type="spellStart"/>
-      <w:r>
-        <w:rPr>
-          <w:color w:val="auto"/>
-        </w:rPr>
-        <w:t>Asuero</w:t>
-      </w:r>
-      <w:proofErr w:type="spellEnd"/>
-      <w:r>
-        <w:rPr>
-          <w:color w:val="auto"/>
-        </w:rPr>
-        <w:t xml:space="preserve">, A.G.; </w:t>
-      </w:r>
-      <w:proofErr w:type="spellStart"/>
-      <w:r>
-        <w:rPr>
-          <w:color w:val="auto"/>
-        </w:rPr>
-        <w:t>Sayago</w:t>
-      </w:r>
-      <w:proofErr w:type="spellEnd"/>
-      <w:r>
-        <w:rPr>
-          <w:color w:val="auto"/>
-        </w:rPr>
-        <w:t xml:space="preserve">, A.; González, A.G. The Correlation Coefficient: An Overview. </w:t>
+        <w:t xml:space="preserve">Asuero, A.G.; Sayago, A.; González, A.G. The Correlation Coefficient: An Overview. </w:t>
       </w:r>
       <w:r>
         <w:rPr>
@@ -30560,48 +28939,7 @@
           <w:color w:val="auto"/>
         </w:rPr>
         <w:tab/>
-      </w:r>
-      <w:proofErr w:type="spellStart"/>
-      <w:r>
-        <w:rPr>
-          <w:color w:val="auto"/>
-        </w:rPr>
-        <w:t>Amberber</w:t>
-      </w:r>
-      <w:proofErr w:type="spellEnd"/>
-      <w:r>
-        <w:rPr>
-          <w:color w:val="auto"/>
-        </w:rPr>
-        <w:t xml:space="preserve">, N.; Howard, A.; Winters, M.; Harris, M.A.; Pike, I.; </w:t>
-      </w:r>
-      <w:proofErr w:type="spellStart"/>
-      <w:r>
-        <w:rPr>
-          <w:color w:val="auto"/>
-        </w:rPr>
-        <w:t>Machperson</w:t>
-      </w:r>
-      <w:proofErr w:type="spellEnd"/>
-      <w:r>
-        <w:rPr>
-          <w:color w:val="auto"/>
-        </w:rPr>
-        <w:t xml:space="preserve">, A.; Cloutier, M.-S.; Richmond, S.A.; Hagel, B.; </w:t>
-      </w:r>
-      <w:proofErr w:type="spellStart"/>
-      <w:r>
-        <w:rPr>
-          <w:color w:val="auto"/>
-        </w:rPr>
-        <w:t>Fuselli</w:t>
-      </w:r>
-      <w:proofErr w:type="spellEnd"/>
-      <w:r>
-        <w:rPr>
-          <w:color w:val="auto"/>
-        </w:rPr>
-        <w:t xml:space="preserve">, P.; et al. Road Traffic Injury During the COVID-19 Pandemic: Cured or a Continued Threat? </w:t>
+        <w:t xml:space="preserve">Amberber, N.; Howard, A.; Winters, M.; Harris, M.A.; Pike, I.; Machperson, A.; Cloutier, M.-S.; Richmond, S.A.; Hagel, B.; Fuselli, P.; et al. Road Traffic Injury During the COVID-19 Pandemic: Cured or a Continued Threat? </w:t>
       </w:r>
       <w:r>
         <w:rPr>
@@ -30643,21 +28981,7 @@
         <w:rPr>
           <w:color w:val="auto"/>
         </w:rPr>
-        <w:t>, doi:10.33137/</w:t>
-      </w:r>
-      <w:proofErr w:type="gramStart"/>
-      <w:r>
-        <w:rPr>
-          <w:color w:val="auto"/>
-        </w:rPr>
-        <w:t>utjph.v</w:t>
-      </w:r>
-      <w:proofErr w:type="gramEnd"/>
-      <w:r>
-        <w:rPr>
-          <w:color w:val="auto"/>
-        </w:rPr>
-        <w:t>2i1.34737.</w:t>
+        <w:t>, doi:10.33137/utjph.v2i1.34737.</w:t>
       </w:r>
     </w:p>
     <w:p>
@@ -30741,35 +29065,7 @@
           <w:color w:val="auto"/>
         </w:rPr>
         <w:tab/>
-        <w:t xml:space="preserve">City of Toronto </w:t>
-      </w:r>
-      <w:proofErr w:type="spellStart"/>
-      <w:r>
-        <w:rPr>
-          <w:color w:val="auto"/>
-        </w:rPr>
-        <w:t>Toronto</w:t>
-      </w:r>
-      <w:proofErr w:type="spellEnd"/>
-      <w:r>
-        <w:rPr>
-          <w:color w:val="auto"/>
-        </w:rPr>
-        <w:t xml:space="preserve"> </w:t>
-      </w:r>
-      <w:proofErr w:type="spellStart"/>
-      <w:r>
-        <w:rPr>
-          <w:color w:val="auto"/>
-        </w:rPr>
-        <w:t>Centreline</w:t>
-      </w:r>
-      <w:proofErr w:type="spellEnd"/>
-      <w:r>
-        <w:rPr>
-          <w:color w:val="auto"/>
-        </w:rPr>
-        <w:t xml:space="preserve"> (TCL) Available online: https://open.toronto.ca/dataset/ (accessed on 30 December 2024).</w:t>
+        <w:t>City of Toronto Toronto Centreline (TCL) Available online: https://open.toronto.ca/dataset/ (accessed on 30 December 2024).</w:t>
       </w:r>
     </w:p>
     <w:p>
@@ -31106,21 +29402,7 @@
           <w:color w:val="auto"/>
         </w:rPr>
         <w:tab/>
-        <w:t xml:space="preserve">City of Toronto Licensed Child Care </w:t>
-      </w:r>
-      <w:proofErr w:type="spellStart"/>
-      <w:r>
-        <w:rPr>
-          <w:color w:val="auto"/>
-        </w:rPr>
-        <w:t>Centres</w:t>
-      </w:r>
-      <w:proofErr w:type="spellEnd"/>
-      <w:r>
-        <w:rPr>
-          <w:color w:val="auto"/>
-        </w:rPr>
-        <w:t xml:space="preserve"> Available online: https://open.toronto.ca/dataset/ (accessed on 30 December 2024).</w:t>
+        <w:t>City of Toronto Licensed Child Care Centres Available online: https://open.toronto.ca/dataset/ (accessed on 30 December 2024).</w:t>
       </w:r>
     </w:p>
     <w:p>
@@ -31274,21 +29556,7 @@
         <w:rPr>
           <w:color w:val="auto"/>
         </w:rPr>
-        <w:t xml:space="preserve">; Pereira, F., Burges, C.J.C., </w:t>
-      </w:r>
-      <w:proofErr w:type="spellStart"/>
-      <w:r>
-        <w:rPr>
-          <w:color w:val="auto"/>
-        </w:rPr>
-        <w:t>Bottou</w:t>
-      </w:r>
-      <w:proofErr w:type="spellEnd"/>
-      <w:r>
-        <w:rPr>
-          <w:color w:val="auto"/>
-        </w:rPr>
-        <w:t>, L., Weinberger, K.Q., Eds.; Curran Associates, Inc., 2012; pp. 2951–2959.</w:t>
+        <w:t>; Pereira, F., Burges, C.J.C., Bottou, L., Weinberger, K.Q., Eds.; Curran Associates, Inc., 2012; pp. 2951–2959.</w:t>
       </w:r>
     </w:p>
     <w:p>
@@ -31309,34 +29577,7 @@
           <w:color w:val="auto"/>
         </w:rPr>
         <w:tab/>
-      </w:r>
-      <w:proofErr w:type="spellStart"/>
-      <w:r>
-        <w:rPr>
-          <w:color w:val="auto"/>
-        </w:rPr>
-        <w:t>Vilalta</w:t>
-      </w:r>
-      <w:proofErr w:type="spellEnd"/>
-      <w:r>
-        <w:rPr>
-          <w:color w:val="auto"/>
-        </w:rPr>
-        <w:t xml:space="preserve">, R.; </w:t>
-      </w:r>
-      <w:proofErr w:type="spellStart"/>
-      <w:r>
-        <w:rPr>
-          <w:color w:val="auto"/>
-        </w:rPr>
-        <w:t>Drissi</w:t>
-      </w:r>
-      <w:proofErr w:type="spellEnd"/>
-      <w:r>
-        <w:rPr>
-          <w:color w:val="auto"/>
-        </w:rPr>
-        <w:t xml:space="preserve">, Y. A Perspective View and Survey of Meta-Learning. </w:t>
+        <w:t xml:space="preserve">Vilalta, R.; Drissi, Y. A Perspective View and Survey of Meta-Learning. </w:t>
       </w:r>
       <w:r>
         <w:rPr>
@@ -31399,49 +29640,7 @@
           <w:color w:val="auto"/>
         </w:rPr>
         <w:tab/>
-        <w:t>Caruana, R.; Niculescu-</w:t>
-      </w:r>
-      <w:proofErr w:type="spellStart"/>
-      <w:r>
-        <w:rPr>
-          <w:color w:val="auto"/>
-        </w:rPr>
-        <w:t>Mizil</w:t>
-      </w:r>
-      <w:proofErr w:type="spellEnd"/>
-      <w:r>
-        <w:rPr>
-          <w:color w:val="auto"/>
-        </w:rPr>
-        <w:t xml:space="preserve">, A.; Crew, G.; </w:t>
-      </w:r>
-      <w:proofErr w:type="spellStart"/>
-      <w:r>
-        <w:rPr>
-          <w:color w:val="auto"/>
-        </w:rPr>
-        <w:t>Ksikes</w:t>
-      </w:r>
-      <w:proofErr w:type="spellEnd"/>
-      <w:r>
-        <w:rPr>
-          <w:color w:val="auto"/>
-        </w:rPr>
-        <w:t>, A. Ensemble Selection from Libraries of Models. In Proceedings of the Proceedings of the twenty-first international conference on Machine learning; Association for Computing Machinery: New York, NY, USA, July 4</w:t>
-      </w:r>
-      <w:proofErr w:type="gramStart"/>
-      <w:r>
-        <w:rPr>
-          <w:color w:val="auto"/>
-        </w:rPr>
-        <w:t xml:space="preserve"> 2004</w:t>
-      </w:r>
-      <w:proofErr w:type="gramEnd"/>
-      <w:r>
-        <w:rPr>
-          <w:color w:val="auto"/>
-        </w:rPr>
-        <w:t>; p. 18.</w:t>
+        <w:t>Caruana, R.; Niculescu-Mizil, A.; Crew, G.; Ksikes, A. Ensemble Selection from Libraries of Models. In Proceedings of the Proceedings of the twenty-first international conference on Machine learning; Association for Computing Machinery: New York, NY, USA, July 4 2004; p. 18.</w:t>
       </w:r>
     </w:p>
     <w:p>
@@ -31463,48 +29662,7 @@
           <w:color w:val="auto"/>
         </w:rPr>
         <w:tab/>
-      </w:r>
-      <w:proofErr w:type="spellStart"/>
-      <w:r>
-        <w:rPr>
-          <w:color w:val="auto"/>
-        </w:rPr>
-        <w:t>Feurer</w:t>
-      </w:r>
-      <w:proofErr w:type="spellEnd"/>
-      <w:r>
-        <w:rPr>
-          <w:color w:val="auto"/>
-        </w:rPr>
-        <w:t xml:space="preserve">, M.; Klein, A.; </w:t>
-      </w:r>
-      <w:proofErr w:type="spellStart"/>
-      <w:r>
-        <w:rPr>
-          <w:color w:val="auto"/>
-        </w:rPr>
-        <w:t>Eggensperger</w:t>
-      </w:r>
-      <w:proofErr w:type="spellEnd"/>
-      <w:r>
-        <w:rPr>
-          <w:color w:val="auto"/>
-        </w:rPr>
-        <w:t xml:space="preserve">, K.; </w:t>
-      </w:r>
-      <w:proofErr w:type="spellStart"/>
-      <w:r>
-        <w:rPr>
-          <w:color w:val="auto"/>
-        </w:rPr>
-        <w:t>Springenberg</w:t>
-      </w:r>
-      <w:proofErr w:type="spellEnd"/>
-      <w:r>
-        <w:rPr>
-          <w:color w:val="auto"/>
-        </w:rPr>
-        <w:t xml:space="preserve">, J.; Blum, M.; Hutter, F. Efficient and Robust Automated Machine Learning. </w:t>
+        <w:t xml:space="preserve">Feurer, M.; Klein, A.; Eggensperger, K.; Springenberg, J.; Blum, M.; Hutter, F. Efficient and Robust Automated Machine Learning. </w:t>
       </w:r>
       <w:r>
         <w:rPr>
@@ -31567,62 +29725,7 @@
           <w:color w:val="auto"/>
         </w:rPr>
         <w:tab/>
-      </w:r>
-      <w:proofErr w:type="spellStart"/>
-      <w:r>
-        <w:rPr>
-          <w:color w:val="auto"/>
-        </w:rPr>
-        <w:t>Feurer</w:t>
-      </w:r>
-      <w:proofErr w:type="spellEnd"/>
-      <w:r>
-        <w:rPr>
-          <w:color w:val="auto"/>
-        </w:rPr>
-        <w:t xml:space="preserve">, M.; Klein, A.; </w:t>
-      </w:r>
-      <w:proofErr w:type="spellStart"/>
-      <w:r>
-        <w:rPr>
-          <w:color w:val="auto"/>
-        </w:rPr>
-        <w:t>Eggensperger</w:t>
-      </w:r>
-      <w:proofErr w:type="spellEnd"/>
-      <w:r>
-        <w:rPr>
-          <w:color w:val="auto"/>
-        </w:rPr>
-        <w:t xml:space="preserve">, K.; </w:t>
-      </w:r>
-      <w:proofErr w:type="spellStart"/>
-      <w:r>
-        <w:rPr>
-          <w:color w:val="auto"/>
-        </w:rPr>
-        <w:t>Springenberg</w:t>
-      </w:r>
-      <w:proofErr w:type="spellEnd"/>
-      <w:r>
-        <w:rPr>
-          <w:color w:val="auto"/>
-        </w:rPr>
-        <w:t>, J.T.; Blum, M.; Hutter, F. Auto-</w:t>
-      </w:r>
-      <w:proofErr w:type="spellStart"/>
-      <w:r>
-        <w:rPr>
-          <w:color w:val="auto"/>
-        </w:rPr>
-        <w:t>Sklearn</w:t>
-      </w:r>
-      <w:proofErr w:type="spellEnd"/>
-      <w:r>
-        <w:rPr>
-          <w:color w:val="auto"/>
-        </w:rPr>
-        <w:t xml:space="preserve">: Efficient and Robust Automated Machine Learning. In </w:t>
+        <w:t xml:space="preserve">Feurer, M.; Klein, A.; Eggensperger, K.; Springenberg, J.T.; Blum, M.; Hutter, F. Auto-Sklearn: Efficient and Robust Automated Machine Learning. In </w:t>
       </w:r>
       <w:r>
         <w:rPr>
@@ -31636,35 +29739,7 @@
         <w:rPr>
           <w:color w:val="auto"/>
         </w:rPr>
-        <w:t xml:space="preserve">; Hutter, F., </w:t>
-      </w:r>
-      <w:proofErr w:type="spellStart"/>
-      <w:r>
-        <w:rPr>
-          <w:color w:val="auto"/>
-        </w:rPr>
-        <w:t>Kotthoff</w:t>
-      </w:r>
-      <w:proofErr w:type="spellEnd"/>
-      <w:r>
-        <w:rPr>
-          <w:color w:val="auto"/>
-        </w:rPr>
-        <w:t xml:space="preserve">, L., </w:t>
-      </w:r>
-      <w:proofErr w:type="spellStart"/>
-      <w:r>
-        <w:rPr>
-          <w:color w:val="auto"/>
-        </w:rPr>
-        <w:t>Vanschoren</w:t>
-      </w:r>
-      <w:proofErr w:type="spellEnd"/>
-      <w:r>
-        <w:rPr>
-          <w:color w:val="auto"/>
-        </w:rPr>
-        <w:t>, J., Eds.; The Springer Series on Challenges in Machine Learning; Springer International Publishing: Cham, 2019; pp. 113–134 ISBN 978-3-030-05317-8.</w:t>
+        <w:t>; Hutter, F., Kotthoff, L., Vanschoren, J., Eds.; The Springer Series on Challenges in Machine Learning; Springer International Publishing: Cham, 2019; pp. 113–134 ISBN 978-3-030-05317-8.</w:t>
       </w:r>
     </w:p>
     <w:p>
@@ -31720,21 +29795,7 @@
           <w:color w:val="auto"/>
         </w:rPr>
         <w:tab/>
-        <w:t>Olson, R.S.; Moore, J.H. TPOT: A Tree-Based Pipeline Optimization Tool for Automating Machine Learning. In Proceedings of the Workshop on Automatic Machine Learning; PMLR, December 4</w:t>
-      </w:r>
-      <w:proofErr w:type="gramStart"/>
-      <w:r>
-        <w:rPr>
-          <w:color w:val="auto"/>
-        </w:rPr>
-        <w:t xml:space="preserve"> 2016</w:t>
-      </w:r>
-      <w:proofErr w:type="gramEnd"/>
-      <w:r>
-        <w:rPr>
-          <w:color w:val="auto"/>
-        </w:rPr>
-        <w:t>; pp. 66–74.</w:t>
+        <w:t>Olson, R.S.; Moore, J.H. TPOT: A Tree-Based Pipeline Optimization Tool for Automating Machine Learning. In Proceedings of the Workshop on Automatic Machine Learning; PMLR, December 4 2016; pp. 66–74.</w:t>
       </w:r>
     </w:p>
     <w:p>
@@ -31997,7 +30058,6 @@
       </w:rPr>
       <w:t>www.mdpi.com/journal/</w:t>
     </w:r>
-    <w:proofErr w:type="spellStart"/>
     <w:r>
       <w:rPr>
         <w:sz w:val="16"/>
@@ -32005,7 +30065,6 @@
       </w:rPr>
       <w:t>ijgi</w:t>
     </w:r>
-    <w:proofErr w:type="spellEnd"/>
   </w:p>
 </w:ftr>
 </file>

</xml_diff>

<commit_message>
Add city clipping for outcome models
</commit_message>
<xml_diff>
--- a/manuscript/wen-li-2024-geointerv.docx
+++ b/manuscript/wen-li-2024-geointerv.docx
@@ -5960,7 +5960,19 @@
         <w:rPr>
           <w:lang w:val="en"/>
         </w:rPr>
-        <w:t xml:space="preserve"> between the actual outcome value </w:t>
+        <w:t xml:space="preserve"> between the </w:t>
+      </w:r>
+      <w:r>
+        <w:rPr>
+          <w:lang w:val="en"/>
+        </w:rPr>
+        <w:t xml:space="preserve">absolute value of the </w:t>
+      </w:r>
+      <w:r>
+        <w:rPr>
+          <w:lang w:val="en"/>
+        </w:rPr>
+        <w:t xml:space="preserve">actual outcome value </w:t>
       </w:r>
       <m:oMath>
         <m:r>
@@ -6094,6 +6106,13 @@
                     <w:lang w:val="en"/>
                   </w:rPr>
                   <m:t xml:space="preserve"> =</m:t>
+                </m:r>
+                <m:r>
+                  <w:rPr>
+                    <w:rFonts w:ascii="Cambria Math" w:hAnsi="Cambria Math"/>
+                    <w:lang w:val="en"/>
+                  </w:rPr>
+                  <m:t>|</m:t>
                 </m:r>
                 <m:sSub>
                   <m:sSubPr>
@@ -6173,6 +6192,13 @@
                     </m:r>
                   </m:sub>
                 </m:sSub>
+                <m:r>
+                  <w:rPr>
+                    <w:rFonts w:ascii="Cambria Math" w:hAnsi="Cambria Math"/>
+                    <w:lang w:val="en"/>
+                  </w:rPr>
+                  <m:t>|</m:t>
+                </m:r>
                 <m:r>
                   <m:rPr>
                     <m:sty m:val="p"/>
@@ -20105,15 +20131,15 @@
         <w:tblLook w:val="04A0" w:firstRow="1" w:lastRow="0" w:firstColumn="1" w:lastColumn="0" w:noHBand="0" w:noVBand="1"/>
       </w:tblPr>
       <w:tblGrid>
-        <w:gridCol w:w="124"/>
-        <w:gridCol w:w="435"/>
-        <w:gridCol w:w="241"/>
-        <w:gridCol w:w="560"/>
-        <w:gridCol w:w="730"/>
-        <w:gridCol w:w="920"/>
-        <w:gridCol w:w="1166"/>
-        <w:gridCol w:w="948"/>
-        <w:gridCol w:w="2736"/>
+        <w:gridCol w:w="130"/>
+        <w:gridCol w:w="453"/>
+        <w:gridCol w:w="251"/>
+        <w:gridCol w:w="259"/>
+        <w:gridCol w:w="760"/>
+        <w:gridCol w:w="958"/>
+        <w:gridCol w:w="1214"/>
+        <w:gridCol w:w="987"/>
+        <w:gridCol w:w="2848"/>
       </w:tblGrid>
       <w:tr>
         <w:tc>
@@ -20549,7 +20575,7 @@
               <w:rPr>
                 <w:lang w:val="en"/>
               </w:rPr>
-              <w:t>0</w:t>
+              <w:t>4</w:t>
             </w:r>
           </w:p>
         </w:tc>
@@ -20759,7 +20785,7 @@
               <w:rPr>
                 <w:lang w:val="en"/>
               </w:rPr>
-              <w:t>9.24</w:t>
+              <w:t>0</w:t>
             </w:r>
           </w:p>
         </w:tc>
@@ -20986,7 +21012,7 @@
               <w:rPr>
                 <w:lang w:val="en"/>
               </w:rPr>
-              <w:t>33.14</w:t>
+              <w:t>16</w:t>
             </w:r>
           </w:p>
         </w:tc>
@@ -21058,7 +21084,7 @@
               <w:rPr>
                 <w:lang w:val="en"/>
               </w:rPr>
-              <w:t>2.82</w:t>
+              <w:t>11.09</w:t>
             </w:r>
           </w:p>
         </w:tc>
@@ -21754,16 +21780,16 @@
         <w:tblLook w:val="04A0" w:firstRow="1" w:lastRow="0" w:firstColumn="1" w:lastColumn="0" w:noHBand="0" w:noVBand="1"/>
       </w:tblPr>
       <w:tblGrid>
-        <w:gridCol w:w="113"/>
-        <w:gridCol w:w="398"/>
-        <w:gridCol w:w="221"/>
-        <w:gridCol w:w="668"/>
+        <w:gridCol w:w="111"/>
+        <w:gridCol w:w="387"/>
+        <w:gridCol w:w="214"/>
+        <w:gridCol w:w="649"/>
+        <w:gridCol w:w="818"/>
+        <w:gridCol w:w="1037"/>
         <w:gridCol w:w="842"/>
-        <w:gridCol w:w="1067"/>
-        <w:gridCol w:w="867"/>
-        <w:gridCol w:w="645"/>
-        <w:gridCol w:w="2038"/>
-        <w:gridCol w:w="1011"/>
+        <w:gridCol w:w="627"/>
+        <w:gridCol w:w="1981"/>
+        <w:gridCol w:w="1204"/>
       </w:tblGrid>
       <w:tr>
         <w:tc>
@@ -22278,6 +22304,13 @@
                 <w:b/>
                 <w:snapToGrid/>
               </w:rPr>
+              <w:t>|</w:t>
+            </w:r>
+            <w:r>
+              <w:rPr>
+                <w:b/>
+                <w:snapToGrid/>
+              </w:rPr>
               <w:t>Y</w:t>
             </w:r>
             <w:r>
@@ -22348,6 +22381,13 @@
                 </m:sub>
               </m:sSub>
             </m:oMath>
+            <w:r>
+              <w:rPr>
+                <w:b/>
+                <w:snapToGrid/>
+              </w:rPr>
+              <w:t>|</w:t>
+            </w:r>
           </w:p>
         </w:tc>
       </w:tr>
@@ -22517,10 +22557,7 @@
               <w:spacing w:line="240" w:lineRule="auto"/>
             </w:pPr>
             <w:r>
-              <w:rPr>
-                <w:lang w:val="en"/>
-              </w:rPr>
-              <w:t>0</w:t>
+              <w:t>4</w:t>
             </w:r>
           </w:p>
         </w:tc>
@@ -22537,7 +22574,7 @@
               <w:spacing w:line="240" w:lineRule="auto"/>
             </w:pPr>
             <w:r>
-              <w:t>0</w:t>
+              <w:t>4.59</w:t>
             </w:r>
           </w:p>
         </w:tc>
@@ -22555,6 +22592,9 @@
             </w:pPr>
             <w:r>
               <w:t>0</w:t>
+            </w:r>
+            <w:r>
+              <w:t>.59</w:t>
             </w:r>
           </w:p>
         </w:tc>
@@ -22733,10 +22773,7 @@
               <w:spacing w:line="240" w:lineRule="auto"/>
             </w:pPr>
             <w:r>
-              <w:rPr>
-                <w:lang w:val="en"/>
-              </w:rPr>
-              <w:t>9.24</w:t>
+              <w:t>0</w:t>
             </w:r>
           </w:p>
         </w:tc>
@@ -22754,7 +22791,7 @@
               <w:spacing w:line="240" w:lineRule="auto"/>
             </w:pPr>
             <w:r>
-              <w:t>9</w:t>
+              <w:t>0</w:t>
             </w:r>
           </w:p>
         </w:tc>
@@ -22772,10 +22809,7 @@
               <w:spacing w:line="240" w:lineRule="auto"/>
             </w:pPr>
             <w:r>
-              <w:t>0.</w:t>
-            </w:r>
-            <w:r>
-              <w:t>24</w:t>
+              <w:t>0</w:t>
             </w:r>
           </w:p>
         </w:tc>
@@ -22912,10 +22946,7 @@
               <w:spacing w:line="240" w:lineRule="auto"/>
             </w:pPr>
             <w:r>
-              <w:rPr>
-                <w:lang w:val="en"/>
-              </w:rPr>
-              <w:t>2.82</w:t>
+              <w:t>11.09</w:t>
             </w:r>
           </w:p>
         </w:tc>
@@ -22954,10 +22985,7 @@
               <w:spacing w:line="240" w:lineRule="auto"/>
             </w:pPr>
             <w:r>
-              <w:rPr>
-                <w:lang w:val="en"/>
-              </w:rPr>
-              <w:t>33.14</w:t>
+              <w:t>16</w:t>
             </w:r>
           </w:p>
         </w:tc>
@@ -22975,7 +23003,7 @@
               <w:spacing w:line="240" w:lineRule="auto"/>
             </w:pPr>
             <w:r>
-              <w:t>32</w:t>
+              <w:t>16.62</w:t>
             </w:r>
           </w:p>
         </w:tc>
@@ -22993,7 +23021,7 @@
               <w:spacing w:line="240" w:lineRule="auto"/>
             </w:pPr>
             <w:r>
-              <w:t>1.14</w:t>
+              <w:t>0.62</w:t>
             </w:r>
           </w:p>
         </w:tc>

</xml_diff>

<commit_message>
Fixed tpot cv params, auto select best model and vars
</commit_message>
<xml_diff>
--- a/manuscript/wen-li-2024-geointerv.docx
+++ b/manuscript/wen-li-2024-geointerv.docx
@@ -1,6 +1,6 @@
 
 <file path=word/document.xml><?xml version="1.0" encoding="utf-8"?>
-<w:document xmlns:wpc="http://schemas.microsoft.com/office/word/2010/wordprocessingCanvas" xmlns:cx="http://schemas.microsoft.com/office/drawing/2014/chartex" xmlns:cx1="http://schemas.microsoft.com/office/drawing/2015/9/8/chartex" xmlns:cx2="http://schemas.microsoft.com/office/drawing/2015/10/21/chartex" xmlns:cx3="http://schemas.microsoft.com/office/drawing/2016/5/9/chartex" xmlns:cx4="http://schemas.microsoft.com/office/drawing/2016/5/10/chartex" xmlns:cx5="http://schemas.microsoft.com/office/drawing/2016/5/11/chartex" xmlns:cx6="http://schemas.microsoft.com/office/drawing/2016/5/12/chartex" xmlns:cx7="http://schemas.microsoft.com/office/drawing/2016/5/13/chartex" xmlns:cx8="http://schemas.microsoft.com/office/drawing/2016/5/14/chartex" xmlns:mc="http://schemas.openxmlformats.org/markup-compatibility/2006" xmlns:aink="http://schemas.microsoft.com/office/drawing/2016/ink" xmlns:am3d="http://schemas.microsoft.com/office/drawing/2017/model3d" xmlns:o="urn:schemas-microsoft-com:office:office" xmlns:oel="http://schemas.microsoft.com/office/2019/extlst" xmlns:r="http://schemas.openxmlformats.org/officeDocument/2006/relationships" xmlns:m="http://schemas.openxmlformats.org/officeDocument/2006/math" xmlns:v="urn:schemas-microsoft-com:vml" xmlns:wp14="http://schemas.microsoft.com/office/word/2010/wordprocessingDrawing" xmlns:wp="http://schemas.openxmlformats.org/drawingml/2006/wordprocessingDrawing" xmlns:w10="urn:schemas-microsoft-com:office:word" xmlns:w="http://schemas.openxmlformats.org/wordprocessingml/2006/main" xmlns:w14="http://schemas.microsoft.com/office/word/2010/wordml" xmlns:w15="http://schemas.microsoft.com/office/word/2012/wordml" xmlns:w16cex="http://schemas.microsoft.com/office/word/2018/wordml/cex" xmlns:w16cid="http://schemas.microsoft.com/office/word/2016/wordml/cid" xmlns:w16="http://schemas.microsoft.com/office/word/2018/wordml" xmlns:w16du="http://schemas.microsoft.com/office/word/2023/wordml/word16du" xmlns:w16sdtdh="http://schemas.microsoft.com/office/word/2020/wordml/sdtdatahash" xmlns:w16se="http://schemas.microsoft.com/office/word/2015/wordml/symex" xmlns:wpg="http://schemas.microsoft.com/office/word/2010/wordprocessingGroup" xmlns:wpi="http://schemas.microsoft.com/office/word/2010/wordprocessingInk" xmlns:wne="http://schemas.microsoft.com/office/word/2006/wordml" xmlns:wps="http://schemas.microsoft.com/office/word/2010/wordprocessingShape" mc:Ignorable="w14 w15 w16se w16cid w16 w16cex w16sdtdh w16du wp14">
+<w:document xmlns:wpc="http://schemas.microsoft.com/office/word/2010/wordprocessingCanvas" xmlns:cx="http://schemas.microsoft.com/office/drawing/2014/chartex" xmlns:cx1="http://schemas.microsoft.com/office/drawing/2015/9/8/chartex" xmlns:cx2="http://schemas.microsoft.com/office/drawing/2015/10/21/chartex" xmlns:cx3="http://schemas.microsoft.com/office/drawing/2016/5/9/chartex" xmlns:cx4="http://schemas.microsoft.com/office/drawing/2016/5/10/chartex" xmlns:cx5="http://schemas.microsoft.com/office/drawing/2016/5/11/chartex" xmlns:cx6="http://schemas.microsoft.com/office/drawing/2016/5/12/chartex" xmlns:cx7="http://schemas.microsoft.com/office/drawing/2016/5/13/chartex" xmlns:cx8="http://schemas.microsoft.com/office/drawing/2016/5/14/chartex" xmlns:mc="http://schemas.openxmlformats.org/markup-compatibility/2006" xmlns:aink="http://schemas.microsoft.com/office/drawing/2016/ink" xmlns:am3d="http://schemas.microsoft.com/office/drawing/2017/model3d" xmlns:o="urn:schemas-microsoft-com:office:office" xmlns:oel="http://schemas.microsoft.com/office/2019/extlst" xmlns:r="http://schemas.openxmlformats.org/officeDocument/2006/relationships" xmlns:m="http://schemas.openxmlformats.org/officeDocument/2006/math" xmlns:v="urn:schemas-microsoft-com:vml" xmlns:wp14="http://schemas.microsoft.com/office/word/2010/wordprocessingDrawing" xmlns:wp="http://schemas.openxmlformats.org/drawingml/2006/wordprocessingDrawing" xmlns:w10="urn:schemas-microsoft-com:office:word" xmlns:w="http://schemas.openxmlformats.org/wordprocessingml/2006/main" xmlns:w14="http://schemas.microsoft.com/office/word/2010/wordml" xmlns:w15="http://schemas.microsoft.com/office/word/2012/wordml" xmlns:w16cex="http://schemas.microsoft.com/office/word/2018/wordml/cex" xmlns:w16cid="http://schemas.microsoft.com/office/word/2016/wordml/cid" xmlns:w16="http://schemas.microsoft.com/office/word/2018/wordml" xmlns:w16du="http://schemas.microsoft.com/office/word/2023/wordml/word16du" xmlns:w16sdtdh="http://schemas.microsoft.com/office/word/2020/wordml/sdtdatahash" xmlns:w16sdtfl="http://schemas.microsoft.com/office/word/2024/wordml/sdtformatlock" xmlns:w16se="http://schemas.microsoft.com/office/word/2015/wordml/symex" xmlns:wpg="http://schemas.microsoft.com/office/word/2010/wordprocessingGroup" xmlns:wpi="http://schemas.microsoft.com/office/word/2010/wordprocessingInk" xmlns:wne="http://schemas.microsoft.com/office/word/2006/wordml" xmlns:wps="http://schemas.microsoft.com/office/word/2010/wordprocessingShape" mc:Ignorable="w14 w15 w16se w16cid w16 w16cex w16sdtdh w16sdtfl w16du wp14">
   <w:body>
     <w:p>
       <w:pPr>
@@ -427,12 +427,18 @@
         <w:rPr>
           <w:szCs w:val="18"/>
         </w:rPr>
-        <w:t>spatial, GIS, framework, intervention, model</w:t>
+        <w:t>geo, s</w:t>
       </w:r>
       <w:r>
         <w:rPr>
           <w:szCs w:val="18"/>
         </w:rPr>
+        <w:t>patial, GIS, framework, intervention, model</w:t>
+      </w:r>
+      <w:r>
+        <w:rPr>
+          <w:szCs w:val="18"/>
+        </w:rPr>
         <w:t>ling</w:t>
       </w:r>
       <w:r>
@@ -445,13 +451,7 @@
         <w:rPr>
           <w:szCs w:val="18"/>
         </w:rPr>
-        <w:t xml:space="preserve">, </w:t>
-      </w:r>
-      <w:r>
-        <w:rPr>
-          <w:szCs w:val="18"/>
-        </w:rPr>
-        <w:t>machine learning</w:t>
+        <w:t>, machine learning</w:t>
       </w:r>
     </w:p>
     <w:p>
@@ -1342,19 +1342,7 @@
         <w:rPr>
           <w:lang w:val="en"/>
         </w:rPr>
-        <w:t>identif</w:t>
-      </w:r>
-      <w:r>
-        <w:rPr>
-          <w:lang w:val="en"/>
-        </w:rPr>
-        <w:t>y</w:t>
-      </w:r>
-      <w:r>
-        <w:rPr>
-          <w:lang w:val="en"/>
-        </w:rPr>
-        <w:t xml:space="preserve"> </w:t>
+        <w:t xml:space="preserve">identify </w:t>
       </w:r>
       <w:r>
         <w:rPr>
@@ -1368,13 +1356,7 @@
         <w:rPr>
           <w:lang w:val="en"/>
         </w:rPr>
-        <w:t xml:space="preserve"> these geo-interventions</w:t>
-      </w:r>
-      <w:r>
-        <w:rPr>
-          <w:lang w:val="en"/>
-        </w:rPr>
-        <w:t xml:space="preserve"> are with</w:t>
+        <w:t xml:space="preserve"> these geo-interventions are with</w:t>
       </w:r>
       <w:r>
         <w:rPr>
@@ -1473,19 +1455,7 @@
         <w:rPr>
           <w:lang w:val="en"/>
         </w:rPr>
-        <w:t xml:space="preserve"> to decrease road traffic collisions at these hotspots </w:t>
-      </w:r>
-      <w:r>
-        <w:rPr>
-          <w:lang w:val="en"/>
-        </w:rPr>
-        <w:t>(e.g., deploying traffic enforcement devices, reducing road widths)</w:t>
-      </w:r>
-      <w:r>
-        <w:rPr>
-          <w:lang w:val="en"/>
-        </w:rPr>
-        <w:t xml:space="preserve"> </w:t>
+        <w:t xml:space="preserve"> to decrease road traffic collisions at these hotspots (e.g., deploying traffic enforcement devices, reducing road widths) </w:t>
       </w:r>
       <w:r>
         <w:rPr>
@@ -1942,10 +1912,7 @@
         <w:t xml:space="preserve"> </w:t>
       </w:r>
       <w:r>
-        <w:t>Figure 1</w:t>
-      </w:r>
-      <w:r>
-        <w:t xml:space="preserve"> visualizes </w:t>
+        <w:t xml:space="preserve">Figure 1 visualizes </w:t>
       </w:r>
       <w:r>
         <w:t xml:space="preserve">the </w:t>
@@ -1978,12 +1945,16 @@
     <w:p>
       <w:pPr>
         <w:pStyle w:val="MDPI52figure"/>
+        <w:ind w:left="510" w:firstLine="510"/>
       </w:pPr>
       <w:r>
+        <w:rPr>
+          <w:noProof/>
+        </w:rPr>
         <w:drawing>
-          <wp:inline distT="0" distB="0" distL="0" distR="0" wp14:anchorId="65E4E077" wp14:editId="7E9DAE03">
-            <wp:extent cx="3314104" cy="2602230"/>
-            <wp:effectExtent l="0" t="0" r="635" b="1270"/>
+          <wp:inline distT="0" distB="0" distL="0" distR="0" wp14:anchorId="65E4E077" wp14:editId="098C487F">
+            <wp:extent cx="4083527" cy="3206381"/>
+            <wp:effectExtent l="0" t="0" r="6350" b="0"/>
             <wp:docPr id="71820359" name="Picture 6"/>
             <wp:cNvGraphicFramePr>
               <a:graphicFrameLocks xmlns:a="http://schemas.openxmlformats.org/drawingml/2006/main" noChangeAspect="1"/>
@@ -2004,7 +1975,7 @@
                   <pic:spPr>
                     <a:xfrm>
                       <a:off x="0" y="0"/>
-                      <a:ext cx="3326884" cy="2612265"/>
+                      <a:ext cx="4302251" cy="3378122"/>
                     </a:xfrm>
                     <a:prstGeom prst="rect">
                       <a:avLst/>
@@ -2101,6 +2072,7 @@
         <w:pStyle w:val="MDPI22heading2"/>
       </w:pPr>
       <w:r>
+        <w:lastRenderedPageBreak/>
         <w:t>2</w:t>
       </w:r>
       <w:r>
@@ -2124,7 +2096,6 @@
         <w:rPr>
           <w:lang w:val="en"/>
         </w:rPr>
-        <w:lastRenderedPageBreak/>
         <w:t>This section defines the concept of geo-interventions based on the sub-concepts of actions, locations, and outcomes, while further structuring these defined concepts into quantifiable optimization problems. Geo</w:t>
       </w:r>
       <w:r>
@@ -2363,12 +2334,16 @@
     <w:p>
       <w:pPr>
         <w:pStyle w:val="MDPI52figure"/>
+        <w:jc w:val="right"/>
       </w:pPr>
       <w:r>
+        <w:rPr>
+          <w:noProof/>
+        </w:rPr>
         <w:drawing>
-          <wp:inline distT="0" distB="0" distL="0" distR="0" wp14:anchorId="5F281D4A" wp14:editId="03640EC1">
-            <wp:extent cx="3304619" cy="627554"/>
-            <wp:effectExtent l="0" t="0" r="0" b="0"/>
+          <wp:inline distT="0" distB="0" distL="0" distR="0" wp14:anchorId="5F281D4A" wp14:editId="129BB4A7">
+            <wp:extent cx="4975893" cy="944932"/>
+            <wp:effectExtent l="0" t="0" r="2540" b="0"/>
             <wp:docPr id="22" name="Picture 22"/>
             <wp:cNvGraphicFramePr>
               <a:graphicFrameLocks xmlns:a="http://schemas.openxmlformats.org/drawingml/2006/main" noChangeAspect="1"/>
@@ -2389,7 +2364,7 @@
                   <pic:spPr>
                     <a:xfrm>
                       <a:off x="0" y="0"/>
-                      <a:ext cx="3304619" cy="627554"/>
+                      <a:ext cx="5089563" cy="966518"/>
                     </a:xfrm>
                     <a:prstGeom prst="rect">
                       <a:avLst/>
@@ -2988,14 +2963,7 @@
             <w:rFonts w:ascii="Cambria Math" w:hAnsi="Cambria Math"/>
             <w:lang w:val="en"/>
           </w:rPr>
-          <m:t>j=</m:t>
-        </m:r>
-        <m:r>
-          <w:rPr>
-            <w:rFonts w:ascii="Cambria Math" w:hAnsi="Cambria Math"/>
-            <w:lang w:val="en"/>
-          </w:rPr>
-          <m:t>2</m:t>
+          <m:t>j=2</m:t>
         </m:r>
       </m:oMath>
       <w:r>
@@ -3069,21 +3037,7 @@
             <w:rFonts w:ascii="Cambria Math" w:hAnsi="Cambria Math"/>
             <w:lang w:val="en"/>
           </w:rPr>
-          <m:t>=</m:t>
-        </m:r>
-        <m:r>
-          <w:rPr>
-            <w:rFonts w:ascii="Cambria Math" w:hAnsi="Cambria Math"/>
-            <w:lang w:val="en"/>
-          </w:rPr>
-          <m:t>-</m:t>
-        </m:r>
-        <m:r>
-          <w:rPr>
-            <w:rFonts w:ascii="Cambria Math" w:hAnsi="Cambria Math"/>
-            <w:lang w:val="en"/>
-          </w:rPr>
-          <m:t>5</m:t>
+          <m:t>=-5</m:t>
         </m:r>
       </m:oMath>
       <w:r>
@@ -3665,16 +3619,7 @@
         <w:pStyle w:val="MDPI23heading3"/>
       </w:pPr>
       <w:r>
-        <w:t>2</w:t>
-      </w:r>
-      <w:r>
-        <w:t>.1.</w:t>
-      </w:r>
-      <w:r>
-        <w:t>2</w:t>
-      </w:r>
-      <w:r>
-        <w:t xml:space="preserve">. </w:t>
+        <w:t xml:space="preserve">2.1.2. </w:t>
       </w:r>
       <w:r>
         <w:t>Locations</w:t>
@@ -4574,14 +4519,7 @@
                     <w:rFonts w:ascii="Cambria Math" w:hAnsi="Cambria Math"/>
                     <w:lang w:val="en"/>
                   </w:rPr>
-                  <m:t>=</m:t>
-                </m:r>
-                <m:r>
-                  <w:rPr>
-                    <w:rFonts w:ascii="Cambria Math" w:hAnsi="Cambria Math"/>
-                    <w:lang w:val="en"/>
-                  </w:rPr>
-                  <m:t>(</m:t>
+                  <m:t>=(</m:t>
                 </m:r>
                 <m:sSub>
                   <m:sSubPr>
@@ -4700,7 +4638,6 @@
         <w:rPr>
           <w:lang w:val="en"/>
         </w:rPr>
-        <w:lastRenderedPageBreak/>
         <w:t>Thus, e</w:t>
       </w:r>
       <w:r>
@@ -4835,14 +4772,7 @@
                 <w:rFonts w:ascii="Cambria Math" w:hAnsi="Cambria Math"/>
                 <w:lang w:val="en"/>
               </w:rPr>
-              <m:t>i,</m:t>
-            </m:r>
-            <m:r>
-              <w:rPr>
-                <w:rFonts w:ascii="Cambria Math" w:hAnsi="Cambria Math"/>
-                <w:lang w:val="en"/>
-              </w:rPr>
-              <m:t>1</m:t>
+              <m:t>i,1</m:t>
             </m:r>
           </m:sub>
         </m:sSub>
@@ -4880,14 +4810,7 @@
                 <w:rFonts w:ascii="Cambria Math" w:hAnsi="Cambria Math"/>
                 <w:lang w:val="en"/>
               </w:rPr>
-              <m:t>i,</m:t>
-            </m:r>
-            <m:r>
-              <w:rPr>
-                <w:rFonts w:ascii="Cambria Math" w:hAnsi="Cambria Math"/>
-                <w:lang w:val="en"/>
-              </w:rPr>
-              <m:t>n</m:t>
+              <m:t>i,n</m:t>
             </m:r>
           </m:sub>
         </m:sSub>
@@ -4956,14 +4879,7 @@
                         <w:rFonts w:ascii="Cambria Math" w:hAnsi="Cambria Math"/>
                         <w:lang w:val="en"/>
                       </w:rPr>
-                      <m:t>i</m:t>
-                    </m:r>
-                    <m:r>
-                      <w:rPr>
-                        <w:rFonts w:ascii="Cambria Math" w:hAnsi="Cambria Math"/>
-                        <w:lang w:val="en"/>
-                      </w:rPr>
-                      <m:t>,j</m:t>
+                      <m:t>i,j</m:t>
                     </m:r>
                   </m:sub>
                 </m:sSub>
@@ -5048,13 +4964,7 @@
                           <w:rPr>
                             <w:rFonts w:ascii="Cambria Math" w:hAnsi="Cambria Math"/>
                           </w:rPr>
-                          <m:t>i,</m:t>
-                        </m:r>
-                        <m:r>
-                          <w:rPr>
-                            <w:rFonts w:ascii="Cambria Math" w:hAnsi="Cambria Math"/>
-                          </w:rPr>
-                          <m:t>n</m:t>
+                          <m:t>i,n</m:t>
                         </m:r>
                       </m:sub>
                     </m:sSub>
@@ -5104,13 +5014,7 @@
         </w:rPr>
       </w:pPr>
       <w:r>
-        <w:t>2.1.</w:t>
-      </w:r>
-      <w:r>
-        <w:t>3</w:t>
-      </w:r>
-      <w:r>
-        <w:t xml:space="preserve">. </w:t>
+        <w:t xml:space="preserve">2.1.3. </w:t>
       </w:r>
       <w:r>
         <w:t>Outcomes</w:t>
@@ -5483,14 +5387,7 @@
                 <w:rFonts w:ascii="Cambria Math" w:hAnsi="Cambria Math"/>
                 <w:lang w:val="en"/>
               </w:rPr>
-              <m:t>i</m:t>
-            </m:r>
-            <m:r>
-              <w:rPr>
-                <w:rFonts w:ascii="Cambria Math" w:hAnsi="Cambria Math"/>
-                <w:lang w:val="en"/>
-              </w:rPr>
-              <m:t>,j</m:t>
+              <m:t>i,j</m:t>
             </m:r>
           </m:sub>
         </m:sSub>
@@ -5588,14 +5485,7 @@
                         <w:rFonts w:ascii="Cambria Math" w:hAnsi="Cambria Math"/>
                         <w:lang w:val="en"/>
                       </w:rPr>
-                      <m:t>i</m:t>
-                    </m:r>
-                    <m:r>
-                      <w:rPr>
-                        <w:rFonts w:ascii="Cambria Math" w:hAnsi="Cambria Math"/>
-                        <w:lang w:val="en"/>
-                      </w:rPr>
-                      <m:t>,j</m:t>
+                      <m:t>i,j</m:t>
                     </m:r>
                   </m:sub>
                 </m:sSub>
@@ -5749,14 +5639,7 @@
                 <w:rFonts w:ascii="Cambria Math" w:hAnsi="Cambria Math"/>
                 <w:lang w:val="en"/>
               </w:rPr>
-              <m:t>i</m:t>
-            </m:r>
-            <m:r>
-              <w:rPr>
-                <w:rFonts w:ascii="Cambria Math" w:hAnsi="Cambria Math"/>
-                <w:lang w:val="en"/>
-              </w:rPr>
-              <m:t>,j</m:t>
+              <m:t>i,j</m:t>
             </m:r>
           </m:sub>
         </m:sSub>
@@ -5868,13 +5751,7 @@
         <w:rPr>
           <w:lang w:val="en"/>
         </w:rPr>
-        <w:t xml:space="preserve"> </w:t>
-      </w:r>
-      <w:r>
-        <w:rPr>
-          <w:lang w:val="en"/>
-        </w:rPr>
-        <w:t xml:space="preserve">at locations </w:t>
+        <w:t xml:space="preserve"> at locations </w:t>
       </w:r>
       <m:oMath>
         <m:r>
@@ -5953,14 +5830,7 @@
                 <w:rFonts w:ascii="Cambria Math" w:hAnsi="Cambria Math"/>
                 <w:lang w:val="en"/>
               </w:rPr>
-              <m:t>i</m:t>
-            </m:r>
-            <m:r>
-              <w:rPr>
-                <w:rFonts w:ascii="Cambria Math" w:hAnsi="Cambria Math"/>
-                <w:lang w:val="en"/>
-              </w:rPr>
-              <m:t>,j</m:t>
+              <m:t>i,j</m:t>
             </m:r>
           </m:sub>
         </m:sSub>
@@ -6071,14 +5941,7 @@
                         <w:rFonts w:ascii="Cambria Math" w:hAnsi="Cambria Math"/>
                         <w:lang w:val="en"/>
                       </w:rPr>
-                      <m:t>i</m:t>
-                    </m:r>
-                    <m:r>
-                      <w:rPr>
-                        <w:rFonts w:ascii="Cambria Math" w:hAnsi="Cambria Math"/>
-                        <w:lang w:val="en"/>
-                      </w:rPr>
-                      <m:t>,j</m:t>
+                      <m:t>i,j</m:t>
                     </m:r>
                   </m:sub>
                 </m:sSub>
@@ -6087,14 +5950,7 @@
                     <w:rFonts w:ascii="Cambria Math" w:hAnsi="Cambria Math"/>
                     <w:lang w:val="en"/>
                   </w:rPr>
-                  <m:t>)</m:t>
-                </m:r>
-                <m:r>
-                  <w:rPr>
-                    <w:rFonts w:ascii="Cambria Math" w:hAnsi="Cambria Math"/>
-                    <w:lang w:val="en"/>
-                  </w:rPr>
-                  <m:t xml:space="preserve"> </m:t>
+                  <m:t xml:space="preserve">) </m:t>
                 </m:r>
               </m:oMath>
             </m:oMathPara>
@@ -6229,13 +6085,7 @@
         <w:rPr>
           <w:lang w:val="en"/>
         </w:rPr>
-        <w:t xml:space="preserve"> at </w:t>
-      </w:r>
-      <w:r>
-        <w:rPr>
-          <w:lang w:val="en"/>
-        </w:rPr>
-        <w:t xml:space="preserve">locations </w:t>
+        <w:t xml:space="preserve"> at locations </w:t>
       </w:r>
       <m:oMath>
         <m:r>
@@ -6319,14 +6169,7 @@
                     <w:rFonts w:ascii="Cambria Math" w:hAnsi="Cambria Math"/>
                     <w:lang w:val="en"/>
                   </w:rPr>
-                  <m:t xml:space="preserve"> =</m:t>
-                </m:r>
-                <m:r>
-                  <w:rPr>
-                    <w:rFonts w:ascii="Cambria Math" w:hAnsi="Cambria Math"/>
-                    <w:lang w:val="en"/>
-                  </w:rPr>
-                  <m:t>|</m:t>
+                  <m:t xml:space="preserve"> =|</m:t>
                 </m:r>
                 <m:sSub>
                   <m:sSubPr>
@@ -6421,17 +6264,7 @@
                     <w:rFonts w:ascii="Cambria Math" w:hAnsi="Cambria Math"/>
                     <w:lang w:val="en"/>
                   </w:rPr>
-                  <m:t xml:space="preserve"> </m:t>
-                </m:r>
-                <m:r>
-                  <m:rPr>
-                    <m:sty m:val="p"/>
-                  </m:rPr>
-                  <w:rPr>
-                    <w:rFonts w:ascii="Cambria Math" w:hAnsi="Cambria Math"/>
-                    <w:lang w:val="en"/>
-                  </w:rPr>
-                  <m:t xml:space="preserve">given </m:t>
+                  <m:t xml:space="preserve"> given </m:t>
                 </m:r>
                 <m:sSub>
                   <m:sSubPr>
@@ -6507,14 +6340,7 @@
                         <w:rFonts w:ascii="Cambria Math" w:hAnsi="Cambria Math"/>
                         <w:lang w:val="en"/>
                       </w:rPr>
-                      <m:t>i</m:t>
-                    </m:r>
-                    <m:r>
-                      <w:rPr>
-                        <w:rFonts w:ascii="Cambria Math" w:hAnsi="Cambria Math"/>
-                        <w:lang w:val="en"/>
-                      </w:rPr>
-                      <m:t>,j</m:t>
+                      <m:t>i,j</m:t>
                     </m:r>
                   </m:sub>
                 </m:sSub>
@@ -6771,14 +6597,7 @@
                 <w:rFonts w:ascii="Cambria Math" w:hAnsi="Cambria Math"/>
                 <w:lang w:val="en"/>
               </w:rPr>
-              <m:t>i</m:t>
-            </m:r>
-            <m:r>
-              <w:rPr>
-                <w:rFonts w:ascii="Cambria Math" w:hAnsi="Cambria Math"/>
-                <w:lang w:val="en"/>
-              </w:rPr>
-              <m:t>,j</m:t>
+              <m:t>i,j</m:t>
             </m:r>
           </m:sub>
         </m:sSub>
@@ -6944,14 +6763,7 @@
                         <w:rFonts w:ascii="Cambria Math" w:hAnsi="Cambria Math"/>
                         <w:lang w:val="en"/>
                       </w:rPr>
-                      <m:t>i</m:t>
-                    </m:r>
-                    <m:r>
-                      <w:rPr>
-                        <w:rFonts w:ascii="Cambria Math" w:hAnsi="Cambria Math"/>
-                        <w:lang w:val="en"/>
-                      </w:rPr>
-                      <m:t>,j</m:t>
+                      <m:t>i,j</m:t>
                     </m:r>
                   </m:sub>
                 </m:sSub>
@@ -7028,14 +6840,7 @@
                 <w:rFonts w:ascii="Cambria Math" w:hAnsi="Cambria Math"/>
                 <w:lang w:val="en"/>
               </w:rPr>
-              <m:t>i</m:t>
-            </m:r>
-            <m:r>
-              <w:rPr>
-                <w:rFonts w:ascii="Cambria Math" w:hAnsi="Cambria Math"/>
-                <w:lang w:val="en"/>
-              </w:rPr>
-              <m:t>,j</m:t>
+              <m:t>i,j</m:t>
             </m:r>
           </m:sub>
         </m:sSub>
@@ -7044,13 +6849,7 @@
         <w:rPr>
           <w:lang w:val="en"/>
         </w:rPr>
-        <w:t xml:space="preserve"> represent the generated geo-interventions</w:t>
-      </w:r>
-      <w:r>
-        <w:rPr>
-          <w:lang w:val="en"/>
-        </w:rPr>
-        <w:t xml:space="preserve">, while the predicted outcomes of those geo-interventions correspond to </w:t>
+        <w:t xml:space="preserve"> represent the generated geo-interventions, while the predicted outcomes of those geo-interventions correspond to </w:t>
       </w:r>
       <m:oMath>
         <m:sSub>
@@ -7170,14 +6969,7 @@
                 <w:rFonts w:ascii="Cambria Math" w:hAnsi="Cambria Math"/>
                 <w:lang w:val="en"/>
               </w:rPr>
-              <m:t>i</m:t>
-            </m:r>
-            <m:r>
-              <w:rPr>
-                <w:rFonts w:ascii="Cambria Math" w:hAnsi="Cambria Math"/>
-                <w:lang w:val="en"/>
-              </w:rPr>
-              <m:t>,j</m:t>
+              <m:t>i,j</m:t>
             </m:r>
           </m:sub>
         </m:sSub>
@@ -7437,14 +7229,7 @@
                     <w:rFonts w:ascii="Cambria Math" w:hAnsi="Cambria Math"/>
                     <w:lang w:val="en"/>
                   </w:rPr>
-                  <m:t>=</m:t>
-                </m:r>
-                <m:r>
-                  <w:rPr>
-                    <w:rFonts w:ascii="Cambria Math" w:hAnsi="Cambria Math"/>
-                    <w:lang w:val="en"/>
-                  </w:rPr>
-                  <m:t>f(</m:t>
+                  <m:t>=f(</m:t>
                 </m:r>
                 <m:sSub>
                   <m:sSubPr>
@@ -7471,14 +7256,7 @@
                         <w:rFonts w:ascii="Cambria Math" w:hAnsi="Cambria Math"/>
                         <w:lang w:val="en"/>
                       </w:rPr>
-                      <m:t>i</m:t>
-                    </m:r>
-                    <m:r>
-                      <w:rPr>
-                        <w:rFonts w:ascii="Cambria Math" w:hAnsi="Cambria Math"/>
-                        <w:lang w:val="en"/>
-                      </w:rPr>
-                      <m:t>,j</m:t>
+                      <m:t>i,j</m:t>
                     </m:r>
                   </m:sub>
                 </m:sSub>
@@ -7854,21 +7632,7 @@
                     <w:rFonts w:ascii="Cambria Math" w:hAnsi="Cambria Math"/>
                     <w:lang w:val="en"/>
                   </w:rPr>
-                  <m:t>maximize</m:t>
-                </m:r>
-                <m:r>
-                  <w:rPr>
-                    <w:rFonts w:ascii="Cambria Math" w:hAnsi="Cambria Math"/>
-                    <w:lang w:val="en"/>
-                  </w:rPr>
-                  <m:t xml:space="preserve"> </m:t>
-                </m:r>
-                <m:r>
-                  <w:rPr>
-                    <w:rFonts w:ascii="Cambria Math" w:hAnsi="Cambria Math"/>
-                    <w:lang w:val="en"/>
-                  </w:rPr>
-                  <m:t>m</m:t>
+                  <m:t>maximize m</m:t>
                 </m:r>
                 <m:d>
                   <m:dPr>
@@ -7930,14 +7694,7 @@
                     <w:rFonts w:ascii="Cambria Math" w:hAnsi="Cambria Math"/>
                     <w:lang w:val="en"/>
                   </w:rPr>
-                  <m:t>=</m:t>
-                </m:r>
-                <m:r>
-                  <w:rPr>
-                    <w:rFonts w:ascii="Cambria Math" w:hAnsi="Cambria Math"/>
-                    <w:lang w:val="en"/>
-                  </w:rPr>
-                  <m:t>f(</m:t>
+                  <m:t>=f(</m:t>
                 </m:r>
                 <m:sSub>
                   <m:sSubPr>
@@ -7964,14 +7721,7 @@
                         <w:rFonts w:ascii="Cambria Math" w:hAnsi="Cambria Math"/>
                         <w:lang w:val="en"/>
                       </w:rPr>
-                      <m:t>i</m:t>
-                    </m:r>
-                    <m:r>
-                      <w:rPr>
-                        <w:rFonts w:ascii="Cambria Math" w:hAnsi="Cambria Math"/>
-                        <w:lang w:val="en"/>
-                      </w:rPr>
-                      <m:t>,j</m:t>
+                      <m:t>i,j</m:t>
                     </m:r>
                   </m:sub>
                 </m:sSub>
@@ -8266,14 +8016,7 @@
                 <w:rFonts w:ascii="Cambria Math" w:hAnsi="Cambria Math"/>
                 <w:lang w:val="en"/>
               </w:rPr>
-              <m:t>i</m:t>
-            </m:r>
-            <m:r>
-              <w:rPr>
-                <w:rFonts w:ascii="Cambria Math" w:hAnsi="Cambria Math"/>
-                <w:lang w:val="en"/>
-              </w:rPr>
-              <m:t>,j</m:t>
+              <m:t>i,j</m:t>
             </m:r>
           </m:sub>
         </m:sSub>
@@ -8319,7 +8062,14 @@
         <w:rPr>
           <w:lang w:val="en"/>
         </w:rPr>
-        <w:t xml:space="preserve">. Instead, we may reduce the number of values to try by limiting the locations </w:t>
+        <w:t xml:space="preserve">. Instead, we may reduce the number of values to try </w:t>
+      </w:r>
+      <w:r>
+        <w:rPr>
+          <w:lang w:val="en"/>
+        </w:rPr>
+        <w:lastRenderedPageBreak/>
+        <w:t xml:space="preserve">by limiting the locations </w:t>
       </w:r>
       <m:oMath>
         <m:r>
@@ -8447,14 +8197,7 @@
         <w:rPr>
           <w:lang w:val="en"/>
         </w:rPr>
-        <w:t xml:space="preserve">where these </w:t>
-      </w:r>
-      <w:r>
-        <w:rPr>
-          <w:lang w:val="en"/>
-        </w:rPr>
-        <w:lastRenderedPageBreak/>
-        <w:t>subsets</w:t>
+        <w:t>where these subsets</w:t>
       </w:r>
       <w:r>
         <w:rPr>
@@ -8644,14 +8387,7 @@
                     <w:rFonts w:ascii="Cambria Math" w:hAnsi="Cambria Math"/>
                     <w:lang w:val="en"/>
                   </w:rPr>
-                  <m:t>⊂ i</m:t>
-                </m:r>
-                <m:r>
-                  <w:rPr>
-                    <w:rFonts w:ascii="Cambria Math" w:hAnsi="Cambria Math"/>
-                    <w:lang w:val="en"/>
-                  </w:rPr>
-                  <m:t xml:space="preserve">, </m:t>
+                  <m:t xml:space="preserve">⊂ i, </m:t>
                 </m:r>
                 <m:acc>
                   <m:accPr>
@@ -8678,14 +8414,7 @@
                     <w:rFonts w:ascii="Cambria Math" w:hAnsi="Cambria Math"/>
                     <w:lang w:val="en"/>
                   </w:rPr>
-                  <m:t>⊂</m:t>
-                </m:r>
-                <m:r>
-                  <w:rPr>
-                    <w:rFonts w:ascii="Cambria Math" w:hAnsi="Cambria Math"/>
-                    <w:lang w:val="en"/>
-                  </w:rPr>
-                  <m:t>j</m:t>
+                  <m:t>⊂j</m:t>
                 </m:r>
               </m:oMath>
             </m:oMathPara>
@@ -8774,14 +8503,7 @@
                 <w:rFonts w:ascii="Cambria Math" w:hAnsi="Cambria Math"/>
                 <w:lang w:val="en"/>
               </w:rPr>
-              <m:t>i</m:t>
-            </m:r>
-            <m:r>
-              <w:rPr>
-                <w:rFonts w:ascii="Cambria Math" w:hAnsi="Cambria Math"/>
-                <w:lang w:val="en"/>
-              </w:rPr>
-              <m:t>,j</m:t>
+              <m:t>i,j</m:t>
             </m:r>
           </m:sub>
         </m:sSub>
@@ -8861,14 +8583,7 @@
             <w:rFonts w:ascii="Cambria Math" w:hAnsi="Cambria Math"/>
             <w:lang w:val="en"/>
           </w:rPr>
-          <m:t xml:space="preserve"> ... </m:t>
-        </m:r>
-        <m:r>
-          <w:rPr>
-            <w:rFonts w:ascii="Cambria Math" w:hAnsi="Cambria Math"/>
-            <w:lang w:val="en"/>
-          </w:rPr>
-          <m:t xml:space="preserve"> </m:t>
+          <m:t xml:space="preserve"> ...  </m:t>
         </m:r>
         <m:sSubSup>
           <m:sSubSupPr>
@@ -8904,14 +8619,7 @@
                 <w:rFonts w:ascii="Cambria Math" w:hAnsi="Cambria Math"/>
                 <w:lang w:val="en"/>
               </w:rPr>
-              <m:t>m</m:t>
-            </m:r>
-            <m:r>
-              <w:rPr>
-                <w:rFonts w:ascii="Cambria Math" w:hAnsi="Cambria Math"/>
-                <w:lang w:val="en"/>
-              </w:rPr>
-              <m:t>ax</m:t>
+              <m:t>max</m:t>
             </m:r>
           </m:sup>
         </m:sSubSup>
@@ -9040,14 +8748,7 @@
                         <w:rFonts w:ascii="Cambria Math" w:hAnsi="Cambria Math"/>
                         <w:lang w:val="en"/>
                       </w:rPr>
-                      <m:t>i</m:t>
-                    </m:r>
-                    <m:r>
-                      <w:rPr>
-                        <w:rFonts w:ascii="Cambria Math" w:hAnsi="Cambria Math"/>
-                        <w:lang w:val="en"/>
-                      </w:rPr>
-                      <m:t>,j</m:t>
+                      <m:t>i,j</m:t>
                     </m:r>
                   </m:sub>
                 </m:sSub>
@@ -9101,14 +8802,7 @@
                     <w:rFonts w:ascii="Cambria Math" w:hAnsi="Cambria Math"/>
                     <w:lang w:val="en"/>
                   </w:rPr>
-                  <m:t xml:space="preserve"> ... </m:t>
-                </m:r>
-                <m:r>
-                  <w:rPr>
-                    <w:rFonts w:ascii="Cambria Math" w:hAnsi="Cambria Math"/>
-                    <w:lang w:val="en"/>
-                  </w:rPr>
-                  <m:t xml:space="preserve"> </m:t>
+                  <m:t xml:space="preserve"> ...  </m:t>
                 </m:r>
                 <m:sSubSup>
                   <m:sSubSupPr>
@@ -9144,14 +8838,7 @@
                         <w:rFonts w:ascii="Cambria Math" w:hAnsi="Cambria Math"/>
                         <w:lang w:val="en"/>
                       </w:rPr>
-                      <m:t>m</m:t>
-                    </m:r>
-                    <m:r>
-                      <w:rPr>
-                        <w:rFonts w:ascii="Cambria Math" w:hAnsi="Cambria Math"/>
-                        <w:lang w:val="en"/>
-                      </w:rPr>
-                      <m:t>ax</m:t>
+                      <m:t>max</m:t>
                     </m:r>
                   </m:sup>
                 </m:sSubSup>
@@ -9160,14 +8847,7 @@
                     <w:rFonts w:ascii="Cambria Math" w:hAnsi="Cambria Math"/>
                     <w:lang w:val="en"/>
                   </w:rPr>
-                  <m:t>}</m:t>
-                </m:r>
-                <m:r>
-                  <w:rPr>
-                    <w:rFonts w:ascii="Cambria Math" w:hAnsi="Cambria Math"/>
-                    <w:lang w:val="en"/>
-                  </w:rPr>
-                  <m:t xml:space="preserve"> </m:t>
+                  <m:t xml:space="preserve">} </m:t>
                 </m:r>
               </m:oMath>
             </m:oMathPara>
@@ -9230,13 +8910,7 @@
         </w:rPr>
       </w:pPr>
       <w:r>
-        <w:t>B</w:t>
-      </w:r>
-      <w:r>
-        <w:t>ased on the problem formulation in Section 2.1</w:t>
-      </w:r>
-      <w:r>
-        <w:t xml:space="preserve">, </w:t>
+        <w:t xml:space="preserve">Based on the problem formulation in Section 2.1, </w:t>
       </w:r>
       <w:r>
         <w:t>this section specifies conceptual components and their sub-components for the concepts of actions, locations, outcomes, and geo-interventions.</w:t>
@@ -9257,13 +8931,7 @@
         <w:rPr>
           <w:lang w:val="en"/>
         </w:rPr>
-        <w:t xml:space="preserve"> geo-interventions?</w:t>
-      </w:r>
-      <w:r>
-        <w:rPr>
-          <w:lang w:val="en"/>
-        </w:rPr>
-        <w:t xml:space="preserve"> </w:t>
+        <w:t xml:space="preserve"> geo-interventions? </w:t>
       </w:r>
       <w:r>
         <w:rPr>
@@ -9287,13 +8955,7 @@
         <w:rPr>
           <w:lang w:val="en"/>
         </w:rPr>
-        <w:t xml:space="preserve"> h</w:t>
-      </w:r>
-      <w:r>
-        <w:rPr>
-          <w:lang w:val="en"/>
-        </w:rPr>
-        <w:t xml:space="preserve">ow do we </w:t>
+        <w:t xml:space="preserve"> how do we </w:t>
       </w:r>
       <w:r>
         <w:rPr>
@@ -10241,6 +9903,7 @@
               <w:jc w:val="left"/>
             </w:pPr>
             <w:r>
+              <w:lastRenderedPageBreak/>
               <w:t>Variable Metrics*</w:t>
             </w:r>
           </w:p>
@@ -10469,22 +10132,7 @@
         </w:rPr>
       </w:pPr>
       <w:r>
-        <w:t>2.</w:t>
-      </w:r>
-      <w:r>
-        <w:t>2</w:t>
-      </w:r>
-      <w:r>
-        <w:t>.</w:t>
-      </w:r>
-      <w:r>
-        <w:t>1</w:t>
-      </w:r>
-      <w:r>
-        <w:t xml:space="preserve">. </w:t>
-      </w:r>
-      <w:r>
-        <w:t xml:space="preserve">Spatial Data </w:t>
+        <w:t xml:space="preserve">2.2.1. Spatial Data </w:t>
       </w:r>
       <w:r>
         <w:t>Specifications</w:t>
@@ -10507,19 +10155,7 @@
         <w:rPr>
           <w:lang w:val="en"/>
         </w:rPr>
-        <w:t xml:space="preserve">, commonly used in </w:t>
-      </w:r>
-      <w:r>
-        <w:rPr>
-          <w:lang w:val="en"/>
-        </w:rPr>
-        <w:t>Geographic Information Systems (GIS)</w:t>
-      </w:r>
-      <w:r>
-        <w:rPr>
-          <w:lang w:val="en"/>
-        </w:rPr>
-        <w:t xml:space="preserve">, </w:t>
+        <w:t xml:space="preserve">, commonly used in Geographic Information Systems (GIS), </w:t>
       </w:r>
       <w:r>
         <w:rPr>
@@ -10574,13 +10210,7 @@
                   <w:rPr>
                     <w:rFonts w:ascii="Cambria Math" w:hAnsi="Cambria Math"/>
                   </w:rPr>
-                  <m:t>i,</m:t>
-                </m:r>
-                <m:r>
-                  <w:rPr>
-                    <w:rFonts w:ascii="Cambria Math" w:hAnsi="Cambria Math"/>
-                  </w:rPr>
-                  <m:t>1</m:t>
+                  <m:t>i,1</m:t>
                 </m:r>
               </m:sub>
             </m:sSub>
@@ -10614,13 +10244,7 @@
                   <w:rPr>
                     <w:rFonts w:ascii="Cambria Math" w:hAnsi="Cambria Math"/>
                   </w:rPr>
-                  <m:t>i,</m:t>
-                </m:r>
-                <m:r>
-                  <w:rPr>
-                    <w:rFonts w:ascii="Cambria Math" w:hAnsi="Cambria Math"/>
-                  </w:rPr>
-                  <m:t>n</m:t>
+                  <m:t>i,n</m:t>
                 </m:r>
               </m:sub>
             </m:sSub>
@@ -10762,14 +10386,7 @@
                 <w:rFonts w:ascii="Cambria Math" w:hAnsi="Cambria Math"/>
                 <w:lang w:val="en"/>
               </w:rPr>
-              <m:t>i</m:t>
-            </m:r>
-            <m:r>
-              <w:rPr>
-                <w:rFonts w:ascii="Cambria Math" w:hAnsi="Cambria Math"/>
-                <w:lang w:val="en"/>
-              </w:rPr>
-              <m:t>,j</m:t>
+              <m:t>i,j</m:t>
             </m:r>
           </m:sub>
         </m:sSub>
@@ -10977,13 +10594,7 @@
                   <w:rPr>
                     <w:rFonts w:ascii="Cambria Math" w:hAnsi="Cambria Math"/>
                   </w:rPr>
-                  <m:t>i,</m:t>
-                </m:r>
-                <m:r>
-                  <w:rPr>
-                    <w:rFonts w:ascii="Cambria Math" w:hAnsi="Cambria Math"/>
-                  </w:rPr>
-                  <m:t>1</m:t>
+                  <m:t>i,1</m:t>
                 </m:r>
               </m:sub>
             </m:sSub>
@@ -11017,13 +10628,7 @@
                   <w:rPr>
                     <w:rFonts w:ascii="Cambria Math" w:hAnsi="Cambria Math"/>
                   </w:rPr>
-                  <m:t>i,</m:t>
-                </m:r>
-                <m:r>
-                  <w:rPr>
-                    <w:rFonts w:ascii="Cambria Math" w:hAnsi="Cambria Math"/>
-                  </w:rPr>
-                  <m:t>n</m:t>
+                  <m:t>i,n</m:t>
                 </m:r>
               </m:sub>
             </m:sSub>
@@ -11732,13 +11337,7 @@
         <w:rPr>
           <w:lang w:val="en"/>
         </w:rPr>
-        <w:t xml:space="preserve"> </w:t>
-      </w:r>
-      <w:r>
-        <w:rPr>
-          <w:lang w:val="en"/>
-        </w:rPr>
-        <w:t xml:space="preserve">(e.g., census boundaries for public health interventions </w:t>
+        <w:t xml:space="preserve"> (e.g., census boundaries for public health interventions </w:t>
       </w:r>
       <w:r>
         <w:rPr>
@@ -12001,19 +11600,7 @@
         </w:rPr>
       </w:pPr>
       <w:r>
-        <w:t>2.</w:t>
-      </w:r>
-      <w:r>
-        <w:t>2</w:t>
-      </w:r>
-      <w:r>
-        <w:t>.</w:t>
-      </w:r>
-      <w:r>
-        <w:t>2</w:t>
-      </w:r>
-      <w:r>
-        <w:t xml:space="preserve">. </w:t>
+        <w:t xml:space="preserve">2.2.2. </w:t>
       </w:r>
       <w:r>
         <w:t>Outcome Modelling</w:t>
@@ -12110,13 +11697,7 @@
                   <w:rPr>
                     <w:rFonts w:ascii="Cambria Math" w:hAnsi="Cambria Math"/>
                   </w:rPr>
-                  <m:t>i,</m:t>
-                </m:r>
-                <m:r>
-                  <w:rPr>
-                    <w:rFonts w:ascii="Cambria Math" w:hAnsi="Cambria Math"/>
-                  </w:rPr>
-                  <m:t>1</m:t>
+                  <m:t>i,1</m:t>
                 </m:r>
               </m:sub>
             </m:sSub>
@@ -12150,13 +11731,7 @@
                   <w:rPr>
                     <w:rFonts w:ascii="Cambria Math" w:hAnsi="Cambria Math"/>
                   </w:rPr>
-                  <m:t>i,</m:t>
-                </m:r>
-                <m:r>
-                  <w:rPr>
-                    <w:rFonts w:ascii="Cambria Math" w:hAnsi="Cambria Math"/>
-                  </w:rPr>
-                  <m:t>n</m:t>
+                  <m:t>i,n</m:t>
                 </m:r>
               </m:sub>
             </m:sSub>
@@ -12210,13 +11785,7 @@
                   <w:rPr>
                     <w:rFonts w:ascii="Cambria Math" w:hAnsi="Cambria Math"/>
                   </w:rPr>
-                  <m:t>i,</m:t>
-                </m:r>
-                <m:r>
-                  <w:rPr>
-                    <w:rFonts w:ascii="Cambria Math" w:hAnsi="Cambria Math"/>
-                  </w:rPr>
-                  <m:t>1</m:t>
+                  <m:t>i,1</m:t>
                 </m:r>
               </m:sub>
             </m:sSub>
@@ -12250,13 +11819,7 @@
                   <w:rPr>
                     <w:rFonts w:ascii="Cambria Math" w:hAnsi="Cambria Math"/>
                   </w:rPr>
-                  <m:t>i,</m:t>
-                </m:r>
-                <m:r>
-                  <w:rPr>
-                    <w:rFonts w:ascii="Cambria Math" w:hAnsi="Cambria Math"/>
-                  </w:rPr>
-                  <m:t>n</m:t>
+                  <m:t>i,n</m:t>
                 </m:r>
               </m:sub>
             </m:sSub>
@@ -12408,14 +11971,7 @@
                 <w:rFonts w:ascii="Cambria Math" w:hAnsi="Cambria Math"/>
                 <w:lang w:val="en"/>
               </w:rPr>
-              <m:t>i</m:t>
-            </m:r>
-            <m:r>
-              <w:rPr>
-                <w:rFonts w:ascii="Cambria Math" w:hAnsi="Cambria Math"/>
-                <w:lang w:val="en"/>
-              </w:rPr>
-              <m:t>,j</m:t>
+              <m:t>i,j</m:t>
             </m:r>
           </m:sub>
         </m:sSub>
@@ -12771,14 +12327,7 @@
                 <w:rFonts w:ascii="Cambria Math" w:hAnsi="Cambria Math"/>
                 <w:lang w:val="en"/>
               </w:rPr>
-              <m:t>i</m:t>
-            </m:r>
-            <m:r>
-              <w:rPr>
-                <w:rFonts w:ascii="Cambria Math" w:hAnsi="Cambria Math"/>
-                <w:lang w:val="en"/>
-              </w:rPr>
-              <m:t>,j</m:t>
+              <m:t>i,j</m:t>
             </m:r>
           </m:sub>
         </m:sSub>
@@ -13144,10 +12693,7 @@
         <w:t>.</w:t>
       </w:r>
       <w:r>
-        <w:t xml:space="preserve"> </w:t>
-      </w:r>
-      <w:r>
-        <w:t xml:space="preserve">We note that the minimization of predicted and actual outcome differences is a simplification of predictive modelling, as models tend to not generalize well to new data, performing well on training data, but poorly on new unseen data </w:t>
+        <w:t xml:space="preserve"> We note that the minimization of predicted and actual outcome differences is a simplification of predictive modelling, as models tend to not generalize well to new data, performing well on training data, but poorly on new unseen data </w:t>
       </w:r>
       <w:r>
         <w:fldChar w:fldCharType="begin"/>
@@ -13296,19 +12842,7 @@
         </w:rPr>
       </w:pPr>
       <w:r>
-        <w:t>2.</w:t>
-      </w:r>
-      <w:r>
-        <w:t>2</w:t>
-      </w:r>
-      <w:r>
-        <w:t>.</w:t>
-      </w:r>
-      <w:r>
-        <w:t>3</w:t>
-      </w:r>
-      <w:r>
-        <w:t xml:space="preserve">. </w:t>
+        <w:t xml:space="preserve">2.2.3. </w:t>
       </w:r>
       <w:r>
         <w:t xml:space="preserve">Geo-intervention Generation </w:t>
@@ -13392,14 +12926,7 @@
                 <w:rFonts w:ascii="Cambria Math" w:hAnsi="Cambria Math"/>
                 <w:lang w:val="en"/>
               </w:rPr>
-              <m:t>i</m:t>
-            </m:r>
-            <m:r>
-              <w:rPr>
-                <w:rFonts w:ascii="Cambria Math" w:hAnsi="Cambria Math"/>
-                <w:lang w:val="en"/>
-              </w:rPr>
-              <m:t>,j</m:t>
+              <m:t>i,j</m:t>
             </m:r>
           </m:sub>
         </m:sSub>
@@ -13628,14 +13155,7 @@
                     <w:rFonts w:ascii="Cambria Math" w:hAnsi="Cambria Math"/>
                     <w:lang w:val="en"/>
                   </w:rPr>
-                  <m:t>i</m:t>
-                </m:r>
-                <m:r>
-                  <w:rPr>
-                    <w:rFonts w:ascii="Cambria Math" w:hAnsi="Cambria Math"/>
-                    <w:lang w:val="en"/>
-                  </w:rPr>
-                  <m:t>,j</m:t>
+                  <m:t>i,j</m:t>
                 </m:r>
               </m:sub>
             </m:sSub>
@@ -13833,14 +13353,7 @@
             <w:rFonts w:ascii="Cambria Math" w:hAnsi="Cambria Math"/>
             <w:lang w:val="en"/>
           </w:rPr>
-          <m:t>=</m:t>
-        </m:r>
-        <m:r>
-          <w:rPr>
-            <w:rFonts w:ascii="Cambria Math" w:hAnsi="Cambria Math"/>
-            <w:lang w:val="en"/>
-          </w:rPr>
-          <m:t>f</m:t>
+          <m:t>=f</m:t>
         </m:r>
         <m:d>
           <m:dPr>
@@ -13878,14 +13391,7 @@
                     <w:rFonts w:ascii="Cambria Math" w:hAnsi="Cambria Math"/>
                     <w:lang w:val="en"/>
                   </w:rPr>
-                  <m:t>i</m:t>
-                </m:r>
-                <m:r>
-                  <w:rPr>
-                    <w:rFonts w:ascii="Cambria Math" w:hAnsi="Cambria Math"/>
-                    <w:lang w:val="en"/>
-                  </w:rPr>
-                  <m:t>,j</m:t>
+                  <m:t>i,j</m:t>
                 </m:r>
               </m:sub>
             </m:sSub>
@@ -14020,14 +13526,7 @@
                 <w:rFonts w:ascii="Cambria Math" w:hAnsi="Cambria Math"/>
                 <w:lang w:val="en"/>
               </w:rPr>
-              <m:t>i</m:t>
-            </m:r>
-            <m:r>
-              <w:rPr>
-                <w:rFonts w:ascii="Cambria Math" w:hAnsi="Cambria Math"/>
-                <w:lang w:val="en"/>
-              </w:rPr>
-              <m:t>,j</m:t>
+              <m:t>i,j</m:t>
             </m:r>
           </m:sub>
         </m:sSub>
@@ -14527,10 +14026,7 @@
         <w:t xml:space="preserve">. </w:t>
       </w:r>
       <w:r>
-        <w:t>C</w:t>
-      </w:r>
-      <w:r>
-        <w:t>ase Study</w:t>
+        <w:t>Case Study</w:t>
       </w:r>
       <w:r>
         <w:t xml:space="preserve"> Design</w:t>
@@ -14724,13 +14220,7 @@
         <w:rPr>
           <w:lang w:val="en"/>
         </w:rPr>
-        <w:t>h</w:t>
-      </w:r>
-      <w:r>
-        <w:rPr>
-          <w:lang w:val="en"/>
-        </w:rPr>
-        <w:t>ow do we apply the geo-intervention generation framework using available models and data?</w:t>
+        <w:t>how do we apply the geo-intervention generation framework using available models and data?</w:t>
       </w:r>
       <w:r>
         <w:rPr>
@@ -14975,13 +14465,7 @@
         <w:t>3</w:t>
       </w:r>
       <w:r>
-        <w:t>.</w:t>
-      </w:r>
-      <w:r>
-        <w:t>1</w:t>
-      </w:r>
-      <w:r>
-        <w:t xml:space="preserve">. </w:t>
+        <w:t xml:space="preserve">.1. </w:t>
       </w:r>
       <w:r>
         <w:t>Spatial Data</w:t>
@@ -15550,7 +15034,7 @@
               <w:fldChar w:fldCharType="begin"/>
             </w:r>
             <w:r>
-              <w:instrText xml:space="preserve"> ADDIN ZOTERO_ITEM CSL_CITATION {"citationID":"TwH8rbDD","properties":{"formattedCitation":"[65]","plainCitation":"[65]","noteIndex":0},"citationItems":[{"id":3195,"uris":["http://zotero.org/users/6749620/items/4ZCJFG3S"],"itemData":{"id":3195,"type":"webpage","container-title":"City of Toronto Open Data Portal","language":"en","title":"Toronto Centreline (TCL)","URL":"https://open.toronto.ca/dataset/","author":[{"literal":"City of Toronto"}],"accessed":{"date-parts":[["2024",12,30]]},"issued":{"date-parts":[["2023"]]},"citation-key":"cityoftorontoTorontoCentrelineTCL2023"}}],"schema":"https://github.com/citation-style-language/schema/raw/master/csl-citation.json"} </w:instrText>
+              <w:instrText xml:space="preserve"> ADDIN ZOTERO_ITEM CSL_CITATION {"citationID":"TwH8rbDD","properties":{"formattedCitation":"[65]","plainCitation":"[65]","noteIndex":0},"citationItems":[{"id":3195,"uris":["http://zotero.org/users/6749620/items/4ZCJFG3S"],"itemData":{"id":3195,"type":"webpage","container-title":"City of Toronto Open Data Portal","language":"en","title":"Toronto Centreline (TCL)","URL":"https://open.toronto.ca/dataset/toronto-centreline-tcl/","author":[{"literal":"City of Toronto"}],"accessed":{"date-parts":[["2024",12,30]]},"issued":{"date-parts":[["2023"]]},"citation-key":"cityoftorontoTorontoCentrelineTCL2023"}}],"schema":"https://github.com/citation-style-language/schema/raw/master/csl-citation.json"} </w:instrText>
             </w:r>
             <w:r>
               <w:fldChar w:fldCharType="separate"/>
@@ -15832,7 +15316,7 @@
               <w:fldChar w:fldCharType="begin"/>
             </w:r>
             <w:r>
-              <w:instrText xml:space="preserve"> ADDIN ZOTERO_ITEM CSL_CITATION {"citationID":"DD2umN6m","properties":{"formattedCitation":"[67]","plainCitation":"[67]","noteIndex":0},"citationItems":[{"id":3197,"uris":["http://zotero.org/users/6749620/items/8PKCWD9K"],"itemData":{"id":3197,"type":"webpage","container-title":"City of Toronto Open Data Portal","language":"en","title":"Traffic Volumes at Intersections for All Modes","URL":"https://open.toronto.ca/dataset/","author":[{"literal":"City of Toronto"}],"accessed":{"date-parts":[["2024",12,30]]},"issued":{"date-parts":[["2023"]]},"citation-key":"cityoftorontoTrafficVolumesIntersections2023"}}],"schema":"https://github.com/citation-style-language/schema/raw/master/csl-citation.json"} </w:instrText>
+              <w:instrText xml:space="preserve"> ADDIN ZOTERO_ITEM CSL_CITATION {"citationID":"DD2umN6m","properties":{"formattedCitation":"[67]","plainCitation":"[67]","noteIndex":0},"citationItems":[{"id":3197,"uris":["http://zotero.org/users/6749620/items/8PKCWD9K"],"itemData":{"id":3197,"type":"webpage","container-title":"City of Toronto Open Data Portal","language":"en","title":"Traffic Volumes at Intersections for All Modes (2010 to 2019)","URL":"https://open.toronto.ca/dataset/traffic-volumes-at-intersections-for-all-modes/","author":[{"literal":"City of Toronto"}],"accessed":{"date-parts":[["2024",12,30]]},"issued":{"date-parts":[["2023"]]},"citation-key":"cityoftorontoTrafficVolumesIntersections2023"}}],"schema":"https://github.com/citation-style-language/schema/raw/master/csl-citation.json"} </w:instrText>
             </w:r>
             <w:r>
               <w:fldChar w:fldCharType="separate"/>
@@ -15968,7 +15452,7 @@
               <w:fldChar w:fldCharType="begin"/>
             </w:r>
             <w:r>
-              <w:instrText xml:space="preserve"> ADDIN ZOTERO_ITEM CSL_CITATION {"citationID":"yrB504z2","properties":{"formattedCitation":"[68]","plainCitation":"[68]","noteIndex":0},"citationItems":[{"id":3199,"uris":["http://zotero.org/users/6749620/items/A4K9J7AQ"],"itemData":{"id":3199,"type":"webpage","container-title":"City of Toronto Open Data Portal","language":"en","title":"Automated Speed Enforcement Locations","URL":"https://open.toronto.ca/dataset/","author":[{"literal":"City of Toronto"}],"accessed":{"date-parts":[["2024",12,30]]},"issued":{"date-parts":[["2023"]]},"citation-key":"cityoftorontoAutomatedSpeedEnforcement2023"}}],"schema":"https://github.com/citation-style-language/schema/raw/master/csl-citation.json"} </w:instrText>
+              <w:instrText xml:space="preserve"> ADDIN ZOTERO_ITEM CSL_CITATION {"citationID":"yrB504z2","properties":{"formattedCitation":"[68]","plainCitation":"[68]","noteIndex":0},"citationItems":[{"id":3199,"uris":["http://zotero.org/users/6749620/items/A4K9J7AQ"],"itemData":{"id":3199,"type":"webpage","container-title":"City of Toronto Open Data Portal","language":"en","title":"Automated Speed Enforcement Locations","URL":"https://open.toronto.ca/dataset/automated-speed-enforcement-locations/","author":[{"literal":"City of Toronto"}],"accessed":{"date-parts":[["2024",12,30]]},"issued":{"date-parts":[["2023"]]},"citation-key":"cityoftorontoAutomatedSpeedEnforcement2023"}}],"schema":"https://github.com/citation-style-language/schema/raw/master/csl-citation.json"} </w:instrText>
             </w:r>
             <w:r>
               <w:fldChar w:fldCharType="separate"/>
@@ -16119,7 +15603,7 @@
               <w:fldChar w:fldCharType="begin"/>
             </w:r>
             <w:r>
-              <w:instrText xml:space="preserve"> ADDIN ZOTERO_ITEM CSL_CITATION {"citationID":"hfd7UzLX","properties":{"formattedCitation":"[69]","plainCitation":"[69]","noteIndex":0},"citationItems":[{"id":3201,"uris":["http://zotero.org/users/6749620/items/EUUJY2S9"],"itemData":{"id":3201,"type":"webpage","container-title":"City of Toronto Open Data Portal","language":"en","title":"School Safety Zone Watch Your Speed Program – Locations","URL":"https://open.toronto.ca/dataset/","author":[{"literal":"City of Toronto"}],"accessed":{"date-parts":[["2024",12,30]]},"issued":{"date-parts":[["2023"]]},"citation-key":"cityoftorontoSchoolSafetyZone2023"}}],"schema":"https://github.com/citation-style-language/schema/raw/master/csl-citation.json"} </w:instrText>
+              <w:instrText xml:space="preserve"> ADDIN ZOTERO_ITEM CSL_CITATION {"citationID":"hfd7UzLX","properties":{"formattedCitation":"[69]","plainCitation":"[69]","noteIndex":0},"citationItems":[{"id":3201,"uris":["http://zotero.org/users/6749620/items/EUUJY2S9"],"itemData":{"id":3201,"type":"webpage","container-title":"City of Toronto Open Data Portal","language":"en","title":"School Safety Zone Watch Your Speed Program – Locations","URL":"https://open.toronto.ca/dataset/school-safety-zone-watch-your-speed-program-locations/","author":[{"literal":"City of Toronto"}],"accessed":{"date-parts":[["2024",12,30]]},"issued":{"date-parts":[["2023"]]},"citation-key":"cityoftorontoSchoolSafetyZone2023"}}],"schema":"https://github.com/citation-style-language/schema/raw/master/csl-citation.json"} </w:instrText>
             </w:r>
             <w:r>
               <w:fldChar w:fldCharType="separate"/>
@@ -16264,7 +15748,7 @@
               <w:fldChar w:fldCharType="begin"/>
             </w:r>
             <w:r>
-              <w:instrText xml:space="preserve"> ADDIN ZOTERO_ITEM CSL_CITATION {"citationID":"q7Lat5Wk","properties":{"formattedCitation":"[70]","plainCitation":"[70]","noteIndex":0},"citationItems":[{"id":3203,"uris":["http://zotero.org/users/6749620/items/E9GJETRN"],"itemData":{"id":3203,"type":"webpage","container-title":"City of Toronto Open Data Portal","language":"en","title":"Red Light Cameras","URL":"https://open.toronto.ca/dataset/","author":[{"literal":"City of Toronto"}],"accessed":{"date-parts":[["2024",12,30]]},"issued":{"date-parts":[["2023"]]},"citation-key":"cityoftorontoRedLightCameras2023"}}],"schema":"https://github.com/citation-style-language/schema/raw/master/csl-citation.json"} </w:instrText>
+              <w:instrText xml:space="preserve"> ADDIN ZOTERO_ITEM CSL_CITATION {"citationID":"q7Lat5Wk","properties":{"formattedCitation":"[70]","plainCitation":"[70]","noteIndex":0},"citationItems":[{"id":3203,"uris":["http://zotero.org/users/6749620/items/E9GJETRN"],"itemData":{"id":3203,"type":"webpage","container-title":"City of Toronto Open Data Portal","language":"en","title":"Red Light Cameras","URL":"https://open.toronto.ca/dataset/red-light-cameras/","author":[{"literal":"City of Toronto"}],"accessed":{"date-parts":[["2024",12,30]]},"issued":{"date-parts":[["2023"]]},"citation-key":"cityoftorontoRedLightCameras2023"}}],"schema":"https://github.com/citation-style-language/schema/raw/master/csl-citation.json"} </w:instrText>
             </w:r>
             <w:r>
               <w:fldChar w:fldCharType="separate"/>
@@ -16404,7 +15888,7 @@
               <w:fldChar w:fldCharType="begin"/>
             </w:r>
             <w:r>
-              <w:instrText xml:space="preserve"> ADDIN ZOTERO_ITEM CSL_CITATION {"citationID":"SFG5N6hz","properties":{"formattedCitation":"[71]","plainCitation":"[71]","noteIndex":0},"citationItems":[{"id":3205,"uris":["http://zotero.org/users/6749620/items/M5YQZHME"],"itemData":{"id":3205,"type":"webpage","container-title":"City of Toronto Open Data Portal","language":"en","title":"Police Facility Locations","URL":"https://open.toronto.ca/dataset/","author":[{"literal":"City of Toronto"}],"accessed":{"date-parts":[["2024",12,30]]},"issued":{"date-parts":[["2023"]]},"citation-key":"cityoftorontoPoliceFacilityLocations2023"}}],"schema":"https://github.com/citation-style-language/schema/raw/master/csl-citation.json"} </w:instrText>
+              <w:instrText xml:space="preserve"> ADDIN ZOTERO_ITEM CSL_CITATION {"citationID":"SFG5N6hz","properties":{"formattedCitation":"[71]","plainCitation":"[71]","noteIndex":0},"citationItems":[{"id":3205,"uris":["http://zotero.org/users/6749620/items/M5YQZHME"],"itemData":{"id":3205,"type":"webpage","container-title":"City of Toronto Open Data Portal","language":"en","title":"Police Facility Locations","URL":"https://open.toronto.ca/dataset/police-facility-locations/","author":[{"literal":"City of Toronto"}],"accessed":{"date-parts":[["2024",12,30]]},"issued":{"date-parts":[["2023"]]},"citation-key":"cityoftorontoPoliceFacilityLocations2023"}}],"schema":"https://github.com/citation-style-language/schema/raw/master/csl-citation.json"} </w:instrText>
             </w:r>
             <w:r>
               <w:fldChar w:fldCharType="separate"/>
@@ -16538,7 +16022,7 @@
               <w:fldChar w:fldCharType="begin"/>
             </w:r>
             <w:r>
-              <w:instrText xml:space="preserve"> ADDIN ZOTERO_ITEM CSL_CITATION {"citationID":"IOTt1QZV","properties":{"formattedCitation":"[72]","plainCitation":"[72]","noteIndex":0},"citationItems":[{"id":3207,"uris":["http://zotero.org/users/6749620/items/CEETX8F6"],"itemData":{"id":3207,"type":"webpage","container-title":"City of Toronto Open Data Portal","language":"en","title":"Ambulance Station Locations","URL":"https://open.toronto.ca/dataset/","author":[{"literal":"City of Toronto"}],"accessed":{"date-parts":[["2024",12,30]]},"issued":{"date-parts":[["2023"]]},"citation-key":"cityoftorontoAmbulanceStationLocations2023"}}],"schema":"https://github.com/citation-style-language/schema/raw/master/csl-citation.json"} </w:instrText>
+              <w:instrText xml:space="preserve"> ADDIN ZOTERO_ITEM CSL_CITATION {"citationID":"IOTt1QZV","properties":{"formattedCitation":"[72]","plainCitation":"[72]","noteIndex":0},"citationItems":[{"id":3207,"uris":["http://zotero.org/users/6749620/items/CEETX8F6"],"itemData":{"id":3207,"type":"webpage","container-title":"City of Toronto Open Data Portal","language":"en","title":"Ambulance Station Locations","URL":"https://open.toronto.ca/dataset/ambulance-station-locations/","author":[{"literal":"City of Toronto"}],"accessed":{"date-parts":[["2024",12,30]]},"issued":{"date-parts":[["2023"]]},"citation-key":"cityoftorontoAmbulanceStationLocations2023"}}],"schema":"https://github.com/citation-style-language/schema/raw/master/csl-citation.json"} </w:instrText>
             </w:r>
             <w:r>
               <w:fldChar w:fldCharType="separate"/>
@@ -16663,7 +16147,7 @@
               <w:fldChar w:fldCharType="begin"/>
             </w:r>
             <w:r>
-              <w:instrText xml:space="preserve"> ADDIN ZOTERO_ITEM CSL_CITATION {"citationID":"35T2AXWh","properties":{"formattedCitation":"[73]","plainCitation":"[73]","noteIndex":0},"citationItems":[{"id":3209,"uris":["http://zotero.org/users/6749620/items/IVV52WLC"],"itemData":{"id":3209,"type":"webpage","container-title":"City of Toronto Open Data Portal","language":"en","title":"Fire Hydrants","URL":"https://open.toronto.ca/dataset/","author":[{"literal":"City of Toronto"}],"accessed":{"date-parts":[["2024",12,30]]},"issued":{"date-parts":[["2023"]]},"citation-key":"cityoftorontoFireHydrants2023"}}],"schema":"https://github.com/citation-style-language/schema/raw/master/csl-citation.json"} </w:instrText>
+              <w:instrText xml:space="preserve"> ADDIN ZOTERO_ITEM CSL_CITATION {"citationID":"35T2AXWh","properties":{"formattedCitation":"[73]","plainCitation":"[73]","noteIndex":0},"citationItems":[{"id":3209,"uris":["http://zotero.org/users/6749620/items/IVV52WLC"],"itemData":{"id":3209,"type":"webpage","container-title":"City of Toronto Open Data Portal","language":"en","title":"Fire Hydrants","URL":"https://open.toronto.ca/dataset/fire-hydrants/","author":[{"literal":"City of Toronto"}],"accessed":{"date-parts":[["2024",12,30]]},"issued":{"date-parts":[["2023"]]},"citation-key":"cityoftorontoFireHydrants2023"}}],"schema":"https://github.com/citation-style-language/schema/raw/master/csl-citation.json"} </w:instrText>
             </w:r>
             <w:r>
               <w:fldChar w:fldCharType="separate"/>
@@ -16791,7 +16275,7 @@
               <w:fldChar w:fldCharType="begin"/>
             </w:r>
             <w:r>
-              <w:instrText xml:space="preserve"> ADDIN ZOTERO_ITEM CSL_CITATION {"citationID":"ZHYW3e4z","properties":{"formattedCitation":"[74]","plainCitation":"[74]","noteIndex":0},"citationItems":[{"id":3211,"uris":["http://zotero.org/users/6749620/items/79X2AVE8"],"itemData":{"id":3211,"type":"webpage","container-title":"City of Toronto Open Data Portal","language":"en","title":"Fire Facility Locations","URL":"https://open.toronto.ca/dataset/","author":[{"literal":"City of Toronto"}],"accessed":{"date-parts":[["2024",12,30]]},"issued":{"date-parts":[["2023"]]},"citation-key":"cityoftorontoFireFacilityLocations2023"}}],"schema":"https://github.com/citation-style-language/schema/raw/master/csl-citation.json"} </w:instrText>
+              <w:instrText xml:space="preserve"> ADDIN ZOTERO_ITEM CSL_CITATION {"citationID":"ZHYW3e4z","properties":{"formattedCitation":"[74]","plainCitation":"[74]","noteIndex":0},"citationItems":[{"id":3211,"uris":["http://zotero.org/users/6749620/items/79X2AVE8"],"itemData":{"id":3211,"type":"webpage","container-title":"City of Toronto Open Data Portal","language":"en","title":"Fire Facility Locations","URL":"https://open.toronto.ca/dataset/fire-station-locations/","author":[{"literal":"City of Toronto"}],"accessed":{"date-parts":[["2024",12,30]]},"issued":{"date-parts":[["2023"]]},"citation-key":"cityoftorontoFireFacilityLocations2023"}}],"schema":"https://github.com/citation-style-language/schema/raw/master/csl-citation.json"} </w:instrText>
             </w:r>
             <w:r>
               <w:fldChar w:fldCharType="separate"/>
@@ -16916,7 +16400,7 @@
               <w:fldChar w:fldCharType="begin"/>
             </w:r>
             <w:r>
-              <w:instrText xml:space="preserve"> ADDIN ZOTERO_ITEM CSL_CITATION {"citationID":"WJSoONC0","properties":{"formattedCitation":"[75]","plainCitation":"[75]","noteIndex":0},"citationItems":[{"id":3213,"uris":["http://zotero.org/users/6749620/items/GDGS8MSB"],"itemData":{"id":3213,"type":"webpage","container-title":"City of Toronto Open Data Portal","language":"en","title":"Renewable Energy Installations","URL":"https://open.toronto.ca/dataset/","author":[{"literal":"City of Toronto"}],"accessed":{"date-parts":[["2024",12,30]]},"issued":{"date-parts":[["2023"]]},"citation-key":"cityoftorontoRenewableEnergyInstallations2023"}}],"schema":"https://github.com/citation-style-language/schema/raw/master/csl-citation.json"} </w:instrText>
+              <w:instrText xml:space="preserve"> ADDIN ZOTERO_ITEM CSL_CITATION {"citationID":"WJSoONC0","properties":{"formattedCitation":"[75]","plainCitation":"[75]","noteIndex":0},"citationItems":[{"id":3213,"uris":["http://zotero.org/users/6749620/items/GDGS8MSB"],"itemData":{"id":3213,"type":"webpage","container-title":"City of Toronto Open Data Portal","language":"en","title":"Renewable Energy Installations","URL":"https://open.toronto.ca/dataset/renewable-energy-installations/","author":[{"literal":"City of Toronto"}],"accessed":{"date-parts":[["2024",12,30]]},"issued":{"date-parts":[["2023"]]},"citation-key":"cityoftorontoRenewableEnergyInstallations2023"}}],"schema":"https://github.com/citation-style-language/schema/raw/master/csl-citation.json"} </w:instrText>
             </w:r>
             <w:r>
               <w:fldChar w:fldCharType="separate"/>
@@ -17047,7 +16531,7 @@
               <w:fldChar w:fldCharType="begin"/>
             </w:r>
             <w:r>
-              <w:instrText xml:space="preserve"> ADDIN ZOTERO_ITEM CSL_CITATION {"citationID":"qCaS9pKD","properties":{"formattedCitation":"[76]","plainCitation":"[76]","noteIndex":0},"citationItems":[{"id":3215,"uris":["http://zotero.org/users/6749620/items/AL7GBGLT"],"itemData":{"id":3215,"type":"webpage","container-title":"City of Toronto Open Data Portal","language":"en","title":"Street Furniture - Bicycle Parking","URL":"https://open.toronto.ca/dataset/","author":[{"literal":"City of Toronto"}],"accessed":{"date-parts":[["2024",12,30]]},"issued":{"date-parts":[["2023"]]},"citation-key":"cityoftorontoStreetFurnitureBicycle2023"}}],"schema":"https://github.com/citation-style-language/schema/raw/master/csl-citation.json"} </w:instrText>
+              <w:instrText xml:space="preserve"> ADDIN ZOTERO_ITEM CSL_CITATION {"citationID":"qCaS9pKD","properties":{"formattedCitation":"[76]","plainCitation":"[76]","noteIndex":0},"citationItems":[{"id":3215,"uris":["http://zotero.org/users/6749620/items/AL7GBGLT"],"itemData":{"id":3215,"type":"webpage","container-title":"City of Toronto Open Data Portal","language":"en","title":"Street Furniture - Bicycle Parking","URL":"https://open.toronto.ca/dataset/street-furniture-bicycle-parking/","author":[{"literal":"City of Toronto"}],"accessed":{"date-parts":[["2024",12,30]]},"issued":{"date-parts":[["2023"]]},"citation-key":"cityoftorontoStreetFurnitureBicycle2023"}}],"schema":"https://github.com/citation-style-language/schema/raw/master/csl-citation.json"} </w:instrText>
             </w:r>
             <w:r>
               <w:fldChar w:fldCharType="separate"/>
@@ -17175,7 +16659,7 @@
               <w:fldChar w:fldCharType="begin"/>
             </w:r>
             <w:r>
-              <w:instrText xml:space="preserve"> ADDIN ZOTERO_ITEM CSL_CITATION {"citationID":"Z71gllNI","properties":{"formattedCitation":"[77]","plainCitation":"[77]","noteIndex":0},"citationItems":[{"id":3217,"uris":["http://zotero.org/users/6749620/items/KC32C9RQ"],"itemData":{"id":3217,"type":"webpage","container-title":"City of Toronto Open Data Portal","language":"en","title":"Street Furniture - Transit Shelter","URL":"https://open.toronto.ca/dataset/","author":[{"literal":"City of Toronto"}],"accessed":{"date-parts":[["2024",12,30]]},"issued":{"date-parts":[["2023"]]},"citation-key":"cityoftorontoStreetFurnitureTransit2023"}}],"schema":"https://github.com/citation-style-language/schema/raw/master/csl-citation.json"} </w:instrText>
+              <w:instrText xml:space="preserve"> ADDIN ZOTERO_ITEM CSL_CITATION {"citationID":"Z71gllNI","properties":{"formattedCitation":"[77]","plainCitation":"[77]","noteIndex":0},"citationItems":[{"id":3217,"uris":["http://zotero.org/users/6749620/items/KC32C9RQ"],"itemData":{"id":3217,"type":"webpage","container-title":"City of Toronto Open Data Portal","language":"en","title":"Street Furniture - Transit Shelter","URL":"https://open.toronto.ca/dataset/street-furniture-transit-shelter/","author":[{"literal":"City of Toronto"}],"accessed":{"date-parts":[["2024",12,30]]},"issued":{"date-parts":[["2023"]]},"citation-key":"cityoftorontoStreetFurnitureTransit2023"}}],"schema":"https://github.com/citation-style-language/schema/raw/master/csl-citation.json"} </w:instrText>
             </w:r>
             <w:r>
               <w:fldChar w:fldCharType="separate"/>
@@ -17314,7 +16798,7 @@
               <w:fldChar w:fldCharType="begin"/>
             </w:r>
             <w:r>
-              <w:instrText xml:space="preserve"> ADDIN ZOTERO_ITEM CSL_CITATION {"citationID":"Up7LnX1h","properties":{"formattedCitation":"[78]","plainCitation":"[78]","noteIndex":0},"citationItems":[{"id":3219,"uris":["http://zotero.org/users/6749620/items/6FAQQXRQ"],"itemData":{"id":3219,"type":"webpage","container-title":"City of Toronto Open Data Portal","language":"en","title":"Street Furniture - Information Pillar-Wayfinding Structure","URL":"https://open.toronto.ca/dataset/","author":[{"literal":"City of Toronto"}],"accessed":{"date-parts":[["2024",12,30]]},"issued":{"date-parts":[["2023"]]},"citation-key":"cityoftorontoStreetFurnitureInformation2023"}}],"schema":"https://github.com/citation-style-language/schema/raw/master/csl-citation.json"} </w:instrText>
+              <w:instrText xml:space="preserve"> ADDIN ZOTERO_ITEM CSL_CITATION {"citationID":"Up7LnX1h","properties":{"formattedCitation":"[78]","plainCitation":"[78]","noteIndex":0},"citationItems":[{"id":3219,"uris":["http://zotero.org/users/6749620/items/6FAQQXRQ"],"itemData":{"id":3219,"type":"webpage","container-title":"City of Toronto Open Data Portal","language":"en","title":"Street Furniture - Information Pillar-Wayfinding Structure","URL":"https://open.toronto.ca/dataset/street-furniture-information-pillar-wayfinding-structure/","author":[{"literal":"City of Toronto"}],"accessed":{"date-parts":[["2024",12,30]]},"issued":{"date-parts":[["2023"]]},"citation-key":"cityoftorontoStreetFurnitureInformation2023"}}],"schema":"https://github.com/citation-style-language/schema/raw/master/csl-citation.json"} </w:instrText>
             </w:r>
             <w:r>
               <w:fldChar w:fldCharType="separate"/>
@@ -17445,7 +16929,7 @@
               <w:fldChar w:fldCharType="begin"/>
             </w:r>
             <w:r>
-              <w:instrText xml:space="preserve"> ADDIN ZOTERO_ITEM CSL_CITATION {"citationID":"QN4xAOGD","properties":{"formattedCitation":"[79]","plainCitation":"[79]","noteIndex":0},"citationItems":[{"id":3221,"uris":["http://zotero.org/users/6749620/items/C7S3DA98"],"itemData":{"id":3221,"type":"webpage","container-title":"City of Toronto Open Data Portal","language":"en","title":"Street Furniture - Litter Receptacle","URL":"https://open.toronto.ca/dataset/","author":[{"literal":"City of Toronto"}],"accessed":{"date-parts":[["2024",12,30]]},"issued":{"date-parts":[["2023"]]},"citation-key":"cityoftorontoStreetFurnitureLitter2023"}}],"schema":"https://github.com/citation-style-language/schema/raw/master/csl-citation.json"} </w:instrText>
+              <w:instrText xml:space="preserve"> ADDIN ZOTERO_ITEM CSL_CITATION {"citationID":"QN4xAOGD","properties":{"formattedCitation":"[79]","plainCitation":"[79]","noteIndex":0},"citationItems":[{"id":3221,"uris":["http://zotero.org/users/6749620/items/C7S3DA98"],"itemData":{"id":3221,"type":"webpage","container-title":"City of Toronto Open Data Portal","language":"en","title":"Street Furniture - Litter Receptacle","URL":"https://open.toronto.ca/dataset/street-furniture-litter-receptacle/","author":[{"literal":"City of Toronto"}],"accessed":{"date-parts":[["2024",12,30]]},"issued":{"date-parts":[["2023"]]},"citation-key":"cityoftorontoStreetFurnitureLitter2023"}}],"schema":"https://github.com/citation-style-language/schema/raw/master/csl-citation.json"} </w:instrText>
             </w:r>
             <w:r>
               <w:fldChar w:fldCharType="separate"/>
@@ -17576,7 +17060,7 @@
               <w:fldChar w:fldCharType="begin"/>
             </w:r>
             <w:r>
-              <w:instrText xml:space="preserve"> ADDIN ZOTERO_ITEM CSL_CITATION {"citationID":"7xpmxqMl","properties":{"formattedCitation":"[80]","plainCitation":"[80]","noteIndex":0},"citationItems":[{"id":3223,"uris":["http://zotero.org/users/6749620/items/ATK5QTMP"],"itemData":{"id":3223,"type":"webpage","container-title":"City of Toronto Open Data Portal","language":"en","title":"School Locations - All Types","URL":"https://open.toronto.ca/dataset/","author":[{"literal":"City of Toronto"}],"accessed":{"date-parts":[["2024",12,30]]},"issued":{"date-parts":[["2023"]]},"citation-key":"cityoftorontoSchoolLocationsAll2023"}}],"schema":"https://github.com/citation-style-language/schema/raw/master/csl-citation.json"} </w:instrText>
+              <w:instrText xml:space="preserve"> ADDIN ZOTERO_ITEM CSL_CITATION {"citationID":"7xpmxqMl","properties":{"formattedCitation":"[80]","plainCitation":"[80]","noteIndex":0},"citationItems":[{"id":3223,"uris":["http://zotero.org/users/6749620/items/ATK5QTMP"],"itemData":{"id":3223,"type":"webpage","container-title":"City of Toronto Open Data Portal","language":"en","title":"School Locations - All Types","URL":"https://open.toronto.ca/dataset/school-locations-all-types/","author":[{"literal":"City of Toronto"}],"accessed":{"date-parts":[["2024",12,30]]},"issued":{"date-parts":[["2023"]]},"citation-key":"cityoftorontoSchoolLocationsAll2023"}}],"schema":"https://github.com/citation-style-language/schema/raw/master/csl-citation.json"} </w:instrText>
             </w:r>
             <w:r>
               <w:fldChar w:fldCharType="separate"/>
@@ -17701,7 +17185,7 @@
               <w:fldChar w:fldCharType="begin"/>
             </w:r>
             <w:r>
-              <w:instrText xml:space="preserve"> ADDIN ZOTERO_ITEM CSL_CITATION {"citationID":"8zk7QTC3","properties":{"formattedCitation":"[81]","plainCitation":"[81]","noteIndex":0},"citationItems":[{"id":3225,"uris":["http://zotero.org/users/6749620/items/SZVMZEVD"],"itemData":{"id":3225,"type":"webpage","container-title":"City of Toronto Open Data Portal","language":"en","title":"Licensed Child Care Centres","URL":"https://open.toronto.ca/dataset/","author":[{"literal":"City of Toronto"}],"accessed":{"date-parts":[["2024",12,30]]},"issued":{"date-parts":[["2023"]]},"citation-key":"cityoftorontoLicensedChildCare2023"}}],"schema":"https://github.com/citation-style-language/schema/raw/master/csl-citation.json"} </w:instrText>
+              <w:instrText xml:space="preserve"> ADDIN ZOTERO_ITEM CSL_CITATION {"citationID":"8zk7QTC3","properties":{"formattedCitation":"[81]","plainCitation":"[81]","noteIndex":0},"citationItems":[{"id":3225,"uris":["http://zotero.org/users/6749620/items/SZVMZEVD"],"itemData":{"id":3225,"type":"webpage","container-title":"City of Toronto Open Data Portal","language":"en","title":"Licensed Child Care Centres","URL":"https://open.toronto.ca/dataset/child-care-licensed-child-care-spaces/","author":[{"literal":"City of Toronto"}],"accessed":{"date-parts":[["2024",12,30]]},"issued":{"date-parts":[["2023"]]},"citation-key":"cityoftorontoLicensedChildCare2023"}}],"schema":"https://github.com/citation-style-language/schema/raw/master/csl-citation.json"} </w:instrText>
             </w:r>
             <w:r>
               <w:fldChar w:fldCharType="separate"/>
@@ -17838,7 +17322,7 @@
               <w:fldChar w:fldCharType="begin"/>
             </w:r>
             <w:r>
-              <w:instrText xml:space="preserve"> ADDIN ZOTERO_ITEM CSL_CITATION {"citationID":"SSu8aWqc","properties":{"formattedCitation":"[82]","plainCitation":"[82]","noteIndex":0},"citationItems":[{"id":3227,"uris":["http://zotero.org/users/6749620/items/V4UT2BYA"],"itemData":{"id":3227,"type":"webpage","container-title":"City of Toronto Open Data Portal","language":"en","title":"Public Art","URL":"https://open.toronto.ca/dataset/","author":[{"literal":"City of Toronto"}],"accessed":{"date-parts":[["2024",12,30]]},"issued":{"date-parts":[["2023"]]},"citation-key":"cityoftorontoPublicArt2023"}}],"schema":"https://github.com/citation-style-language/schema/raw/master/csl-citation.json"} </w:instrText>
+              <w:instrText xml:space="preserve"> ADDIN ZOTERO_ITEM CSL_CITATION {"citationID":"SSu8aWqc","properties":{"formattedCitation":"[82]","plainCitation":"[82]","noteIndex":0},"citationItems":[{"id":3227,"uris":["http://zotero.org/users/6749620/items/V4UT2BYA"],"itemData":{"id":3227,"type":"webpage","container-title":"City of Toronto Open Data Portal","language":"en","title":"Public Art","URL":"https://open.toronto.ca/dataset/public-art/","author":[{"literal":"City of Toronto"}],"accessed":{"date-parts":[["2024",12,30]]},"issued":{"date-parts":[["2023"]]},"citation-key":"cityoftorontoPublicArt2023"}}],"schema":"https://github.com/citation-style-language/schema/raw/master/csl-citation.json"} </w:instrText>
             </w:r>
             <w:r>
               <w:fldChar w:fldCharType="separate"/>
@@ -17972,7 +17456,7 @@
               <w:fldChar w:fldCharType="begin"/>
             </w:r>
             <w:r>
-              <w:instrText xml:space="preserve"> ADDIN ZOTERO_ITEM CSL_CITATION {"citationID":"yz4rexhb","properties":{"formattedCitation":"[83]","plainCitation":"[83]","noteIndex":0},"citationItems":[{"id":3229,"uris":["http://zotero.org/users/6749620/items/IBC8DRQ4"],"itemData":{"id":3229,"type":"webpage","container-title":"City of Toronto Open Data Portal","language":"en","title":"Cultural Hotspot - Points of Interest","URL":"https://open.toronto.ca/dataset/","author":[{"literal":"City of Toronto"}],"accessed":{"date-parts":[["2024",12,30]]},"issued":{"date-parts":[["2023"]]},"citation-key":"cityoftorontoCulturalHotspotPoints2023"}}],"schema":"https://github.com/citation-style-language/schema/raw/master/csl-citation.json"} </w:instrText>
+              <w:instrText xml:space="preserve"> ADDIN ZOTERO_ITEM CSL_CITATION {"citationID":"yz4rexhb","properties":{"formattedCitation":"[83]","plainCitation":"[83]","noteIndex":0},"citationItems":[{"id":3229,"uris":["http://zotero.org/users/6749620/items/IBC8DRQ4"],"itemData":{"id":3229,"type":"webpage","container-title":"City of Toronto Open Data Portal","language":"en","title":"Cultural Hotspot - Points of Interest","URL":"https://open.toronto.ca/dataset/cultural-hotspot-points-of-interest/","author":[{"literal":"City of Toronto"}],"accessed":{"date-parts":[["2024",12,30]]},"issued":{"date-parts":[["2023"]]},"citation-key":"cityoftorontoCulturalHotspotPoints2023"}}],"schema":"https://github.com/citation-style-language/schema/raw/master/csl-citation.json"} </w:instrText>
             </w:r>
             <w:r>
               <w:fldChar w:fldCharType="separate"/>
@@ -18101,7 +17585,7 @@
               <w:fldChar w:fldCharType="begin"/>
             </w:r>
             <w:r>
-              <w:instrText xml:space="preserve"> ADDIN ZOTERO_ITEM CSL_CITATION {"citationID":"IKiLR20W","properties":{"formattedCitation":"[84]","plainCitation":"[84]","noteIndex":0},"citationItems":[{"id":3231,"uris":["http://zotero.org/users/6749620/items/5HEVKMQQ"],"itemData":{"id":3231,"type":"webpage","container-title":"City of Toronto Open Data Portal","language":"en","title":"Places of Worship","URL":"https://open.toronto.ca/dataset/","author":[{"literal":"City of Toronto"}],"accessed":{"date-parts":[["2024",12,30]]},"issued":{"date-parts":[["2023"]]},"citation-key":"cityoftorontoPlacesWorship2023"}}],"schema":"https://github.com/citation-style-language/schema/raw/master/csl-citation.json"} </w:instrText>
+              <w:instrText xml:space="preserve"> ADDIN ZOTERO_ITEM CSL_CITATION {"citationID":"IKiLR20W","properties":{"formattedCitation":"[84]","plainCitation":"[84]","noteIndex":0},"citationItems":[{"id":3231,"uris":["http://zotero.org/users/6749620/items/5HEVKMQQ"],"itemData":{"id":3231,"type":"webpage","container-title":"City of Toronto Open Data Portal","language":"en","title":"Places of Worship","URL":"https://open.toronto.ca/dataset/places-of-worship/","author":[{"literal":"City of Toronto"}],"accessed":{"date-parts":[["2024",12,30]]},"issued":{"date-parts":[["2023"]]},"citation-key":"cityoftorontoPlacesWorship2023"}}],"schema":"https://github.com/citation-style-language/schema/raw/master/csl-citation.json"} </w:instrText>
             </w:r>
             <w:r>
               <w:fldChar w:fldCharType="separate"/>
@@ -18367,25 +17851,7 @@
         <w:rPr>
           <w:lang w:val="en"/>
         </w:rPr>
-        <w:t>W</w:t>
-      </w:r>
-      <w:r>
-        <w:rPr>
-          <w:lang w:val="en"/>
-        </w:rPr>
-        <w:t>e spatially aggregated the 21 datasets into regularized grids of 10 by 10, 40 by 40, and 80 by 80 cells</w:t>
-      </w:r>
-      <w:r>
-        <w:rPr>
-          <w:lang w:val="en"/>
-        </w:rPr>
-        <w:t xml:space="preserve"> to improve interpretability and provide simpler visualization of the results. </w:t>
-      </w:r>
-      <w:r>
-        <w:rPr>
-          <w:lang w:val="en"/>
-        </w:rPr>
-        <w:t xml:space="preserve"> Inside of each cell, spatial entities from each dataset had all variables (columns) aggregated by the following statistics: </w:t>
+        <w:t xml:space="preserve">We spatially aggregated the 21 datasets into regularized grids of 10 by 10, 40 by 40, and 80 by 80 cells to improve interpretability and provide simpler visualization of the results.  Inside of each cell, spatial entities from each dataset had all variables (columns) aggregated by the following statistics: </w:t>
       </w:r>
       <w:r>
         <w:t>sum, mean, median, min, max, variance, skew, standard deviation, standard error of the mean, and mean absolute deviation</w:t>
@@ -18838,13 +18304,7 @@
         <w:t>3</w:t>
       </w:r>
       <w:r>
-        <w:t>.</w:t>
-      </w:r>
-      <w:r>
-        <w:t>2</w:t>
-      </w:r>
-      <w:r>
-        <w:t xml:space="preserve">. </w:t>
+        <w:t xml:space="preserve">.2. </w:t>
       </w:r>
       <w:r>
         <w:t>Outcome Modelling</w:t>
@@ -19892,19 +19352,49 @@
         <w:rPr>
           <w:lang w:val="en"/>
         </w:rPr>
-        <w:t xml:space="preserve">For the constraints sub-component, we limited the variables for the </w:t>
-      </w:r>
-      <w:r>
-        <w:rPr>
-          <w:lang w:val="en"/>
-        </w:rPr>
-        <w:t xml:space="preserve">optimization algorithm to the top three most important modifiable infrastructure variables (determined by the variable importance metric), which was the top three of the </w:t>
-      </w:r>
-      <w:r>
-        <w:rPr>
-          <w:lang w:val="en"/>
-        </w:rPr>
-        <w:t xml:space="preserve">variables from the </w:t>
+        <w:t>For the constraints sub-component, we limited the</w:t>
+      </w:r>
+      <w:r>
+        <w:rPr>
+          <w:lang w:val="en"/>
+        </w:rPr>
+        <w:t xml:space="preserve"> number of optimization iterations to 100 and the </w:t>
+      </w:r>
+      <w:r>
+        <w:rPr>
+          <w:lang w:val="en"/>
+        </w:rPr>
+        <w:t>variables for the optimization algorithm to the top three most important modifiable infrastructure variables (determined by the variable importance metric), which was the top three</w:t>
+      </w:r>
+      <w:r>
+        <w:rPr>
+          <w:lang w:val="en"/>
+        </w:rPr>
+        <w:t xml:space="preserve"> most important</w:t>
+      </w:r>
+      <w:r>
+        <w:rPr>
+          <w:lang w:val="en"/>
+        </w:rPr>
+        <w:t xml:space="preserve"> </w:t>
+      </w:r>
+      <w:r>
+        <w:rPr>
+          <w:lang w:val="en"/>
+        </w:rPr>
+        <w:t xml:space="preserve">variables </w:t>
+      </w:r>
+      <w:r>
+        <w:rPr>
+          <w:lang w:val="en"/>
+        </w:rPr>
+        <w:t xml:space="preserve">of </w:t>
+      </w:r>
+      <w:r>
+        <w:rPr>
+          <w:lang w:val="en"/>
+        </w:rPr>
+        <w:t xml:space="preserve">the </w:t>
       </w:r>
       <w:r>
         <w:rPr>
@@ -20085,19 +19575,7 @@
         <w:rPr>
           <w:lang w:val="en"/>
         </w:rPr>
-        <w:t xml:space="preserve">ow do we model geo-interventions? </w:t>
-      </w:r>
-      <w:r>
-        <w:rPr>
-          <w:lang w:val="en"/>
-        </w:rPr>
-        <w:t xml:space="preserve">and </w:t>
-      </w:r>
-      <w:r>
-        <w:rPr>
-          <w:lang w:val="en"/>
-        </w:rPr>
-        <w:t xml:space="preserve">(Q2) </w:t>
+        <w:t xml:space="preserve">ow do we model geo-interventions? and (Q2) </w:t>
       </w:r>
       <w:r>
         <w:rPr>
@@ -20115,6 +19593,7 @@
         <w:rPr>
           <w:lang w:val="en"/>
         </w:rPr>
+        <w:lastRenderedPageBreak/>
         <w:t>interventions?</w:t>
       </w:r>
       <w:r>
@@ -20127,14 +19606,7 @@
         <w:rPr>
           <w:lang w:val="en"/>
         </w:rPr>
-        <w:t xml:space="preserve">For question (Q1), the framework structured a data modelling process to </w:t>
-      </w:r>
-      <w:r>
-        <w:rPr>
-          <w:lang w:val="en"/>
-        </w:rPr>
-        <w:lastRenderedPageBreak/>
-        <w:t>create prediction models for a target outcome associated with potential geo-interventions, while</w:t>
+        <w:t>For question (Q1), the framework structured a data modelling process to create prediction models for a target outcome associated with potential geo-interventions, while</w:t>
       </w:r>
       <w:r>
         <w:rPr>
@@ -20200,13 +19672,7 @@
         <w:rPr>
           <w:lang w:val="en"/>
         </w:rPr>
-        <w:t>h</w:t>
-      </w:r>
-      <w:r>
-        <w:rPr>
-          <w:lang w:val="en"/>
-        </w:rPr>
-        <w:t>ow do we apply the geo-intervention generation framework using available models and data?</w:t>
+        <w:t>how do we apply the geo-intervention generation framework using available models and data?</w:t>
       </w:r>
       <w:r>
         <w:rPr>
@@ -20308,16 +19774,47 @@
       <w:r>
         <w:t>.</w:t>
       </w:r>
+      <w:r>
+        <w:t xml:space="preserve"> </w:t>
+      </w:r>
+      <w:r>
+        <w:t>The Python code for the minimal examples is available at</w:t>
+      </w:r>
+      <w:r>
+        <w:t xml:space="preserve"> </w:t>
+      </w:r>
+      <w:r>
+        <w:fldChar w:fldCharType="begin"/>
+      </w:r>
+      <w:r>
+        <w:instrText xml:space="preserve"> ADDIN ZOTERO_ITEM CSL_CITATION {"citationID":"akufekauhh","properties":{"formattedCitation":"[95]","plainCitation":"[95]","noteIndex":0},"citationItems":[{"id":3241,"uris":["http://zotero.org/users/6749620/items/J7ZPSY2Q"],"itemData":{"id":3241,"type":"webpage","license":"MIT","title":"Example: Geo-intervention Modelling Framework","URL":"https://github.com/rrwen/geointerv-paper/blob/main/src/example.ipynb","author":[{"literal":"Richard Wen"}],"accessed":{"date-parts":[["2025",2,4]]},"issued":{"date-parts":[["2025",2,4]]},"citation-key":"richardwenExampleGeointerventionModelling2025"}}],"schema":"https://github.com/citation-style-language/schema/raw/master/csl-citation.json"} </w:instrText>
+      </w:r>
+      <w:r>
+        <w:fldChar w:fldCharType="separate"/>
+      </w:r>
+      <w:r>
+        <w:t>[95]</w:t>
+      </w:r>
+      <w:r>
+        <w:fldChar w:fldCharType="end"/>
+      </w:r>
+      <w:r>
+        <w:t>.</w:t>
+      </w:r>
     </w:p>
     <w:p>
       <w:pPr>
         <w:pStyle w:val="MDPI52figure"/>
+        <w:jc w:val="right"/>
       </w:pPr>
       <w:r>
+        <w:rPr>
+          <w:noProof/>
+        </w:rPr>
         <w:drawing>
-          <wp:inline distT="0" distB="0" distL="0" distR="0" wp14:anchorId="5EC69434" wp14:editId="5715FAAD">
-            <wp:extent cx="3441521" cy="2355146"/>
-            <wp:effectExtent l="0" t="0" r="635" b="0"/>
+          <wp:inline distT="0" distB="0" distL="0" distR="0" wp14:anchorId="5EC69434" wp14:editId="6BBFBB45">
+            <wp:extent cx="4961326" cy="3395198"/>
+            <wp:effectExtent l="0" t="0" r="4445" b="0"/>
             <wp:docPr id="224512040" name="Picture 6"/>
             <wp:cNvGraphicFramePr>
               <a:graphicFrameLocks xmlns:a="http://schemas.openxmlformats.org/drawingml/2006/main" noChangeAspect="1"/>
@@ -20338,7 +19835,7 @@
                   <pic:spPr>
                     <a:xfrm>
                       <a:off x="0" y="0"/>
-                      <a:ext cx="3441521" cy="2355146"/>
+                      <a:ext cx="4996982" cy="3419599"/>
                     </a:xfrm>
                     <a:prstGeom prst="rect">
                       <a:avLst/>
@@ -20438,25 +19935,7 @@
         </w:rPr>
       </w:pPr>
       <w:r>
-        <w:t>3</w:t>
-      </w:r>
-      <w:r>
-        <w:t>.</w:t>
-      </w:r>
-      <w:r>
-        <w:t>1</w:t>
-      </w:r>
-      <w:r>
-        <w:t>.</w:t>
-      </w:r>
-      <w:r>
-        <w:t>1</w:t>
-      </w:r>
-      <w:r>
-        <w:t xml:space="preserve">. </w:t>
-      </w:r>
-      <w:r>
-        <w:t>Spatial Data Component</w:t>
+        <w:t>3.1.1. Spatial Data Component</w:t>
       </w:r>
     </w:p>
     <w:p>
@@ -20500,10 +19979,7 @@
         <w:t xml:space="preserve">sub-component </w:t>
       </w:r>
       <w:r>
-        <w:t xml:space="preserve">was optionally included as raster data can be processed into vector structured data with various GIS approaches </w:t>
-      </w:r>
-      <w:r>
-        <w:t xml:space="preserve">(e.g., polygon grids </w:t>
+        <w:t xml:space="preserve">was optionally included as raster data can be processed into vector structured data with various GIS approaches (e.g., polygon grids </w:t>
       </w:r>
       <w:r>
         <w:fldChar w:fldCharType="begin"/>
@@ -20575,7 +20051,11 @@
         <w:t xml:space="preserve"> geometries of spatial data, structured as ordered coordinates forming locations in the real-world</w:t>
       </w:r>
       <w:r>
-        <w:t xml:space="preserve">, while also containing several variables describing </w:t>
+        <w:t xml:space="preserve">, while also containing several </w:t>
+      </w:r>
+      <w:r>
+        <w:lastRenderedPageBreak/>
+        <w:t xml:space="preserve">variables describing </w:t>
       </w:r>
       <w:r>
         <w:t>phenomena, entities, and characteristics at these</w:t>
@@ -20741,11 +20221,7 @@
       </w:r>
       <w:proofErr w:type="spellEnd"/>
       <w:r>
-        <w:t xml:space="preserve"> of the nearest location, the length of the location entity, and </w:t>
-      </w:r>
-      <w:r>
-        <w:lastRenderedPageBreak/>
-        <w:t>the type of the location entity respectively</w:t>
+        <w:t xml:space="preserve"> of the nearest location, the length of the location entity, and the type of the location entity respectively</w:t>
       </w:r>
       <w:r>
         <w:t>.</w:t>
@@ -21024,14 +20500,7 @@
                 <w:b/>
                 <w:snapToGrid/>
               </w:rPr>
-              <w:t xml:space="preserve"> + </w:t>
-            </w:r>
-            <w:r>
-              <w:rPr>
-                <w:b/>
-                <w:snapToGrid/>
-              </w:rPr>
-              <w:t>X</w:t>
+              <w:t xml:space="preserve"> + X</w:t>
             </w:r>
             <w:r>
               <w:rPr>
@@ -22112,10 +21581,7 @@
         <w:fldChar w:fldCharType="end"/>
       </w:r>
       <w:r>
-        <w:t>, selecting the model with the best model metric value</w:t>
-      </w:r>
-      <w:r>
-        <w:t xml:space="preserve">) </w:t>
+        <w:t xml:space="preserve">, selecting the model with the best model metric value) </w:t>
       </w:r>
       <w:r>
         <w:rPr>
@@ -22993,16 +22459,7 @@
                 <w:sz w:val="16"/>
                 <w:szCs w:val="16"/>
               </w:rPr>
-              <w:t xml:space="preserve"> = </w:t>
-            </w:r>
-            <w:r>
-              <w:rPr>
-                <w:b/>
-                <w:snapToGrid/>
-                <w:sz w:val="16"/>
-                <w:szCs w:val="16"/>
-              </w:rPr>
-              <w:t>X</w:t>
+              <w:t xml:space="preserve"> = X</w:t>
             </w:r>
             <w:r>
               <w:rPr>
@@ -23160,16 +22617,7 @@
                 <w:sz w:val="16"/>
                 <w:szCs w:val="16"/>
               </w:rPr>
-              <w:t>… Type(</w:t>
-            </w:r>
-            <w:r>
-              <w:rPr>
-                <w:b/>
-                <w:snapToGrid/>
-                <w:sz w:val="16"/>
-                <w:szCs w:val="16"/>
-              </w:rPr>
-              <w:t>L</w:t>
+              <w:t>… Type(L</w:t>
             </w:r>
             <w:r>
               <w:rPr>
@@ -24096,7 +23544,14 @@
         <w:rPr>
           <w:lang w:val="en"/>
         </w:rPr>
-        <w:t xml:space="preserve"> limitations on the possible actions to optimize for based on prior knowledge.</w:t>
+        <w:t xml:space="preserve"> </w:t>
+      </w:r>
+      <w:r>
+        <w:rPr>
+          <w:lang w:val="en"/>
+        </w:rPr>
+        <w:lastRenderedPageBreak/>
+        <w:t>limitations on the possible actions to optimize for based on prior knowledge.</w:t>
       </w:r>
       <w:r>
         <w:rPr>
@@ -24138,14 +23593,7 @@
         <w:rPr>
           <w:lang w:val="en"/>
         </w:rPr>
-        <w:t xml:space="preserve"> These geo-interventions represented the most optimal actions for each of the locations to </w:t>
-      </w:r>
-      <w:r>
-        <w:rPr>
-          <w:lang w:val="en"/>
-        </w:rPr>
-        <w:lastRenderedPageBreak/>
-        <w:t>produce the optimal predicted outcomes, given the constraints set.</w:t>
+        <w:t xml:space="preserve"> These geo-interventions represented the most optimal actions for each of the locations to produce the optimal predicted outcomes, given the constraints set.</w:t>
       </w:r>
       <w:r>
         <w:rPr>
@@ -24277,15 +23725,7 @@
           <w:snapToGrid/>
           <w:vertAlign w:val="subscript"/>
         </w:rPr>
-        <w:t>i,</w:t>
-      </w:r>
-      <w:r>
-        <w:rPr>
-          <w:bCs/>
-          <w:snapToGrid/>
-          <w:vertAlign w:val="subscript"/>
-        </w:rPr>
-        <w:t>2</w:t>
+        <w:t>i,2</w:t>
       </w:r>
       <w:r>
         <w:rPr>
@@ -24377,17 +23817,7 @@
                 <w:rFonts w:ascii="Cambria Math" w:hAnsi="Cambria Math"/>
                 <w:snapToGrid/>
               </w:rPr>
-              <m:t>i,</m:t>
-            </m:r>
-            <m:r>
-              <m:rPr>
-                <m:sty m:val="bi"/>
-              </m:rPr>
-              <w:rPr>
-                <w:rFonts w:ascii="Cambria Math" w:hAnsi="Cambria Math"/>
-                <w:snapToGrid/>
-              </w:rPr>
-              <m:t>4</m:t>
+              <m:t>i,4</m:t>
             </m:r>
           </m:sub>
         </m:sSub>
@@ -24540,15 +23970,7 @@
           <w:snapToGrid/>
           <w:vertAlign w:val="subscript"/>
         </w:rPr>
-        <w:t>i,2</w:t>
-      </w:r>
-      <w:r>
-        <w:rPr>
-          <w:bCs/>
-          <w:snapToGrid/>
-          <w:vertAlign w:val="subscript"/>
-        </w:rPr>
-        <w:t xml:space="preserve"> </w:t>
+        <w:t xml:space="preserve">i,2 </w:t>
       </w:r>
       <w:r>
         <w:rPr>
@@ -25359,13 +24781,13 @@
       </w:tblPr>
       <w:tblGrid>
         <w:gridCol w:w="127"/>
-        <w:gridCol w:w="750"/>
-        <w:gridCol w:w="954"/>
-        <w:gridCol w:w="295"/>
-        <w:gridCol w:w="295"/>
+        <w:gridCol w:w="746"/>
+        <w:gridCol w:w="949"/>
+        <w:gridCol w:w="294"/>
+        <w:gridCol w:w="294"/>
         <w:gridCol w:w="1838"/>
-        <w:gridCol w:w="2000"/>
-        <w:gridCol w:w="1599"/>
+        <w:gridCol w:w="2001"/>
+        <w:gridCol w:w="1609"/>
       </w:tblGrid>
       <w:tr>
         <w:tc>
@@ -25690,19 +25112,7 @@
                       <w:sz w:val="16"/>
                       <w:szCs w:val="16"/>
                     </w:rPr>
-                    <m:t>i,</m:t>
-                  </m:r>
-                  <m:r>
-                    <m:rPr>
-                      <m:sty m:val="bi"/>
-                    </m:rPr>
-                    <w:rPr>
-                      <w:rFonts w:ascii="Cambria Math" w:hAnsi="Cambria Math"/>
-                      <w:snapToGrid/>
-                      <w:sz w:val="16"/>
-                      <w:szCs w:val="16"/>
-                    </w:rPr>
-                    <m:t>4</m:t>
+                    <m:t>i,4</m:t>
                   </m:r>
                 </m:sub>
               </m:sSub>
@@ -26045,16 +25455,7 @@
                 <w:sz w:val="16"/>
                 <w:szCs w:val="16"/>
               </w:rPr>
-              <w:t xml:space="preserve"> </w:t>
-            </w:r>
-            <w:r>
-              <w:rPr>
-                <w:b/>
-                <w:snapToGrid/>
-                <w:sz w:val="16"/>
-                <w:szCs w:val="16"/>
-              </w:rPr>
-              <w:t xml:space="preserve">= </w:t>
+              <w:t xml:space="preserve"> = </w:t>
             </w:r>
             <w:proofErr w:type="gramStart"/>
             <w:r>
@@ -26133,19 +25534,7 @@
                       <w:sz w:val="16"/>
                       <w:szCs w:val="16"/>
                     </w:rPr>
-                    <m:t>i,</m:t>
-                  </m:r>
-                  <m:r>
-                    <m:rPr>
-                      <m:sty m:val="bi"/>
-                    </m:rPr>
-                    <w:rPr>
-                      <w:rFonts w:ascii="Cambria Math" w:hAnsi="Cambria Math"/>
-                      <w:snapToGrid/>
-                      <w:sz w:val="16"/>
-                      <w:szCs w:val="16"/>
-                    </w:rPr>
-                    <m:t>1</m:t>
+                    <m:t>i,1</m:t>
                   </m:r>
                 </m:sub>
               </m:sSub>
@@ -26702,13 +26091,17 @@
     <w:p>
       <w:pPr>
         <w:pStyle w:val="MDPI52figure"/>
+        <w:jc w:val="right"/>
       </w:pPr>
       <w:r>
+        <w:rPr>
+          <w:noProof/>
+        </w:rPr>
         <w:lastRenderedPageBreak/>
         <w:drawing>
-          <wp:inline distT="0" distB="0" distL="0" distR="0" wp14:anchorId="17F7A8F7" wp14:editId="234E314E">
-            <wp:extent cx="3376871" cy="4099502"/>
-            <wp:effectExtent l="0" t="0" r="1905" b="3175"/>
+          <wp:inline distT="0" distB="0" distL="0" distR="0" wp14:anchorId="17F7A8F7" wp14:editId="013D5387">
+            <wp:extent cx="5108955" cy="6195017"/>
+            <wp:effectExtent l="0" t="0" r="0" b="3175"/>
             <wp:docPr id="482265357" name="Picture 6"/>
             <wp:cNvGraphicFramePr>
               <a:graphicFrameLocks xmlns:a="http://schemas.openxmlformats.org/drawingml/2006/main" noChangeAspect="1"/>
@@ -26729,7 +26122,7 @@
                   <pic:spPr>
                     <a:xfrm>
                       <a:off x="0" y="0"/>
-                      <a:ext cx="3376871" cy="4099502"/>
+                      <a:ext cx="5108955" cy="6195017"/>
                     </a:xfrm>
                     <a:prstGeom prst="rect">
                       <a:avLst/>
@@ -26837,58 +26230,55 @@
         <w:rPr>
           <w:lang w:val="en"/>
         </w:rPr>
-        <w:t>1,488,148</w:t>
-      </w:r>
-      <w:r>
-        <w:rPr>
-          <w:lang w:val="en"/>
-        </w:rPr>
+        <w:t xml:space="preserve">1,488,148 </w:t>
+      </w:r>
+      <w:r>
+        <w:t xml:space="preserve">spatial </w:t>
+      </w:r>
+      <w:r>
+        <w:t>objects (rows) were collected from the City of Toronto Open Data Portal and Toronto Police Service Public Safety Data Portal related to infrastructure, socio</w:t>
+      </w:r>
+      <w:r>
+        <w:t>-</w:t>
+      </w:r>
+      <w:r>
+        <w:t>demographic</w:t>
+      </w:r>
+      <w:r>
+        <w:t>s</w:t>
+      </w:r>
+      <w:r>
+        <w:t>, transportation, and crime</w:t>
+      </w:r>
+      <w:r>
+        <w:t xml:space="preserve"> (Table 2). </w:t>
+      </w:r>
+      <w:r>
+        <w:t xml:space="preserve">These datasets were </w:t>
+      </w:r>
+      <w:r>
+        <w:t xml:space="preserve">spatially </w:t>
+      </w:r>
+      <w:r>
+        <w:t>aggregated</w:t>
+      </w:r>
+      <w:r>
+        <w:t xml:space="preserve"> (see Table 3)</w:t>
+      </w:r>
+      <w:r>
+        <w:t xml:space="preserve"> in</w:t>
+      </w:r>
+      <w:r>
+        <w:t>to</w:t>
+      </w:r>
+      <w:r>
+        <w:t xml:space="preserve"> regularized grids based on spatial resolutions of 10 by 10, 40 by 40, and 80 by 80 grid cells.</w:t>
+      </w:r>
+      <w:r>
         <w:t xml:space="preserve"> </w:t>
       </w:r>
       <w:r>
-        <w:t xml:space="preserve">spatial </w:t>
-      </w:r>
-      <w:r>
-        <w:t>objects (rows) were collected from the City of Toronto Open Data Portal and Toronto Police Service Public Safety Data Portal related to infrastructure, socio</w:t>
-      </w:r>
-      <w:r>
-        <w:t>-</w:t>
-      </w:r>
-      <w:r>
-        <w:t>demographic</w:t>
-      </w:r>
-      <w:r>
-        <w:t>s</w:t>
-      </w:r>
-      <w:r>
-        <w:t>, transportation, and crime</w:t>
-      </w:r>
-      <w:r>
-        <w:t xml:space="preserve"> (Table 2). </w:t>
-      </w:r>
-      <w:r>
-        <w:t xml:space="preserve">These datasets were </w:t>
-      </w:r>
-      <w:r>
-        <w:t xml:space="preserve">spatially </w:t>
-      </w:r>
-      <w:r>
-        <w:t>aggregated</w:t>
-      </w:r>
-      <w:r>
-        <w:t xml:space="preserve"> in</w:t>
-      </w:r>
-      <w:r>
-        <w:t>to</w:t>
-      </w:r>
-      <w:r>
-        <w:t xml:space="preserve"> regularized grids based on spatial resolutions of 10 by 10, 40 by 40, and 80 by 80 grid cells.</w:t>
-      </w:r>
-      <w:r>
-        <w:t xml:space="preserve"> See Table 3 for aggregation behavior based on geometry and data type.</w:t>
-      </w:r>
-      <w:r>
-        <w:t xml:space="preserve"> The</w:t>
+        <w:t>The</w:t>
       </w:r>
       <w:r>
         <w:t xml:space="preserve"> 10 by 10, 40 by 40, and 80 by 80</w:t>
@@ -26900,7 +26290,13 @@
         <w:t>grids</w:t>
       </w:r>
       <w:r>
-        <w:t xml:space="preserve"> had 1417 aggregate variables (</w:t>
+        <w:t xml:space="preserve"> had 1</w:t>
+      </w:r>
+      <w:r>
+        <w:t>614</w:t>
+      </w:r>
+      <w:r>
+        <w:t xml:space="preserve"> aggregate variables (</w:t>
       </w:r>
       <w:r>
         <w:t>from 5</w:t>
@@ -26912,7 +26308,13 @@
         <w:t xml:space="preserve"> variables originally in the datasets</w:t>
       </w:r>
       <w:r>
-        <w:t>), and 100, 1600, and 6400 cells (rows), respectively.</w:t>
+        <w:t xml:space="preserve">), </w:t>
+      </w:r>
+      <w:r>
+        <w:t>with</w:t>
+      </w:r>
+      <w:r>
+        <w:t xml:space="preserve"> 100, 1600, and 6400 cells (rows), respectively.</w:t>
       </w:r>
       <w:r>
         <w:t xml:space="preserve"> Each of these grids of data were used as input for outcome modelling, where the total number of MVCs in each cell was used as the outcome variable.</w:t>
@@ -26982,38 +26384,51 @@
       </w:r>
       <w:proofErr w:type="spellEnd"/>
       <w:r>
-        <w:t xml:space="preserve"> were built for each of the three set of standardized grids, which produced six models (two for each 10 by 10, 40 by 40, and 80 by 80 grid).</w:t>
-      </w:r>
-      <w:r>
-        <w:t xml:space="preserve"> </w:t>
-      </w:r>
-      <w:r>
-        <w:t>Out of the six models,</w:t>
-      </w:r>
-      <w:r>
-        <w:t xml:space="preserve"> the</w:t>
-      </w:r>
-      <w:r>
-        <w:t xml:space="preserve"> 80 by 80 cell </w:t>
-      </w:r>
+        <w:t xml:space="preserve"> were built for each of the three set of standardized grids, which produced six models (two for each 10 by 10, 40 by </w:t>
+      </w:r>
+      <w:r>
+        <w:lastRenderedPageBreak/>
+        <w:t>40, and 80 by 80 grid).</w:t>
+      </w:r>
+      <w:r>
+        <w:t xml:space="preserve"> Out of the six models, the </w:t>
+      </w:r>
+      <w:r>
+        <w:t>4</w:t>
+      </w:r>
+      <w:r>
+        <w:t xml:space="preserve">0 by </w:t>
+      </w:r>
+      <w:r>
+        <w:t>4</w:t>
+      </w:r>
+      <w:r>
+        <w:t xml:space="preserve">0 cell </w:t>
+      </w:r>
+      <w:proofErr w:type="spellStart"/>
       <w:r>
         <w:rPr>
           <w:i/>
           <w:iCs/>
         </w:rPr>
-        <w:t>auto-</w:t>
-      </w:r>
-      <w:proofErr w:type="spellStart"/>
+        <w:t>tpot</w:t>
+      </w:r>
+      <w:proofErr w:type="spellEnd"/>
       <w:r>
         <w:rPr>
           <w:i/>
           <w:iCs/>
         </w:rPr>
-        <w:t>sklearn</w:t>
-      </w:r>
-      <w:proofErr w:type="spellEnd"/>
-      <w:r>
-        <w:t xml:space="preserve"> model had the best performance with the lowest MAE of 117.68 (an average difference of 117.68 between actual and predicted traffic collisions across all cells), while the 10 by 10 cell </w:t>
+        <w:t xml:space="preserve"> </w:t>
+      </w:r>
+      <w:r>
+        <w:t xml:space="preserve">model had the best performance </w:t>
+      </w:r>
+      <w:r>
+        <w:t xml:space="preserve">(MAE=105.87), </w:t>
+      </w:r>
+      <w:r>
+        <w:t xml:space="preserve">while the 10 by 10 cell </w:t>
       </w:r>
       <w:proofErr w:type="spellStart"/>
       <w:r>
@@ -27021,60 +26436,83 @@
           <w:i/>
           <w:iCs/>
         </w:rPr>
-        <w:t>tpot</w:t>
+        <w:t>autosklearn</w:t>
       </w:r>
       <w:proofErr w:type="spellEnd"/>
       <w:r>
-        <w:t xml:space="preserve"> model had the worst performance with the highest MAE of 630.08.</w:t>
-      </w:r>
-      <w:r>
-        <w:t xml:space="preserve"> </w:t>
-      </w:r>
-      <w:r>
-        <w:t>The performance of the six models is seen in</w:t>
-      </w:r>
-      <w:r>
-        <w:t xml:space="preserve"> Figure 5</w:t>
-      </w:r>
-      <w:r>
-        <w:t xml:space="preserve">, where the first part before the underscore indicates the </w:t>
+        <w:t xml:space="preserve"> model had the worst performance </w:t>
+      </w:r>
+      <w:r>
+        <w:t>(</w:t>
+      </w:r>
+      <w:r>
+        <w:t>MAE</w:t>
+      </w:r>
+      <w:r>
+        <w:t>=</w:t>
+      </w:r>
+      <w:r>
+        <w:t>1983</w:t>
+      </w:r>
+      <w:r>
+        <w:t>.8</w:t>
+      </w:r>
+      <w:r>
+        <w:t>)</w:t>
+      </w:r>
+      <w:r>
+        <w:t>.</w:t>
+      </w:r>
+      <w:r>
+        <w:t xml:space="preserve"> We note that the 80 by 80 cell </w:t>
       </w:r>
       <w:proofErr w:type="spellStart"/>
-      <w:r>
-        <w:t>AutoML</w:t>
-      </w:r>
-      <w:proofErr w:type="spellEnd"/>
-      <w:r>
-        <w:t xml:space="preserve"> model algorithm, and the second part after the underscore indicates the grid size (e.g., </w:t>
-      </w:r>
       <w:r>
         <w:rPr>
           <w:i/>
           <w:iCs/>
         </w:rPr>
-        <w:t>autosklearn_80</w:t>
-      </w:r>
-      <w:r>
-        <w:t xml:space="preserve"> is the 80 by 80 cell </w:t>
-      </w:r>
+        <w:t>tpot</w:t>
+      </w:r>
+      <w:proofErr w:type="spellEnd"/>
+      <w:r>
+        <w:t xml:space="preserve"> model had a very similar performance (MAE=111.94) to the 40 by 40 cell </w:t>
+      </w:r>
+      <w:proofErr w:type="spellStart"/>
       <w:r>
         <w:rPr>
           <w:i/>
           <w:iCs/>
         </w:rPr>
-        <w:t>auto-</w:t>
-      </w:r>
-      <w:proofErr w:type="spellStart"/>
-      <w:r>
-        <w:rPr>
-          <w:i/>
-          <w:iCs/>
-        </w:rPr>
-        <w:t>sklearn</w:t>
+        <w:t>tpot</w:t>
       </w:r>
       <w:proofErr w:type="spellEnd"/>
       <w:r>
-        <w:t xml:space="preserve"> model).</w:t>
+        <w:t xml:space="preserve"> </w:t>
+      </w:r>
+      <w:r>
+        <w:t>model and</w:t>
+      </w:r>
+      <w:r>
+        <w:t xml:space="preserve"> was chosen instead as the best model due to the higher spatial resolution (larger number of cells).</w:t>
+      </w:r>
+      <w:r>
+        <w:t xml:space="preserve"> </w:t>
+      </w:r>
+      <w:r>
+        <w:t>The performance of the six models</w:t>
+      </w:r>
+      <w:r>
+        <w:t xml:space="preserve"> by MAE</w:t>
+      </w:r>
+      <w:r>
+        <w:t xml:space="preserve"> is seen in</w:t>
+      </w:r>
+      <w:r>
+        <w:t xml:space="preserve"> Figure 5</w:t>
+      </w:r>
+      <w:r>
+        <w:t>.</w:t>
       </w:r>
     </w:p>
     <w:p>
@@ -27082,12 +26520,14 @@
         <w:pStyle w:val="MDPI52figure"/>
       </w:pPr>
       <w:r>
-        <w:lastRenderedPageBreak/>
+        <w:rPr>
+          <w:noProof/>
+        </w:rPr>
         <w:drawing>
-          <wp:inline distT="0" distB="0" distL="0" distR="0" wp14:anchorId="003B3579" wp14:editId="7E06BA81">
-            <wp:extent cx="3262475" cy="3245485"/>
-            <wp:effectExtent l="0" t="0" r="1905" b="5715"/>
-            <wp:docPr id="17" name="Picture 17" descr="Chart, bar chart&#10;&#10;Description automatically generated"/>
+          <wp:inline distT="0" distB="0" distL="0" distR="0" wp14:anchorId="003B3579" wp14:editId="3DD39F70">
+            <wp:extent cx="3262475" cy="2744364"/>
+            <wp:effectExtent l="0" t="0" r="1905" b="0"/>
+            <wp:docPr id="17" name="Picture 17"/>
             <wp:cNvGraphicFramePr>
               <a:graphicFrameLocks xmlns:a="http://schemas.openxmlformats.org/drawingml/2006/main" noChangeAspect="1"/>
             </wp:cNvGraphicFramePr>
@@ -27095,20 +26535,13 @@
               <a:graphicData uri="http://schemas.openxmlformats.org/drawingml/2006/picture">
                 <pic:pic xmlns:pic="http://schemas.openxmlformats.org/drawingml/2006/picture">
                   <pic:nvPicPr>
-                    <pic:cNvPr id="0" name="Picture 2" descr="Chart, bar chart&#10;&#10;Description automatically generated"/>
+                    <pic:cNvPr id="17" name="Picture 17"/>
                     <pic:cNvPicPr>
                       <a:picLocks/>
                     </pic:cNvPicPr>
                   </pic:nvPicPr>
                   <pic:blipFill>
-                    <a:blip r:embed="rId13">
-                      <a:extLst>
-                        <a:ext uri="{28A0092B-C50C-407E-A947-70E740481C1C}">
-                          <a14:useLocalDpi xmlns:a14="http://schemas.microsoft.com/office/drawing/2010/main" val="0"/>
-                        </a:ext>
-                      </a:extLst>
-                    </a:blip>
-                    <a:srcRect/>
+                    <a:blip r:embed="rId13"/>
                     <a:stretch>
                       <a:fillRect/>
                     </a:stretch>
@@ -27116,7 +26549,7 @@
                   <pic:spPr bwMode="auto">
                     <a:xfrm>
                       <a:off x="0" y="0"/>
-                      <a:ext cx="3538298" cy="3519871"/>
+                      <a:ext cx="3262475" cy="2744364"/>
                     </a:xfrm>
                     <a:prstGeom prst="rect">
                       <a:avLst/>
@@ -27205,13 +26638,303 @@
         </w:rPr>
       </w:pPr>
       <w:r>
-        <w:t xml:space="preserve">3.2.1. </w:t>
-      </w:r>
-      <w:r>
-        <w:t xml:space="preserve">Geo-intervention </w:t>
+        <w:t xml:space="preserve">3.2.1. Geo-intervention </w:t>
       </w:r>
       <w:r>
         <w:t>Generation</w:t>
+      </w:r>
+    </w:p>
+    <w:p>
+      <w:pPr>
+        <w:pStyle w:val="MDPI31text"/>
+        <w:rPr>
+          <w:lang w:val="en"/>
+        </w:rPr>
+      </w:pPr>
+      <w:r>
+        <w:rPr>
+          <w:lang w:val="en"/>
+        </w:rPr>
+        <w:t>x.</w:t>
+      </w:r>
+    </w:p>
+    <w:p>
+      <w:pPr>
+        <w:pStyle w:val="MDPI31text"/>
+        <w:rPr>
+          <w:lang w:val="en"/>
+        </w:rPr>
+      </w:pPr>
+    </w:p>
+    <w:p>
+      <w:pPr>
+        <w:pStyle w:val="MDPI52figure"/>
+        <w:jc w:val="right"/>
+      </w:pPr>
+      <w:r>
+        <w:rPr>
+          <w:noProof/>
+        </w:rPr>
+        <w:drawing>
+          <wp:inline distT="0" distB="0" distL="0" distR="0" wp14:anchorId="48E99B9E" wp14:editId="55644153">
+            <wp:extent cx="4966499" cy="2436542"/>
+            <wp:effectExtent l="0" t="0" r="0" b="1905"/>
+            <wp:docPr id="495516568" name="Picture 495516568"/>
+            <wp:cNvGraphicFramePr>
+              <a:graphicFrameLocks xmlns:a="http://schemas.openxmlformats.org/drawingml/2006/main" noChangeAspect="1"/>
+            </wp:cNvGraphicFramePr>
+            <a:graphic xmlns:a="http://schemas.openxmlformats.org/drawingml/2006/main">
+              <a:graphicData uri="http://schemas.openxmlformats.org/drawingml/2006/picture">
+                <pic:pic xmlns:pic="http://schemas.openxmlformats.org/drawingml/2006/picture">
+                  <pic:nvPicPr>
+                    <pic:cNvPr id="495516568" name="Picture 495516568"/>
+                    <pic:cNvPicPr>
+                      <a:picLocks/>
+                    </pic:cNvPicPr>
+                  </pic:nvPicPr>
+                  <pic:blipFill>
+                    <a:blip r:embed="rId14"/>
+                    <a:stretch>
+                      <a:fillRect/>
+                    </a:stretch>
+                  </pic:blipFill>
+                  <pic:spPr bwMode="auto">
+                    <a:xfrm>
+                      <a:off x="0" y="0"/>
+                      <a:ext cx="5354492" cy="2626890"/>
+                    </a:xfrm>
+                    <a:prstGeom prst="rect">
+                      <a:avLst/>
+                    </a:prstGeom>
+                    <a:noFill/>
+                    <a:ln>
+                      <a:noFill/>
+                    </a:ln>
+                  </pic:spPr>
+                </pic:pic>
+              </a:graphicData>
+            </a:graphic>
+          </wp:inline>
+        </w:drawing>
+      </w:r>
+    </w:p>
+    <w:p>
+      <w:pPr>
+        <w:pStyle w:val="MDPI51figurecaption"/>
+      </w:pPr>
+      <w:r>
+        <w:rPr>
+          <w:b/>
+          <w:bCs/>
+        </w:rPr>
+        <w:t xml:space="preserve">Figure </w:t>
+      </w:r>
+      <w:r>
+        <w:rPr>
+          <w:b/>
+          <w:bCs/>
+        </w:rPr>
+        <w:fldChar w:fldCharType="begin"/>
+      </w:r>
+      <w:r>
+        <w:rPr>
+          <w:b/>
+          <w:bCs/>
+        </w:rPr>
+        <w:instrText xml:space="preserve"> SEQ Figure \* ARABIC </w:instrText>
+      </w:r>
+      <w:r>
+        <w:rPr>
+          <w:b/>
+          <w:bCs/>
+        </w:rPr>
+        <w:fldChar w:fldCharType="separate"/>
+      </w:r>
+      <w:r>
+        <w:rPr>
+          <w:b/>
+          <w:bCs/>
+          <w:noProof/>
+        </w:rPr>
+        <w:t>6</w:t>
+      </w:r>
+      <w:r>
+        <w:rPr>
+          <w:b/>
+          <w:bCs/>
+        </w:rPr>
+        <w:fldChar w:fldCharType="end"/>
+      </w:r>
+      <w:r>
+        <w:rPr>
+          <w:b/>
+          <w:bCs/>
+        </w:rPr>
+        <w:t>.</w:t>
+      </w:r>
+      <w:r>
+        <w:t xml:space="preserve"> </w:t>
+      </w:r>
+      <w:r>
+        <w:t xml:space="preserve">Top 25 most important variables for 80 by 80 grid </w:t>
+      </w:r>
+      <w:proofErr w:type="spellStart"/>
+      <w:r>
+        <w:t>tpot</w:t>
+      </w:r>
+      <w:proofErr w:type="spellEnd"/>
+      <w:r>
+        <w:rPr>
+          <w:i/>
+          <w:iCs/>
+        </w:rPr>
+        <w:t xml:space="preserve"> </w:t>
+      </w:r>
+      <w:r>
+        <w:t>model.</w:t>
+      </w:r>
+    </w:p>
+    <w:p>
+      <w:pPr>
+        <w:pStyle w:val="MDPI52figure"/>
+        <w:jc w:val="right"/>
+      </w:pPr>
+      <w:r>
+        <w:rPr>
+          <w:noProof/>
+        </w:rPr>
+        <w:lastRenderedPageBreak/>
+        <w:drawing>
+          <wp:inline distT="0" distB="0" distL="0" distR="0" wp14:anchorId="6D808F4C" wp14:editId="1F109103">
+            <wp:extent cx="5016401" cy="2350499"/>
+            <wp:effectExtent l="0" t="0" r="635" b="0"/>
+            <wp:docPr id="1062818734" name="Picture 1062818734"/>
+            <wp:cNvGraphicFramePr>
+              <a:graphicFrameLocks xmlns:a="http://schemas.openxmlformats.org/drawingml/2006/main" noChangeAspect="1"/>
+            </wp:cNvGraphicFramePr>
+            <a:graphic xmlns:a="http://schemas.openxmlformats.org/drawingml/2006/main">
+              <a:graphicData uri="http://schemas.openxmlformats.org/drawingml/2006/picture">
+                <pic:pic xmlns:pic="http://schemas.openxmlformats.org/drawingml/2006/picture">
+                  <pic:nvPicPr>
+                    <pic:cNvPr id="1062818734" name="Picture 1062818734"/>
+                    <pic:cNvPicPr>
+                      <a:picLocks/>
+                    </pic:cNvPicPr>
+                  </pic:nvPicPr>
+                  <pic:blipFill>
+                    <a:blip r:embed="rId15"/>
+                    <a:stretch>
+                      <a:fillRect/>
+                    </a:stretch>
+                  </pic:blipFill>
+                  <pic:spPr bwMode="auto">
+                    <a:xfrm>
+                      <a:off x="0" y="0"/>
+                      <a:ext cx="5016401" cy="2350499"/>
+                    </a:xfrm>
+                    <a:prstGeom prst="rect">
+                      <a:avLst/>
+                    </a:prstGeom>
+                    <a:noFill/>
+                    <a:ln>
+                      <a:noFill/>
+                    </a:ln>
+                  </pic:spPr>
+                </pic:pic>
+              </a:graphicData>
+            </a:graphic>
+          </wp:inline>
+        </w:drawing>
+      </w:r>
+    </w:p>
+    <w:p>
+      <w:pPr>
+        <w:pStyle w:val="MDPI51figurecaption"/>
+      </w:pPr>
+      <w:r>
+        <w:rPr>
+          <w:b/>
+          <w:bCs/>
+        </w:rPr>
+        <w:t xml:space="preserve">Figure </w:t>
+      </w:r>
+      <w:r>
+        <w:rPr>
+          <w:b/>
+          <w:bCs/>
+        </w:rPr>
+        <w:fldChar w:fldCharType="begin"/>
+      </w:r>
+      <w:r>
+        <w:rPr>
+          <w:b/>
+          <w:bCs/>
+        </w:rPr>
+        <w:instrText xml:space="preserve"> SEQ Figure \* ARABIC </w:instrText>
+      </w:r>
+      <w:r>
+        <w:rPr>
+          <w:b/>
+          <w:bCs/>
+        </w:rPr>
+        <w:fldChar w:fldCharType="separate"/>
+      </w:r>
+      <w:r>
+        <w:rPr>
+          <w:b/>
+          <w:bCs/>
+          <w:noProof/>
+        </w:rPr>
+        <w:t>7</w:t>
+      </w:r>
+      <w:r>
+        <w:rPr>
+          <w:b/>
+          <w:bCs/>
+        </w:rPr>
+        <w:fldChar w:fldCharType="end"/>
+      </w:r>
+      <w:r>
+        <w:rPr>
+          <w:b/>
+          <w:bCs/>
+        </w:rPr>
+        <w:t>.</w:t>
+      </w:r>
+      <w:r>
+        <w:t xml:space="preserve"> </w:t>
+      </w:r>
+      <w:r>
+        <w:t xml:space="preserve">Top 25 most important </w:t>
+      </w:r>
+      <w:r>
+        <w:t xml:space="preserve">infrastructure-related </w:t>
+      </w:r>
+      <w:r>
+        <w:t xml:space="preserve">variables for 80 by 80 grid </w:t>
+      </w:r>
+      <w:proofErr w:type="spellStart"/>
+      <w:r>
+        <w:t>tpot</w:t>
+      </w:r>
+      <w:proofErr w:type="spellEnd"/>
+      <w:r>
+        <w:rPr>
+          <w:i/>
+          <w:iCs/>
+        </w:rPr>
+        <w:t xml:space="preserve"> </w:t>
+      </w:r>
+      <w:r>
+        <w:t>model.</w:t>
+      </w:r>
+    </w:p>
+    <w:p>
+      <w:pPr>
+        <w:pStyle w:val="MDPI21heading1"/>
+      </w:pPr>
+      <w:r>
+        <w:t>4. Discussion</w:t>
       </w:r>
     </w:p>
     <w:p>
@@ -27219,18 +26942,27 @@
         <w:pStyle w:val="MDPI31text"/>
       </w:pPr>
       <w:r>
-        <w:rPr>
-          <w:lang w:val="en"/>
-        </w:rPr>
         <w:t>x.</w:t>
       </w:r>
     </w:p>
     <w:p>
       <w:pPr>
-        <w:pStyle w:val="MDPI21heading1"/>
+        <w:pStyle w:val="MDPI22heading2"/>
       </w:pPr>
       <w:r>
-        <w:t>4. Discussion</w:t>
+        <w:t>4</w:t>
+      </w:r>
+      <w:r>
+        <w:t>.</w:t>
+      </w:r>
+      <w:r>
+        <w:t>1</w:t>
+      </w:r>
+      <w:r>
+        <w:t xml:space="preserve">. </w:t>
+      </w:r>
+      <w:r>
+        <w:t>Advantages</w:t>
       </w:r>
     </w:p>
     <w:p>
@@ -27238,13 +26970,91 @@
         <w:pStyle w:val="MDPI31text"/>
       </w:pPr>
       <w:r>
-        <w:t xml:space="preserve">Authors should discuss the results and how they can be </w:t>
-      </w:r>
-      <w:r>
-        <w:t xml:space="preserve">interpreted from the perspective </w:t>
-      </w:r>
-      <w:r>
-        <w:t>of previous studies and of the working hypotheses. The findings and their implications should be discussed in the broadest context possible. Future research directions may also be highlighted.</w:t>
+        <w:t>x.</w:t>
+      </w:r>
+    </w:p>
+    <w:p>
+      <w:pPr>
+        <w:pStyle w:val="MDPI22heading2"/>
+      </w:pPr>
+      <w:r>
+        <w:t>4</w:t>
+      </w:r>
+      <w:r>
+        <w:t>.</w:t>
+      </w:r>
+      <w:r>
+        <w:t>2</w:t>
+      </w:r>
+      <w:r>
+        <w:t xml:space="preserve">. </w:t>
+      </w:r>
+      <w:r>
+        <w:t>Disadvantages</w:t>
+      </w:r>
+    </w:p>
+    <w:p>
+      <w:pPr>
+        <w:pStyle w:val="MDPI31text"/>
+      </w:pPr>
+      <w:r>
+        <w:t>x.</w:t>
+      </w:r>
+    </w:p>
+    <w:p>
+      <w:pPr>
+        <w:pStyle w:val="MDPI22heading2"/>
+      </w:pPr>
+      <w:r>
+        <w:t>4</w:t>
+      </w:r>
+      <w:r>
+        <w:t>.</w:t>
+      </w:r>
+      <w:r>
+        <w:t>3</w:t>
+      </w:r>
+      <w:r>
+        <w:t xml:space="preserve">. </w:t>
+      </w:r>
+      <w:r>
+        <w:t>Limitations</w:t>
+      </w:r>
+    </w:p>
+    <w:p>
+      <w:pPr>
+        <w:pStyle w:val="MDPI31text"/>
+      </w:pPr>
+      <w:r>
+        <w:t>x.</w:t>
+      </w:r>
+    </w:p>
+    <w:p>
+      <w:pPr>
+        <w:pStyle w:val="MDPI22heading2"/>
+      </w:pPr>
+      <w:r>
+        <w:t>4</w:t>
+      </w:r>
+      <w:r>
+        <w:t>.</w:t>
+      </w:r>
+      <w:r>
+        <w:t>4</w:t>
+      </w:r>
+      <w:r>
+        <w:t xml:space="preserve">. </w:t>
+      </w:r>
+      <w:r>
+        <w:t>Future Research</w:t>
+      </w:r>
+    </w:p>
+    <w:p>
+      <w:pPr>
+        <w:pStyle w:val="MDPI31text"/>
+      </w:pPr>
+      <w:r>
+        <w:t>x.</w:t>
       </w:r>
     </w:p>
     <w:p>
@@ -27324,7 +27134,13 @@
       </w:r>
       <w:proofErr w:type="spellEnd"/>
       <w:r>
-        <w:t xml:space="preserve"> Li; Investigation, data curation, software, writing—original draft preparation, Richard Wen; superv</w:t>
+        <w:t xml:space="preserve"> Li; </w:t>
+      </w:r>
+      <w:r>
+        <w:t>i</w:t>
+      </w:r>
+      <w:r>
+        <w:t>nvestigation, data curation, software, writing—original draft preparation, Richard Wen; superv</w:t>
       </w:r>
       <w:r>
         <w:t>i</w:t>
@@ -27404,7 +27220,7 @@
         <w:fldChar w:fldCharType="begin"/>
       </w:r>
       <w:r>
-        <w:instrText xml:space="preserve"> ADDIN ZOTERO_ITEM CSL_CITATION {"citationID":"yJmZuVyT","properties":{"formattedCitation":"[65\\uc0\\u8211{}85]","plainCitation":"[65–85]","noteIndex":0},"citationItems":[{"id":3195,"uris":["http://zotero.org/users/6749620/items/4ZCJFG3S"],"itemData":{"id":3195,"type":"webpage","container-title":"City of Toronto Open Data Portal","language":"en","title":"Toronto Centreline (TCL)","URL":"https://open.toronto.ca/dataset/","author":[{"literal":"City of Toronto"}],"accessed":{"date-parts":[["2024",12,30]]},"issued":{"date-parts":[["2023"]]},"citation-key":"cityoftorontoTorontoCentrelineTCL2023"}},{"id":3193,"uris":["http://zotero.org/users/6749620/items/6QLXZDQ6"],"itemData":{"id":3193,"type":"webpage","abstract":"Collision occurrences by occurrence date.","container-title":"Public Safety Data Portal","language":"en-us","title":"Traffic Collisions Open Data (ASR-T-TBL-001)","URL":"https://data.torontopolice.on.ca/datasets/TorontoPS::traffic-collisions-open-data-asr-t-tbl-001/about","author":[{"literal":"Toronto Police Service"}],"accessed":{"date-parts":[["2024",12,30]]},"issued":{"date-parts":[["2023"]]},"citation-key":"torontopoliceserviceTrafficCollisionsOpen2023"}},{"id":3197,"uris":["http://zotero.org/users/6749620/items/8PKCWD9K"],"itemData":{"id":3197,"type":"webpage","container-title":"City of Toronto Open Data Portal","language":"en","title":"Traffic Volumes at Intersections for All Modes","URL":"https://open.toronto.ca/dataset/","author":[{"literal":"City of Toronto"}],"accessed":{"date-parts":[["2024",12,30]]},"issued":{"date-parts":[["2023"]]},"citation-key":"cityoftorontoTrafficVolumesIntersections2023"}},{"id":3199,"uris":["http://zotero.org/users/6749620/items/A4K9J7AQ"],"itemData":{"id":3199,"type":"webpage","container-title":"City of Toronto Open Data Portal","language":"en","title":"Automated Speed Enforcement Locations","URL":"https://open.toronto.ca/dataset/","author":[{"literal":"City of Toronto"}],"accessed":{"date-parts":[["2024",12,30]]},"issued":{"date-parts":[["2023"]]},"citation-key":"cityoftorontoAutomatedSpeedEnforcement2023"}},{"id":3201,"uris":["http://zotero.org/users/6749620/items/EUUJY2S9"],"itemData":{"id":3201,"type":"webpage","container-title":"City of Toronto Open Data Portal","language":"en","title":"School Safety Zone Watch Your Speed Program – Locations","URL":"https://open.toronto.ca/dataset/","author":[{"literal":"City of Toronto"}],"accessed":{"date-parts":[["2024",12,30]]},"issued":{"date-parts":[["2023"]]},"citation-key":"cityoftorontoSchoolSafetyZone2023"}},{"id":3203,"uris":["http://zotero.org/users/6749620/items/E9GJETRN"],"itemData":{"id":3203,"type":"webpage","container-title":"City of Toronto Open Data Portal","language":"en","title":"Red Light Cameras","URL":"https://open.toronto.ca/dataset/","author":[{"literal":"City of Toronto"}],"accessed":{"date-parts":[["2024",12,30]]},"issued":{"date-parts":[["2023"]]},"citation-key":"cityoftorontoRedLightCameras2023"}},{"id":3205,"uris":["http://zotero.org/users/6749620/items/M5YQZHME"],"itemData":{"id":3205,"type":"webpage","container-title":"City of Toronto Open Data Portal","language":"en","title":"Police Facility Locations","URL":"https://open.toronto.ca/dataset/","author":[{"literal":"City of Toronto"}],"accessed":{"date-parts":[["2024",12,30]]},"issued":{"date-parts":[["2023"]]},"citation-key":"cityoftorontoPoliceFacilityLocations2023"}},{"id":3207,"uris":["http://zotero.org/users/6749620/items/CEETX8F6"],"itemData":{"id":3207,"type":"webpage","container-title":"City of Toronto Open Data Portal","language":"en","title":"Ambulance Station Locations","URL":"https://open.toronto.ca/dataset/","author":[{"literal":"City of Toronto"}],"accessed":{"date-parts":[["2024",12,30]]},"issued":{"date-parts":[["2023"]]},"citation-key":"cityoftorontoAmbulanceStationLocations2023"}},{"id":3209,"uris":["http://zotero.org/users/6749620/items/IVV52WLC"],"itemData":{"id":3209,"type":"webpage","container-title":"City of Toronto Open Data Portal","language":"en","title":"Fire Hydrants","URL":"https://open.toronto.ca/dataset/","author":[{"literal":"City of Toronto"}],"accessed":{"date-parts":[["2024",12,30]]},"issued":{"date-parts":[["2023"]]},"citation-key":"cityoftorontoFireHydrants2023"}},{"id":3211,"uris":["http://zotero.org/users/6749620/items/79X2AVE8"],"itemData":{"id":3211,"type":"webpage","container-title":"City of Toronto Open Data Portal","language":"en","title":"Fire Facility Locations","URL":"https://open.toronto.ca/dataset/","author":[{"literal":"City of Toronto"}],"accessed":{"date-parts":[["2024",12,30]]},"issued":{"date-parts":[["2023"]]},"citation-key":"cityoftorontoFireFacilityLocations2023"}},{"id":3213,"uris":["http://zotero.org/users/6749620/items/GDGS8MSB"],"itemData":{"id":3213,"type":"webpage","container-title":"City of Toronto Open Data Portal","language":"en","title":"Renewable Energy Installations","URL":"https://open.toronto.ca/dataset/","author":[{"literal":"City of Toronto"}],"accessed":{"date-parts":[["2024",12,30]]},"issued":{"date-parts":[["2023"]]},"citation-key":"cityoftorontoRenewableEnergyInstallations2023"}},{"id":3215,"uris":["http://zotero.org/users/6749620/items/AL7GBGLT"],"itemData":{"id":3215,"type":"webpage","container-title":"City of Toronto Open Data Portal","language":"en","title":"Street Furniture - Bicycle Parking","URL":"https://open.toronto.ca/dataset/","author":[{"literal":"City of Toronto"}],"accessed":{"date-parts":[["2024",12,30]]},"issued":{"date-parts":[["2023"]]},"citation-key":"cityoftorontoStreetFurnitureBicycle2023"}},{"id":3217,"uris":["http://zotero.org/users/6749620/items/KC32C9RQ"],"itemData":{"id":3217,"type":"webpage","container-title":"City of Toronto Open Data Portal","language":"en","title":"Street Furniture - Transit Shelter","URL":"https://open.toronto.ca/dataset/","author":[{"literal":"City of Toronto"}],"accessed":{"date-parts":[["2024",12,30]]},"issued":{"date-parts":[["2023"]]},"citation-key":"cityoftorontoStreetFurnitureTransit2023"}},{"id":3219,"uris":["http://zotero.org/users/6749620/items/6FAQQXRQ"],"itemData":{"id":3219,"type":"webpage","container-title":"City of Toronto Open Data Portal","language":"en","title":"Street Furniture - Information Pillar-Wayfinding Structure","URL":"https://open.toronto.ca/dataset/","author":[{"literal":"City of Toronto"}],"accessed":{"date-parts":[["2024",12,30]]},"issued":{"date-parts":[["2023"]]},"citation-key":"cityoftorontoStreetFurnitureInformation2023"}},{"id":3221,"uris":["http://zotero.org/users/6749620/items/C7S3DA98"],"itemData":{"id":3221,"type":"webpage","container-title":"City of Toronto Open Data Portal","language":"en","title":"Street Furniture - Litter Receptacle","URL":"https://open.toronto.ca/dataset/","author":[{"literal":"City of Toronto"}],"accessed":{"date-parts":[["2024",12,30]]},"issued":{"date-parts":[["2023"]]},"citation-key":"cityoftorontoStreetFurnitureLitter2023"}},{"id":3223,"uris":["http://zotero.org/users/6749620/items/ATK5QTMP"],"itemData":{"id":3223,"type":"webpage","container-title":"City of Toronto Open Data Portal","language":"en","title":"School Locations - All Types","URL":"https://open.toronto.ca/dataset/","author":[{"literal":"City of Toronto"}],"accessed":{"date-parts":[["2024",12,30]]},"issued":{"date-parts":[["2023"]]},"citation-key":"cityoftorontoSchoolLocationsAll2023"}},{"id":3225,"uris":["http://zotero.org/users/6749620/items/SZVMZEVD"],"itemData":{"id":3225,"type":"webpage","container-title":"City of Toronto Open Data Portal","language":"en","title":"Licensed Child Care Centres","URL":"https://open.toronto.ca/dataset/","author":[{"literal":"City of Toronto"}],"accessed":{"date-parts":[["2024",12,30]]},"issued":{"date-parts":[["2023"]]},"citation-key":"cityoftorontoLicensedChildCare2023"}},{"id":3227,"uris":["http://zotero.org/users/6749620/items/V4UT2BYA"],"itemData":{"id":3227,"type":"webpage","container-title":"City of Toronto Open Data Portal","language":"en","title":"Public Art","URL":"https://open.toronto.ca/dataset/","author":[{"literal":"City of Toronto"}],"accessed":{"date-parts":[["2024",12,30]]},"issued":{"date-parts":[["2023"]]},"citation-key":"cityoftorontoPublicArt2023"}},{"id":3229,"uris":["http://zotero.org/users/6749620/items/IBC8DRQ4"],"itemData":{"id":3229,"type":"webpage","container-title":"City of Toronto Open Data Portal","language":"en","title":"Cultural Hotspot - Points of Interest","URL":"https://open.toronto.ca/dataset/","author":[{"literal":"City of Toronto"}],"accessed":{"date-parts":[["2024",12,30]]},"issued":{"date-parts":[["2023"]]},"citation-key":"cityoftorontoCulturalHotspotPoints2023"}},{"id":3231,"uris":["http://zotero.org/users/6749620/items/5HEVKMQQ"],"itemData":{"id":3231,"type":"webpage","container-title":"City of Toronto Open Data Portal","language":"en","title":"Places of Worship","URL":"https://open.toronto.ca/dataset/","author":[{"literal":"City of Toronto"}],"accessed":{"date-parts":[["2024",12,30]]},"issued":{"date-parts":[["2023"]]},"citation-key":"cityoftorontoPlacesWorship2023"}},{"id":3233,"uris":["http://zotero.org/users/6749620/items/XNBNQEZ4"],"itemData":{"id":3233,"type":"webpage","abstract":"Major Crime Indicators (MCI) occurrences by reported date.","container-title":"Public Safety Data Portal","language":"en-ca","title":"Major Crime Indicators Open Data","URL":"https://data.torontopolice.on.ca/datasets/TorontoPS::major-crime-indicators-open-data/about","author":[{"literal":"Toronto Police Service"}],"accessed":{"date-parts":[["2024",12,30]]},"issued":{"date-parts":[["2023"]]},"citation-key":"torontopoliceserviceMajorCrimeIndicators2023"}}],"schema":"https://github.com/citation-style-language/schema/raw/master/csl-citation.json"} </w:instrText>
+        <w:instrText xml:space="preserve"> ADDIN ZOTERO_ITEM CSL_CITATION {"citationID":"yJmZuVyT","properties":{"formattedCitation":"[65\\uc0\\u8211{}85]","plainCitation":"[65–85]","noteIndex":0},"citationItems":[{"id":3195,"uris":["http://zotero.org/users/6749620/items/4ZCJFG3S"],"itemData":{"id":3195,"type":"webpage","container-title":"City of Toronto Open Data Portal","language":"en","title":"Toronto Centreline (TCL)","URL":"https://open.toronto.ca/dataset/toronto-centreline-tcl/","author":[{"literal":"City of Toronto"}],"accessed":{"date-parts":[["2024",12,30]]},"issued":{"date-parts":[["2023"]]},"citation-key":"cityoftorontoTorontoCentrelineTCL2023"}},{"id":3193,"uris":["http://zotero.org/users/6749620/items/6QLXZDQ6"],"itemData":{"id":3193,"type":"webpage","abstract":"Collision occurrences by occurrence date.","container-title":"Public Safety Data Portal","language":"en-us","title":"Traffic Collisions Open Data (ASR-T-TBL-001)","URL":"https://data.torontopolice.on.ca/datasets/TorontoPS::traffic-collisions-open-data-asr-t-tbl-001/about","author":[{"literal":"Toronto Police Service"}],"accessed":{"date-parts":[["2024",12,30]]},"issued":{"date-parts":[["2023"]]},"citation-key":"torontopoliceserviceTrafficCollisionsOpen2023"}},{"id":3197,"uris":["http://zotero.org/users/6749620/items/8PKCWD9K"],"itemData":{"id":3197,"type":"webpage","container-title":"City of Toronto Open Data Portal","language":"en","title":"Traffic Volumes at Intersections for All Modes (2010 to 2019)","URL":"https://open.toronto.ca/dataset/traffic-volumes-at-intersections-for-all-modes/","author":[{"literal":"City of Toronto"}],"accessed":{"date-parts":[["2024",12,30]]},"issued":{"date-parts":[["2023"]]},"citation-key":"cityoftorontoTrafficVolumesIntersections2023"}},{"id":3199,"uris":["http://zotero.org/users/6749620/items/A4K9J7AQ"],"itemData":{"id":3199,"type":"webpage","container-title":"City of Toronto Open Data Portal","language":"en","title":"Automated Speed Enforcement Locations","URL":"https://open.toronto.ca/dataset/automated-speed-enforcement-locations/","author":[{"literal":"City of Toronto"}],"accessed":{"date-parts":[["2024",12,30]]},"issued":{"date-parts":[["2023"]]},"citation-key":"cityoftorontoAutomatedSpeedEnforcement2023"}},{"id":3201,"uris":["http://zotero.org/users/6749620/items/EUUJY2S9"],"itemData":{"id":3201,"type":"webpage","container-title":"City of Toronto Open Data Portal","language":"en","title":"School Safety Zone Watch Your Speed Program – Locations","URL":"https://open.toronto.ca/dataset/school-safety-zone-watch-your-speed-program-locations/","author":[{"literal":"City of Toronto"}],"accessed":{"date-parts":[["2024",12,30]]},"issued":{"date-parts":[["2023"]]},"citation-key":"cityoftorontoSchoolSafetyZone2023"}},{"id":3203,"uris":["http://zotero.org/users/6749620/items/E9GJETRN"],"itemData":{"id":3203,"type":"webpage","container-title":"City of Toronto Open Data Portal","language":"en","title":"Red Light Cameras","URL":"https://open.toronto.ca/dataset/red-light-cameras/","author":[{"literal":"City of Toronto"}],"accessed":{"date-parts":[["2024",12,30]]},"issued":{"date-parts":[["2023"]]},"citation-key":"cityoftorontoRedLightCameras2023"}},{"id":3205,"uris":["http://zotero.org/users/6749620/items/M5YQZHME"],"itemData":{"id":3205,"type":"webpage","container-title":"City of Toronto Open Data Portal","language":"en","title":"Police Facility Locations","URL":"https://open.toronto.ca/dataset/police-facility-locations/","author":[{"literal":"City of Toronto"}],"accessed":{"date-parts":[["2024",12,30]]},"issued":{"date-parts":[["2023"]]},"citation-key":"cityoftorontoPoliceFacilityLocations2023"}},{"id":3207,"uris":["http://zotero.org/users/6749620/items/CEETX8F6"],"itemData":{"id":3207,"type":"webpage","container-title":"City of Toronto Open Data Portal","language":"en","title":"Ambulance Station Locations","URL":"https://open.toronto.ca/dataset/ambulance-station-locations/","author":[{"literal":"City of Toronto"}],"accessed":{"date-parts":[["2024",12,30]]},"issued":{"date-parts":[["2023"]]},"citation-key":"cityoftorontoAmbulanceStationLocations2023"}},{"id":3209,"uris":["http://zotero.org/users/6749620/items/IVV52WLC"],"itemData":{"id":3209,"type":"webpage","container-title":"City of Toronto Open Data Portal","language":"en","title":"Fire Hydrants","URL":"https://open.toronto.ca/dataset/fire-hydrants/","author":[{"literal":"City of Toronto"}],"accessed":{"date-parts":[["2024",12,30]]},"issued":{"date-parts":[["2023"]]},"citation-key":"cityoftorontoFireHydrants2023"}},{"id":3211,"uris":["http://zotero.org/users/6749620/items/79X2AVE8"],"itemData":{"id":3211,"type":"webpage","container-title":"City of Toronto Open Data Portal","language":"en","title":"Fire Facility Locations","URL":"https://open.toronto.ca/dataset/fire-station-locations/","author":[{"literal":"City of Toronto"}],"accessed":{"date-parts":[["2024",12,30]]},"issued":{"date-parts":[["2023"]]},"citation-key":"cityoftorontoFireFacilityLocations2023"}},{"id":3213,"uris":["http://zotero.org/users/6749620/items/GDGS8MSB"],"itemData":{"id":3213,"type":"webpage","container-title":"City of Toronto Open Data Portal","language":"en","title":"Renewable Energy Installations","URL":"https://open.toronto.ca/dataset/renewable-energy-installations/","author":[{"literal":"City of Toronto"}],"accessed":{"date-parts":[["2024",12,30]]},"issued":{"date-parts":[["2023"]]},"citation-key":"cityoftorontoRenewableEnergyInstallations2023"}},{"id":3215,"uris":["http://zotero.org/users/6749620/items/AL7GBGLT"],"itemData":{"id":3215,"type":"webpage","container-title":"City of Toronto Open Data Portal","language":"en","title":"Street Furniture - Bicycle Parking","URL":"https://open.toronto.ca/dataset/street-furniture-bicycle-parking/","author":[{"literal":"City of Toronto"}],"accessed":{"date-parts":[["2024",12,30]]},"issued":{"date-parts":[["2023"]]},"citation-key":"cityoftorontoStreetFurnitureBicycle2023"}},{"id":3217,"uris":["http://zotero.org/users/6749620/items/KC32C9RQ"],"itemData":{"id":3217,"type":"webpage","container-title":"City of Toronto Open Data Portal","language":"en","title":"Street Furniture - Transit Shelter","URL":"https://open.toronto.ca/dataset/street-furniture-transit-shelter/","author":[{"literal":"City of Toronto"}],"accessed":{"date-parts":[["2024",12,30]]},"issued":{"date-parts":[["2023"]]},"citation-key":"cityoftorontoStreetFurnitureTransit2023"}},{"id":3219,"uris":["http://zotero.org/users/6749620/items/6FAQQXRQ"],"itemData":{"id":3219,"type":"webpage","container-title":"City of Toronto Open Data Portal","language":"en","title":"Street Furniture - Information Pillar-Wayfinding Structure","URL":"https://open.toronto.ca/dataset/street-furniture-information-pillar-wayfinding-structure/","author":[{"literal":"City of Toronto"}],"accessed":{"date-parts":[["2024",12,30]]},"issued":{"date-parts":[["2023"]]},"citation-key":"cityoftorontoStreetFurnitureInformation2023"}},{"id":3221,"uris":["http://zotero.org/users/6749620/items/C7S3DA98"],"itemData":{"id":3221,"type":"webpage","container-title":"City of Toronto Open Data Portal","language":"en","title":"Street Furniture - Litter Receptacle","URL":"https://open.toronto.ca/dataset/street-furniture-litter-receptacle/","author":[{"literal":"City of Toronto"}],"accessed":{"date-parts":[["2024",12,30]]},"issued":{"date-parts":[["2023"]]},"citation-key":"cityoftorontoStreetFurnitureLitter2023"}},{"id":3223,"uris":["http://zotero.org/users/6749620/items/ATK5QTMP"],"itemData":{"id":3223,"type":"webpage","container-title":"City of Toronto Open Data Portal","language":"en","title":"School Locations - All Types","URL":"https://open.toronto.ca/dataset/school-locations-all-types/","author":[{"literal":"City of Toronto"}],"accessed":{"date-parts":[["2024",12,30]]},"issued":{"date-parts":[["2023"]]},"citation-key":"cityoftorontoSchoolLocationsAll2023"}},{"id":3225,"uris":["http://zotero.org/users/6749620/items/SZVMZEVD"],"itemData":{"id":3225,"type":"webpage","container-title":"City of Toronto Open Data Portal","language":"en","title":"Licensed Child Care Centres","URL":"https://open.toronto.ca/dataset/child-care-licensed-child-care-spaces/","author":[{"literal":"City of Toronto"}],"accessed":{"date-parts":[["2024",12,30]]},"issued":{"date-parts":[["2023"]]},"citation-key":"cityoftorontoLicensedChildCare2023"}},{"id":3227,"uris":["http://zotero.org/users/6749620/items/V4UT2BYA"],"itemData":{"id":3227,"type":"webpage","container-title":"City of Toronto Open Data Portal","language":"en","title":"Public Art","URL":"https://open.toronto.ca/dataset/public-art/","author":[{"literal":"City of Toronto"}],"accessed":{"date-parts":[["2024",12,30]]},"issued":{"date-parts":[["2023"]]},"citation-key":"cityoftorontoPublicArt2023"}},{"id":3229,"uris":["http://zotero.org/users/6749620/items/IBC8DRQ4"],"itemData":{"id":3229,"type":"webpage","container-title":"City of Toronto Open Data Portal","language":"en","title":"Cultural Hotspot - Points of Interest","URL":"https://open.toronto.ca/dataset/cultural-hotspot-points-of-interest/","author":[{"literal":"City of Toronto"}],"accessed":{"date-parts":[["2024",12,30]]},"issued":{"date-parts":[["2023"]]},"citation-key":"cityoftorontoCulturalHotspotPoints2023"}},{"id":3231,"uris":["http://zotero.org/users/6749620/items/5HEVKMQQ"],"itemData":{"id":3231,"type":"webpage","container-title":"City of Toronto Open Data Portal","language":"en","title":"Places of Worship","URL":"https://open.toronto.ca/dataset/places-of-worship/","author":[{"literal":"City of Toronto"}],"accessed":{"date-parts":[["2024",12,30]]},"issued":{"date-parts":[["2023"]]},"citation-key":"cityoftorontoPlacesWorship2023"}},{"id":3233,"uris":["http://zotero.org/users/6749620/items/XNBNQEZ4"],"itemData":{"id":3233,"type":"webpage","abstract":"Major Crime Indicators (MCI) occurrences by reported date.","container-title":"Public Safety Data Portal","language":"en-ca","title":"Major Crime Indicators Open Data","URL":"https://data.torontopolice.on.ca/datasets/TorontoPS::major-crime-indicators-open-data/about","author":[{"literal":"Toronto Police Service"}],"accessed":{"date-parts":[["2024",12,30]]},"issued":{"date-parts":[["2023"]]},"citation-key":"torontopoliceserviceMajorCrimeIndicators2023"}}],"schema":"https://github.com/citation-style-language/schema/raw/master/csl-citation.json"} </w:instrText>
       </w:r>
       <w:r>
         <w:fldChar w:fldCharType="separate"/>
@@ -32092,7 +31908,7 @@
         <w:rPr>
           <w:color w:val="auto"/>
         </w:rPr>
-        <w:t xml:space="preserve"> (TCL) Available online: https://open.toronto.ca/dataset/ (accessed on 30 December 2024).</w:t>
+        <w:t xml:space="preserve"> (TCL) Available online: https://open.toronto.ca/dataset/toronto-centreline-tcl/ (accessed on 30 December 2024).</w:t>
       </w:r>
     </w:p>
     <w:p>
@@ -32134,7 +31950,7 @@
           <w:color w:val="auto"/>
         </w:rPr>
         <w:tab/>
-        <w:t>City of Toronto Traffic Volumes at Intersections for All Modes Available online: https://open.toronto.ca/dataset/ (accessed on 30 December 2024).</w:t>
+        <w:t>City of Toronto Traffic Volumes at Intersections for All Modes (2010 to 2019) Available online: https://open.toronto.ca/dataset/traffic-volumes-at-intersections-for-all-modes/ (accessed on 30 December 2024).</w:t>
       </w:r>
     </w:p>
     <w:p>
@@ -32155,7 +31971,7 @@
           <w:color w:val="auto"/>
         </w:rPr>
         <w:tab/>
-        <w:t>City of Toronto Automated Speed Enforcement Locations Available online: https://open.toronto.ca/dataset/ (accessed on 30 December 2024).</w:t>
+        <w:t>City of Toronto Automated Speed Enforcement Locations Available online: https://open.toronto.ca/dataset/automated-speed-enforcement-locations/ (accessed on 30 December 2024).</w:t>
       </w:r>
     </w:p>
     <w:p>
@@ -32176,7 +31992,7 @@
           <w:color w:val="auto"/>
         </w:rPr>
         <w:tab/>
-        <w:t>City of Toronto School Safety Zone Watch Your Speed Program – Locations Available online: https://open.toronto.ca/dataset/ (accessed on 30 December 2024).</w:t>
+        <w:t>City of Toronto School Safety Zone Watch Your Speed Program – Locations Available online: https://open.toronto.ca/dataset/school-safety-zone-watch-your-speed-program-locations/ (accessed on 30 December 2024).</w:t>
       </w:r>
     </w:p>
     <w:p>
@@ -32197,7 +32013,7 @@
           <w:color w:val="auto"/>
         </w:rPr>
         <w:tab/>
-        <w:t>City of Toronto Red Light Cameras Available online: https://open.toronto.ca/dataset/ (accessed on 30 December 2024).</w:t>
+        <w:t>City of Toronto Red Light Cameras Available online: https://open.toronto.ca/dataset/red-light-cameras/ (accessed on 30 December 2024).</w:t>
       </w:r>
     </w:p>
     <w:p>
@@ -32218,7 +32034,7 @@
           <w:color w:val="auto"/>
         </w:rPr>
         <w:tab/>
-        <w:t>City of Toronto Police Facility Locations Available online: https://open.toronto.ca/dataset/ (accessed on 30 December 2024).</w:t>
+        <w:t>City of Toronto Police Facility Locations Available online: https://open.toronto.ca/dataset/police-facility-locations/ (accessed on 30 December 2024).</w:t>
       </w:r>
     </w:p>
     <w:p>
@@ -32239,7 +32055,7 @@
           <w:color w:val="auto"/>
         </w:rPr>
         <w:tab/>
-        <w:t>City of Toronto Ambulance Station Locations Available online: https://open.toronto.ca/dataset/ (accessed on 30 December 2024).</w:t>
+        <w:t>City of Toronto Ambulance Station Locations Available online: https://open.toronto.ca/dataset/ambulance-station-locations/ (accessed on 30 December 2024).</w:t>
       </w:r>
     </w:p>
     <w:p>
@@ -32260,7 +32076,7 @@
           <w:color w:val="auto"/>
         </w:rPr>
         <w:tab/>
-        <w:t>City of Toronto Fire Hydrants Available online: https://open.toronto.ca/dataset/ (accessed on 30 December 2024).</w:t>
+        <w:t>City of Toronto Fire Hydrants Available online: https://open.toronto.ca/dataset/fire-hydrants/ (accessed on 30 December 2024).</w:t>
       </w:r>
     </w:p>
     <w:p>
@@ -32281,7 +32097,7 @@
           <w:color w:val="auto"/>
         </w:rPr>
         <w:tab/>
-        <w:t>City of Toronto Fire Facility Locations Available online: https://open.toronto.ca/dataset/ (accessed on 30 December 2024).</w:t>
+        <w:t>City of Toronto Fire Facility Locations Available online: https://open.toronto.ca/dataset/fire-station-locations/ (accessed on 30 December 2024).</w:t>
       </w:r>
     </w:p>
     <w:p>
@@ -32302,7 +32118,7 @@
           <w:color w:val="auto"/>
         </w:rPr>
         <w:tab/>
-        <w:t>City of Toronto Renewable Energy Installations Available online: https://open.toronto.ca/dataset/ (accessed on 30 December 2024).</w:t>
+        <w:t>City of Toronto Renewable Energy Installations Available online: https://open.toronto.ca/dataset/renewable-energy-installations/ (accessed on 30 December 2024).</w:t>
       </w:r>
     </w:p>
     <w:p>
@@ -32323,7 +32139,7 @@
           <w:color w:val="auto"/>
         </w:rPr>
         <w:tab/>
-        <w:t>City of Toronto Street Furniture - Bicycle Parking Available online: https://open.toronto.ca/dataset/ (accessed on 30 December 2024).</w:t>
+        <w:t>City of Toronto Street Furniture - Bicycle Parking Available online: https://open.toronto.ca/dataset/street-furniture-bicycle-parking/ (accessed on 30 December 2024).</w:t>
       </w:r>
     </w:p>
     <w:p>
@@ -32344,7 +32160,7 @@
           <w:color w:val="auto"/>
         </w:rPr>
         <w:tab/>
-        <w:t>City of Toronto Street Furniture - Transit Shelter Available online: https://open.toronto.ca/dataset/ (accessed on 30 December 2024).</w:t>
+        <w:t>City of Toronto Street Furniture - Transit Shelter Available online: https://open.toronto.ca/dataset/street-furniture-transit-shelter/ (accessed on 30 December 2024).</w:t>
       </w:r>
     </w:p>
     <w:p>
@@ -32358,6 +32174,7 @@
         <w:rPr>
           <w:color w:val="auto"/>
         </w:rPr>
+        <w:lastRenderedPageBreak/>
         <w:t xml:space="preserve">78. </w:t>
       </w:r>
       <w:r>
@@ -32365,7 +32182,7 @@
           <w:color w:val="auto"/>
         </w:rPr>
         <w:tab/>
-        <w:t>City of Toronto Street Furniture - Information Pillar-Wayfinding Structure Available online: https://open.toronto.ca/dataset/ (accessed on 30 December 2024).</w:t>
+        <w:t>City of Toronto Street Furniture - Information Pillar-Wayfinding Structure Available online: https://open.toronto.ca/dataset/street-furniture-information-pillar-wayfinding-structure/ (accessed on 30 December 2024).</w:t>
       </w:r>
     </w:p>
     <w:p>
@@ -32379,7 +32196,6 @@
         <w:rPr>
           <w:color w:val="auto"/>
         </w:rPr>
-        <w:lastRenderedPageBreak/>
         <w:t xml:space="preserve">79. </w:t>
       </w:r>
       <w:r>
@@ -32387,7 +32203,7 @@
           <w:color w:val="auto"/>
         </w:rPr>
         <w:tab/>
-        <w:t>City of Toronto Street Furniture - Litter Receptacle Available online: https://open.toronto.ca/dataset/ (accessed on 30 December 2024).</w:t>
+        <w:t>City of Toronto Street Furniture - Litter Receptacle Available online: https://open.toronto.ca/dataset/street-furniture-litter-receptacle/ (accessed on 30 December 2024).</w:t>
       </w:r>
     </w:p>
     <w:p>
@@ -32408,7 +32224,7 @@
           <w:color w:val="auto"/>
         </w:rPr>
         <w:tab/>
-        <w:t>City of Toronto School Locations - All Types Available online: https://open.toronto.ca/dataset/ (accessed on 30 December 2024).</w:t>
+        <w:t>City of Toronto School Locations - All Types Available online: https://open.toronto.ca/dataset/school-locations-all-types/ (accessed on 30 December 2024).</w:t>
       </w:r>
     </w:p>
     <w:p>
@@ -32443,7 +32259,7 @@
         <w:rPr>
           <w:color w:val="auto"/>
         </w:rPr>
-        <w:t xml:space="preserve"> Available online: https://open.toronto.ca/dataset/ (accessed on 30 December 2024).</w:t>
+        <w:t xml:space="preserve"> Available online: https://open.toronto.ca/dataset/child-care-licensed-child-care-spaces/ (accessed on 30 December 2024).</w:t>
       </w:r>
     </w:p>
     <w:p>
@@ -32464,7 +32280,7 @@
           <w:color w:val="auto"/>
         </w:rPr>
         <w:tab/>
-        <w:t>City of Toronto Public Art Available online: https://open.toronto.ca/dataset/ (accessed on 30 December 2024).</w:t>
+        <w:t>City of Toronto Public Art Available online: https://open.toronto.ca/dataset/public-art/ (accessed on 30 December 2024).</w:t>
       </w:r>
     </w:p>
     <w:p>
@@ -32485,7 +32301,7 @@
           <w:color w:val="auto"/>
         </w:rPr>
         <w:tab/>
-        <w:t>City of Toronto Cultural Hotspot - Points of Interest Available online: https://open.toronto.ca/dataset/ (accessed on 30 December 2024).</w:t>
+        <w:t>City of Toronto Cultural Hotspot - Points of Interest Available online: https://open.toronto.ca/dataset/cultural-hotspot-points-of-interest/ (accessed on 30 December 2024).</w:t>
       </w:r>
     </w:p>
     <w:p>
@@ -32506,7 +32322,7 @@
           <w:color w:val="auto"/>
         </w:rPr>
         <w:tab/>
-        <w:t>City of Toronto Places of Worship Available online: https://open.toronto.ca/dataset/ (accessed on 30 December 2024).</w:t>
+        <w:t>City of Toronto Places of Worship Available online: https://open.toronto.ca/dataset/places-of-worship/ (accessed on 30 December 2024).</w:t>
       </w:r>
     </w:p>
     <w:p>
@@ -33120,6 +32936,27 @@
           <w:color w:val="auto"/>
         </w:rPr>
         <w:t>, 79–82.</w:t>
+      </w:r>
+    </w:p>
+    <w:p>
+      <w:pPr>
+        <w:pStyle w:val="Bibliography"/>
+        <w:rPr>
+          <w:color w:val="auto"/>
+        </w:rPr>
+      </w:pPr>
+      <w:r>
+        <w:rPr>
+          <w:color w:val="auto"/>
+        </w:rPr>
+        <w:t xml:space="preserve">95. </w:t>
+      </w:r>
+      <w:r>
+        <w:rPr>
+          <w:color w:val="auto"/>
+        </w:rPr>
+        <w:tab/>
+        <w:t>Richard Wen Example: Geo-Intervention Modelling Framework Available online: https://github.com/rrwen/geointerv-paper/blob/main/src/example.ipynb (accessed on 4 February 2025).</w:t>
       </w:r>
     </w:p>
     <w:p>
@@ -33142,6 +32979,7 @@
         <w:rPr>
           <w:b/>
         </w:rPr>
+        <w:lastRenderedPageBreak/>
         <w:t>Disclaimer/Publisher’s Note:</w:t>
       </w:r>
       <w:r>
@@ -33149,11 +32987,11 @@
       </w:r>
     </w:p>
     <w:sectPr>
-      <w:headerReference w:type="even" r:id="rId14"/>
-      <w:headerReference w:type="default" r:id="rId15"/>
-      <w:footerReference w:type="default" r:id="rId16"/>
-      <w:headerReference w:type="first" r:id="rId17"/>
-      <w:footerReference w:type="first" r:id="rId18"/>
+      <w:headerReference w:type="even" r:id="rId16"/>
+      <w:headerReference w:type="default" r:id="rId17"/>
+      <w:footerReference w:type="default" r:id="rId18"/>
+      <w:headerReference w:type="first" r:id="rId19"/>
+      <w:footerReference w:type="first" r:id="rId20"/>
       <w:type w:val="continuous"/>
       <w:pgSz w:w="11906" w:h="16838" w:code="9"/>
       <w:pgMar w:top="1417" w:right="720" w:bottom="1077" w:left="720" w:header="1020" w:footer="340" w:gutter="0"/>
@@ -33169,7 +33007,7 @@
 </file>
 
 <file path=word/endnotes.xml><?xml version="1.0" encoding="utf-8"?>
-<w:endnotes xmlns:wpc="http://schemas.microsoft.com/office/word/2010/wordprocessingCanvas" xmlns:cx="http://schemas.microsoft.com/office/drawing/2014/chartex" xmlns:cx1="http://schemas.microsoft.com/office/drawing/2015/9/8/chartex" xmlns:cx2="http://schemas.microsoft.com/office/drawing/2015/10/21/chartex" xmlns:cx3="http://schemas.microsoft.com/office/drawing/2016/5/9/chartex" xmlns:cx4="http://schemas.microsoft.com/office/drawing/2016/5/10/chartex" xmlns:cx5="http://schemas.microsoft.com/office/drawing/2016/5/11/chartex" xmlns:cx6="http://schemas.microsoft.com/office/drawing/2016/5/12/chartex" xmlns:cx7="http://schemas.microsoft.com/office/drawing/2016/5/13/chartex" xmlns:cx8="http://schemas.microsoft.com/office/drawing/2016/5/14/chartex" xmlns:mc="http://schemas.openxmlformats.org/markup-compatibility/2006" xmlns:aink="http://schemas.microsoft.com/office/drawing/2016/ink" xmlns:am3d="http://schemas.microsoft.com/office/drawing/2017/model3d" xmlns:o="urn:schemas-microsoft-com:office:office" xmlns:oel="http://schemas.microsoft.com/office/2019/extlst" xmlns:r="http://schemas.openxmlformats.org/officeDocument/2006/relationships" xmlns:m="http://schemas.openxmlformats.org/officeDocument/2006/math" xmlns:v="urn:schemas-microsoft-com:vml" xmlns:wp14="http://schemas.microsoft.com/office/word/2010/wordprocessingDrawing" xmlns:wp="http://schemas.openxmlformats.org/drawingml/2006/wordprocessingDrawing" xmlns:w10="urn:schemas-microsoft-com:office:word" xmlns:w="http://schemas.openxmlformats.org/wordprocessingml/2006/main" xmlns:w14="http://schemas.microsoft.com/office/word/2010/wordml" xmlns:w15="http://schemas.microsoft.com/office/word/2012/wordml" xmlns:w16cex="http://schemas.microsoft.com/office/word/2018/wordml/cex" xmlns:w16cid="http://schemas.microsoft.com/office/word/2016/wordml/cid" xmlns:w16="http://schemas.microsoft.com/office/word/2018/wordml" xmlns:w16du="http://schemas.microsoft.com/office/word/2023/wordml/word16du" xmlns:w16sdtdh="http://schemas.microsoft.com/office/word/2020/wordml/sdtdatahash" xmlns:w16se="http://schemas.microsoft.com/office/word/2015/wordml/symex" xmlns:wpg="http://schemas.microsoft.com/office/word/2010/wordprocessingGroup" xmlns:wpi="http://schemas.microsoft.com/office/word/2010/wordprocessingInk" xmlns:wne="http://schemas.microsoft.com/office/word/2006/wordml" xmlns:wps="http://schemas.microsoft.com/office/word/2010/wordprocessingShape" mc:Ignorable="w14 w15 w16se w16cid w16 w16cex w16sdtdh w16du wp14">
+<w:endnotes xmlns:wpc="http://schemas.microsoft.com/office/word/2010/wordprocessingCanvas" xmlns:cx="http://schemas.microsoft.com/office/drawing/2014/chartex" xmlns:cx1="http://schemas.microsoft.com/office/drawing/2015/9/8/chartex" xmlns:cx2="http://schemas.microsoft.com/office/drawing/2015/10/21/chartex" xmlns:cx3="http://schemas.microsoft.com/office/drawing/2016/5/9/chartex" xmlns:cx4="http://schemas.microsoft.com/office/drawing/2016/5/10/chartex" xmlns:cx5="http://schemas.microsoft.com/office/drawing/2016/5/11/chartex" xmlns:cx6="http://schemas.microsoft.com/office/drawing/2016/5/12/chartex" xmlns:cx7="http://schemas.microsoft.com/office/drawing/2016/5/13/chartex" xmlns:cx8="http://schemas.microsoft.com/office/drawing/2016/5/14/chartex" xmlns:mc="http://schemas.openxmlformats.org/markup-compatibility/2006" xmlns:aink="http://schemas.microsoft.com/office/drawing/2016/ink" xmlns:am3d="http://schemas.microsoft.com/office/drawing/2017/model3d" xmlns:o="urn:schemas-microsoft-com:office:office" xmlns:oel="http://schemas.microsoft.com/office/2019/extlst" xmlns:r="http://schemas.openxmlformats.org/officeDocument/2006/relationships" xmlns:m="http://schemas.openxmlformats.org/officeDocument/2006/math" xmlns:v="urn:schemas-microsoft-com:vml" xmlns:wp14="http://schemas.microsoft.com/office/word/2010/wordprocessingDrawing" xmlns:wp="http://schemas.openxmlformats.org/drawingml/2006/wordprocessingDrawing" xmlns:w10="urn:schemas-microsoft-com:office:word" xmlns:w="http://schemas.openxmlformats.org/wordprocessingml/2006/main" xmlns:w14="http://schemas.microsoft.com/office/word/2010/wordml" xmlns:w15="http://schemas.microsoft.com/office/word/2012/wordml" xmlns:w16cex="http://schemas.microsoft.com/office/word/2018/wordml/cex" xmlns:w16cid="http://schemas.microsoft.com/office/word/2016/wordml/cid" xmlns:w16="http://schemas.microsoft.com/office/word/2018/wordml" xmlns:w16du="http://schemas.microsoft.com/office/word/2023/wordml/word16du" xmlns:w16sdtdh="http://schemas.microsoft.com/office/word/2020/wordml/sdtdatahash" xmlns:w16sdtfl="http://schemas.microsoft.com/office/word/2024/wordml/sdtformatlock" xmlns:w16se="http://schemas.microsoft.com/office/word/2015/wordml/symex" xmlns:wpg="http://schemas.microsoft.com/office/word/2010/wordprocessingGroup" xmlns:wpi="http://schemas.microsoft.com/office/word/2010/wordprocessingInk" xmlns:wne="http://schemas.microsoft.com/office/word/2006/wordml" xmlns:wps="http://schemas.microsoft.com/office/word/2010/wordprocessingShape" mc:Ignorable="w14 w15 w16se w16cid w16 w16cex w16sdtdh w16sdtfl w16du wp14">
   <w:endnote w:type="separator" w:id="-1">
     <w:p>
       <w:pPr>
@@ -33194,7 +33032,7 @@
 </file>
 
 <file path=word/footer1.xml><?xml version="1.0" encoding="utf-8"?>
-<w:ftr xmlns:wpc="http://schemas.microsoft.com/office/word/2010/wordprocessingCanvas" xmlns:cx="http://schemas.microsoft.com/office/drawing/2014/chartex" xmlns:cx1="http://schemas.microsoft.com/office/drawing/2015/9/8/chartex" xmlns:cx2="http://schemas.microsoft.com/office/drawing/2015/10/21/chartex" xmlns:cx3="http://schemas.microsoft.com/office/drawing/2016/5/9/chartex" xmlns:cx4="http://schemas.microsoft.com/office/drawing/2016/5/10/chartex" xmlns:cx5="http://schemas.microsoft.com/office/drawing/2016/5/11/chartex" xmlns:cx6="http://schemas.microsoft.com/office/drawing/2016/5/12/chartex" xmlns:cx7="http://schemas.microsoft.com/office/drawing/2016/5/13/chartex" xmlns:cx8="http://schemas.microsoft.com/office/drawing/2016/5/14/chartex" xmlns:mc="http://schemas.openxmlformats.org/markup-compatibility/2006" xmlns:aink="http://schemas.microsoft.com/office/drawing/2016/ink" xmlns:am3d="http://schemas.microsoft.com/office/drawing/2017/model3d" xmlns:o="urn:schemas-microsoft-com:office:office" xmlns:oel="http://schemas.microsoft.com/office/2019/extlst" xmlns:r="http://schemas.openxmlformats.org/officeDocument/2006/relationships" xmlns:m="http://schemas.openxmlformats.org/officeDocument/2006/math" xmlns:v="urn:schemas-microsoft-com:vml" xmlns:wp14="http://schemas.microsoft.com/office/word/2010/wordprocessingDrawing" xmlns:wp="http://schemas.openxmlformats.org/drawingml/2006/wordprocessingDrawing" xmlns:w10="urn:schemas-microsoft-com:office:word" xmlns:w="http://schemas.openxmlformats.org/wordprocessingml/2006/main" xmlns:w14="http://schemas.microsoft.com/office/word/2010/wordml" xmlns:w15="http://schemas.microsoft.com/office/word/2012/wordml" xmlns:w16cex="http://schemas.microsoft.com/office/word/2018/wordml/cex" xmlns:w16cid="http://schemas.microsoft.com/office/word/2016/wordml/cid" xmlns:w16="http://schemas.microsoft.com/office/word/2018/wordml" xmlns:w16du="http://schemas.microsoft.com/office/word/2023/wordml/word16du" xmlns:w16sdtdh="http://schemas.microsoft.com/office/word/2020/wordml/sdtdatahash" xmlns:w16se="http://schemas.microsoft.com/office/word/2015/wordml/symex" xmlns:wpg="http://schemas.microsoft.com/office/word/2010/wordprocessingGroup" xmlns:wpi="http://schemas.microsoft.com/office/word/2010/wordprocessingInk" xmlns:wne="http://schemas.microsoft.com/office/word/2006/wordml" xmlns:wps="http://schemas.microsoft.com/office/word/2010/wordprocessingShape" mc:Ignorable="w14 w15 w16se w16cid w16 w16cex w16sdtdh w16du wp14">
+<w:ftr xmlns:wpc="http://schemas.microsoft.com/office/word/2010/wordprocessingCanvas" xmlns:cx="http://schemas.microsoft.com/office/drawing/2014/chartex" xmlns:cx1="http://schemas.microsoft.com/office/drawing/2015/9/8/chartex" xmlns:cx2="http://schemas.microsoft.com/office/drawing/2015/10/21/chartex" xmlns:cx3="http://schemas.microsoft.com/office/drawing/2016/5/9/chartex" xmlns:cx4="http://schemas.microsoft.com/office/drawing/2016/5/10/chartex" xmlns:cx5="http://schemas.microsoft.com/office/drawing/2016/5/11/chartex" xmlns:cx6="http://schemas.microsoft.com/office/drawing/2016/5/12/chartex" xmlns:cx7="http://schemas.microsoft.com/office/drawing/2016/5/13/chartex" xmlns:cx8="http://schemas.microsoft.com/office/drawing/2016/5/14/chartex" xmlns:mc="http://schemas.openxmlformats.org/markup-compatibility/2006" xmlns:aink="http://schemas.microsoft.com/office/drawing/2016/ink" xmlns:am3d="http://schemas.microsoft.com/office/drawing/2017/model3d" xmlns:o="urn:schemas-microsoft-com:office:office" xmlns:oel="http://schemas.microsoft.com/office/2019/extlst" xmlns:r="http://schemas.openxmlformats.org/officeDocument/2006/relationships" xmlns:m="http://schemas.openxmlformats.org/officeDocument/2006/math" xmlns:v="urn:schemas-microsoft-com:vml" xmlns:wp14="http://schemas.microsoft.com/office/word/2010/wordprocessingDrawing" xmlns:wp="http://schemas.openxmlformats.org/drawingml/2006/wordprocessingDrawing" xmlns:w10="urn:schemas-microsoft-com:office:word" xmlns:w="http://schemas.openxmlformats.org/wordprocessingml/2006/main" xmlns:w14="http://schemas.microsoft.com/office/word/2010/wordml" xmlns:w15="http://schemas.microsoft.com/office/word/2012/wordml" xmlns:w16cex="http://schemas.microsoft.com/office/word/2018/wordml/cex" xmlns:w16cid="http://schemas.microsoft.com/office/word/2016/wordml/cid" xmlns:w16="http://schemas.microsoft.com/office/word/2018/wordml" xmlns:w16du="http://schemas.microsoft.com/office/word/2023/wordml/word16du" xmlns:w16sdtdh="http://schemas.microsoft.com/office/word/2020/wordml/sdtdatahash" xmlns:w16sdtfl="http://schemas.microsoft.com/office/word/2024/wordml/sdtformatlock" xmlns:w16se="http://schemas.microsoft.com/office/word/2015/wordml/symex" xmlns:wpg="http://schemas.microsoft.com/office/word/2010/wordprocessingGroup" xmlns:wpi="http://schemas.microsoft.com/office/word/2010/wordprocessingInk" xmlns:wne="http://schemas.microsoft.com/office/word/2006/wordml" xmlns:wps="http://schemas.microsoft.com/office/word/2010/wordprocessingShape" mc:Ignorable="w14 w15 w16se w16cid w16 w16cex w16sdtdh w16sdtfl w16du wp14">
   <w:p>
     <w:pPr>
       <w:pStyle w:val="Footer"/>
@@ -33205,7 +33043,7 @@
 </file>
 
 <file path=word/footer2.xml><?xml version="1.0" encoding="utf-8"?>
-<w:ftr xmlns:wpc="http://schemas.microsoft.com/office/word/2010/wordprocessingCanvas" xmlns:cx="http://schemas.microsoft.com/office/drawing/2014/chartex" xmlns:cx1="http://schemas.microsoft.com/office/drawing/2015/9/8/chartex" xmlns:cx2="http://schemas.microsoft.com/office/drawing/2015/10/21/chartex" xmlns:cx3="http://schemas.microsoft.com/office/drawing/2016/5/9/chartex" xmlns:cx4="http://schemas.microsoft.com/office/drawing/2016/5/10/chartex" xmlns:cx5="http://schemas.microsoft.com/office/drawing/2016/5/11/chartex" xmlns:cx6="http://schemas.microsoft.com/office/drawing/2016/5/12/chartex" xmlns:cx7="http://schemas.microsoft.com/office/drawing/2016/5/13/chartex" xmlns:cx8="http://schemas.microsoft.com/office/drawing/2016/5/14/chartex" xmlns:mc="http://schemas.openxmlformats.org/markup-compatibility/2006" xmlns:aink="http://schemas.microsoft.com/office/drawing/2016/ink" xmlns:am3d="http://schemas.microsoft.com/office/drawing/2017/model3d" xmlns:o="urn:schemas-microsoft-com:office:office" xmlns:oel="http://schemas.microsoft.com/office/2019/extlst" xmlns:r="http://schemas.openxmlformats.org/officeDocument/2006/relationships" xmlns:m="http://schemas.openxmlformats.org/officeDocument/2006/math" xmlns:v="urn:schemas-microsoft-com:vml" xmlns:wp14="http://schemas.microsoft.com/office/word/2010/wordprocessingDrawing" xmlns:wp="http://schemas.openxmlformats.org/drawingml/2006/wordprocessingDrawing" xmlns:w10="urn:schemas-microsoft-com:office:word" xmlns:w="http://schemas.openxmlformats.org/wordprocessingml/2006/main" xmlns:w14="http://schemas.microsoft.com/office/word/2010/wordml" xmlns:w15="http://schemas.microsoft.com/office/word/2012/wordml" xmlns:w16cex="http://schemas.microsoft.com/office/word/2018/wordml/cex" xmlns:w16cid="http://schemas.microsoft.com/office/word/2016/wordml/cid" xmlns:w16="http://schemas.microsoft.com/office/word/2018/wordml" xmlns:w16du="http://schemas.microsoft.com/office/word/2023/wordml/word16du" xmlns:w16sdtdh="http://schemas.microsoft.com/office/word/2020/wordml/sdtdatahash" xmlns:w16se="http://schemas.microsoft.com/office/word/2015/wordml/symex" xmlns:wpg="http://schemas.microsoft.com/office/word/2010/wordprocessingGroup" xmlns:wpi="http://schemas.microsoft.com/office/word/2010/wordprocessingInk" xmlns:wne="http://schemas.microsoft.com/office/word/2006/wordml" xmlns:wps="http://schemas.microsoft.com/office/word/2010/wordprocessingShape" mc:Ignorable="w14 w15 w16se w16cid w16 w16cex w16sdtdh w16du wp14">
+<w:ftr xmlns:wpc="http://schemas.microsoft.com/office/word/2010/wordprocessingCanvas" xmlns:cx="http://schemas.microsoft.com/office/drawing/2014/chartex" xmlns:cx1="http://schemas.microsoft.com/office/drawing/2015/9/8/chartex" xmlns:cx2="http://schemas.microsoft.com/office/drawing/2015/10/21/chartex" xmlns:cx3="http://schemas.microsoft.com/office/drawing/2016/5/9/chartex" xmlns:cx4="http://schemas.microsoft.com/office/drawing/2016/5/10/chartex" xmlns:cx5="http://schemas.microsoft.com/office/drawing/2016/5/11/chartex" xmlns:cx6="http://schemas.microsoft.com/office/drawing/2016/5/12/chartex" xmlns:cx7="http://schemas.microsoft.com/office/drawing/2016/5/13/chartex" xmlns:cx8="http://schemas.microsoft.com/office/drawing/2016/5/14/chartex" xmlns:mc="http://schemas.openxmlformats.org/markup-compatibility/2006" xmlns:aink="http://schemas.microsoft.com/office/drawing/2016/ink" xmlns:am3d="http://schemas.microsoft.com/office/drawing/2017/model3d" xmlns:o="urn:schemas-microsoft-com:office:office" xmlns:oel="http://schemas.microsoft.com/office/2019/extlst" xmlns:r="http://schemas.openxmlformats.org/officeDocument/2006/relationships" xmlns:m="http://schemas.openxmlformats.org/officeDocument/2006/math" xmlns:v="urn:schemas-microsoft-com:vml" xmlns:wp14="http://schemas.microsoft.com/office/word/2010/wordprocessingDrawing" xmlns:wp="http://schemas.openxmlformats.org/drawingml/2006/wordprocessingDrawing" xmlns:w10="urn:schemas-microsoft-com:office:word" xmlns:w="http://schemas.openxmlformats.org/wordprocessingml/2006/main" xmlns:w14="http://schemas.microsoft.com/office/word/2010/wordml" xmlns:w15="http://schemas.microsoft.com/office/word/2012/wordml" xmlns:w16cex="http://schemas.microsoft.com/office/word/2018/wordml/cex" xmlns:w16cid="http://schemas.microsoft.com/office/word/2016/wordml/cid" xmlns:w16="http://schemas.microsoft.com/office/word/2018/wordml" xmlns:w16du="http://schemas.microsoft.com/office/word/2023/wordml/word16du" xmlns:w16sdtdh="http://schemas.microsoft.com/office/word/2020/wordml/sdtdatahash" xmlns:w16sdtfl="http://schemas.microsoft.com/office/word/2024/wordml/sdtformatlock" xmlns:w16se="http://schemas.microsoft.com/office/word/2015/wordml/symex" xmlns:wpg="http://schemas.microsoft.com/office/word/2010/wordprocessingGroup" xmlns:wpi="http://schemas.microsoft.com/office/word/2010/wordprocessingInk" xmlns:wne="http://schemas.microsoft.com/office/word/2006/wordml" xmlns:wps="http://schemas.microsoft.com/office/word/2010/wordprocessingShape" mc:Ignorable="w14 w15 w16se w16cid w16 w16cex w16sdtdh w16sdtfl w16du wp14">
   <w:p>
     <w:pPr>
       <w:pBdr>
@@ -33333,7 +33171,7 @@
 </file>
 
 <file path=word/footnotes.xml><?xml version="1.0" encoding="utf-8"?>
-<w:footnotes xmlns:wpc="http://schemas.microsoft.com/office/word/2010/wordprocessingCanvas" xmlns:cx="http://schemas.microsoft.com/office/drawing/2014/chartex" xmlns:cx1="http://schemas.microsoft.com/office/drawing/2015/9/8/chartex" xmlns:cx2="http://schemas.microsoft.com/office/drawing/2015/10/21/chartex" xmlns:cx3="http://schemas.microsoft.com/office/drawing/2016/5/9/chartex" xmlns:cx4="http://schemas.microsoft.com/office/drawing/2016/5/10/chartex" xmlns:cx5="http://schemas.microsoft.com/office/drawing/2016/5/11/chartex" xmlns:cx6="http://schemas.microsoft.com/office/drawing/2016/5/12/chartex" xmlns:cx7="http://schemas.microsoft.com/office/drawing/2016/5/13/chartex" xmlns:cx8="http://schemas.microsoft.com/office/drawing/2016/5/14/chartex" xmlns:mc="http://schemas.openxmlformats.org/markup-compatibility/2006" xmlns:aink="http://schemas.microsoft.com/office/drawing/2016/ink" xmlns:am3d="http://schemas.microsoft.com/office/drawing/2017/model3d" xmlns:o="urn:schemas-microsoft-com:office:office" xmlns:oel="http://schemas.microsoft.com/office/2019/extlst" xmlns:r="http://schemas.openxmlformats.org/officeDocument/2006/relationships" xmlns:m="http://schemas.openxmlformats.org/officeDocument/2006/math" xmlns:v="urn:schemas-microsoft-com:vml" xmlns:wp14="http://schemas.microsoft.com/office/word/2010/wordprocessingDrawing" xmlns:wp="http://schemas.openxmlformats.org/drawingml/2006/wordprocessingDrawing" xmlns:w10="urn:schemas-microsoft-com:office:word" xmlns:w="http://schemas.openxmlformats.org/wordprocessingml/2006/main" xmlns:w14="http://schemas.microsoft.com/office/word/2010/wordml" xmlns:w15="http://schemas.microsoft.com/office/word/2012/wordml" xmlns:w16cex="http://schemas.microsoft.com/office/word/2018/wordml/cex" xmlns:w16cid="http://schemas.microsoft.com/office/word/2016/wordml/cid" xmlns:w16="http://schemas.microsoft.com/office/word/2018/wordml" xmlns:w16du="http://schemas.microsoft.com/office/word/2023/wordml/word16du" xmlns:w16sdtdh="http://schemas.microsoft.com/office/word/2020/wordml/sdtdatahash" xmlns:w16se="http://schemas.microsoft.com/office/word/2015/wordml/symex" xmlns:wpg="http://schemas.microsoft.com/office/word/2010/wordprocessingGroup" xmlns:wpi="http://schemas.microsoft.com/office/word/2010/wordprocessingInk" xmlns:wne="http://schemas.microsoft.com/office/word/2006/wordml" xmlns:wps="http://schemas.microsoft.com/office/word/2010/wordprocessingShape" mc:Ignorable="w14 w15 w16se w16cid w16 w16cex w16sdtdh w16du wp14">
+<w:footnotes xmlns:wpc="http://schemas.microsoft.com/office/word/2010/wordprocessingCanvas" xmlns:cx="http://schemas.microsoft.com/office/drawing/2014/chartex" xmlns:cx1="http://schemas.microsoft.com/office/drawing/2015/9/8/chartex" xmlns:cx2="http://schemas.microsoft.com/office/drawing/2015/10/21/chartex" xmlns:cx3="http://schemas.microsoft.com/office/drawing/2016/5/9/chartex" xmlns:cx4="http://schemas.microsoft.com/office/drawing/2016/5/10/chartex" xmlns:cx5="http://schemas.microsoft.com/office/drawing/2016/5/11/chartex" xmlns:cx6="http://schemas.microsoft.com/office/drawing/2016/5/12/chartex" xmlns:cx7="http://schemas.microsoft.com/office/drawing/2016/5/13/chartex" xmlns:cx8="http://schemas.microsoft.com/office/drawing/2016/5/14/chartex" xmlns:mc="http://schemas.openxmlformats.org/markup-compatibility/2006" xmlns:aink="http://schemas.microsoft.com/office/drawing/2016/ink" xmlns:am3d="http://schemas.microsoft.com/office/drawing/2017/model3d" xmlns:o="urn:schemas-microsoft-com:office:office" xmlns:oel="http://schemas.microsoft.com/office/2019/extlst" xmlns:r="http://schemas.openxmlformats.org/officeDocument/2006/relationships" xmlns:m="http://schemas.openxmlformats.org/officeDocument/2006/math" xmlns:v="urn:schemas-microsoft-com:vml" xmlns:wp14="http://schemas.microsoft.com/office/word/2010/wordprocessingDrawing" xmlns:wp="http://schemas.openxmlformats.org/drawingml/2006/wordprocessingDrawing" xmlns:w10="urn:schemas-microsoft-com:office:word" xmlns:w="http://schemas.openxmlformats.org/wordprocessingml/2006/main" xmlns:w14="http://schemas.microsoft.com/office/word/2010/wordml" xmlns:w15="http://schemas.microsoft.com/office/word/2012/wordml" xmlns:w16cex="http://schemas.microsoft.com/office/word/2018/wordml/cex" xmlns:w16cid="http://schemas.microsoft.com/office/word/2016/wordml/cid" xmlns:w16="http://schemas.microsoft.com/office/word/2018/wordml" xmlns:w16du="http://schemas.microsoft.com/office/word/2023/wordml/word16du" xmlns:w16sdtdh="http://schemas.microsoft.com/office/word/2020/wordml/sdtdatahash" xmlns:w16sdtfl="http://schemas.microsoft.com/office/word/2024/wordml/sdtformatlock" xmlns:w16se="http://schemas.microsoft.com/office/word/2015/wordml/symex" xmlns:wpg="http://schemas.microsoft.com/office/word/2010/wordprocessingGroup" xmlns:wpi="http://schemas.microsoft.com/office/word/2010/wordprocessingInk" xmlns:wne="http://schemas.microsoft.com/office/word/2006/wordml" xmlns:wps="http://schemas.microsoft.com/office/word/2010/wordprocessingShape" mc:Ignorable="w14 w15 w16se w16cid w16 w16cex w16sdtdh w16sdtfl w16du wp14">
   <w:footnote w:type="separator" w:id="-1">
     <w:p>
       <w:pPr>
@@ -33358,7 +33196,7 @@
 </file>
 
 <file path=word/header1.xml><?xml version="1.0" encoding="utf-8"?>
-<w:hdr xmlns:wpc="http://schemas.microsoft.com/office/word/2010/wordprocessingCanvas" xmlns:cx="http://schemas.microsoft.com/office/drawing/2014/chartex" xmlns:cx1="http://schemas.microsoft.com/office/drawing/2015/9/8/chartex" xmlns:cx2="http://schemas.microsoft.com/office/drawing/2015/10/21/chartex" xmlns:cx3="http://schemas.microsoft.com/office/drawing/2016/5/9/chartex" xmlns:cx4="http://schemas.microsoft.com/office/drawing/2016/5/10/chartex" xmlns:cx5="http://schemas.microsoft.com/office/drawing/2016/5/11/chartex" xmlns:cx6="http://schemas.microsoft.com/office/drawing/2016/5/12/chartex" xmlns:cx7="http://schemas.microsoft.com/office/drawing/2016/5/13/chartex" xmlns:cx8="http://schemas.microsoft.com/office/drawing/2016/5/14/chartex" xmlns:mc="http://schemas.openxmlformats.org/markup-compatibility/2006" xmlns:aink="http://schemas.microsoft.com/office/drawing/2016/ink" xmlns:am3d="http://schemas.microsoft.com/office/drawing/2017/model3d" xmlns:o="urn:schemas-microsoft-com:office:office" xmlns:oel="http://schemas.microsoft.com/office/2019/extlst" xmlns:r="http://schemas.openxmlformats.org/officeDocument/2006/relationships" xmlns:m="http://schemas.openxmlformats.org/officeDocument/2006/math" xmlns:v="urn:schemas-microsoft-com:vml" xmlns:wp14="http://schemas.microsoft.com/office/word/2010/wordprocessingDrawing" xmlns:wp="http://schemas.openxmlformats.org/drawingml/2006/wordprocessingDrawing" xmlns:w10="urn:schemas-microsoft-com:office:word" xmlns:w="http://schemas.openxmlformats.org/wordprocessingml/2006/main" xmlns:w14="http://schemas.microsoft.com/office/word/2010/wordml" xmlns:w15="http://schemas.microsoft.com/office/word/2012/wordml" xmlns:w16cex="http://schemas.microsoft.com/office/word/2018/wordml/cex" xmlns:w16cid="http://schemas.microsoft.com/office/word/2016/wordml/cid" xmlns:w16="http://schemas.microsoft.com/office/word/2018/wordml" xmlns:w16du="http://schemas.microsoft.com/office/word/2023/wordml/word16du" xmlns:w16sdtdh="http://schemas.microsoft.com/office/word/2020/wordml/sdtdatahash" xmlns:w16se="http://schemas.microsoft.com/office/word/2015/wordml/symex" xmlns:wpg="http://schemas.microsoft.com/office/word/2010/wordprocessingGroup" xmlns:wpi="http://schemas.microsoft.com/office/word/2010/wordprocessingInk" xmlns:wne="http://schemas.microsoft.com/office/word/2006/wordml" xmlns:wps="http://schemas.microsoft.com/office/word/2010/wordprocessingShape" mc:Ignorable="w14 w15 w16se w16cid w16 w16cex w16sdtdh w16du wp14">
+<w:hdr xmlns:wpc="http://schemas.microsoft.com/office/word/2010/wordprocessingCanvas" xmlns:cx="http://schemas.microsoft.com/office/drawing/2014/chartex" xmlns:cx1="http://schemas.microsoft.com/office/drawing/2015/9/8/chartex" xmlns:cx2="http://schemas.microsoft.com/office/drawing/2015/10/21/chartex" xmlns:cx3="http://schemas.microsoft.com/office/drawing/2016/5/9/chartex" xmlns:cx4="http://schemas.microsoft.com/office/drawing/2016/5/10/chartex" xmlns:cx5="http://schemas.microsoft.com/office/drawing/2016/5/11/chartex" xmlns:cx6="http://schemas.microsoft.com/office/drawing/2016/5/12/chartex" xmlns:cx7="http://schemas.microsoft.com/office/drawing/2016/5/13/chartex" xmlns:cx8="http://schemas.microsoft.com/office/drawing/2016/5/14/chartex" xmlns:mc="http://schemas.openxmlformats.org/markup-compatibility/2006" xmlns:aink="http://schemas.microsoft.com/office/drawing/2016/ink" xmlns:am3d="http://schemas.microsoft.com/office/drawing/2017/model3d" xmlns:o="urn:schemas-microsoft-com:office:office" xmlns:oel="http://schemas.microsoft.com/office/2019/extlst" xmlns:r="http://schemas.openxmlformats.org/officeDocument/2006/relationships" xmlns:m="http://schemas.openxmlformats.org/officeDocument/2006/math" xmlns:v="urn:schemas-microsoft-com:vml" xmlns:wp14="http://schemas.microsoft.com/office/word/2010/wordprocessingDrawing" xmlns:wp="http://schemas.openxmlformats.org/drawingml/2006/wordprocessingDrawing" xmlns:w10="urn:schemas-microsoft-com:office:word" xmlns:w="http://schemas.openxmlformats.org/wordprocessingml/2006/main" xmlns:w14="http://schemas.microsoft.com/office/word/2010/wordml" xmlns:w15="http://schemas.microsoft.com/office/word/2012/wordml" xmlns:w16cex="http://schemas.microsoft.com/office/word/2018/wordml/cex" xmlns:w16cid="http://schemas.microsoft.com/office/word/2016/wordml/cid" xmlns:w16="http://schemas.microsoft.com/office/word/2018/wordml" xmlns:w16du="http://schemas.microsoft.com/office/word/2023/wordml/word16du" xmlns:w16sdtdh="http://schemas.microsoft.com/office/word/2020/wordml/sdtdatahash" xmlns:w16sdtfl="http://schemas.microsoft.com/office/word/2024/wordml/sdtformatlock" xmlns:w16se="http://schemas.microsoft.com/office/word/2015/wordml/symex" xmlns:wpg="http://schemas.microsoft.com/office/word/2010/wordprocessingGroup" xmlns:wpi="http://schemas.microsoft.com/office/word/2010/wordprocessingInk" xmlns:wne="http://schemas.microsoft.com/office/word/2006/wordml" xmlns:wps="http://schemas.microsoft.com/office/word/2010/wordprocessingShape" mc:Ignorable="w14 w15 w16se w16cid w16 w16cex w16sdtdh w16sdtfl w16du wp14">
   <w:p>
     <w:pPr>
       <w:pStyle w:val="Header"/>
@@ -33371,7 +33209,7 @@
 </file>
 
 <file path=word/header2.xml><?xml version="1.0" encoding="utf-8"?>
-<w:hdr xmlns:wpc="http://schemas.microsoft.com/office/word/2010/wordprocessingCanvas" xmlns:cx="http://schemas.microsoft.com/office/drawing/2014/chartex" xmlns:cx1="http://schemas.microsoft.com/office/drawing/2015/9/8/chartex" xmlns:cx2="http://schemas.microsoft.com/office/drawing/2015/10/21/chartex" xmlns:cx3="http://schemas.microsoft.com/office/drawing/2016/5/9/chartex" xmlns:cx4="http://schemas.microsoft.com/office/drawing/2016/5/10/chartex" xmlns:cx5="http://schemas.microsoft.com/office/drawing/2016/5/11/chartex" xmlns:cx6="http://schemas.microsoft.com/office/drawing/2016/5/12/chartex" xmlns:cx7="http://schemas.microsoft.com/office/drawing/2016/5/13/chartex" xmlns:cx8="http://schemas.microsoft.com/office/drawing/2016/5/14/chartex" xmlns:mc="http://schemas.openxmlformats.org/markup-compatibility/2006" xmlns:aink="http://schemas.microsoft.com/office/drawing/2016/ink" xmlns:am3d="http://schemas.microsoft.com/office/drawing/2017/model3d" xmlns:o="urn:schemas-microsoft-com:office:office" xmlns:oel="http://schemas.microsoft.com/office/2019/extlst" xmlns:r="http://schemas.openxmlformats.org/officeDocument/2006/relationships" xmlns:m="http://schemas.openxmlformats.org/officeDocument/2006/math" xmlns:v="urn:schemas-microsoft-com:vml" xmlns:wp14="http://schemas.microsoft.com/office/word/2010/wordprocessingDrawing" xmlns:wp="http://schemas.openxmlformats.org/drawingml/2006/wordprocessingDrawing" xmlns:w10="urn:schemas-microsoft-com:office:word" xmlns:w="http://schemas.openxmlformats.org/wordprocessingml/2006/main" xmlns:w14="http://schemas.microsoft.com/office/word/2010/wordml" xmlns:w15="http://schemas.microsoft.com/office/word/2012/wordml" xmlns:w16cex="http://schemas.microsoft.com/office/word/2018/wordml/cex" xmlns:w16cid="http://schemas.microsoft.com/office/word/2016/wordml/cid" xmlns:w16="http://schemas.microsoft.com/office/word/2018/wordml" xmlns:w16du="http://schemas.microsoft.com/office/word/2023/wordml/word16du" xmlns:w16sdtdh="http://schemas.microsoft.com/office/word/2020/wordml/sdtdatahash" xmlns:w16se="http://schemas.microsoft.com/office/word/2015/wordml/symex" xmlns:wpg="http://schemas.microsoft.com/office/word/2010/wordprocessingGroup" xmlns:wpi="http://schemas.microsoft.com/office/word/2010/wordprocessingInk" xmlns:wne="http://schemas.microsoft.com/office/word/2006/wordml" xmlns:wps="http://schemas.microsoft.com/office/word/2010/wordprocessingShape" mc:Ignorable="w14 w15 w16se w16cid w16 w16cex w16sdtdh w16du wp14">
+<w:hdr xmlns:wpc="http://schemas.microsoft.com/office/word/2010/wordprocessingCanvas" xmlns:cx="http://schemas.microsoft.com/office/drawing/2014/chartex" xmlns:cx1="http://schemas.microsoft.com/office/drawing/2015/9/8/chartex" xmlns:cx2="http://schemas.microsoft.com/office/drawing/2015/10/21/chartex" xmlns:cx3="http://schemas.microsoft.com/office/drawing/2016/5/9/chartex" xmlns:cx4="http://schemas.microsoft.com/office/drawing/2016/5/10/chartex" xmlns:cx5="http://schemas.microsoft.com/office/drawing/2016/5/11/chartex" xmlns:cx6="http://schemas.microsoft.com/office/drawing/2016/5/12/chartex" xmlns:cx7="http://schemas.microsoft.com/office/drawing/2016/5/13/chartex" xmlns:cx8="http://schemas.microsoft.com/office/drawing/2016/5/14/chartex" xmlns:mc="http://schemas.openxmlformats.org/markup-compatibility/2006" xmlns:aink="http://schemas.microsoft.com/office/drawing/2016/ink" xmlns:am3d="http://schemas.microsoft.com/office/drawing/2017/model3d" xmlns:o="urn:schemas-microsoft-com:office:office" xmlns:oel="http://schemas.microsoft.com/office/2019/extlst" xmlns:r="http://schemas.openxmlformats.org/officeDocument/2006/relationships" xmlns:m="http://schemas.openxmlformats.org/officeDocument/2006/math" xmlns:v="urn:schemas-microsoft-com:vml" xmlns:wp14="http://schemas.microsoft.com/office/word/2010/wordprocessingDrawing" xmlns:wp="http://schemas.openxmlformats.org/drawingml/2006/wordprocessingDrawing" xmlns:w10="urn:schemas-microsoft-com:office:word" xmlns:w="http://schemas.openxmlformats.org/wordprocessingml/2006/main" xmlns:w14="http://schemas.microsoft.com/office/word/2010/wordml" xmlns:w15="http://schemas.microsoft.com/office/word/2012/wordml" xmlns:w16cex="http://schemas.microsoft.com/office/word/2018/wordml/cex" xmlns:w16cid="http://schemas.microsoft.com/office/word/2016/wordml/cid" xmlns:w16="http://schemas.microsoft.com/office/word/2018/wordml" xmlns:w16du="http://schemas.microsoft.com/office/word/2023/wordml/word16du" xmlns:w16sdtdh="http://schemas.microsoft.com/office/word/2020/wordml/sdtdatahash" xmlns:w16sdtfl="http://schemas.microsoft.com/office/word/2024/wordml/sdtformatlock" xmlns:w16se="http://schemas.microsoft.com/office/word/2015/wordml/symex" xmlns:wpg="http://schemas.microsoft.com/office/word/2010/wordprocessingGroup" xmlns:wpi="http://schemas.microsoft.com/office/word/2010/wordprocessingInk" xmlns:wne="http://schemas.microsoft.com/office/word/2006/wordml" xmlns:wps="http://schemas.microsoft.com/office/word/2010/wordprocessingShape" mc:Ignorable="w14 w15 w16se w16cid w16 w16cex w16sdtdh w16sdtfl w16du wp14">
   <w:p>
     <w:pPr>
       <w:tabs>
@@ -33511,7 +33349,7 @@
 </file>
 
 <file path=word/header3.xml><?xml version="1.0" encoding="utf-8"?>
-<w:hdr xmlns:wpc="http://schemas.microsoft.com/office/word/2010/wordprocessingCanvas" xmlns:cx="http://schemas.microsoft.com/office/drawing/2014/chartex" xmlns:cx1="http://schemas.microsoft.com/office/drawing/2015/9/8/chartex" xmlns:cx2="http://schemas.microsoft.com/office/drawing/2015/10/21/chartex" xmlns:cx3="http://schemas.microsoft.com/office/drawing/2016/5/9/chartex" xmlns:cx4="http://schemas.microsoft.com/office/drawing/2016/5/10/chartex" xmlns:cx5="http://schemas.microsoft.com/office/drawing/2016/5/11/chartex" xmlns:cx6="http://schemas.microsoft.com/office/drawing/2016/5/12/chartex" xmlns:cx7="http://schemas.microsoft.com/office/drawing/2016/5/13/chartex" xmlns:cx8="http://schemas.microsoft.com/office/drawing/2016/5/14/chartex" xmlns:mc="http://schemas.openxmlformats.org/markup-compatibility/2006" xmlns:aink="http://schemas.microsoft.com/office/drawing/2016/ink" xmlns:am3d="http://schemas.microsoft.com/office/drawing/2017/model3d" xmlns:o="urn:schemas-microsoft-com:office:office" xmlns:oel="http://schemas.microsoft.com/office/2019/extlst" xmlns:r="http://schemas.openxmlformats.org/officeDocument/2006/relationships" xmlns:m="http://schemas.openxmlformats.org/officeDocument/2006/math" xmlns:v="urn:schemas-microsoft-com:vml" xmlns:wp14="http://schemas.microsoft.com/office/word/2010/wordprocessingDrawing" xmlns:wp="http://schemas.openxmlformats.org/drawingml/2006/wordprocessingDrawing" xmlns:w10="urn:schemas-microsoft-com:office:word" xmlns:w="http://schemas.openxmlformats.org/wordprocessingml/2006/main" xmlns:w14="http://schemas.microsoft.com/office/word/2010/wordml" xmlns:w15="http://schemas.microsoft.com/office/word/2012/wordml" xmlns:w16cex="http://schemas.microsoft.com/office/word/2018/wordml/cex" xmlns:w16cid="http://schemas.microsoft.com/office/word/2016/wordml/cid" xmlns:w16="http://schemas.microsoft.com/office/word/2018/wordml" xmlns:w16du="http://schemas.microsoft.com/office/word/2023/wordml/word16du" xmlns:w16sdtdh="http://schemas.microsoft.com/office/word/2020/wordml/sdtdatahash" xmlns:w16se="http://schemas.microsoft.com/office/word/2015/wordml/symex" xmlns:wpg="http://schemas.microsoft.com/office/word/2010/wordprocessingGroup" xmlns:wpi="http://schemas.microsoft.com/office/word/2010/wordprocessingInk" xmlns:wne="http://schemas.microsoft.com/office/word/2006/wordml" xmlns:wps="http://schemas.microsoft.com/office/word/2010/wordprocessingShape" mc:Ignorable="w14 w15 w16se w16cid w16 w16cex w16sdtdh w16du wp14">
+<w:hdr xmlns:wpc="http://schemas.microsoft.com/office/word/2010/wordprocessingCanvas" xmlns:cx="http://schemas.microsoft.com/office/drawing/2014/chartex" xmlns:cx1="http://schemas.microsoft.com/office/drawing/2015/9/8/chartex" xmlns:cx2="http://schemas.microsoft.com/office/drawing/2015/10/21/chartex" xmlns:cx3="http://schemas.microsoft.com/office/drawing/2016/5/9/chartex" xmlns:cx4="http://schemas.microsoft.com/office/drawing/2016/5/10/chartex" xmlns:cx5="http://schemas.microsoft.com/office/drawing/2016/5/11/chartex" xmlns:cx6="http://schemas.microsoft.com/office/drawing/2016/5/12/chartex" xmlns:cx7="http://schemas.microsoft.com/office/drawing/2016/5/13/chartex" xmlns:cx8="http://schemas.microsoft.com/office/drawing/2016/5/14/chartex" xmlns:mc="http://schemas.openxmlformats.org/markup-compatibility/2006" xmlns:aink="http://schemas.microsoft.com/office/drawing/2016/ink" xmlns:am3d="http://schemas.microsoft.com/office/drawing/2017/model3d" xmlns:o="urn:schemas-microsoft-com:office:office" xmlns:oel="http://schemas.microsoft.com/office/2019/extlst" xmlns:r="http://schemas.openxmlformats.org/officeDocument/2006/relationships" xmlns:m="http://schemas.openxmlformats.org/officeDocument/2006/math" xmlns:v="urn:schemas-microsoft-com:vml" xmlns:wp14="http://schemas.microsoft.com/office/word/2010/wordprocessingDrawing" xmlns:wp="http://schemas.openxmlformats.org/drawingml/2006/wordprocessingDrawing" xmlns:w10="urn:schemas-microsoft-com:office:word" xmlns:w="http://schemas.openxmlformats.org/wordprocessingml/2006/main" xmlns:w14="http://schemas.microsoft.com/office/word/2010/wordml" xmlns:w15="http://schemas.microsoft.com/office/word/2012/wordml" xmlns:w16cex="http://schemas.microsoft.com/office/word/2018/wordml/cex" xmlns:w16cid="http://schemas.microsoft.com/office/word/2016/wordml/cid" xmlns:w16="http://schemas.microsoft.com/office/word/2018/wordml" xmlns:w16du="http://schemas.microsoft.com/office/word/2023/wordml/word16du" xmlns:w16sdtdh="http://schemas.microsoft.com/office/word/2020/wordml/sdtdatahash" xmlns:w16sdtfl="http://schemas.microsoft.com/office/word/2024/wordml/sdtformatlock" xmlns:w16se="http://schemas.microsoft.com/office/word/2015/wordml/symex" xmlns:wpg="http://schemas.microsoft.com/office/word/2010/wordprocessingGroup" xmlns:wpi="http://schemas.microsoft.com/office/word/2010/wordprocessingInk" xmlns:wne="http://schemas.microsoft.com/office/word/2006/wordml" xmlns:wps="http://schemas.microsoft.com/office/word/2010/wordprocessingShape" mc:Ignorable="w14 w15 w16se w16cid w16 w16cex w16sdtdh w16sdtfl w16du wp14">
   <w:tbl>
     <w:tblPr>
       <w:tblW w:w="10487" w:type="dxa"/>
@@ -33693,7 +33531,7 @@
 </file>
 
 <file path=word/numbering.xml><?xml version="1.0" encoding="utf-8"?>
-<w:numbering xmlns:wpc="http://schemas.microsoft.com/office/word/2010/wordprocessingCanvas" xmlns:cx="http://schemas.microsoft.com/office/drawing/2014/chartex" xmlns:cx1="http://schemas.microsoft.com/office/drawing/2015/9/8/chartex" xmlns:cx2="http://schemas.microsoft.com/office/drawing/2015/10/21/chartex" xmlns:cx3="http://schemas.microsoft.com/office/drawing/2016/5/9/chartex" xmlns:cx4="http://schemas.microsoft.com/office/drawing/2016/5/10/chartex" xmlns:cx5="http://schemas.microsoft.com/office/drawing/2016/5/11/chartex" xmlns:cx6="http://schemas.microsoft.com/office/drawing/2016/5/12/chartex" xmlns:cx7="http://schemas.microsoft.com/office/drawing/2016/5/13/chartex" xmlns:cx8="http://schemas.microsoft.com/office/drawing/2016/5/14/chartex" xmlns:mc="http://schemas.openxmlformats.org/markup-compatibility/2006" xmlns:aink="http://schemas.microsoft.com/office/drawing/2016/ink" xmlns:am3d="http://schemas.microsoft.com/office/drawing/2017/model3d" xmlns:o="urn:schemas-microsoft-com:office:office" xmlns:oel="http://schemas.microsoft.com/office/2019/extlst" xmlns:r="http://schemas.openxmlformats.org/officeDocument/2006/relationships" xmlns:m="http://schemas.openxmlformats.org/officeDocument/2006/math" xmlns:v="urn:schemas-microsoft-com:vml" xmlns:wp14="http://schemas.microsoft.com/office/word/2010/wordprocessingDrawing" xmlns:wp="http://schemas.openxmlformats.org/drawingml/2006/wordprocessingDrawing" xmlns:w10="urn:schemas-microsoft-com:office:word" xmlns:w="http://schemas.openxmlformats.org/wordprocessingml/2006/main" xmlns:w14="http://schemas.microsoft.com/office/word/2010/wordml" xmlns:w15="http://schemas.microsoft.com/office/word/2012/wordml" xmlns:w16cex="http://schemas.microsoft.com/office/word/2018/wordml/cex" xmlns:w16cid="http://schemas.microsoft.com/office/word/2016/wordml/cid" xmlns:w16="http://schemas.microsoft.com/office/word/2018/wordml" xmlns:w16du="http://schemas.microsoft.com/office/word/2023/wordml/word16du" xmlns:w16sdtdh="http://schemas.microsoft.com/office/word/2020/wordml/sdtdatahash" xmlns:w16se="http://schemas.microsoft.com/office/word/2015/wordml/symex" xmlns:wpg="http://schemas.microsoft.com/office/word/2010/wordprocessingGroup" xmlns:wpi="http://schemas.microsoft.com/office/word/2010/wordprocessingInk" xmlns:wne="http://schemas.microsoft.com/office/word/2006/wordml" xmlns:wps="http://schemas.microsoft.com/office/word/2010/wordprocessingShape" mc:Ignorable="w14 w15 w16se w16cid w16 w16cex w16sdtdh w16du wp14">
+<w:numbering xmlns:wpc="http://schemas.microsoft.com/office/word/2010/wordprocessingCanvas" xmlns:cx="http://schemas.microsoft.com/office/drawing/2014/chartex" xmlns:cx1="http://schemas.microsoft.com/office/drawing/2015/9/8/chartex" xmlns:cx2="http://schemas.microsoft.com/office/drawing/2015/10/21/chartex" xmlns:cx3="http://schemas.microsoft.com/office/drawing/2016/5/9/chartex" xmlns:cx4="http://schemas.microsoft.com/office/drawing/2016/5/10/chartex" xmlns:cx5="http://schemas.microsoft.com/office/drawing/2016/5/11/chartex" xmlns:cx6="http://schemas.microsoft.com/office/drawing/2016/5/12/chartex" xmlns:cx7="http://schemas.microsoft.com/office/drawing/2016/5/13/chartex" xmlns:cx8="http://schemas.microsoft.com/office/drawing/2016/5/14/chartex" xmlns:mc="http://schemas.openxmlformats.org/markup-compatibility/2006" xmlns:aink="http://schemas.microsoft.com/office/drawing/2016/ink" xmlns:am3d="http://schemas.microsoft.com/office/drawing/2017/model3d" xmlns:o="urn:schemas-microsoft-com:office:office" xmlns:oel="http://schemas.microsoft.com/office/2019/extlst" xmlns:r="http://schemas.openxmlformats.org/officeDocument/2006/relationships" xmlns:m="http://schemas.openxmlformats.org/officeDocument/2006/math" xmlns:v="urn:schemas-microsoft-com:vml" xmlns:wp14="http://schemas.microsoft.com/office/word/2010/wordprocessingDrawing" xmlns:wp="http://schemas.openxmlformats.org/drawingml/2006/wordprocessingDrawing" xmlns:w10="urn:schemas-microsoft-com:office:word" xmlns:w="http://schemas.openxmlformats.org/wordprocessingml/2006/main" xmlns:w14="http://schemas.microsoft.com/office/word/2010/wordml" xmlns:w15="http://schemas.microsoft.com/office/word/2012/wordml" xmlns:w16cex="http://schemas.microsoft.com/office/word/2018/wordml/cex" xmlns:w16cid="http://schemas.microsoft.com/office/word/2016/wordml/cid" xmlns:w16="http://schemas.microsoft.com/office/word/2018/wordml" xmlns:w16du="http://schemas.microsoft.com/office/word/2023/wordml/word16du" xmlns:w16sdtdh="http://schemas.microsoft.com/office/word/2020/wordml/sdtdatahash" xmlns:w16sdtfl="http://schemas.microsoft.com/office/word/2024/wordml/sdtformatlock" xmlns:w16se="http://schemas.microsoft.com/office/word/2015/wordml/symex" xmlns:wpg="http://schemas.microsoft.com/office/word/2010/wordprocessingGroup" xmlns:wpi="http://schemas.microsoft.com/office/word/2010/wordprocessingInk" xmlns:wne="http://schemas.microsoft.com/office/word/2006/wordml" xmlns:wps="http://schemas.microsoft.com/office/word/2010/wordprocessingShape" mc:Ignorable="w14 w15 w16se w16cid w16 w16cex w16sdtdh w16sdtfl w16du wp14">
   <w:abstractNum w:abstractNumId="0" w15:restartNumberingAfterBreak="0">
     <w:nsid w:val="04A4495D"/>
     <w:multiLevelType w:val="hybridMultilevel"/>
@@ -35227,7 +35065,7 @@
 </file>
 
 <file path=word/styles.xml><?xml version="1.0" encoding="utf-8"?>
-<w:styles xmlns:mc="http://schemas.openxmlformats.org/markup-compatibility/2006" xmlns:r="http://schemas.openxmlformats.org/officeDocument/2006/relationships" xmlns:w="http://schemas.openxmlformats.org/wordprocessingml/2006/main" xmlns:w14="http://schemas.microsoft.com/office/word/2010/wordml" xmlns:w15="http://schemas.microsoft.com/office/word/2012/wordml" xmlns:w16cex="http://schemas.microsoft.com/office/word/2018/wordml/cex" xmlns:w16cid="http://schemas.microsoft.com/office/word/2016/wordml/cid" xmlns:w16="http://schemas.microsoft.com/office/word/2018/wordml" xmlns:w16du="http://schemas.microsoft.com/office/word/2023/wordml/word16du" xmlns:w16sdtdh="http://schemas.microsoft.com/office/word/2020/wordml/sdtdatahash" xmlns:w16se="http://schemas.microsoft.com/office/word/2015/wordml/symex" mc:Ignorable="w14 w15 w16se w16cid w16 w16cex w16sdtdh w16du">
+<w:styles xmlns:mc="http://schemas.openxmlformats.org/markup-compatibility/2006" xmlns:r="http://schemas.openxmlformats.org/officeDocument/2006/relationships" xmlns:w="http://schemas.openxmlformats.org/wordprocessingml/2006/main" xmlns:w14="http://schemas.microsoft.com/office/word/2010/wordml" xmlns:w15="http://schemas.microsoft.com/office/word/2012/wordml" xmlns:w16cex="http://schemas.microsoft.com/office/word/2018/wordml/cex" xmlns:w16cid="http://schemas.microsoft.com/office/word/2016/wordml/cid" xmlns:w16="http://schemas.microsoft.com/office/word/2018/wordml" xmlns:w16du="http://schemas.microsoft.com/office/word/2023/wordml/word16du" xmlns:w16sdtdh="http://schemas.microsoft.com/office/word/2020/wordml/sdtdatahash" xmlns:w16sdtfl="http://schemas.microsoft.com/office/word/2024/wordml/sdtformatlock" xmlns:w16se="http://schemas.microsoft.com/office/word/2015/wordml/symex" mc:Ignorable="w14 w15 w16se w16cid w16 w16cex w16sdtdh w16sdtfl w16du">
   <w:docDefaults>
     <w:rPrDefault>
       <w:rPr>
@@ -35631,6 +35469,7 @@
   <w:style w:type="character" w:default="1" w:styleId="DefaultParagraphFont">
     <w:name w:val="Default Paragraph Font"/>
     <w:uiPriority w:val="1"/>
+    <w:semiHidden/>
     <w:unhideWhenUsed/>
   </w:style>
   <w:style w:type="table" w:default="1" w:styleId="TableNormal">

</xml_diff>

<commit_message>
Add initial probe of orig values to opt for better geoints
</commit_message>
<xml_diff>
--- a/manuscript/wen-li-2024-geointerv.docx
+++ b/manuscript/wen-li-2024-geointerv.docx
@@ -11989,12 +11989,14 @@
         </w:rPr>
         <w:t>, such that the diff</w:t>
       </w:r>
+      <w:proofErr w:type="spellStart"/>
       <w:r>
         <w:rPr>
           <w:lang w:val="en"/>
         </w:rPr>
         <w:t>erence</w:t>
       </w:r>
+      <w:proofErr w:type="spellEnd"/>
       <w:r>
         <w:rPr>
           <w:lang w:val="en"/>
@@ -26099,8 +26101,8 @@
         </w:rPr>
         <w:lastRenderedPageBreak/>
         <w:drawing>
-          <wp:inline distT="0" distB="0" distL="0" distR="0" wp14:anchorId="17F7A8F7" wp14:editId="013D5387">
-            <wp:extent cx="5108955" cy="6195017"/>
+          <wp:inline distT="0" distB="0" distL="0" distR="0" wp14:anchorId="17F7A8F7" wp14:editId="780539F7">
+            <wp:extent cx="5108954" cy="6195017"/>
             <wp:effectExtent l="0" t="0" r="0" b="3175"/>
             <wp:docPr id="482265357" name="Picture 6"/>
             <wp:cNvGraphicFramePr>
@@ -26122,7 +26124,7 @@
                   <pic:spPr>
                     <a:xfrm>
                       <a:off x="0" y="0"/>
-                      <a:ext cx="5108955" cy="6195017"/>
+                      <a:ext cx="5108954" cy="6195017"/>
                     </a:xfrm>
                     <a:prstGeom prst="rect">
                       <a:avLst/>
@@ -26293,7 +26295,7 @@
         <w:t xml:space="preserve"> had 1</w:t>
       </w:r>
       <w:r>
-        <w:t>614</w:t>
+        <w:t>408</w:t>
       </w:r>
       <w:r>
         <w:t xml:space="preserve"> aggregate variables (</w:t>
@@ -26394,16 +26396,22 @@
         <w:t xml:space="preserve"> Out of the six models, the </w:t>
       </w:r>
       <w:r>
-        <w:t>4</w:t>
+        <w:t>8</w:t>
       </w:r>
       <w:r>
         <w:t xml:space="preserve">0 by </w:t>
       </w:r>
       <w:r>
-        <w:t>4</w:t>
-      </w:r>
-      <w:r>
-        <w:t xml:space="preserve">0 cell </w:t>
+        <w:t>8</w:t>
+      </w:r>
+      <w:r>
+        <w:t xml:space="preserve">0 </w:t>
+      </w:r>
+      <w:r>
+        <w:t>grid</w:t>
+      </w:r>
+      <w:r>
+        <w:t xml:space="preserve"> </w:t>
       </w:r>
       <w:proofErr w:type="spellStart"/>
       <w:r>
@@ -26411,7 +26419,7 @@
           <w:i/>
           <w:iCs/>
         </w:rPr>
-        <w:t>tpot</w:t>
+        <w:t>autosklearn</w:t>
       </w:r>
       <w:proofErr w:type="spellEnd"/>
       <w:r>
@@ -26425,10 +26433,28 @@
         <w:t xml:space="preserve">model had the best performance </w:t>
       </w:r>
       <w:r>
-        <w:t xml:space="preserve">(MAE=105.87), </w:t>
-      </w:r>
-      <w:r>
-        <w:t xml:space="preserve">while the 10 by 10 cell </w:t>
+        <w:t>(</w:t>
+      </w:r>
+      <w:r>
+        <w:t xml:space="preserve">lowest </w:t>
+      </w:r>
+      <w:r>
+        <w:t>MAE=</w:t>
+      </w:r>
+      <w:r>
+        <w:t>82.95</w:t>
+      </w:r>
+      <w:r>
+        <w:t xml:space="preserve">), </w:t>
+      </w:r>
+      <w:r>
+        <w:t xml:space="preserve">while the 10 by 10 </w:t>
+      </w:r>
+      <w:r>
+        <w:t>grid</w:t>
+      </w:r>
+      <w:r>
+        <w:t xml:space="preserve"> </w:t>
       </w:r>
       <w:proofErr w:type="spellStart"/>
       <w:r>
@@ -26446,16 +26472,19 @@
         <w:t>(</w:t>
       </w:r>
       <w:r>
+        <w:t xml:space="preserve">highest </w:t>
+      </w:r>
+      <w:r>
         <w:t>MAE</w:t>
       </w:r>
       <w:r>
         <w:t>=</w:t>
       </w:r>
       <w:r>
-        <w:t>1983</w:t>
-      </w:r>
-      <w:r>
-        <w:t>.8</w:t>
+        <w:t>1</w:t>
+      </w:r>
+      <w:r>
+        <w:t>241.93</w:t>
       </w:r>
       <w:r>
         <w:t>)</w:t>
@@ -26464,7 +26493,58 @@
         <w:t>.</w:t>
       </w:r>
       <w:r>
-        <w:t xml:space="preserve"> We note that the 80 by 80 cell </w:t>
+        <w:t xml:space="preserve"> </w:t>
+      </w:r>
+      <w:r>
+        <w:t xml:space="preserve">The performances improved with higher </w:t>
+      </w:r>
+      <w:r>
+        <w:t xml:space="preserve">cell counts </w:t>
+      </w:r>
+      <w:r>
+        <w:t>from 40</w:t>
+      </w:r>
+      <w:r>
+        <w:t xml:space="preserve"> by 40</w:t>
+      </w:r>
+      <w:r>
+        <w:t xml:space="preserve"> to 80</w:t>
+      </w:r>
+      <w:r>
+        <w:t xml:space="preserve"> by 80</w:t>
+      </w:r>
+      <w:r>
+        <w:t xml:space="preserve"> grids, with the greatest improvement </w:t>
+      </w:r>
+      <w:r>
+        <w:t>seen in</w:t>
+      </w:r>
+      <w:r>
+        <w:t xml:space="preserve"> 10</w:t>
+      </w:r>
+      <w:r>
+        <w:t xml:space="preserve"> by 10</w:t>
+      </w:r>
+      <w:r>
+        <w:t xml:space="preserve"> to 40</w:t>
+      </w:r>
+      <w:r>
+        <w:t xml:space="preserve"> by 40</w:t>
+      </w:r>
+      <w:r>
+        <w:t xml:space="preserve"> grid models</w:t>
+      </w:r>
+      <w:r>
+        <w:t xml:space="preserve"> (</w:t>
+      </w:r>
+      <w:r>
+        <w:t>-1039 and -951</w:t>
+      </w:r>
+      <w:r>
+        <w:t xml:space="preserve"> MAE</w:t>
+      </w:r>
+      <w:r>
+        <w:t xml:space="preserve"> for </w:t>
       </w:r>
       <w:proofErr w:type="spellStart"/>
       <w:r>
@@ -26472,11 +26552,11 @@
           <w:i/>
           <w:iCs/>
         </w:rPr>
-        <w:t>tpot</w:t>
+        <w:t>autosklearn</w:t>
       </w:r>
       <w:proofErr w:type="spellEnd"/>
       <w:r>
-        <w:t xml:space="preserve"> model had a very similar performance (MAE=111.94) to the 40 by 40 cell </w:t>
+        <w:t xml:space="preserve"> and </w:t>
       </w:r>
       <w:proofErr w:type="spellStart"/>
       <w:r>
@@ -26488,25 +26568,46 @@
       </w:r>
       <w:proofErr w:type="spellEnd"/>
       <w:r>
+        <w:t xml:space="preserve"> respectively</w:t>
+      </w:r>
+      <w:r>
+        <w:t>)</w:t>
+      </w:r>
+      <w:r>
+        <w:t>.</w:t>
+      </w:r>
+      <w:r>
+        <w:t xml:space="preserve"> The 80 by 80 grid </w:t>
+      </w:r>
+      <w:proofErr w:type="spellStart"/>
+      <w:r>
+        <w:rPr>
+          <w:i/>
+          <w:iCs/>
+        </w:rPr>
+        <w:t>autosklearn</w:t>
+      </w:r>
+      <w:proofErr w:type="spellEnd"/>
+      <w:r>
+        <w:t xml:space="preserve"> model was selected as the best model for the geo-intervention generation component.</w:t>
+      </w:r>
+      <w:r>
         <w:t xml:space="preserve"> </w:t>
       </w:r>
       <w:r>
-        <w:t>model and</w:t>
-      </w:r>
-      <w:r>
-        <w:t xml:space="preserve"> was chosen instead as the best model due to the higher spatial resolution (larger number of cells).</w:t>
-      </w:r>
-      <w:r>
-        <w:t xml:space="preserve"> </w:t>
-      </w:r>
-      <w:r>
         <w:t>The performance of the six models</w:t>
       </w:r>
       <w:r>
         <w:t xml:space="preserve"> by MAE</w:t>
       </w:r>
       <w:r>
-        <w:t xml:space="preserve"> is seen in</w:t>
+        <w:t xml:space="preserve"> is s</w:t>
+      </w:r>
+      <w:r>
+        <w:t>hown</w:t>
+      </w:r>
+      <w:r>
+        <w:t xml:space="preserve"> in</w:t>
       </w:r>
       <w:r>
         <w:t xml:space="preserve"> Figure 5</w:t>
@@ -26524,7 +26625,7 @@
           <w:noProof/>
         </w:rPr>
         <w:drawing>
-          <wp:inline distT="0" distB="0" distL="0" distR="0" wp14:anchorId="003B3579" wp14:editId="3DD39F70">
+          <wp:inline distT="0" distB="0" distL="0" distR="0" wp14:anchorId="003B3579" wp14:editId="2B36D156">
             <wp:extent cx="3262475" cy="2744364"/>
             <wp:effectExtent l="0" t="0" r="1905" b="0"/>
             <wp:docPr id="17" name="Picture 17"/>
@@ -26655,7 +26756,157 @@
         <w:rPr>
           <w:lang w:val="en"/>
         </w:rPr>
-        <w:t>x.</w:t>
+        <w:t xml:space="preserve">With the 80 by 80 grid </w:t>
+      </w:r>
+      <w:proofErr w:type="spellStart"/>
+      <w:r>
+        <w:rPr>
+          <w:i/>
+          <w:iCs/>
+          <w:lang w:val="en"/>
+        </w:rPr>
+        <w:t>autosklearn</w:t>
+      </w:r>
+      <w:proofErr w:type="spellEnd"/>
+      <w:r>
+        <w:rPr>
+          <w:lang w:val="en"/>
+        </w:rPr>
+        <w:t xml:space="preserve"> model as the best model (lowest MAE=82.95), permutation variable importance was calculated for 1</w:t>
+      </w:r>
+      <w:r>
+        <w:rPr>
+          <w:lang w:val="en"/>
+        </w:rPr>
+        <w:t>408</w:t>
+      </w:r>
+      <w:r>
+        <w:rPr>
+          <w:lang w:val="en"/>
+        </w:rPr>
+        <w:t xml:space="preserve"> variables</w:t>
+      </w:r>
+      <w:r>
+        <w:rPr>
+          <w:lang w:val="en"/>
+        </w:rPr>
+        <w:t xml:space="preserve"> used in the model</w:t>
+      </w:r>
+      <w:r>
+        <w:rPr>
+          <w:lang w:val="en"/>
+        </w:rPr>
+        <w:t xml:space="preserve"> </w:t>
+      </w:r>
+      <w:r>
+        <w:rPr>
+          <w:lang w:val="en"/>
+        </w:rPr>
+        <w:fldChar w:fldCharType="begin"/>
+      </w:r>
+      <w:r>
+        <w:rPr>
+          <w:lang w:val="en"/>
+        </w:rPr>
+        <w:instrText xml:space="preserve"> ADDIN ZOTERO_ITEM CSL_CITATION {"citationID":"aj3bf8t8no","properties":{"formattedCitation":"[96]","plainCitation":"[96]","noteIndex":0},"citationItems":[{"id":1971,"uris":["http://zotero.org/users/6749620/items/VMQ6QZS8"],"itemData":{"id":1971,"type":"article-journal","abstract":"Motivation: In life sciences, interpretability of machine learning models is as important as their prediction accuracy. Linear models are probably the most frequently used methods for assessing feature relevance, despite their relative inflexibility. However, in the past years effective estimators of feature relevance have been derived for highly complex or non-parametric models such as support vector machines and RandomForest (RF) models. Recently, it has been observed that RF models are biased in such a way that categorical variables with a large number of categories are preferred.Results: In this work, we introduce a heuristic for normalizing feature importance measures that can correct the feature importance bias. The method is based on repeated permutations of the outcome vector for estimating the distribution of measured importance for each variable in a non-informative setting. The P-value of the observed importance provides a corrected measure of feature importance. We apply our method to simulated data and demonstrate that (i) non-informative predictors do not receive significant P-values, (ii) informative variables can successfully be recovered among non-informative variables and (iii) P-values computed with permutation importance (PIMP) are very helpful for deciding the significance of variables, and therefore improve model interpretability. Furthermore, PIMP was used to correct RF-based importance measures for two real-world case studies. We propose an improved RF model that uses the significant variables with respect to the PIMP measure and show that its prediction accuracy is superior to that of other existing models.Availability: R code for the method presented in this article is available at http://www.mpi-inf.mpg.de/</w:instrText>
+      </w:r>
+      <w:r>
+        <w:rPr>
+          <w:rFonts w:ascii="Cambria Math" w:hAnsi="Cambria Math" w:cs="Cambria Math"/>
+          <w:lang w:val="en"/>
+        </w:rPr>
+        <w:instrText>∼</w:instrText>
+      </w:r>
+      <w:r>
+        <w:rPr>
+          <w:lang w:val="en"/>
+        </w:rPr>
+        <w:instrText xml:space="preserve">altmann/download/PIMP.RContact:altmann@mpi-inf.mpg.de, laura.tolosi@mpi-inf.mpg.deSupplementary information:Supplementary data are available at Bioinformatics online.","container-title":"Bioinformatics","DOI":"10.1093/bioinformatics/btq134","ISSN":"1367-4803","issue":"10","journalAbbreviation":"Bioinformatics","page":"1340-1347","source":"Silverchair","title":"Permutation importance: a corrected feature importance measure","title-short":"Permutation importance","volume":"26","author":[{"family":"Altmann","given":"André"},{"family":"Toloşi","given":"Laura"},{"family":"Sander","given":"Oliver"},{"family":"Lengauer","given":"Thomas"}],"issued":{"date-parts":[["2010",5,15]]},"citation-key":"altmannPermutationImportanceCorrected2010"}}],"schema":"https://github.com/citation-style-language/schema/raw/master/csl-citation.json"} </w:instrText>
+      </w:r>
+      <w:r>
+        <w:rPr>
+          <w:lang w:val="en"/>
+        </w:rPr>
+        <w:fldChar w:fldCharType="separate"/>
+      </w:r>
+      <w:r>
+        <w:t>[96]</w:t>
+      </w:r>
+      <w:r>
+        <w:rPr>
+          <w:lang w:val="en"/>
+        </w:rPr>
+        <w:fldChar w:fldCharType="end"/>
+      </w:r>
+      <w:r>
+        <w:rPr>
+          <w:lang w:val="en"/>
+        </w:rPr>
+        <w:t>.</w:t>
+      </w:r>
+      <w:r>
+        <w:rPr>
+          <w:lang w:val="en"/>
+        </w:rPr>
+        <w:t xml:space="preserve"> The top 25 most important variables from the best model </w:t>
+      </w:r>
+      <w:r>
+        <w:rPr>
+          <w:lang w:val="en"/>
+        </w:rPr>
+        <w:t>are</w:t>
+      </w:r>
+      <w:r>
+        <w:rPr>
+          <w:lang w:val="en"/>
+        </w:rPr>
+        <w:t xml:space="preserve"> shown in Figure 6.</w:t>
+      </w:r>
+      <w:r>
+        <w:rPr>
+          <w:lang w:val="en"/>
+        </w:rPr>
+        <w:t xml:space="preserve"> The most important variable was the number of arterial roads, followed by the number of </w:t>
+      </w:r>
+      <w:proofErr w:type="gramStart"/>
+      <w:r>
+        <w:rPr>
+          <w:lang w:val="en"/>
+        </w:rPr>
+        <w:t>red light</w:t>
+      </w:r>
+      <w:proofErr w:type="gramEnd"/>
+      <w:r>
+        <w:rPr>
+          <w:lang w:val="en"/>
+        </w:rPr>
+        <w:t xml:space="preserve"> cameras</w:t>
+      </w:r>
+      <w:r>
+        <w:rPr>
+          <w:lang w:val="en"/>
+        </w:rPr>
+        <w:t>, transit shelters, and crime occurrences involving pointing a firearm.</w:t>
+      </w:r>
+      <w:r>
+        <w:rPr>
+          <w:lang w:val="en"/>
+        </w:rPr>
+        <w:t xml:space="preserve"> The rest of the variables with variable importance lower than 0.005 were mostly related to traffic volumes and crime occurrences, with a few related to infrastructure (wayfinding, fire hydrants, public art locations, litter receptacles), and one related to the curvature (sinuosity) of road </w:t>
+      </w:r>
+      <w:proofErr w:type="spellStart"/>
+      <w:r>
+        <w:rPr>
+          <w:lang w:val="en"/>
+        </w:rPr>
+        <w:t>centrelines</w:t>
+      </w:r>
+      <w:proofErr w:type="spellEnd"/>
+      <w:r>
+        <w:rPr>
+          <w:lang w:val="en"/>
+        </w:rPr>
+        <w:t>.</w:t>
       </w:r>
     </w:p>
     <w:p>
@@ -26676,9 +26927,9 @@
           <w:noProof/>
         </w:rPr>
         <w:drawing>
-          <wp:inline distT="0" distB="0" distL="0" distR="0" wp14:anchorId="48E99B9E" wp14:editId="55644153">
-            <wp:extent cx="4966499" cy="2436542"/>
-            <wp:effectExtent l="0" t="0" r="0" b="1905"/>
+          <wp:inline distT="0" distB="0" distL="0" distR="0" wp14:anchorId="48E99B9E" wp14:editId="66A05A03">
+            <wp:extent cx="4569073" cy="2206977"/>
+            <wp:effectExtent l="0" t="0" r="3175" b="3175"/>
             <wp:docPr id="495516568" name="Picture 495516568"/>
             <wp:cNvGraphicFramePr>
               <a:graphicFrameLocks xmlns:a="http://schemas.openxmlformats.org/drawingml/2006/main" noChangeAspect="1"/>
@@ -26701,7 +26952,7 @@
                   <pic:spPr bwMode="auto">
                     <a:xfrm>
                       <a:off x="0" y="0"/>
-                      <a:ext cx="5354492" cy="2626890"/>
+                      <a:ext cx="4902848" cy="2368199"/>
                     </a:xfrm>
                     <a:prstGeom prst="rect">
                       <a:avLst/>
@@ -26780,7 +27031,7 @@
       </w:r>
       <w:proofErr w:type="spellStart"/>
       <w:r>
-        <w:t>tpot</w:t>
+        <w:t>autosklearn</w:t>
       </w:r>
       <w:proofErr w:type="spellEnd"/>
       <w:r>
@@ -26792,6 +27043,49 @@
       </w:r>
       <w:r>
         <w:t>model.</w:t>
+      </w:r>
+    </w:p>
+    <w:p>
+      <w:pPr>
+        <w:pStyle w:val="MDPI31text"/>
+        <w:rPr>
+          <w:lang w:val="en"/>
+        </w:rPr>
+      </w:pPr>
+      <w:r>
+        <w:rPr>
+          <w:lang w:val="en"/>
+        </w:rPr>
+        <w:lastRenderedPageBreak/>
+        <w:t xml:space="preserve">The top 25 most important infrastructure-related variables are shown in Figure 7. Asides from the number of </w:t>
+      </w:r>
+      <w:proofErr w:type="gramStart"/>
+      <w:r>
+        <w:rPr>
+          <w:lang w:val="en"/>
+        </w:rPr>
+        <w:t>red light</w:t>
+      </w:r>
+      <w:proofErr w:type="gramEnd"/>
+      <w:r>
+        <w:rPr>
+          <w:lang w:val="en"/>
+        </w:rPr>
+        <w:t xml:space="preserve"> cameras and transit shelters being the top variables, the number of wayfinding structures, fire hydrants, public art locations, and litter receptacles were among the top most important infrastructure-related variables. Other variables with variable importance less than 0.002 were related to bicycle, Watch Your Speed (WYS) program, school, and cultural hotspot infrastructure. The top three infrastructure variables selected as the actions were the number of </w:t>
+      </w:r>
+      <w:proofErr w:type="gramStart"/>
+      <w:r>
+        <w:rPr>
+          <w:lang w:val="en"/>
+        </w:rPr>
+        <w:t>red light</w:t>
+      </w:r>
+      <w:proofErr w:type="gramEnd"/>
+      <w:r>
+        <w:rPr>
+          <w:lang w:val="en"/>
+        </w:rPr>
+        <w:t xml:space="preserve"> cameras, the number of transit shelters, and the number of wayfinding structures according to their variable importance.</w:t>
       </w:r>
     </w:p>
     <w:p>
@@ -26803,10 +27097,9 @@
         <w:rPr>
           <w:noProof/>
         </w:rPr>
-        <w:lastRenderedPageBreak/>
         <w:drawing>
-          <wp:inline distT="0" distB="0" distL="0" distR="0" wp14:anchorId="6D808F4C" wp14:editId="1F109103">
-            <wp:extent cx="5016401" cy="2350499"/>
+          <wp:inline distT="0" distB="0" distL="0" distR="0" wp14:anchorId="6D808F4C" wp14:editId="440D5F26">
+            <wp:extent cx="4965468" cy="2921413"/>
             <wp:effectExtent l="0" t="0" r="635" b="0"/>
             <wp:docPr id="1062818734" name="Picture 1062818734"/>
             <wp:cNvGraphicFramePr>
@@ -26830,7 +27123,7 @@
                   <pic:spPr bwMode="auto">
                     <a:xfrm>
                       <a:off x="0" y="0"/>
-                      <a:ext cx="5016401" cy="2350499"/>
+                      <a:ext cx="5176899" cy="3045808"/>
                     </a:xfrm>
                     <a:prstGeom prst="rect">
                       <a:avLst/>
@@ -26908,14 +27201,285 @@
         <w:t xml:space="preserve">Top 25 most important </w:t>
       </w:r>
       <w:r>
-        <w:t xml:space="preserve">infrastructure-related </w:t>
+        <w:t xml:space="preserve">infrastructure </w:t>
       </w:r>
       <w:r>
         <w:t xml:space="preserve">variables for 80 by 80 grid </w:t>
       </w:r>
       <w:proofErr w:type="spellStart"/>
       <w:r>
-        <w:t>tpot</w:t>
+        <w:t>autosklearn</w:t>
+      </w:r>
+      <w:proofErr w:type="spellEnd"/>
+      <w:r>
+        <w:rPr>
+          <w:i/>
+          <w:iCs/>
+        </w:rPr>
+        <w:t xml:space="preserve"> </w:t>
+      </w:r>
+      <w:r>
+        <w:t>model.</w:t>
+      </w:r>
+    </w:p>
+    <w:p>
+      <w:pPr>
+        <w:pStyle w:val="MDPI31text"/>
+      </w:pPr>
+      <w:r>
+        <w:t>x.</w:t>
+      </w:r>
+    </w:p>
+    <w:p>
+      <w:pPr>
+        <w:pStyle w:val="MDPI52figure"/>
+        <w:jc w:val="right"/>
+      </w:pPr>
+      <w:r>
+        <w:rPr>
+          <w:noProof/>
+        </w:rPr>
+        <w:drawing>
+          <wp:inline distT="0" distB="0" distL="0" distR="0" wp14:anchorId="142D5E5E" wp14:editId="3D99D567">
+            <wp:extent cx="4965468" cy="2921413"/>
+            <wp:effectExtent l="0" t="0" r="635" b="0"/>
+            <wp:docPr id="539038463" name="Picture 539038463" descr="A graph with text and numbers&#10;&#10;AI-generated content may be incorrect."/>
+            <wp:cNvGraphicFramePr>
+              <a:graphicFrameLocks xmlns:a="http://schemas.openxmlformats.org/drawingml/2006/main" noChangeAspect="1"/>
+            </wp:cNvGraphicFramePr>
+            <a:graphic xmlns:a="http://schemas.openxmlformats.org/drawingml/2006/main">
+              <a:graphicData uri="http://schemas.openxmlformats.org/drawingml/2006/picture">
+                <pic:pic xmlns:pic="http://schemas.openxmlformats.org/drawingml/2006/picture">
+                  <pic:nvPicPr>
+                    <pic:cNvPr id="539038463" name="Picture 539038463" descr="A graph with text and numbers&#10;&#10;AI-generated content may be incorrect."/>
+                    <pic:cNvPicPr>
+                      <a:picLocks/>
+                    </pic:cNvPicPr>
+                  </pic:nvPicPr>
+                  <pic:blipFill>
+                    <a:blip r:embed="rId15"/>
+                    <a:stretch>
+                      <a:fillRect/>
+                    </a:stretch>
+                  </pic:blipFill>
+                  <pic:spPr bwMode="auto">
+                    <a:xfrm>
+                      <a:off x="0" y="0"/>
+                      <a:ext cx="5176899" cy="3045808"/>
+                    </a:xfrm>
+                    <a:prstGeom prst="rect">
+                      <a:avLst/>
+                    </a:prstGeom>
+                    <a:noFill/>
+                    <a:ln>
+                      <a:noFill/>
+                    </a:ln>
+                  </pic:spPr>
+                </pic:pic>
+              </a:graphicData>
+            </a:graphic>
+          </wp:inline>
+        </w:drawing>
+      </w:r>
+    </w:p>
+    <w:p>
+      <w:pPr>
+        <w:pStyle w:val="MDPI51figurecaption"/>
+      </w:pPr>
+      <w:r>
+        <w:rPr>
+          <w:b/>
+          <w:bCs/>
+        </w:rPr>
+        <w:t xml:space="preserve">Figure </w:t>
+      </w:r>
+      <w:r>
+        <w:rPr>
+          <w:b/>
+          <w:bCs/>
+        </w:rPr>
+        <w:fldChar w:fldCharType="begin"/>
+      </w:r>
+      <w:r>
+        <w:rPr>
+          <w:b/>
+          <w:bCs/>
+        </w:rPr>
+        <w:instrText xml:space="preserve"> SEQ Figure \* ARABIC </w:instrText>
+      </w:r>
+      <w:r>
+        <w:rPr>
+          <w:b/>
+          <w:bCs/>
+        </w:rPr>
+        <w:fldChar w:fldCharType="separate"/>
+      </w:r>
+      <w:r>
+        <w:rPr>
+          <w:b/>
+          <w:bCs/>
+          <w:noProof/>
+        </w:rPr>
+        <w:t>8</w:t>
+      </w:r>
+      <w:r>
+        <w:rPr>
+          <w:b/>
+          <w:bCs/>
+        </w:rPr>
+        <w:fldChar w:fldCharType="end"/>
+      </w:r>
+      <w:r>
+        <w:rPr>
+          <w:b/>
+          <w:bCs/>
+        </w:rPr>
+        <w:t>.</w:t>
+      </w:r>
+      <w:r>
+        <w:t xml:space="preserve"> </w:t>
+      </w:r>
+      <w:r>
+        <w:t>Scenario 1 using</w:t>
+      </w:r>
+      <w:r>
+        <w:t xml:space="preserve"> 80 by 80 grid </w:t>
+      </w:r>
+      <w:proofErr w:type="spellStart"/>
+      <w:r>
+        <w:t>autosklearn</w:t>
+      </w:r>
+      <w:proofErr w:type="spellEnd"/>
+      <w:r>
+        <w:rPr>
+          <w:i/>
+          <w:iCs/>
+        </w:rPr>
+        <w:t xml:space="preserve"> </w:t>
+      </w:r>
+      <w:r>
+        <w:t>model.</w:t>
+      </w:r>
+    </w:p>
+    <w:p>
+      <w:pPr>
+        <w:pStyle w:val="MDPI52figure"/>
+        <w:jc w:val="right"/>
+      </w:pPr>
+      <w:r>
+        <w:rPr>
+          <w:noProof/>
+        </w:rPr>
+        <w:lastRenderedPageBreak/>
+        <w:drawing>
+          <wp:inline distT="0" distB="0" distL="0" distR="0" wp14:anchorId="7FD00207" wp14:editId="1D0C04D9">
+            <wp:extent cx="4965468" cy="2921413"/>
+            <wp:effectExtent l="0" t="0" r="635" b="0"/>
+            <wp:docPr id="1833426649" name="Picture 1833426649" descr="A graph with text and numbers&#10;&#10;AI-generated content may be incorrect."/>
+            <wp:cNvGraphicFramePr>
+              <a:graphicFrameLocks xmlns:a="http://schemas.openxmlformats.org/drawingml/2006/main" noChangeAspect="1"/>
+            </wp:cNvGraphicFramePr>
+            <a:graphic xmlns:a="http://schemas.openxmlformats.org/drawingml/2006/main">
+              <a:graphicData uri="http://schemas.openxmlformats.org/drawingml/2006/picture">
+                <pic:pic xmlns:pic="http://schemas.openxmlformats.org/drawingml/2006/picture">
+                  <pic:nvPicPr>
+                    <pic:cNvPr id="1833426649" name="Picture 1833426649" descr="A graph with text and numbers&#10;&#10;AI-generated content may be incorrect."/>
+                    <pic:cNvPicPr>
+                      <a:picLocks/>
+                    </pic:cNvPicPr>
+                  </pic:nvPicPr>
+                  <pic:blipFill>
+                    <a:blip r:embed="rId15"/>
+                    <a:stretch>
+                      <a:fillRect/>
+                    </a:stretch>
+                  </pic:blipFill>
+                  <pic:spPr bwMode="auto">
+                    <a:xfrm>
+                      <a:off x="0" y="0"/>
+                      <a:ext cx="5176899" cy="3045808"/>
+                    </a:xfrm>
+                    <a:prstGeom prst="rect">
+                      <a:avLst/>
+                    </a:prstGeom>
+                    <a:noFill/>
+                    <a:ln>
+                      <a:noFill/>
+                    </a:ln>
+                  </pic:spPr>
+                </pic:pic>
+              </a:graphicData>
+            </a:graphic>
+          </wp:inline>
+        </w:drawing>
+      </w:r>
+    </w:p>
+    <w:p>
+      <w:pPr>
+        <w:pStyle w:val="MDPI51figurecaption"/>
+      </w:pPr>
+      <w:r>
+        <w:rPr>
+          <w:b/>
+          <w:bCs/>
+        </w:rPr>
+        <w:t xml:space="preserve">Figure </w:t>
+      </w:r>
+      <w:r>
+        <w:rPr>
+          <w:b/>
+          <w:bCs/>
+        </w:rPr>
+        <w:fldChar w:fldCharType="begin"/>
+      </w:r>
+      <w:r>
+        <w:rPr>
+          <w:b/>
+          <w:bCs/>
+        </w:rPr>
+        <w:instrText xml:space="preserve"> SEQ Figure \* ARABIC </w:instrText>
+      </w:r>
+      <w:r>
+        <w:rPr>
+          <w:b/>
+          <w:bCs/>
+        </w:rPr>
+        <w:fldChar w:fldCharType="separate"/>
+      </w:r>
+      <w:r>
+        <w:rPr>
+          <w:b/>
+          <w:bCs/>
+          <w:noProof/>
+        </w:rPr>
+        <w:t>9</w:t>
+      </w:r>
+      <w:r>
+        <w:rPr>
+          <w:b/>
+          <w:bCs/>
+        </w:rPr>
+        <w:fldChar w:fldCharType="end"/>
+      </w:r>
+      <w:r>
+        <w:rPr>
+          <w:b/>
+          <w:bCs/>
+        </w:rPr>
+        <w:t>.</w:t>
+      </w:r>
+      <w:r>
+        <w:t xml:space="preserve"> </w:t>
+      </w:r>
+      <w:r>
+        <w:t>Scenario 2 using</w:t>
+      </w:r>
+      <w:r>
+        <w:t xml:space="preserve"> 80 by 80 grid </w:t>
+      </w:r>
+      <w:proofErr w:type="spellStart"/>
+      <w:r>
+        <w:t>autosklearn</w:t>
       </w:r>
       <w:proofErr w:type="spellEnd"/>
       <w:r>
@@ -27278,6 +27842,7 @@
         <w:rPr>
           <w:noProof/>
         </w:rPr>
+        <w:lastRenderedPageBreak/>
         <w:fldChar w:fldCharType="begin"/>
       </w:r>
       <w:r>
@@ -27314,16 +27879,8 @@
         <w:rPr>
           <w:color w:val="auto"/>
         </w:rPr>
-        <w:t xml:space="preserve">; Geneva, </w:t>
-      </w:r>
-      <w:proofErr w:type="gramStart"/>
-      <w:r>
-        <w:rPr>
-          <w:color w:val="auto"/>
-        </w:rPr>
-        <w:t>2018;</w:t>
-      </w:r>
-      <w:proofErr w:type="gramEnd"/>
+        <w:t>; Geneva, 2018;</w:t>
+      </w:r>
     </w:p>
     <w:p>
       <w:pPr>
@@ -27357,16 +27914,8 @@
         <w:rPr>
           <w:color w:val="auto"/>
         </w:rPr>
-        <w:t xml:space="preserve">; Vienna, </w:t>
-      </w:r>
-      <w:proofErr w:type="gramStart"/>
-      <w:r>
-        <w:rPr>
-          <w:color w:val="auto"/>
-        </w:rPr>
-        <w:t>2019;</w:t>
-      </w:r>
-      <w:proofErr w:type="gramEnd"/>
+        <w:t>; Vienna, 2019;</w:t>
+      </w:r>
     </w:p>
     <w:p>
       <w:pPr>
@@ -27379,7 +27928,6 @@
         <w:rPr>
           <w:color w:val="auto"/>
         </w:rPr>
-        <w:lastRenderedPageBreak/>
         <w:t xml:space="preserve">3. </w:t>
       </w:r>
       <w:r>
@@ -27513,21 +28061,7 @@
           <w:color w:val="auto"/>
         </w:rPr>
         <w:tab/>
-        <w:t xml:space="preserve">Richard Wen Generative Design of Geospatial Interventions </w:t>
-      </w:r>
-      <w:proofErr w:type="gramStart"/>
-      <w:r>
-        <w:rPr>
-          <w:color w:val="auto"/>
-        </w:rPr>
-        <w:t>With</w:t>
-      </w:r>
-      <w:proofErr w:type="gramEnd"/>
-      <w:r>
-        <w:rPr>
-          <w:color w:val="auto"/>
-        </w:rPr>
-        <w:t xml:space="preserve"> Automated Machine Learning and Bayesian Optimization, Toronto Metropolitan University: Toronto, 2023.</w:t>
+        <w:t>Richard Wen Generative Design of Geospatial Interventions With Automated Machine Learning and Bayesian Optimization, Toronto Metropolitan University: Toronto, 2023.</w:t>
       </w:r>
     </w:p>
     <w:p>
@@ -27548,35 +28082,7 @@
           <w:color w:val="auto"/>
         </w:rPr>
         <w:tab/>
-        <w:t xml:space="preserve">Bonnet, E.; </w:t>
-      </w:r>
-      <w:proofErr w:type="spellStart"/>
-      <w:r>
-        <w:rPr>
-          <w:color w:val="auto"/>
-        </w:rPr>
-        <w:t>Lechat</w:t>
-      </w:r>
-      <w:proofErr w:type="spellEnd"/>
-      <w:r>
-        <w:rPr>
-          <w:color w:val="auto"/>
-        </w:rPr>
-        <w:t xml:space="preserve">, L.; </w:t>
-      </w:r>
-      <w:proofErr w:type="spellStart"/>
-      <w:r>
-        <w:rPr>
-          <w:color w:val="auto"/>
-        </w:rPr>
-        <w:t>Ridde</w:t>
-      </w:r>
-      <w:proofErr w:type="spellEnd"/>
-      <w:r>
-        <w:rPr>
-          <w:color w:val="auto"/>
-        </w:rPr>
-        <w:t xml:space="preserve">, V. What Interventions Are Required to Reduce Road Traffic Injuries in Africa? A Scoping Review of the Literature. </w:t>
+        <w:t xml:space="preserve">Bonnet, E.; Lechat, L.; Ridde, V. What Interventions Are Required to Reduce Road Traffic Injuries in Africa? A Scoping Review of the Literature. </w:t>
       </w:r>
       <w:r>
         <w:rPr>
@@ -27618,21 +28124,7 @@
         <w:rPr>
           <w:color w:val="auto"/>
         </w:rPr>
-        <w:t xml:space="preserve">, e0208195, </w:t>
-      </w:r>
-      <w:proofErr w:type="gramStart"/>
-      <w:r>
-        <w:rPr>
-          <w:color w:val="auto"/>
-        </w:rPr>
-        <w:t>doi:10.1371/journal.pone</w:t>
-      </w:r>
-      <w:proofErr w:type="gramEnd"/>
-      <w:r>
-        <w:rPr>
-          <w:color w:val="auto"/>
-        </w:rPr>
-        <w:t>.0208195.</w:t>
+        <w:t>, e0208195, doi:10.1371/journal.pone.0208195.</w:t>
       </w:r>
     </w:p>
     <w:p>
@@ -27787,18 +28279,8 @@
           <w:iCs/>
           <w:color w:val="auto"/>
         </w:rPr>
-        <w:t xml:space="preserve">Int J Health </w:t>
-      </w:r>
-      <w:proofErr w:type="spellStart"/>
-      <w:r>
-        <w:rPr>
-          <w:i/>
-          <w:iCs/>
-          <w:color w:val="auto"/>
-        </w:rPr>
-        <w:t>Geogr</w:t>
-      </w:r>
-      <w:proofErr w:type="spellEnd"/>
+        <w:t>Int J Health Geogr</w:t>
+      </w:r>
       <w:r>
         <w:rPr>
           <w:color w:val="auto"/>
@@ -27852,20 +28334,7 @@
           <w:color w:val="auto"/>
         </w:rPr>
         <w:tab/>
-      </w:r>
-      <w:proofErr w:type="spellStart"/>
-      <w:r>
-        <w:rPr>
-          <w:color w:val="auto"/>
-        </w:rPr>
-        <w:t>Nykiforuk</w:t>
-      </w:r>
-      <w:proofErr w:type="spellEnd"/>
-      <w:r>
-        <w:rPr>
-          <w:color w:val="auto"/>
-        </w:rPr>
-        <w:t xml:space="preserve">, C.I.J.; Flaman, L.M. Geographic Information Systems (GIS) for Health Promotion and Public Health: A Review. </w:t>
+        <w:t xml:space="preserve">Nykiforuk, C.I.J.; Flaman, L.M. Geographic Information Systems (GIS) for Health Promotion and Public Health: A Review. </w:t>
       </w:r>
       <w:r>
         <w:rPr>
@@ -27970,21 +28439,7 @@
         <w:rPr>
           <w:color w:val="auto"/>
         </w:rPr>
-        <w:t xml:space="preserve">, 100474, </w:t>
-      </w:r>
-      <w:proofErr w:type="gramStart"/>
-      <w:r>
-        <w:rPr>
-          <w:color w:val="auto"/>
-        </w:rPr>
-        <w:t>doi:10.1016/j.rsase</w:t>
-      </w:r>
-      <w:proofErr w:type="gramEnd"/>
-      <w:r>
-        <w:rPr>
-          <w:color w:val="auto"/>
-        </w:rPr>
-        <w:t>.2021.100474.</w:t>
+        <w:t>, 100474, doi:10.1016/j.rsase.2021.100474.</w:t>
       </w:r>
     </w:p>
     <w:p>
@@ -28005,62 +28460,7 @@
           <w:color w:val="auto"/>
         </w:rPr>
         <w:tab/>
-      </w:r>
-      <w:proofErr w:type="spellStart"/>
-      <w:r>
-        <w:rPr>
-          <w:color w:val="auto"/>
-        </w:rPr>
-        <w:t>Elsahlamy</w:t>
-      </w:r>
-      <w:proofErr w:type="spellEnd"/>
-      <w:r>
-        <w:rPr>
-          <w:color w:val="auto"/>
-        </w:rPr>
-        <w:t xml:space="preserve">, E.; </w:t>
-      </w:r>
-      <w:proofErr w:type="spellStart"/>
-      <w:r>
-        <w:rPr>
-          <w:color w:val="auto"/>
-        </w:rPr>
-        <w:t>Eshra</w:t>
-      </w:r>
-      <w:proofErr w:type="spellEnd"/>
-      <w:r>
-        <w:rPr>
-          <w:color w:val="auto"/>
-        </w:rPr>
-        <w:t xml:space="preserve">, A.; </w:t>
-      </w:r>
-      <w:proofErr w:type="spellStart"/>
-      <w:r>
-        <w:rPr>
-          <w:color w:val="auto"/>
-        </w:rPr>
-        <w:t>Eshra</w:t>
-      </w:r>
-      <w:proofErr w:type="spellEnd"/>
-      <w:r>
-        <w:rPr>
-          <w:color w:val="auto"/>
-        </w:rPr>
-        <w:t>, N.; El-</w:t>
-      </w:r>
-      <w:proofErr w:type="spellStart"/>
-      <w:r>
-        <w:rPr>
-          <w:color w:val="auto"/>
-        </w:rPr>
-        <w:t>Fishawy</w:t>
-      </w:r>
-      <w:proofErr w:type="spellEnd"/>
-      <w:r>
-        <w:rPr>
-          <w:color w:val="auto"/>
-        </w:rPr>
-        <w:t>, N. Empowering GIS with Big Data: A Review of Recent Advances. In Proceedings of the 2021 International Conference on Electronic Engineering (ICEEM); July 2021; pp. 1–7.</w:t>
+        <w:t>Elsahlamy, E.; Eshra, A.; Eshra, N.; El-Fishawy, N. Empowering GIS with Big Data: A Review of Recent Advances. In Proceedings of the 2021 International Conference on Electronic Engineering (ICEEM); July 2021; pp. 1–7.</w:t>
       </w:r>
     </w:p>
     <w:p>
@@ -28123,21 +28523,7 @@
         <w:rPr>
           <w:color w:val="auto"/>
         </w:rPr>
-        <w:t xml:space="preserve">, 300–309, </w:t>
-      </w:r>
-      <w:proofErr w:type="gramStart"/>
-      <w:r>
-        <w:rPr>
-          <w:color w:val="auto"/>
-        </w:rPr>
-        <w:t>doi:10.1016/j.ijgo</w:t>
-      </w:r>
-      <w:proofErr w:type="gramEnd"/>
-      <w:r>
-        <w:rPr>
-          <w:color w:val="auto"/>
-        </w:rPr>
-        <w:t>.2011.09.004.</w:t>
+        <w:t>, 300–309, doi:10.1016/j.ijgo.2011.09.004.</w:t>
       </w:r>
     </w:p>
     <w:p>
@@ -28158,21 +28544,7 @@
           <w:color w:val="auto"/>
         </w:rPr>
         <w:tab/>
-        <w:t xml:space="preserve">Franch-Pardo, I.; Napoletano, B.M.; </w:t>
-      </w:r>
-      <w:proofErr w:type="spellStart"/>
-      <w:r>
-        <w:rPr>
-          <w:color w:val="auto"/>
-        </w:rPr>
-        <w:t>Rosete</w:t>
-      </w:r>
-      <w:proofErr w:type="spellEnd"/>
-      <w:r>
-        <w:rPr>
-          <w:color w:val="auto"/>
-        </w:rPr>
-        <w:t xml:space="preserve">-Verges, F.; Billa, L. Spatial Analysis and GIS in the Study of COVID-19. A Review. </w:t>
+        <w:t xml:space="preserve">Franch-Pardo, I.; Napoletano, B.M.; Rosete-Verges, F.; Billa, L. Spatial Analysis and GIS in the Study of COVID-19. A Review. </w:t>
       </w:r>
       <w:r>
         <w:rPr>
@@ -28214,21 +28586,7 @@
         <w:rPr>
           <w:color w:val="auto"/>
         </w:rPr>
-        <w:t xml:space="preserve">, 140033, </w:t>
-      </w:r>
-      <w:proofErr w:type="gramStart"/>
-      <w:r>
-        <w:rPr>
-          <w:color w:val="auto"/>
-        </w:rPr>
-        <w:t>doi:10.1016/j.scitotenv</w:t>
-      </w:r>
-      <w:proofErr w:type="gramEnd"/>
-      <w:r>
-        <w:rPr>
-          <w:color w:val="auto"/>
-        </w:rPr>
-        <w:t>.2020.140033.</w:t>
+        <w:t>, 140033, doi:10.1016/j.scitotenv.2020.140033.</w:t>
       </w:r>
     </w:p>
     <w:p>
@@ -28249,90 +28607,7 @@
           <w:color w:val="auto"/>
         </w:rPr>
         <w:tab/>
-      </w:r>
-      <w:proofErr w:type="spellStart"/>
-      <w:r>
-        <w:rPr>
-          <w:color w:val="auto"/>
-        </w:rPr>
-        <w:t>Ištoka</w:t>
-      </w:r>
-      <w:proofErr w:type="spellEnd"/>
-      <w:r>
-        <w:rPr>
-          <w:color w:val="auto"/>
-        </w:rPr>
-        <w:t xml:space="preserve"> </w:t>
-      </w:r>
-      <w:proofErr w:type="spellStart"/>
-      <w:r>
-        <w:rPr>
-          <w:color w:val="auto"/>
-        </w:rPr>
-        <w:t>Otković</w:t>
-      </w:r>
-      <w:proofErr w:type="spellEnd"/>
-      <w:r>
-        <w:rPr>
-          <w:color w:val="auto"/>
-        </w:rPr>
-        <w:t xml:space="preserve">, I.; </w:t>
-      </w:r>
-      <w:proofErr w:type="spellStart"/>
-      <w:r>
-        <w:rPr>
-          <w:color w:val="auto"/>
-        </w:rPr>
-        <w:t>Karleuša</w:t>
-      </w:r>
-      <w:proofErr w:type="spellEnd"/>
-      <w:r>
-        <w:rPr>
-          <w:color w:val="auto"/>
-        </w:rPr>
-        <w:t xml:space="preserve">, B.; </w:t>
-      </w:r>
-      <w:proofErr w:type="spellStart"/>
-      <w:r>
-        <w:rPr>
-          <w:color w:val="auto"/>
-        </w:rPr>
-        <w:t>Deluka-Tibljaš</w:t>
-      </w:r>
-      <w:proofErr w:type="spellEnd"/>
-      <w:r>
-        <w:rPr>
-          <w:color w:val="auto"/>
-        </w:rPr>
-        <w:t xml:space="preserve">, A.; </w:t>
-      </w:r>
-      <w:proofErr w:type="spellStart"/>
-      <w:r>
-        <w:rPr>
-          <w:color w:val="auto"/>
-        </w:rPr>
-        <w:t>Šurdonja</w:t>
-      </w:r>
-      <w:proofErr w:type="spellEnd"/>
-      <w:r>
-        <w:rPr>
-          <w:color w:val="auto"/>
-        </w:rPr>
-        <w:t xml:space="preserve">, S.; </w:t>
-      </w:r>
-      <w:proofErr w:type="spellStart"/>
-      <w:r>
-        <w:rPr>
-          <w:color w:val="auto"/>
-        </w:rPr>
-        <w:t>Marušić</w:t>
-      </w:r>
-      <w:proofErr w:type="spellEnd"/>
-      <w:r>
-        <w:rPr>
-          <w:color w:val="auto"/>
-        </w:rPr>
-        <w:t xml:space="preserve">, M. Combining Traffic Microsimulation Modeling and Multi-Criteria Analysis for Sustainable Spatial-Traffic Planning. </w:t>
+        <w:t xml:space="preserve">Ištoka Otković, I.; Karleuša, B.; Deluka-Tibljaš, A.; Šurdonja, S.; Marušić, M. Combining Traffic Microsimulation Modeling and Multi-Criteria Analysis for Sustainable Spatial-Traffic Planning. </w:t>
       </w:r>
       <w:r>
         <w:rPr>
@@ -28397,23 +28672,13 @@
         <w:tab/>
         <w:t xml:space="preserve">Piza, E.L.; Kennedy, L.W.; Caplan, J.M. Facilitators and Impediments to Designing, Implementing, and Evaluating Risk-Based Policing Strategies Using Risk Terrain Modeling: Insights from a Multi-City Evaluation in the United States. </w:t>
       </w:r>
-      <w:proofErr w:type="spellStart"/>
       <w:r>
         <w:rPr>
           <w:i/>
           <w:iCs/>
           <w:color w:val="auto"/>
         </w:rPr>
-        <w:t>Eur</w:t>
-      </w:r>
-      <w:proofErr w:type="spellEnd"/>
-      <w:r>
-        <w:rPr>
-          <w:i/>
-          <w:iCs/>
-          <w:color w:val="auto"/>
-        </w:rPr>
-        <w:t xml:space="preserve"> J Crim Policy Res</w:t>
+        <w:t>Eur J Crim Policy Res</w:t>
       </w:r>
       <w:r>
         <w:rPr>
@@ -28594,34 +28859,7 @@
           <w:color w:val="auto"/>
         </w:rPr>
         <w:tab/>
-      </w:r>
-      <w:proofErr w:type="spellStart"/>
-      <w:r>
-        <w:rPr>
-          <w:color w:val="auto"/>
-        </w:rPr>
-        <w:t>Mortaheb</w:t>
-      </w:r>
-      <w:proofErr w:type="spellEnd"/>
-      <w:r>
-        <w:rPr>
-          <w:color w:val="auto"/>
-        </w:rPr>
-        <w:t xml:space="preserve">, R.; Jankowski, P. Smart City Re-Imagined: City Planning and </w:t>
-      </w:r>
-      <w:proofErr w:type="spellStart"/>
-      <w:r>
-        <w:rPr>
-          <w:color w:val="auto"/>
-        </w:rPr>
-        <w:t>GeoAI</w:t>
-      </w:r>
-      <w:proofErr w:type="spellEnd"/>
-      <w:r>
-        <w:rPr>
-          <w:color w:val="auto"/>
-        </w:rPr>
-        <w:t xml:space="preserve"> in the Age of Big Data. </w:t>
+        <w:t xml:space="preserve">Mortaheb, R.; Jankowski, P. Smart City Re-Imagined: City Planning and GeoAI in the Age of Big Data. </w:t>
       </w:r>
       <w:r>
         <w:rPr>
@@ -28677,6 +28915,7 @@
         <w:rPr>
           <w:color w:val="auto"/>
         </w:rPr>
+        <w:lastRenderedPageBreak/>
         <w:t xml:space="preserve">20. </w:t>
       </w:r>
       <w:r>
@@ -28684,35 +28923,7 @@
           <w:color w:val="auto"/>
         </w:rPr>
         <w:tab/>
-        <w:t xml:space="preserve">Chen, M.; </w:t>
-      </w:r>
-      <w:proofErr w:type="spellStart"/>
-      <w:r>
-        <w:rPr>
-          <w:color w:val="auto"/>
-        </w:rPr>
-        <w:t>Claramunt</w:t>
-      </w:r>
-      <w:proofErr w:type="spellEnd"/>
-      <w:r>
-        <w:rPr>
-          <w:color w:val="auto"/>
-        </w:rPr>
-        <w:t xml:space="preserve">, C.; </w:t>
-      </w:r>
-      <w:proofErr w:type="spellStart"/>
-      <w:r>
-        <w:rPr>
-          <w:color w:val="auto"/>
-        </w:rPr>
-        <w:t>Çöltekin</w:t>
-      </w:r>
-      <w:proofErr w:type="spellEnd"/>
-      <w:r>
-        <w:rPr>
-          <w:color w:val="auto"/>
-        </w:rPr>
-        <w:t xml:space="preserve">, A.; Liu, X.; Peng, P.; Robinson, A.C.; Wang, D.; Strobl, J.; Wilson, J.P.; Batty, M. Artificial Intelligence and Visual Analytics in Geographical Space and Cyberspace: Research Opportunities and Challenges. </w:t>
+        <w:t xml:space="preserve">Chen, M.; Claramunt, C.; Çöltekin, A.; Liu, X.; Peng, P.; Robinson, A.C.; Wang, D.; Strobl, J.; Wilson, J.P.; Batty, M. Artificial Intelligence and Visual Analytics in Geographical Space and Cyberspace: Research Opportunities and Challenges. </w:t>
       </w:r>
       <w:r>
         <w:rPr>
@@ -28768,7 +28979,6 @@
         <w:rPr>
           <w:color w:val="auto"/>
         </w:rPr>
-        <w:lastRenderedPageBreak/>
         <w:t xml:space="preserve">21. </w:t>
       </w:r>
       <w:r>
@@ -28776,49 +28986,7 @@
           <w:color w:val="auto"/>
         </w:rPr>
         <w:tab/>
-        <w:t xml:space="preserve">Biu, P.W.; </w:t>
-      </w:r>
-      <w:proofErr w:type="spellStart"/>
-      <w:r>
-        <w:rPr>
-          <w:color w:val="auto"/>
-        </w:rPr>
-        <w:t>Nwasike</w:t>
-      </w:r>
-      <w:proofErr w:type="spellEnd"/>
-      <w:r>
-        <w:rPr>
-          <w:color w:val="auto"/>
-        </w:rPr>
-        <w:t xml:space="preserve">, C.N.; Tula, O.A.; </w:t>
-      </w:r>
-      <w:proofErr w:type="spellStart"/>
-      <w:r>
-        <w:rPr>
-          <w:color w:val="auto"/>
-        </w:rPr>
-        <w:t>Ezeigweneme</w:t>
-      </w:r>
-      <w:proofErr w:type="spellEnd"/>
-      <w:r>
-        <w:rPr>
-          <w:color w:val="auto"/>
-        </w:rPr>
-        <w:t xml:space="preserve">, C.A.; </w:t>
-      </w:r>
-      <w:proofErr w:type="spellStart"/>
-      <w:r>
-        <w:rPr>
-          <w:color w:val="auto"/>
-        </w:rPr>
-        <w:t>Gidiagba</w:t>
-      </w:r>
-      <w:proofErr w:type="spellEnd"/>
-      <w:r>
-        <w:rPr>
-          <w:color w:val="auto"/>
-        </w:rPr>
-        <w:t xml:space="preserve">, J.O. A Review of GIS Applications in Public Health Surveillance. </w:t>
+        <w:t xml:space="preserve">Biu, P.W.; Nwasike, C.N.; Tula, O.A.; Ezeigweneme, C.A.; Gidiagba, J.O. A Review of GIS Applications in Public Health Surveillance. </w:t>
       </w:r>
       <w:r>
         <w:rPr>
@@ -28881,76 +29049,7 @@
           <w:color w:val="auto"/>
         </w:rPr>
         <w:tab/>
-      </w:r>
-      <w:proofErr w:type="spellStart"/>
-      <w:r>
-        <w:rPr>
-          <w:color w:val="auto"/>
-        </w:rPr>
-        <w:t>Fradelos</w:t>
-      </w:r>
-      <w:proofErr w:type="spellEnd"/>
-      <w:r>
-        <w:rPr>
-          <w:color w:val="auto"/>
-        </w:rPr>
-        <w:t xml:space="preserve">, E.C.; </w:t>
-      </w:r>
-      <w:proofErr w:type="spellStart"/>
-      <w:r>
-        <w:rPr>
-          <w:color w:val="auto"/>
-        </w:rPr>
-        <w:t>Papathanasiou</w:t>
-      </w:r>
-      <w:proofErr w:type="spellEnd"/>
-      <w:r>
-        <w:rPr>
-          <w:color w:val="auto"/>
-        </w:rPr>
-        <w:t xml:space="preserve">, I.V.; Mitsi, D.; </w:t>
-      </w:r>
-      <w:proofErr w:type="spellStart"/>
-      <w:r>
-        <w:rPr>
-          <w:color w:val="auto"/>
-        </w:rPr>
-        <w:t>Tsaras</w:t>
-      </w:r>
-      <w:proofErr w:type="spellEnd"/>
-      <w:r>
-        <w:rPr>
-          <w:color w:val="auto"/>
-        </w:rPr>
-        <w:t xml:space="preserve">, K.; </w:t>
-      </w:r>
-      <w:proofErr w:type="spellStart"/>
-      <w:r>
-        <w:rPr>
-          <w:color w:val="auto"/>
-        </w:rPr>
-        <w:t>Kleisiaris</w:t>
-      </w:r>
-      <w:proofErr w:type="spellEnd"/>
-      <w:r>
-        <w:rPr>
-          <w:color w:val="auto"/>
-        </w:rPr>
-        <w:t xml:space="preserve">, C.F.; </w:t>
-      </w:r>
-      <w:proofErr w:type="spellStart"/>
-      <w:r>
-        <w:rPr>
-          <w:color w:val="auto"/>
-        </w:rPr>
-        <w:t>Kourkouta</w:t>
-      </w:r>
-      <w:proofErr w:type="spellEnd"/>
-      <w:r>
-        <w:rPr>
-          <w:color w:val="auto"/>
-        </w:rPr>
-        <w:t xml:space="preserve">, L. Health Based Geographic Information Systems (GIS) and Their Applications. </w:t>
+        <w:t xml:space="preserve">Fradelos, E.C.; Papathanasiou, I.V.; Mitsi, D.; Tsaras, K.; Kleisiaris, C.F.; Kourkouta, L. Health Based Geographic Information Systems (GIS) and Their Applications. </w:t>
       </w:r>
       <w:r>
         <w:rPr>
@@ -29013,21 +29112,7 @@
           <w:color w:val="auto"/>
         </w:rPr>
         <w:tab/>
-        <w:t>Wen, R.; Li, S. Generative Design for Precision Geo-Interventions. In Proceedings of the ISPRS Annals of the Photogrammetry, Remote Sensing and Spatial Information Sciences; Copernicus GmbH, October 27</w:t>
-      </w:r>
-      <w:proofErr w:type="gramStart"/>
-      <w:r>
-        <w:rPr>
-          <w:color w:val="auto"/>
-        </w:rPr>
-        <w:t xml:space="preserve"> 2022</w:t>
-      </w:r>
-      <w:proofErr w:type="gramEnd"/>
-      <w:r>
-        <w:rPr>
-          <w:color w:val="auto"/>
-        </w:rPr>
-        <w:t>; Vol. X-3-W2-2022, pp. 37–42.</w:t>
+        <w:t>Wen, R.; Li, S. Generative Design for Precision Geo-Interventions. In Proceedings of the ISPRS Annals of the Photogrammetry, Remote Sensing and Spatial Information Sciences; Copernicus GmbH, October 27 2022; Vol. X-3-W2-2022, pp. 37–42.</w:t>
       </w:r>
     </w:p>
     <w:p>
@@ -29048,35 +29133,7 @@
           <w:color w:val="auto"/>
         </w:rPr>
         <w:tab/>
-        <w:t xml:space="preserve">Blaschke, T.; </w:t>
-      </w:r>
-      <w:proofErr w:type="spellStart"/>
-      <w:r>
-        <w:rPr>
-          <w:color w:val="auto"/>
-        </w:rPr>
-        <w:t>Merschdorf</w:t>
-      </w:r>
-      <w:proofErr w:type="spellEnd"/>
-      <w:r>
-        <w:rPr>
-          <w:color w:val="auto"/>
-        </w:rPr>
-        <w:t>, H.; Cabrera-Barona, P.; Gao, S.; Papadakis, E.; Kovacs-</w:t>
-      </w:r>
-      <w:proofErr w:type="spellStart"/>
-      <w:r>
-        <w:rPr>
-          <w:color w:val="auto"/>
-        </w:rPr>
-        <w:t>Györi</w:t>
-      </w:r>
-      <w:proofErr w:type="spellEnd"/>
-      <w:r>
-        <w:rPr>
-          <w:color w:val="auto"/>
-        </w:rPr>
-        <w:t xml:space="preserve">, A. Place versus Space: From Points, Lines and Polygons in GIS to Place-Based Representations Reflecting Language and Culture. </w:t>
+        <w:t xml:space="preserve">Blaschke, T.; Merschdorf, H.; Cabrera-Barona, P.; Gao, S.; Papadakis, E.; Kovacs-Györi, A. Place versus Space: From Points, Lines and Polygons in GIS to Place-Based Representations Reflecting Language and Culture. </w:t>
       </w:r>
       <w:r>
         <w:rPr>
@@ -29139,20 +29196,7 @@
           <w:color w:val="auto"/>
         </w:rPr>
         <w:tab/>
-      </w:r>
-      <w:proofErr w:type="spellStart"/>
-      <w:r>
-        <w:rPr>
-          <w:color w:val="auto"/>
-        </w:rPr>
-        <w:t>Verbyla</w:t>
-      </w:r>
-      <w:proofErr w:type="spellEnd"/>
-      <w:r>
-        <w:rPr>
-          <w:color w:val="auto"/>
-        </w:rPr>
-        <w:t xml:space="preserve">, D.L. </w:t>
+        <w:t xml:space="preserve">Verbyla, D.L. </w:t>
       </w:r>
       <w:r>
         <w:rPr>
@@ -29166,16 +29210,8 @@
         <w:rPr>
           <w:color w:val="auto"/>
         </w:rPr>
-        <w:t xml:space="preserve">; CRC press, </w:t>
-      </w:r>
-      <w:proofErr w:type="gramStart"/>
-      <w:r>
-        <w:rPr>
-          <w:color w:val="auto"/>
-        </w:rPr>
-        <w:t>2002;</w:t>
-      </w:r>
-      <w:proofErr w:type="gramEnd"/>
+        <w:t>; CRC press, 2002;</w:t>
+      </w:r>
     </w:p>
     <w:p>
       <w:pPr>
@@ -29216,35 +29252,7 @@
           <w:color w:val="auto"/>
         </w:rPr>
         <w:tab/>
-        <w:t xml:space="preserve">Horst, R.; </w:t>
-      </w:r>
-      <w:proofErr w:type="spellStart"/>
-      <w:r>
-        <w:rPr>
-          <w:color w:val="auto"/>
-        </w:rPr>
-        <w:t>Pardalos</w:t>
-      </w:r>
-      <w:proofErr w:type="spellEnd"/>
-      <w:r>
-        <w:rPr>
-          <w:color w:val="auto"/>
-        </w:rPr>
-        <w:t xml:space="preserve">, P.M.; Van </w:t>
-      </w:r>
-      <w:proofErr w:type="spellStart"/>
-      <w:r>
-        <w:rPr>
-          <w:color w:val="auto"/>
-        </w:rPr>
-        <w:t>Thoai</w:t>
-      </w:r>
-      <w:proofErr w:type="spellEnd"/>
-      <w:r>
-        <w:rPr>
-          <w:color w:val="auto"/>
-        </w:rPr>
-        <w:t xml:space="preserve">, N. </w:t>
+        <w:t xml:space="preserve">Horst, R.; Pardalos, P.M.; Van Thoai, N. </w:t>
       </w:r>
       <w:r>
         <w:rPr>
@@ -29258,16 +29266,8 @@
         <w:rPr>
           <w:color w:val="auto"/>
         </w:rPr>
-        <w:t xml:space="preserve">; Springer Science &amp; Business Media, </w:t>
-      </w:r>
-      <w:proofErr w:type="gramStart"/>
-      <w:r>
-        <w:rPr>
-          <w:color w:val="auto"/>
-        </w:rPr>
-        <w:t>2000;</w:t>
-      </w:r>
-      <w:proofErr w:type="gramEnd"/>
+        <w:t>; Springer Science &amp; Business Media, 2000;</w:t>
+      </w:r>
     </w:p>
     <w:p>
       <w:pPr>
@@ -29350,21 +29350,7 @@
           <w:color w:val="auto"/>
         </w:rPr>
         <w:tab/>
-        <w:t xml:space="preserve">Ho, Y.C.; </w:t>
-      </w:r>
-      <w:proofErr w:type="spellStart"/>
-      <w:r>
-        <w:rPr>
-          <w:color w:val="auto"/>
-        </w:rPr>
-        <w:t>Pepyne</w:t>
-      </w:r>
-      <w:proofErr w:type="spellEnd"/>
-      <w:r>
-        <w:rPr>
-          <w:color w:val="auto"/>
-        </w:rPr>
-        <w:t xml:space="preserve">, D.L. Simple Explanation of the No-Free-Lunch Theorem and Its Implications. </w:t>
+        <w:t xml:space="preserve">Ho, Y.C.; Pepyne, D.L. Simple Explanation of the No-Free-Lunch Theorem and Its Implications. </w:t>
       </w:r>
       <w:r>
         <w:rPr>
@@ -29504,16 +29490,8 @@
         <w:rPr>
           <w:color w:val="auto"/>
         </w:rPr>
-        <w:t>, 246–264, doi:10.1111/j.1461-0248.2009.</w:t>
-      </w:r>
-      <w:proofErr w:type="gramStart"/>
-      <w:r>
-        <w:rPr>
-          <w:color w:val="auto"/>
-        </w:rPr>
-        <w:t>01422.x.</w:t>
-      </w:r>
-      <w:proofErr w:type="gramEnd"/>
+        <w:t>, 246–264, doi:10.1111/j.1461-0248.2009.01422.x.</w:t>
+      </w:r>
     </w:p>
     <w:p>
       <w:pPr>
@@ -29533,20 +29511,7 @@
           <w:color w:val="auto"/>
         </w:rPr>
         <w:tab/>
-      </w:r>
-      <w:proofErr w:type="spellStart"/>
-      <w:r>
-        <w:rPr>
-          <w:color w:val="auto"/>
-        </w:rPr>
-        <w:t>Maffini</w:t>
-      </w:r>
-      <w:proofErr w:type="spellEnd"/>
-      <w:r>
-        <w:rPr>
-          <w:color w:val="auto"/>
-        </w:rPr>
-        <w:t xml:space="preserve">, G. Raster versus Vector Data Encoding and Handling: A Commentary. </w:t>
+        <w:t xml:space="preserve">Maffini, G. Raster versus Vector Data Encoding and Handling: A Commentary. </w:t>
       </w:r>
       <w:r>
         <w:rPr>
@@ -29609,20 +29574,7 @@
           <w:color w:val="auto"/>
         </w:rPr>
         <w:tab/>
-      </w:r>
-      <w:proofErr w:type="spellStart"/>
-      <w:r>
-        <w:rPr>
-          <w:color w:val="auto"/>
-        </w:rPr>
-        <w:t>Congalton</w:t>
-      </w:r>
-      <w:proofErr w:type="spellEnd"/>
-      <w:r>
-        <w:rPr>
-          <w:color w:val="auto"/>
-        </w:rPr>
-        <w:t xml:space="preserve">, R.G. Exploring and Evaluating the Consequences of Vector-to-Raster and Raster-to-Vector Conversion. </w:t>
+        <w:t xml:space="preserve">Congalton, R.G. Exploring and Evaluating the Consequences of Vector-to-Raster and Raster-to-Vector Conversion. </w:t>
       </w:r>
       <w:r>
         <w:rPr>
@@ -29748,76 +29700,7 @@
           <w:color w:val="auto"/>
         </w:rPr>
         <w:tab/>
-      </w:r>
-      <w:proofErr w:type="spellStart"/>
-      <w:r>
-        <w:rPr>
-          <w:color w:val="auto"/>
-        </w:rPr>
-        <w:t>Adegun</w:t>
-      </w:r>
-      <w:proofErr w:type="spellEnd"/>
-      <w:r>
-        <w:rPr>
-          <w:color w:val="auto"/>
-        </w:rPr>
-        <w:t xml:space="preserve">, A.A.; </w:t>
-      </w:r>
-      <w:proofErr w:type="spellStart"/>
-      <w:r>
-        <w:rPr>
-          <w:color w:val="auto"/>
-        </w:rPr>
-        <w:t>Fonou</w:t>
-      </w:r>
-      <w:proofErr w:type="spellEnd"/>
-      <w:r>
-        <w:rPr>
-          <w:color w:val="auto"/>
-        </w:rPr>
-        <w:t xml:space="preserve"> </w:t>
-      </w:r>
-      <w:proofErr w:type="spellStart"/>
-      <w:r>
-        <w:rPr>
-          <w:color w:val="auto"/>
-        </w:rPr>
-        <w:t>Dombeu</w:t>
-      </w:r>
-      <w:proofErr w:type="spellEnd"/>
-      <w:r>
-        <w:rPr>
-          <w:color w:val="auto"/>
-        </w:rPr>
-        <w:t xml:space="preserve">, J.V.; </w:t>
-      </w:r>
-      <w:proofErr w:type="spellStart"/>
-      <w:r>
-        <w:rPr>
-          <w:color w:val="auto"/>
-        </w:rPr>
-        <w:t>Viriri</w:t>
-      </w:r>
-      <w:proofErr w:type="spellEnd"/>
-      <w:r>
-        <w:rPr>
-          <w:color w:val="auto"/>
-        </w:rPr>
-        <w:t xml:space="preserve">, S.; </w:t>
-      </w:r>
-      <w:proofErr w:type="spellStart"/>
-      <w:r>
-        <w:rPr>
-          <w:color w:val="auto"/>
-        </w:rPr>
-        <w:t>Odindi</w:t>
-      </w:r>
-      <w:proofErr w:type="spellEnd"/>
-      <w:r>
-        <w:rPr>
-          <w:color w:val="auto"/>
-        </w:rPr>
-        <w:t xml:space="preserve">, J. State-of-the-Art Deep Learning Methods for Objects Detection in Remote Sensing Satellite Images. </w:t>
+        <w:t xml:space="preserve">Adegun, A.A.; Fonou Dombeu, J.V.; Viriri, S.; Odindi, J. State-of-the-Art Deep Learning Methods for Objects Detection in Remote Sensing Satellite Images. </w:t>
       </w:r>
       <w:r>
         <w:rPr>
@@ -29901,76 +29784,7 @@
           <w:color w:val="auto"/>
         </w:rPr>
         <w:tab/>
-      </w:r>
-      <w:proofErr w:type="spellStart"/>
-      <w:r>
-        <w:rPr>
-          <w:color w:val="auto"/>
-        </w:rPr>
-        <w:t>Verdonck</w:t>
-      </w:r>
-      <w:proofErr w:type="spellEnd"/>
-      <w:r>
-        <w:rPr>
-          <w:color w:val="auto"/>
-        </w:rPr>
-        <w:t xml:space="preserve">, T.; </w:t>
-      </w:r>
-      <w:proofErr w:type="spellStart"/>
-      <w:r>
-        <w:rPr>
-          <w:color w:val="auto"/>
-        </w:rPr>
-        <w:t>Baesens</w:t>
-      </w:r>
-      <w:proofErr w:type="spellEnd"/>
-      <w:r>
-        <w:rPr>
-          <w:color w:val="auto"/>
-        </w:rPr>
-        <w:t xml:space="preserve">, B.; </w:t>
-      </w:r>
-      <w:proofErr w:type="spellStart"/>
-      <w:r>
-        <w:rPr>
-          <w:color w:val="auto"/>
-        </w:rPr>
-        <w:t>Óskarsdóttir</w:t>
-      </w:r>
-      <w:proofErr w:type="spellEnd"/>
-      <w:r>
-        <w:rPr>
-          <w:color w:val="auto"/>
-        </w:rPr>
-        <w:t xml:space="preserve">, M.; </w:t>
-      </w:r>
-      <w:proofErr w:type="spellStart"/>
-      <w:r>
-        <w:rPr>
-          <w:color w:val="auto"/>
-        </w:rPr>
-        <w:t>vanden</w:t>
-      </w:r>
-      <w:proofErr w:type="spellEnd"/>
-      <w:r>
-        <w:rPr>
-          <w:color w:val="auto"/>
-        </w:rPr>
-        <w:t xml:space="preserve"> </w:t>
-      </w:r>
-      <w:proofErr w:type="spellStart"/>
-      <w:r>
-        <w:rPr>
-          <w:color w:val="auto"/>
-        </w:rPr>
-        <w:t>Broucke</w:t>
-      </w:r>
-      <w:proofErr w:type="spellEnd"/>
-      <w:r>
-        <w:rPr>
-          <w:color w:val="auto"/>
-        </w:rPr>
-        <w:t xml:space="preserve">, S. Special Issue on Feature Engineering Editorial. </w:t>
+        <w:t xml:space="preserve">Verdonck, T.; Baesens, B.; Óskarsdóttir, M.; vanden Broucke, S. Special Issue on Feature Engineering Editorial. </w:t>
       </w:r>
       <w:r>
         <w:rPr>
@@ -30026,6 +29840,7 @@
         <w:rPr>
           <w:color w:val="auto"/>
         </w:rPr>
+        <w:lastRenderedPageBreak/>
         <w:t xml:space="preserve">38. </w:t>
       </w:r>
       <w:r>
@@ -30033,20 +29848,7 @@
           <w:color w:val="auto"/>
         </w:rPr>
         <w:tab/>
-      </w:r>
-      <w:proofErr w:type="spellStart"/>
-      <w:r>
-        <w:rPr>
-          <w:color w:val="auto"/>
-        </w:rPr>
-        <w:t>MacQuillan</w:t>
-      </w:r>
-      <w:proofErr w:type="spellEnd"/>
-      <w:r>
-        <w:rPr>
-          <w:color w:val="auto"/>
-        </w:rPr>
-        <w:t xml:space="preserve">, E.L.; Curtis, A.B.; Baker, K.M.; Paul, R.; Back, Y.O. Using GIS Mapping to Target Public Health Interventions: Examining Birth Outcomes Across GIS Techniques. </w:t>
+        <w:t xml:space="preserve">MacQuillan, E.L.; Curtis, A.B.; Baker, K.M.; Paul, R.; Back, Y.O. Using GIS Mapping to Target Public Health Interventions: Examining Birth Outcomes Across GIS Techniques. </w:t>
       </w:r>
       <w:r>
         <w:rPr>
@@ -30102,7 +29904,6 @@
         <w:rPr>
           <w:color w:val="auto"/>
         </w:rPr>
-        <w:lastRenderedPageBreak/>
         <w:t xml:space="preserve">39. </w:t>
       </w:r>
       <w:r>
@@ -30110,35 +29911,7 @@
           <w:color w:val="auto"/>
         </w:rPr>
         <w:tab/>
-        <w:t xml:space="preserve">Almeida, C.M.D.; Monteiro, A.M.V.; </w:t>
-      </w:r>
-      <w:proofErr w:type="spellStart"/>
-      <w:r>
-        <w:rPr>
-          <w:color w:val="auto"/>
-        </w:rPr>
-        <w:t>Câmara</w:t>
-      </w:r>
-      <w:proofErr w:type="spellEnd"/>
-      <w:r>
-        <w:rPr>
-          <w:color w:val="auto"/>
-        </w:rPr>
-        <w:t xml:space="preserve">, G.; Soares‐Filho, B.S.; Cerqueira, G.C.; </w:t>
-      </w:r>
-      <w:proofErr w:type="spellStart"/>
-      <w:r>
-        <w:rPr>
-          <w:color w:val="auto"/>
-        </w:rPr>
-        <w:t>Pennachin</w:t>
-      </w:r>
-      <w:proofErr w:type="spellEnd"/>
-      <w:r>
-        <w:rPr>
-          <w:color w:val="auto"/>
-        </w:rPr>
-        <w:t xml:space="preserve">, C.L.; Batty, M. GIS and Remote Sensing as Tools for the Simulation of Urban Land‐use Change. </w:t>
+        <w:t xml:space="preserve">Almeida, C.M.D.; Monteiro, A.M.V.; Câmara, G.; Soares‐Filho, B.S.; Cerqueira, G.C.; Pennachin, C.L.; Batty, M. GIS and Remote Sensing as Tools for the Simulation of Urban Land‐use Change. </w:t>
       </w:r>
       <w:r>
         <w:rPr>
@@ -30201,49 +29974,7 @@
           <w:color w:val="auto"/>
         </w:rPr>
         <w:tab/>
-        <w:t xml:space="preserve">Gómez, L.; </w:t>
-      </w:r>
-      <w:proofErr w:type="spellStart"/>
-      <w:r>
-        <w:rPr>
-          <w:color w:val="auto"/>
-        </w:rPr>
-        <w:t>Haesevoets</w:t>
-      </w:r>
-      <w:proofErr w:type="spellEnd"/>
-      <w:r>
-        <w:rPr>
-          <w:color w:val="auto"/>
-        </w:rPr>
-        <w:t xml:space="preserve">, S.; </w:t>
-      </w:r>
-      <w:proofErr w:type="spellStart"/>
-      <w:r>
-        <w:rPr>
-          <w:color w:val="auto"/>
-        </w:rPr>
-        <w:t>Kuijpers</w:t>
-      </w:r>
-      <w:proofErr w:type="spellEnd"/>
-      <w:r>
-        <w:rPr>
-          <w:color w:val="auto"/>
-        </w:rPr>
-        <w:t xml:space="preserve">, B.; </w:t>
-      </w:r>
-      <w:proofErr w:type="spellStart"/>
-      <w:r>
-        <w:rPr>
-          <w:color w:val="auto"/>
-        </w:rPr>
-        <w:t>Vaisman</w:t>
-      </w:r>
-      <w:proofErr w:type="spellEnd"/>
-      <w:r>
-        <w:rPr>
-          <w:color w:val="auto"/>
-        </w:rPr>
-        <w:t xml:space="preserve">, A.A. Spatial Aggregation: Data Model and Implementation. </w:t>
+        <w:t xml:space="preserve">Gómez, L.; Haesevoets, S.; Kuijpers, B.; Vaisman, A.A. Spatial Aggregation: Data Model and Implementation. </w:t>
       </w:r>
       <w:r>
         <w:rPr>
@@ -30369,34 +30100,7 @@
           <w:color w:val="auto"/>
         </w:rPr>
         <w:tab/>
-      </w:r>
-      <w:proofErr w:type="spellStart"/>
-      <w:r>
-        <w:rPr>
-          <w:color w:val="auto"/>
-        </w:rPr>
-        <w:t>Getis</w:t>
-      </w:r>
-      <w:proofErr w:type="spellEnd"/>
-      <w:r>
-        <w:rPr>
-          <w:color w:val="auto"/>
-        </w:rPr>
-        <w:t xml:space="preserve">, A.; </w:t>
-      </w:r>
-      <w:proofErr w:type="spellStart"/>
-      <w:r>
-        <w:rPr>
-          <w:color w:val="auto"/>
-        </w:rPr>
-        <w:t>Aldstadt</w:t>
-      </w:r>
-      <w:proofErr w:type="spellEnd"/>
-      <w:r>
-        <w:rPr>
-          <w:color w:val="auto"/>
-        </w:rPr>
-        <w:t xml:space="preserve">, J. Constructing the Spatial Weights Matrix Using a Local Statistic. </w:t>
+        <w:t xml:space="preserve">Getis, A.; Aldstadt, J. Constructing the Spatial Weights Matrix Using a Local Statistic. </w:t>
       </w:r>
       <w:r>
         <w:rPr>
@@ -30438,21 +30142,7 @@
         <w:rPr>
           <w:color w:val="auto"/>
         </w:rPr>
-        <w:t>, 90–104, doi:10.1111/j.1538-</w:t>
-      </w:r>
-      <w:proofErr w:type="gramStart"/>
-      <w:r>
-        <w:rPr>
-          <w:color w:val="auto"/>
-        </w:rPr>
-        <w:t>4632.2004.tb</w:t>
-      </w:r>
-      <w:proofErr w:type="gramEnd"/>
-      <w:r>
-        <w:rPr>
-          <w:color w:val="auto"/>
-        </w:rPr>
-        <w:t>01127.x.</w:t>
+        <w:t>, 90–104, doi:10.1111/j.1538-4632.2004.tb01127.x.</w:t>
       </w:r>
     </w:p>
     <w:p>
@@ -30473,21 +30163,7 @@
           <w:color w:val="auto"/>
         </w:rPr>
         <w:tab/>
-        <w:t xml:space="preserve">Roberts, S. Applying Efficient Techniques for Finding Nearest </w:t>
-      </w:r>
-      <w:proofErr w:type="spellStart"/>
-      <w:r>
-        <w:rPr>
-          <w:color w:val="auto"/>
-        </w:rPr>
-        <w:t>Neighbours</w:t>
-      </w:r>
-      <w:proofErr w:type="spellEnd"/>
-      <w:r>
-        <w:rPr>
-          <w:color w:val="auto"/>
-        </w:rPr>
-        <w:t xml:space="preserve"> in GIS Applications. In </w:t>
+        <w:t xml:space="preserve">Roberts, S. Applying Efficient Techniques for Finding Nearest Neighbours in GIS Applications. In </w:t>
       </w:r>
       <w:r>
         <w:rPr>
@@ -30522,35 +30198,7 @@
           <w:color w:val="auto"/>
         </w:rPr>
         <w:tab/>
-        <w:t xml:space="preserve">García-García, F.; Corral, A.; Iribarne, L.; </w:t>
-      </w:r>
-      <w:proofErr w:type="spellStart"/>
-      <w:r>
-        <w:rPr>
-          <w:color w:val="auto"/>
-        </w:rPr>
-        <w:t>Vassilakopoulos</w:t>
-      </w:r>
-      <w:proofErr w:type="spellEnd"/>
-      <w:r>
-        <w:rPr>
-          <w:color w:val="auto"/>
-        </w:rPr>
-        <w:t xml:space="preserve">, M.; </w:t>
-      </w:r>
-      <w:proofErr w:type="spellStart"/>
-      <w:r>
-        <w:rPr>
-          <w:color w:val="auto"/>
-        </w:rPr>
-        <w:t>Manolopoulos</w:t>
-      </w:r>
-      <w:proofErr w:type="spellEnd"/>
-      <w:r>
-        <w:rPr>
-          <w:color w:val="auto"/>
-        </w:rPr>
-        <w:t xml:space="preserve">, Y. Efficient Distance Join Query Processing in Distributed Spatial Data Management Systems. </w:t>
+        <w:t xml:space="preserve">García-García, F.; Corral, A.; Iribarne, L.; Vassilakopoulos, M.; Manolopoulos, Y. Efficient Distance Join Query Processing in Distributed Spatial Data Management Systems. </w:t>
       </w:r>
       <w:r>
         <w:rPr>
@@ -30592,21 +30240,7 @@
         <w:rPr>
           <w:color w:val="auto"/>
         </w:rPr>
-        <w:t xml:space="preserve">, 985–1008, </w:t>
-      </w:r>
-      <w:proofErr w:type="gramStart"/>
-      <w:r>
-        <w:rPr>
-          <w:color w:val="auto"/>
-        </w:rPr>
-        <w:t>doi:10.1016/j.ins</w:t>
-      </w:r>
-      <w:proofErr w:type="gramEnd"/>
-      <w:r>
-        <w:rPr>
-          <w:color w:val="auto"/>
-        </w:rPr>
-        <w:t>.2019.10.030.</w:t>
+        <w:t>, 985–1008, doi:10.1016/j.ins.2019.10.030.</w:t>
       </w:r>
     </w:p>
     <w:p>
@@ -30627,20 +30261,7 @@
           <w:color w:val="auto"/>
         </w:rPr>
         <w:tab/>
-      </w:r>
-      <w:proofErr w:type="spellStart"/>
-      <w:r>
-        <w:rPr>
-          <w:color w:val="auto"/>
-        </w:rPr>
-        <w:t>Steyerberg</w:t>
-      </w:r>
-      <w:proofErr w:type="spellEnd"/>
-      <w:r>
-        <w:rPr>
-          <w:color w:val="auto"/>
-        </w:rPr>
-        <w:t xml:space="preserve">, E.W. Applications of Prediction Models. In </w:t>
+        <w:t xml:space="preserve">Steyerberg, E.W. Applications of Prediction Models. In </w:t>
       </w:r>
       <w:r>
         <w:rPr>
@@ -30654,21 +30275,7 @@
         <w:rPr>
           <w:color w:val="auto"/>
         </w:rPr>
-        <w:t xml:space="preserve">; </w:t>
-      </w:r>
-      <w:proofErr w:type="spellStart"/>
-      <w:r>
-        <w:rPr>
-          <w:color w:val="auto"/>
-        </w:rPr>
-        <w:t>Steyerberg</w:t>
-      </w:r>
-      <w:proofErr w:type="spellEnd"/>
-      <w:r>
-        <w:rPr>
-          <w:color w:val="auto"/>
-        </w:rPr>
-        <w:t>, E.W., Ed.; Springer: New York, NY, 2009; pp. 11–31 ISBN 978-0-387-77244-8.</w:t>
+        <w:t>; Steyerberg, E.W., Ed.; Springer: New York, NY, 2009; pp. 11–31 ISBN 978-0-387-77244-8.</w:t>
       </w:r>
     </w:p>
     <w:p>
@@ -30689,21 +30296,7 @@
           <w:color w:val="auto"/>
         </w:rPr>
         <w:tab/>
-        <w:t>Ray, S. A Quick Review of Machine Learning Algorithms. In Proceedings of the 2019 International conference on machine learning, big data, cloud and parallel computing (</w:t>
-      </w:r>
-      <w:proofErr w:type="spellStart"/>
-      <w:r>
-        <w:rPr>
-          <w:color w:val="auto"/>
-        </w:rPr>
-        <w:t>COMITCon</w:t>
-      </w:r>
-      <w:proofErr w:type="spellEnd"/>
-      <w:r>
-        <w:rPr>
-          <w:color w:val="auto"/>
-        </w:rPr>
-        <w:t>); IEEE, 2019; pp. 35–39.</w:t>
+        <w:t>Ray, S. A Quick Review of Machine Learning Algorithms. In Proceedings of the 2019 International conference on machine learning, big data, cloud and parallel computing (COMITCon); IEEE, 2019; pp. 35–39.</w:t>
       </w:r>
     </w:p>
     <w:p>
@@ -30724,21 +30317,7 @@
           <w:color w:val="auto"/>
         </w:rPr>
         <w:tab/>
-        <w:t xml:space="preserve">Muñoz, J.; </w:t>
-      </w:r>
-      <w:proofErr w:type="spellStart"/>
-      <w:r>
-        <w:rPr>
-          <w:color w:val="auto"/>
-        </w:rPr>
-        <w:t>Felicísimo</w:t>
-      </w:r>
-      <w:proofErr w:type="spellEnd"/>
-      <w:r>
-        <w:rPr>
-          <w:color w:val="auto"/>
-        </w:rPr>
-        <w:t xml:space="preserve">, Á.M. Comparison of Statistical Methods Commonly Used in Predictive Modelling. </w:t>
+        <w:t xml:space="preserve">Muñoz, J.; Felicísimo, Á.M. Comparison of Statistical Methods Commonly Used in Predictive Modelling. </w:t>
       </w:r>
       <w:r>
         <w:rPr>
@@ -30780,21 +30359,7 @@
         <w:rPr>
           <w:color w:val="auto"/>
         </w:rPr>
-        <w:t>, 285–292, doi:10.1111/j.1654-</w:t>
-      </w:r>
-      <w:proofErr w:type="gramStart"/>
-      <w:r>
-        <w:rPr>
-          <w:color w:val="auto"/>
-        </w:rPr>
-        <w:t>1103.2004.tb</w:t>
-      </w:r>
-      <w:proofErr w:type="gramEnd"/>
-      <w:r>
-        <w:rPr>
-          <w:color w:val="auto"/>
-        </w:rPr>
-        <w:t>02263.x.</w:t>
+        <w:t>, 285–292, doi:10.1111/j.1654-1103.2004.tb02263.x.</w:t>
       </w:r>
     </w:p>
     <w:p>
@@ -30857,29 +30422,7 @@
         <w:rPr>
           <w:color w:val="auto"/>
         </w:rPr>
-        <w:t xml:space="preserve">, 553–578, </w:t>
-      </w:r>
-      <w:proofErr w:type="spellStart"/>
-      <w:proofErr w:type="gramStart"/>
-      <w:r>
-        <w:rPr>
-          <w:color w:val="auto"/>
-        </w:rPr>
-        <w:t>doi:https</w:t>
-      </w:r>
-      <w:proofErr w:type="spellEnd"/>
-      <w:r>
-        <w:rPr>
-          <w:color w:val="auto"/>
-        </w:rPr>
-        <w:t>://doi.org/10.1111/0272-4332.00039</w:t>
-      </w:r>
-      <w:proofErr w:type="gramEnd"/>
-      <w:r>
-        <w:rPr>
-          <w:color w:val="auto"/>
-        </w:rPr>
-        <w:t>.</w:t>
+        <w:t>, 553–578, doi:https://doi.org/10.1111/0272-4332.00039.</w:t>
       </w:r>
     </w:p>
     <w:p>
@@ -30900,21 +30443,7 @@
           <w:color w:val="auto"/>
         </w:rPr>
         <w:tab/>
-        <w:t xml:space="preserve">Ingalls, B. Sensitivity Analysis: From Model Parameters to System </w:t>
-      </w:r>
-      <w:proofErr w:type="spellStart"/>
-      <w:r>
-        <w:rPr>
-          <w:color w:val="auto"/>
-        </w:rPr>
-        <w:t>Behaviour</w:t>
-      </w:r>
-      <w:proofErr w:type="spellEnd"/>
-      <w:r>
-        <w:rPr>
-          <w:color w:val="auto"/>
-        </w:rPr>
-        <w:t xml:space="preserve">. </w:t>
+        <w:t xml:space="preserve">Ingalls, B. Sensitivity Analysis: From Model Parameters to System Behaviour. </w:t>
       </w:r>
       <w:r>
         <w:rPr>
@@ -30985,25 +30514,7 @@
           <w:iCs/>
           <w:color w:val="auto"/>
         </w:rPr>
-        <w:t xml:space="preserve">Environ </w:t>
-      </w:r>
-      <w:proofErr w:type="spellStart"/>
-      <w:r>
-        <w:rPr>
-          <w:i/>
-          <w:iCs/>
-          <w:color w:val="auto"/>
-        </w:rPr>
-        <w:t>Monit</w:t>
-      </w:r>
-      <w:proofErr w:type="spellEnd"/>
-      <w:r>
-        <w:rPr>
-          <w:i/>
-          <w:iCs/>
-          <w:color w:val="auto"/>
-        </w:rPr>
-        <w:t xml:space="preserve"> Assess</w:t>
+        <w:t>Environ Monit Assess</w:t>
       </w:r>
       <w:r>
         <w:rPr>
@@ -31066,25 +30577,7 @@
           <w:iCs/>
           <w:color w:val="auto"/>
         </w:rPr>
-        <w:t xml:space="preserve">J. Chem. Inf. </w:t>
-      </w:r>
-      <w:proofErr w:type="spellStart"/>
-      <w:r>
-        <w:rPr>
-          <w:i/>
-          <w:iCs/>
-          <w:color w:val="auto"/>
-        </w:rPr>
-        <w:t>Comput</w:t>
-      </w:r>
-      <w:proofErr w:type="spellEnd"/>
-      <w:r>
-        <w:rPr>
-          <w:i/>
-          <w:iCs/>
-          <w:color w:val="auto"/>
-        </w:rPr>
-        <w:t>. Sci.</w:t>
+        <w:t>J. Chem. Inf. Comput. Sci.</w:t>
       </w:r>
       <w:r>
         <w:rPr>
@@ -31139,21 +30632,7 @@
           <w:color w:val="auto"/>
         </w:rPr>
         <w:tab/>
-        <w:t xml:space="preserve">Ding, J.; </w:t>
-      </w:r>
-      <w:proofErr w:type="spellStart"/>
-      <w:r>
-        <w:rPr>
-          <w:color w:val="auto"/>
-        </w:rPr>
-        <w:t>Tarokh</w:t>
-      </w:r>
-      <w:proofErr w:type="spellEnd"/>
-      <w:r>
-        <w:rPr>
-          <w:color w:val="auto"/>
-        </w:rPr>
-        <w:t xml:space="preserve">, V.; Yang, Y. Model Selection Techniques: An Overview. </w:t>
+        <w:t xml:space="preserve">Ding, J.; Tarokh, V.; Yang, Y. Model Selection Techniques: An Overview. </w:t>
       </w:r>
       <w:r>
         <w:rPr>
@@ -31216,20 +30695,7 @@
           <w:color w:val="auto"/>
         </w:rPr>
         <w:tab/>
-      </w:r>
-      <w:proofErr w:type="spellStart"/>
-      <w:r>
-        <w:rPr>
-          <w:color w:val="auto"/>
-        </w:rPr>
-        <w:t>Berrar</w:t>
-      </w:r>
-      <w:proofErr w:type="spellEnd"/>
-      <w:r>
-        <w:rPr>
-          <w:color w:val="auto"/>
-        </w:rPr>
-        <w:t xml:space="preserve">, D. Cross-Validation. In </w:t>
+        <w:t xml:space="preserve">Berrar, D. Cross-Validation. In </w:t>
       </w:r>
       <w:r>
         <w:rPr>
@@ -31243,35 +30709,7 @@
         <w:rPr>
           <w:color w:val="auto"/>
         </w:rPr>
-        <w:t xml:space="preserve">; Ranganathan, S., </w:t>
-      </w:r>
-      <w:proofErr w:type="spellStart"/>
-      <w:r>
-        <w:rPr>
-          <w:color w:val="auto"/>
-        </w:rPr>
-        <w:t>Gribskov</w:t>
-      </w:r>
-      <w:proofErr w:type="spellEnd"/>
-      <w:r>
-        <w:rPr>
-          <w:color w:val="auto"/>
-        </w:rPr>
-        <w:t xml:space="preserve">, M., Nakai, K., </w:t>
-      </w:r>
-      <w:proofErr w:type="spellStart"/>
-      <w:r>
-        <w:rPr>
-          <w:color w:val="auto"/>
-        </w:rPr>
-        <w:t>Schönbach</w:t>
-      </w:r>
-      <w:proofErr w:type="spellEnd"/>
-      <w:r>
-        <w:rPr>
-          <w:color w:val="auto"/>
-        </w:rPr>
-        <w:t>, C., Eds.; Academic Press: Oxford, 2019; pp. 542–545 ISBN 978-0-12-811432-2.</w:t>
+        <w:t>; Ranganathan, S., Gribskov, M., Nakai, K., Schönbach, C., Eds.; Academic Press: Oxford, 2019; pp. 542–545 ISBN 978-0-12-811432-2.</w:t>
       </w:r>
     </w:p>
     <w:p>
@@ -31355,21 +30793,7 @@
           <w:color w:val="auto"/>
         </w:rPr>
         <w:tab/>
-        <w:t xml:space="preserve">Nguyen, D.C.H.; Dandy, G.C.; Maier, H.R.; </w:t>
-      </w:r>
-      <w:proofErr w:type="spellStart"/>
-      <w:r>
-        <w:rPr>
-          <w:color w:val="auto"/>
-        </w:rPr>
-        <w:t>Ascough</w:t>
-      </w:r>
-      <w:proofErr w:type="spellEnd"/>
-      <w:r>
-        <w:rPr>
-          <w:color w:val="auto"/>
-        </w:rPr>
-        <w:t xml:space="preserve">, J.C. Improved Ant Colony Optimization for Optimal Crop and Irrigation Water Allocation by Incorporating Domain Knowledge. </w:t>
+        <w:t xml:space="preserve">Nguyen, D.C.H.; Dandy, G.C.; Maier, H.R.; Ascough, J.C. Improved Ant Colony Optimization for Optimal Crop and Irrigation Water Allocation by Incorporating Domain Knowledge. </w:t>
       </w:r>
       <w:r>
         <w:rPr>
@@ -31377,43 +30801,7 @@
           <w:iCs/>
           <w:color w:val="auto"/>
         </w:rPr>
-        <w:t xml:space="preserve">J. Water </w:t>
-      </w:r>
-      <w:proofErr w:type="spellStart"/>
-      <w:r>
-        <w:rPr>
-          <w:i/>
-          <w:iCs/>
-          <w:color w:val="auto"/>
-        </w:rPr>
-        <w:t>Resour</w:t>
-      </w:r>
-      <w:proofErr w:type="spellEnd"/>
-      <w:r>
-        <w:rPr>
-          <w:i/>
-          <w:iCs/>
-          <w:color w:val="auto"/>
-        </w:rPr>
-        <w:t xml:space="preserve">. </w:t>
-      </w:r>
-      <w:proofErr w:type="spellStart"/>
-      <w:r>
-        <w:rPr>
-          <w:i/>
-          <w:iCs/>
-          <w:color w:val="auto"/>
-        </w:rPr>
-        <w:t>Plann</w:t>
-      </w:r>
-      <w:proofErr w:type="spellEnd"/>
-      <w:r>
-        <w:rPr>
-          <w:i/>
-          <w:iCs/>
-          <w:color w:val="auto"/>
-        </w:rPr>
-        <w:t>. Manage.</w:t>
+        <w:t>J. Water Resour. Plann. Manage.</w:t>
       </w:r>
       <w:r>
         <w:rPr>
@@ -31510,21 +30898,7 @@
         <w:rPr>
           <w:color w:val="auto"/>
         </w:rPr>
-        <w:t xml:space="preserve">, 399–432, </w:t>
-      </w:r>
-      <w:proofErr w:type="gramStart"/>
-      <w:r>
-        <w:rPr>
-          <w:color w:val="auto"/>
-        </w:rPr>
-        <w:t>doi:10.1016/j.ress</w:t>
-      </w:r>
-      <w:proofErr w:type="gramEnd"/>
-      <w:r>
-        <w:rPr>
-          <w:color w:val="auto"/>
-        </w:rPr>
-        <w:t>.2015.05.018.</w:t>
+        <w:t>, 399–432, doi:10.1016/j.ress.2015.05.018.</w:t>
       </w:r>
     </w:p>
     <w:p>
@@ -31538,6 +30912,7 @@
         <w:rPr>
           <w:color w:val="auto"/>
         </w:rPr>
+        <w:lastRenderedPageBreak/>
         <w:t xml:space="preserve">57. </w:t>
       </w:r>
       <w:r>
@@ -31545,34 +30920,7 @@
           <w:color w:val="auto"/>
         </w:rPr>
         <w:tab/>
-      </w:r>
-      <w:proofErr w:type="spellStart"/>
-      <w:r>
-        <w:rPr>
-          <w:color w:val="auto"/>
-        </w:rPr>
-        <w:t>Asuero</w:t>
-      </w:r>
-      <w:proofErr w:type="spellEnd"/>
-      <w:r>
-        <w:rPr>
-          <w:color w:val="auto"/>
-        </w:rPr>
-        <w:t xml:space="preserve">, A.G.; </w:t>
-      </w:r>
-      <w:proofErr w:type="spellStart"/>
-      <w:r>
-        <w:rPr>
-          <w:color w:val="auto"/>
-        </w:rPr>
-        <w:t>Sayago</w:t>
-      </w:r>
-      <w:proofErr w:type="spellEnd"/>
-      <w:r>
-        <w:rPr>
-          <w:color w:val="auto"/>
-        </w:rPr>
-        <w:t xml:space="preserve">, A.; González, A.G. The Correlation Coefficient: An Overview. </w:t>
+        <w:t xml:space="preserve">Asuero, A.G.; Sayago, A.; González, A.G. The Correlation Coefficient: An Overview. </w:t>
       </w:r>
       <w:r>
         <w:rPr>
@@ -31628,7 +30976,6 @@
         <w:rPr>
           <w:color w:val="auto"/>
         </w:rPr>
-        <w:lastRenderedPageBreak/>
         <w:t xml:space="preserve">58. </w:t>
       </w:r>
       <w:r>
@@ -31699,48 +31046,7 @@
           <w:color w:val="auto"/>
         </w:rPr>
         <w:tab/>
-      </w:r>
-      <w:proofErr w:type="spellStart"/>
-      <w:r>
-        <w:rPr>
-          <w:color w:val="auto"/>
-        </w:rPr>
-        <w:t>Amberber</w:t>
-      </w:r>
-      <w:proofErr w:type="spellEnd"/>
-      <w:r>
-        <w:rPr>
-          <w:color w:val="auto"/>
-        </w:rPr>
-        <w:t xml:space="preserve">, N.; Howard, A.; Winters, M.; Harris, M.A.; Pike, I.; </w:t>
-      </w:r>
-      <w:proofErr w:type="spellStart"/>
-      <w:r>
-        <w:rPr>
-          <w:color w:val="auto"/>
-        </w:rPr>
-        <w:t>Machperson</w:t>
-      </w:r>
-      <w:proofErr w:type="spellEnd"/>
-      <w:r>
-        <w:rPr>
-          <w:color w:val="auto"/>
-        </w:rPr>
-        <w:t xml:space="preserve">, A.; Cloutier, M.-S.; Richmond, S.A.; Hagel, B.; </w:t>
-      </w:r>
-      <w:proofErr w:type="spellStart"/>
-      <w:r>
-        <w:rPr>
-          <w:color w:val="auto"/>
-        </w:rPr>
-        <w:t>Fuselli</w:t>
-      </w:r>
-      <w:proofErr w:type="spellEnd"/>
-      <w:r>
-        <w:rPr>
-          <w:color w:val="auto"/>
-        </w:rPr>
-        <w:t xml:space="preserve">, P.; et al. Road Traffic Injury During the COVID-19 Pandemic: Cured or a Continued Threat? </w:t>
+        <w:t xml:space="preserve">Amberber, N.; Howard, A.; Winters, M.; Harris, M.A.; Pike, I.; Machperson, A.; Cloutier, M.-S.; Richmond, S.A.; Hagel, B.; Fuselli, P.; et al. Road Traffic Injury During the COVID-19 Pandemic: Cured or a Continued Threat? </w:t>
       </w:r>
       <w:r>
         <w:rPr>
@@ -31782,21 +31088,7 @@
         <w:rPr>
           <w:color w:val="auto"/>
         </w:rPr>
-        <w:t>, doi:10.33137/</w:t>
-      </w:r>
-      <w:proofErr w:type="gramStart"/>
-      <w:r>
-        <w:rPr>
-          <w:color w:val="auto"/>
-        </w:rPr>
-        <w:t>utjph.v</w:t>
-      </w:r>
-      <w:proofErr w:type="gramEnd"/>
-      <w:r>
-        <w:rPr>
-          <w:color w:val="auto"/>
-        </w:rPr>
-        <w:t>2i1.34737.</w:t>
+        <w:t>, doi:10.33137/utjph.v2i1.34737.</w:t>
       </w:r>
     </w:p>
     <w:p>
@@ -31880,35 +31172,7 @@
           <w:color w:val="auto"/>
         </w:rPr>
         <w:tab/>
-        <w:t xml:space="preserve">City of Toronto </w:t>
-      </w:r>
-      <w:proofErr w:type="spellStart"/>
-      <w:r>
-        <w:rPr>
-          <w:color w:val="auto"/>
-        </w:rPr>
-        <w:t>Toronto</w:t>
-      </w:r>
-      <w:proofErr w:type="spellEnd"/>
-      <w:r>
-        <w:rPr>
-          <w:color w:val="auto"/>
-        </w:rPr>
-        <w:t xml:space="preserve"> </w:t>
-      </w:r>
-      <w:proofErr w:type="spellStart"/>
-      <w:r>
-        <w:rPr>
-          <w:color w:val="auto"/>
-        </w:rPr>
-        <w:t>Centreline</w:t>
-      </w:r>
-      <w:proofErr w:type="spellEnd"/>
-      <w:r>
-        <w:rPr>
-          <w:color w:val="auto"/>
-        </w:rPr>
-        <w:t xml:space="preserve"> (TCL) Available online: https://open.toronto.ca/dataset/toronto-centreline-tcl/ (accessed on 30 December 2024).</w:t>
+        <w:t>City of Toronto Toronto Centreline (TCL) Available online: https://open.toronto.ca/dataset/toronto-centreline-tcl/ (accessed on 30 December 2024).</w:t>
       </w:r>
     </w:p>
     <w:p>
@@ -32153,6 +31417,7 @@
         <w:rPr>
           <w:color w:val="auto"/>
         </w:rPr>
+        <w:lastRenderedPageBreak/>
         <w:t xml:space="preserve">77. </w:t>
       </w:r>
       <w:r>
@@ -32174,7 +31439,6 @@
         <w:rPr>
           <w:color w:val="auto"/>
         </w:rPr>
-        <w:lastRenderedPageBreak/>
         <w:t xml:space="preserve">78. </w:t>
       </w:r>
       <w:r>
@@ -32245,21 +31509,7 @@
           <w:color w:val="auto"/>
         </w:rPr>
         <w:tab/>
-        <w:t xml:space="preserve">City of Toronto Licensed Child Care </w:t>
-      </w:r>
-      <w:proofErr w:type="spellStart"/>
-      <w:r>
-        <w:rPr>
-          <w:color w:val="auto"/>
-        </w:rPr>
-        <w:t>Centres</w:t>
-      </w:r>
-      <w:proofErr w:type="spellEnd"/>
-      <w:r>
-        <w:rPr>
-          <w:color w:val="auto"/>
-        </w:rPr>
-        <w:t xml:space="preserve"> Available online: https://open.toronto.ca/dataset/child-care-licensed-child-care-spaces/ (accessed on 30 December 2024).</w:t>
+        <w:t>City of Toronto Licensed Child Care Centres Available online: https://open.toronto.ca/dataset/child-care-licensed-child-care-spaces/ (accessed on 30 December 2024).</w:t>
       </w:r>
     </w:p>
     <w:p>
@@ -32413,21 +31663,7 @@
         <w:rPr>
           <w:color w:val="auto"/>
         </w:rPr>
-        <w:t xml:space="preserve">; Pereira, F., Burges, C.J.C., </w:t>
-      </w:r>
-      <w:proofErr w:type="spellStart"/>
-      <w:r>
-        <w:rPr>
-          <w:color w:val="auto"/>
-        </w:rPr>
-        <w:t>Bottou</w:t>
-      </w:r>
-      <w:proofErr w:type="spellEnd"/>
-      <w:r>
-        <w:rPr>
-          <w:color w:val="auto"/>
-        </w:rPr>
-        <w:t>, L., Weinberger, K.Q., Eds.; Curran Associates, Inc., 2012; pp. 2951–2959.</w:t>
+        <w:t>; Pereira, F., Burges, C.J.C., Bottou, L., Weinberger, K.Q., Eds.; Curran Associates, Inc., 2012; pp. 2951–2959.</w:t>
       </w:r>
     </w:p>
     <w:p>
@@ -32448,34 +31684,7 @@
           <w:color w:val="auto"/>
         </w:rPr>
         <w:tab/>
-      </w:r>
-      <w:proofErr w:type="spellStart"/>
-      <w:r>
-        <w:rPr>
-          <w:color w:val="auto"/>
-        </w:rPr>
-        <w:t>Vilalta</w:t>
-      </w:r>
-      <w:proofErr w:type="spellEnd"/>
-      <w:r>
-        <w:rPr>
-          <w:color w:val="auto"/>
-        </w:rPr>
-        <w:t xml:space="preserve">, R.; </w:t>
-      </w:r>
-      <w:proofErr w:type="spellStart"/>
-      <w:r>
-        <w:rPr>
-          <w:color w:val="auto"/>
-        </w:rPr>
-        <w:t>Drissi</w:t>
-      </w:r>
-      <w:proofErr w:type="spellEnd"/>
-      <w:r>
-        <w:rPr>
-          <w:color w:val="auto"/>
-        </w:rPr>
-        <w:t xml:space="preserve">, Y. A Perspective View and Survey of Meta-Learning. </w:t>
+        <w:t xml:space="preserve">Vilalta, R.; Drissi, Y. A Perspective View and Survey of Meta-Learning. </w:t>
       </w:r>
       <w:r>
         <w:rPr>
@@ -32538,49 +31747,7 @@
           <w:color w:val="auto"/>
         </w:rPr>
         <w:tab/>
-        <w:t>Caruana, R.; Niculescu-</w:t>
-      </w:r>
-      <w:proofErr w:type="spellStart"/>
-      <w:r>
-        <w:rPr>
-          <w:color w:val="auto"/>
-        </w:rPr>
-        <w:t>Mizil</w:t>
-      </w:r>
-      <w:proofErr w:type="spellEnd"/>
-      <w:r>
-        <w:rPr>
-          <w:color w:val="auto"/>
-        </w:rPr>
-        <w:t xml:space="preserve">, A.; Crew, G.; </w:t>
-      </w:r>
-      <w:proofErr w:type="spellStart"/>
-      <w:r>
-        <w:rPr>
-          <w:color w:val="auto"/>
-        </w:rPr>
-        <w:t>Ksikes</w:t>
-      </w:r>
-      <w:proofErr w:type="spellEnd"/>
-      <w:r>
-        <w:rPr>
-          <w:color w:val="auto"/>
-        </w:rPr>
-        <w:t>, A. Ensemble Selection from Libraries of Models. In Proceedings of the Proceedings of the twenty-first international conference on Machine learning; Association for Computing Machinery: New York, NY, USA, July 4</w:t>
-      </w:r>
-      <w:proofErr w:type="gramStart"/>
-      <w:r>
-        <w:rPr>
-          <w:color w:val="auto"/>
-        </w:rPr>
-        <w:t xml:space="preserve"> 2004</w:t>
-      </w:r>
-      <w:proofErr w:type="gramEnd"/>
-      <w:r>
-        <w:rPr>
-          <w:color w:val="auto"/>
-        </w:rPr>
-        <w:t>; p. 18.</w:t>
+        <w:t>Caruana, R.; Niculescu-Mizil, A.; Crew, G.; Ksikes, A. Ensemble Selection from Libraries of Models. In Proceedings of the Proceedings of the twenty-first international conference on Machine learning; Association for Computing Machinery: New York, NY, USA, July 4 2004; p. 18.</w:t>
       </w:r>
     </w:p>
     <w:p>
@@ -32601,48 +31768,7 @@
           <w:color w:val="auto"/>
         </w:rPr>
         <w:tab/>
-      </w:r>
-      <w:proofErr w:type="spellStart"/>
-      <w:r>
-        <w:rPr>
-          <w:color w:val="auto"/>
-        </w:rPr>
-        <w:t>Feurer</w:t>
-      </w:r>
-      <w:proofErr w:type="spellEnd"/>
-      <w:r>
-        <w:rPr>
-          <w:color w:val="auto"/>
-        </w:rPr>
-        <w:t xml:space="preserve">, M.; Klein, A.; </w:t>
-      </w:r>
-      <w:proofErr w:type="spellStart"/>
-      <w:r>
-        <w:rPr>
-          <w:color w:val="auto"/>
-        </w:rPr>
-        <w:t>Eggensperger</w:t>
-      </w:r>
-      <w:proofErr w:type="spellEnd"/>
-      <w:r>
-        <w:rPr>
-          <w:color w:val="auto"/>
-        </w:rPr>
-        <w:t xml:space="preserve">, K.; </w:t>
-      </w:r>
-      <w:proofErr w:type="spellStart"/>
-      <w:r>
-        <w:rPr>
-          <w:color w:val="auto"/>
-        </w:rPr>
-        <w:t>Springenberg</w:t>
-      </w:r>
-      <w:proofErr w:type="spellEnd"/>
-      <w:r>
-        <w:rPr>
-          <w:color w:val="auto"/>
-        </w:rPr>
-        <w:t xml:space="preserve">, J.; Blum, M.; Hutter, F. Efficient and Robust Automated Machine Learning. </w:t>
+        <w:t xml:space="preserve">Feurer, M.; Klein, A.; Eggensperger, K.; Springenberg, J.; Blum, M.; Hutter, F. Efficient and Robust Automated Machine Learning. </w:t>
       </w:r>
       <w:r>
         <w:rPr>
@@ -32705,62 +31831,7 @@
           <w:color w:val="auto"/>
         </w:rPr>
         <w:tab/>
-      </w:r>
-      <w:proofErr w:type="spellStart"/>
-      <w:r>
-        <w:rPr>
-          <w:color w:val="auto"/>
-        </w:rPr>
-        <w:t>Feurer</w:t>
-      </w:r>
-      <w:proofErr w:type="spellEnd"/>
-      <w:r>
-        <w:rPr>
-          <w:color w:val="auto"/>
-        </w:rPr>
-        <w:t xml:space="preserve">, M.; Klein, A.; </w:t>
-      </w:r>
-      <w:proofErr w:type="spellStart"/>
-      <w:r>
-        <w:rPr>
-          <w:color w:val="auto"/>
-        </w:rPr>
-        <w:t>Eggensperger</w:t>
-      </w:r>
-      <w:proofErr w:type="spellEnd"/>
-      <w:r>
-        <w:rPr>
-          <w:color w:val="auto"/>
-        </w:rPr>
-        <w:t xml:space="preserve">, K.; </w:t>
-      </w:r>
-      <w:proofErr w:type="spellStart"/>
-      <w:r>
-        <w:rPr>
-          <w:color w:val="auto"/>
-        </w:rPr>
-        <w:t>Springenberg</w:t>
-      </w:r>
-      <w:proofErr w:type="spellEnd"/>
-      <w:r>
-        <w:rPr>
-          <w:color w:val="auto"/>
-        </w:rPr>
-        <w:t>, J.T.; Blum, M.; Hutter, F. Auto-</w:t>
-      </w:r>
-      <w:proofErr w:type="spellStart"/>
-      <w:r>
-        <w:rPr>
-          <w:color w:val="auto"/>
-        </w:rPr>
-        <w:t>Sklearn</w:t>
-      </w:r>
-      <w:proofErr w:type="spellEnd"/>
-      <w:r>
-        <w:rPr>
-          <w:color w:val="auto"/>
-        </w:rPr>
-        <w:t xml:space="preserve">: Efficient and Robust Automated Machine Learning. In </w:t>
+        <w:t xml:space="preserve">Feurer, M.; Klein, A.; Eggensperger, K.; Springenberg, J.T.; Blum, M.; Hutter, F. Auto-Sklearn: Efficient and Robust Automated Machine Learning. In </w:t>
       </w:r>
       <w:r>
         <w:rPr>
@@ -32774,35 +31845,7 @@
         <w:rPr>
           <w:color w:val="auto"/>
         </w:rPr>
-        <w:t xml:space="preserve">; Hutter, F., </w:t>
-      </w:r>
-      <w:proofErr w:type="spellStart"/>
-      <w:r>
-        <w:rPr>
-          <w:color w:val="auto"/>
-        </w:rPr>
-        <w:t>Kotthoff</w:t>
-      </w:r>
-      <w:proofErr w:type="spellEnd"/>
-      <w:r>
-        <w:rPr>
-          <w:color w:val="auto"/>
-        </w:rPr>
-        <w:t xml:space="preserve">, L., </w:t>
-      </w:r>
-      <w:proofErr w:type="spellStart"/>
-      <w:r>
-        <w:rPr>
-          <w:color w:val="auto"/>
-        </w:rPr>
-        <w:t>Vanschoren</w:t>
-      </w:r>
-      <w:proofErr w:type="spellEnd"/>
-      <w:r>
-        <w:rPr>
-          <w:color w:val="auto"/>
-        </w:rPr>
-        <w:t>, J., Eds.; The Springer Series on Challenges in Machine Learning; Springer International Publishing: Cham, 2019; pp. 113–134 ISBN 978-3-030-05317-8.</w:t>
+        <w:t>; Hutter, F., Kotthoff, L., Vanschoren, J., Eds.; The Springer Series on Challenges in Machine Learning; Springer International Publishing: Cham, 2019; pp. 113–134 ISBN 978-3-030-05317-8.</w:t>
       </w:r>
     </w:p>
     <w:p>
@@ -32858,21 +31901,7 @@
           <w:color w:val="auto"/>
         </w:rPr>
         <w:tab/>
-        <w:t>Olson, R.S.; Moore, J.H. TPOT: A Tree-Based Pipeline Optimization Tool for Automating Machine Learning. In Proceedings of the Workshop on Automatic Machine Learning; PMLR, December 4</w:t>
-      </w:r>
-      <w:proofErr w:type="gramStart"/>
-      <w:r>
-        <w:rPr>
-          <w:color w:val="auto"/>
-        </w:rPr>
-        <w:t xml:space="preserve"> 2016</w:t>
-      </w:r>
-      <w:proofErr w:type="gramEnd"/>
-      <w:r>
-        <w:rPr>
-          <w:color w:val="auto"/>
-        </w:rPr>
-        <w:t>; pp. 66–74.</w:t>
+        <w:t>Olson, R.S.; Moore, J.H. TPOT: A Tree-Based Pipeline Optimization Tool for Automating Machine Learning. In Proceedings of the Workshop on Automatic Machine Learning; PMLR, December 4 2016; pp. 66–74.</w:t>
       </w:r>
     </w:p>
     <w:p>
@@ -32949,6 +31978,7 @@
         <w:rPr>
           <w:color w:val="auto"/>
         </w:rPr>
+        <w:lastRenderedPageBreak/>
         <w:t xml:space="preserve">95. </w:t>
       </w:r>
       <w:r>
@@ -32957,6 +31987,69 @@
         </w:rPr>
         <w:tab/>
         <w:t>Richard Wen Example: Geo-Intervention Modelling Framework Available online: https://github.com/rrwen/geointerv-paper/blob/main/src/example.ipynb (accessed on 4 February 2025).</w:t>
+      </w:r>
+    </w:p>
+    <w:p>
+      <w:pPr>
+        <w:pStyle w:val="Bibliography"/>
+        <w:rPr>
+          <w:color w:val="auto"/>
+        </w:rPr>
+      </w:pPr>
+      <w:r>
+        <w:rPr>
+          <w:color w:val="auto"/>
+        </w:rPr>
+        <w:t xml:space="preserve">96. </w:t>
+      </w:r>
+      <w:r>
+        <w:rPr>
+          <w:color w:val="auto"/>
+        </w:rPr>
+        <w:tab/>
+        <w:t xml:space="preserve">Altmann, A.; Toloşi, L.; Sander, O.; Lengauer, T. Permutation Importance: A Corrected Feature Importance Measure. </w:t>
+      </w:r>
+      <w:r>
+        <w:rPr>
+          <w:i/>
+          <w:iCs/>
+          <w:color w:val="auto"/>
+        </w:rPr>
+        <w:t>Bioinformatics</w:t>
+      </w:r>
+      <w:r>
+        <w:rPr>
+          <w:color w:val="auto"/>
+        </w:rPr>
+        <w:t xml:space="preserve"> </w:t>
+      </w:r>
+      <w:r>
+        <w:rPr>
+          <w:b/>
+          <w:bCs/>
+          <w:color w:val="auto"/>
+        </w:rPr>
+        <w:t>2010</w:t>
+      </w:r>
+      <w:r>
+        <w:rPr>
+          <w:color w:val="auto"/>
+        </w:rPr>
+        <w:t xml:space="preserve">, </w:t>
+      </w:r>
+      <w:r>
+        <w:rPr>
+          <w:i/>
+          <w:iCs/>
+          <w:color w:val="auto"/>
+        </w:rPr>
+        <w:t>26</w:t>
+      </w:r>
+      <w:r>
+        <w:rPr>
+          <w:color w:val="auto"/>
+        </w:rPr>
+        <w:t>, 1340–1347, doi:10.1093/bioinformatics/btq134.</w:t>
       </w:r>
     </w:p>
     <w:p>
@@ -32979,7 +32072,6 @@
         <w:rPr>
           <w:b/>
         </w:rPr>
-        <w:lastRenderedPageBreak/>
         <w:t>Disclaimer/Publisher’s Note:</w:t>
       </w:r>
       <w:r>

</xml_diff>

<commit_message>
finish runnin sc2, 1000 iterations, inspect vars
</commit_message>
<xml_diff>
--- a/manuscript/wen-li-2024-geointerv.docx
+++ b/manuscript/wen-li-2024-geointerv.docx
@@ -11989,14 +11989,12 @@
         </w:rPr>
         <w:t>, such that the diff</w:t>
       </w:r>
-      <w:proofErr w:type="spellStart"/>
       <w:r>
         <w:rPr>
           <w:lang w:val="en"/>
         </w:rPr>
         <w:t>erence</w:t>
       </w:r>
-      <w:proofErr w:type="spellEnd"/>
       <w:r>
         <w:rPr>
           <w:lang w:val="en"/>
@@ -27506,7 +27504,22 @@
         <w:pStyle w:val="MDPI31text"/>
       </w:pPr>
       <w:r>
-        <w:t>x.</w:t>
+        <w:t>This section discusses the considerations, advantages, disadvantages, limitations, and future research directions rel</w:t>
+      </w:r>
+      <w:r>
+        <w:t>evant</w:t>
+      </w:r>
+      <w:r>
+        <w:t xml:space="preserve"> to the geo-interventions modelling framework, and the case study</w:t>
+      </w:r>
+      <w:r>
+        <w:t xml:space="preserve"> from the</w:t>
+      </w:r>
+      <w:r>
+        <w:t xml:space="preserve"> results in Section 3</w:t>
+      </w:r>
+      <w:r>
+        <w:t>.</w:t>
       </w:r>
     </w:p>
     <w:p>
@@ -27526,7 +27539,7 @@
         <w:t xml:space="preserve">. </w:t>
       </w:r>
       <w:r>
-        <w:t>Advantages</w:t>
+        <w:t>Considerations</w:t>
       </w:r>
     </w:p>
     <w:p>
@@ -27554,7 +27567,7 @@
         <w:t xml:space="preserve">. </w:t>
       </w:r>
       <w:r>
-        <w:t>Disadvantages</w:t>
+        <w:t>Advantages</w:t>
       </w:r>
     </w:p>
     <w:p>
@@ -27582,7 +27595,7 @@
         <w:t xml:space="preserve">. </w:t>
       </w:r>
       <w:r>
-        <w:t>Limitations</w:t>
+        <w:t>Disadvantages</w:t>
       </w:r>
     </w:p>
     <w:p>
@@ -27605,6 +27618,34 @@
       </w:r>
       <w:r>
         <w:t>4</w:t>
+      </w:r>
+      <w:r>
+        <w:t xml:space="preserve">. </w:t>
+      </w:r>
+      <w:r>
+        <w:t>Limitations</w:t>
+      </w:r>
+    </w:p>
+    <w:p>
+      <w:pPr>
+        <w:pStyle w:val="MDPI31text"/>
+      </w:pPr>
+      <w:r>
+        <w:t>x.</w:t>
+      </w:r>
+    </w:p>
+    <w:p>
+      <w:pPr>
+        <w:pStyle w:val="MDPI22heading2"/>
+      </w:pPr>
+      <w:r>
+        <w:t>4</w:t>
+      </w:r>
+      <w:r>
+        <w:t>.</w:t>
+      </w:r>
+      <w:r>
+        <w:t>5</w:t>
       </w:r>
       <w:r>
         <w:t xml:space="preserve">. </w:t>
@@ -27807,6 +27848,7 @@
         <w:rPr>
           <w:b/>
         </w:rPr>
+        <w:lastRenderedPageBreak/>
         <w:t>Conflicts of Interest:</w:t>
       </w:r>
       <w:r>
@@ -27842,7 +27884,6 @@
         <w:rPr>
           <w:noProof/>
         </w:rPr>
-        <w:lastRenderedPageBreak/>
         <w:fldChar w:fldCharType="begin"/>
       </w:r>
       <w:r>

</xml_diff>

<commit_message>
Add collisions change map
</commit_message>
<xml_diff>
--- a/manuscript/wen-li-2024-geointerv.docx
+++ b/manuscript/wen-li-2024-geointerv.docx
@@ -44,13 +44,8 @@
         <w:t xml:space="preserve"> </w:t>
       </w:r>
       <w:r>
-        <w:t xml:space="preserve">Wen and </w:t>
-      </w:r>
-      <w:proofErr w:type="spellStart"/>
-      <w:r>
-        <w:t>Songnian</w:t>
-      </w:r>
-      <w:proofErr w:type="spellEnd"/>
+        <w:t>Wen and Songnian</w:t>
+      </w:r>
       <w:r>
         <w:t xml:space="preserve"> L</w:t>
       </w:r>
@@ -111,21 +106,8 @@
               <w:spacing w:after="120"/>
             </w:pPr>
             <w:r>
-              <w:t xml:space="preserve">Academic Editor: </w:t>
-            </w:r>
-            <w:proofErr w:type="spellStart"/>
-            <w:r>
-              <w:t>Firstname</w:t>
-            </w:r>
-            <w:proofErr w:type="spellEnd"/>
-            <w:r>
-              <w:t xml:space="preserve"> </w:t>
-            </w:r>
-            <w:proofErr w:type="spellStart"/>
-            <w:r>
-              <w:t>Lastname</w:t>
-            </w:r>
-            <w:proofErr w:type="spellEnd"/>
+              <w:t>Academic Editor: Firstname Lastname</w:t>
+            </w:r>
           </w:p>
           <w:p>
             <w:pPr>
@@ -392,21 +374,7 @@
         <w:rPr>
           <w:szCs w:val="18"/>
         </w:rPr>
-        <w:t xml:space="preserve">stract should be an objective representation of the </w:t>
-      </w:r>
-      <w:proofErr w:type="gramStart"/>
-      <w:r>
-        <w:rPr>
-          <w:szCs w:val="18"/>
-        </w:rPr>
-        <w:t>article</w:t>
-      </w:r>
-      <w:proofErr w:type="gramEnd"/>
-      <w:r>
-        <w:rPr>
-          <w:szCs w:val="18"/>
-        </w:rPr>
-        <w:t xml:space="preserve"> and it must not contain results that are not presented and substantiated in the main text and should not exaggerate the main conclusions.</w:t>
+        <w:t>stract should be an objective representation of the article and it must not contain results that are not presented and substantiated in the main text and should not exaggerate the main conclusions.</w:t>
       </w:r>
     </w:p>
     <w:p>
@@ -9412,14 +9380,12 @@
               <w:spacing w:line="240" w:lineRule="auto"/>
               <w:jc w:val="left"/>
             </w:pPr>
-            <w:proofErr w:type="spellStart"/>
             <w:r>
               <w:t>Raster</w:t>
             </w:r>
             <w:r>
               <w:t>s</w:t>
             </w:r>
-            <w:proofErr w:type="spellEnd"/>
             <w:r>
               <w:t>*</w:t>
             </w:r>
@@ -12583,11 +12549,7 @@
         <w:fldChar w:fldCharType="end"/>
       </w:r>
       <w:r>
-        <w:t xml:space="preserve">. The </w:t>
-      </w:r>
-      <w:proofErr w:type="gramStart"/>
-      <w:r>
-        <w:t>mo</w:t>
+        <w:t>. The mo</w:t>
       </w:r>
       <w:r>
         <w:t>d</w:t>
@@ -12598,7 +12560,6 @@
       <w:r>
         <w:t>s</w:t>
       </w:r>
-      <w:proofErr w:type="gramEnd"/>
       <w:r>
         <w:t xml:space="preserve"> sub-component</w:t>
       </w:r>
@@ -14774,19 +14735,11 @@
         </w:rPr>
         <w:t xml:space="preserve">, where all datasets were of point geometry, except for </w:t>
       </w:r>
-      <w:proofErr w:type="spellStart"/>
-      <w:r>
-        <w:rPr>
-          <w:lang w:val="en"/>
-        </w:rPr>
-        <w:t>centrelines</w:t>
-      </w:r>
-      <w:proofErr w:type="spellEnd"/>
-      <w:r>
-        <w:rPr>
-          <w:lang w:val="en"/>
-        </w:rPr>
-        <w:t>.</w:t>
+      <w:r>
+        <w:rPr>
+          <w:lang w:val="en"/>
+        </w:rPr>
+        <w:t>centrelines.</w:t>
       </w:r>
     </w:p>
     <w:p>
@@ -15022,11 +14975,9 @@
             <w:pPr>
               <w:pStyle w:val="MDPI42tablebody"/>
             </w:pPr>
-            <w:proofErr w:type="spellStart"/>
             <w:r>
               <w:t>Centrelines</w:t>
             </w:r>
-            <w:proofErr w:type="spellEnd"/>
             <w:r>
               <w:t xml:space="preserve"> </w:t>
             </w:r>
@@ -17674,15 +17625,7 @@
               <w:jc w:val="left"/>
             </w:pPr>
             <w:r>
-              <w:t xml:space="preserve">Religious locations such as churches, synagogues, temples, ashrams, mosques, </w:t>
-            </w:r>
-            <w:proofErr w:type="spellStart"/>
-            <w:r>
-              <w:t>etc</w:t>
-            </w:r>
-            <w:proofErr w:type="spellEnd"/>
-            <w:r>
-              <w:t xml:space="preserve"> (one-off capture as of 2006)</w:t>
+              <w:t>Religious locations such as churches, synagogues, temples, ashrams, mosques, etc (one-off capture as of 2006)</w:t>
             </w:r>
           </w:p>
         </w:tc>
@@ -18321,21 +18264,7 @@
         <w:rPr>
           <w:lang w:val="en"/>
         </w:rPr>
-        <w:t>For the case study, we applied Automated Machine Learning (</w:t>
-      </w:r>
-      <w:proofErr w:type="spellStart"/>
-      <w:r>
-        <w:rPr>
-          <w:lang w:val="en"/>
-        </w:rPr>
-        <w:t>AutoML</w:t>
-      </w:r>
-      <w:proofErr w:type="spellEnd"/>
-      <w:r>
-        <w:rPr>
-          <w:lang w:val="en"/>
-        </w:rPr>
-        <w:t xml:space="preserve">) for the outcome modelling component </w:t>
+        <w:t xml:space="preserve">For the case study, we applied Automated Machine Learning (AutoML) for the outcome modelling component </w:t>
       </w:r>
       <w:r>
         <w:rPr>
@@ -18456,21 +18385,7 @@
         <w:rPr>
           <w:lang w:val="en"/>
         </w:rPr>
-        <w:t xml:space="preserve"> two python packages for </w:t>
-      </w:r>
-      <w:proofErr w:type="spellStart"/>
-      <w:r>
-        <w:rPr>
-          <w:lang w:val="en"/>
-        </w:rPr>
-        <w:t>AutoML</w:t>
-      </w:r>
-      <w:proofErr w:type="spellEnd"/>
-      <w:r>
-        <w:rPr>
-          <w:lang w:val="en"/>
-        </w:rPr>
-        <w:t xml:space="preserve">: </w:t>
+        <w:t xml:space="preserve"> two python packages for AutoML: </w:t>
       </w:r>
       <w:r>
         <w:rPr>
@@ -18478,39 +18393,243 @@
           <w:iCs/>
           <w:lang w:val="en"/>
         </w:rPr>
-        <w:t>auto-</w:t>
-      </w:r>
-      <w:proofErr w:type="spellStart"/>
+        <w:t>auto-sklearn</w:t>
+      </w:r>
+      <w:r>
+        <w:rPr>
+          <w:lang w:val="en"/>
+        </w:rPr>
+        <w:t xml:space="preserve"> and </w:t>
+      </w:r>
       <w:r>
         <w:rPr>
           <w:i/>
           <w:iCs/>
           <w:lang w:val="en"/>
         </w:rPr>
-        <w:t>sklearn</w:t>
-      </w:r>
-      <w:proofErr w:type="spellEnd"/>
-      <w:r>
-        <w:rPr>
-          <w:lang w:val="en"/>
-        </w:rPr>
-        <w:t xml:space="preserve"> and </w:t>
-      </w:r>
-      <w:proofErr w:type="spellStart"/>
+        <w:t>tpot</w:t>
+      </w:r>
+      <w:r>
+        <w:rPr>
+          <w:lang w:val="en"/>
+        </w:rPr>
+        <w:t xml:space="preserve">. The package </w:t>
+      </w:r>
       <w:r>
         <w:rPr>
           <w:i/>
           <w:iCs/>
           <w:lang w:val="en"/>
         </w:rPr>
-        <w:t>tpot</w:t>
-      </w:r>
-      <w:proofErr w:type="spellEnd"/>
-      <w:r>
-        <w:rPr>
-          <w:lang w:val="en"/>
-        </w:rPr>
-        <w:t xml:space="preserve">. The package </w:t>
+        <w:t>auto-sklearn</w:t>
+      </w:r>
+      <w:r>
+        <w:rPr>
+          <w:lang w:val="en"/>
+        </w:rPr>
+        <w:t xml:space="preserve"> use</w:t>
+      </w:r>
+      <w:r>
+        <w:rPr>
+          <w:lang w:val="en"/>
+        </w:rPr>
+        <w:t>s</w:t>
+      </w:r>
+      <w:r>
+        <w:rPr>
+          <w:lang w:val="en"/>
+        </w:rPr>
+        <w:t xml:space="preserve"> </w:t>
+      </w:r>
+      <w:r>
+        <w:rPr>
+          <w:lang w:val="en"/>
+        </w:rPr>
+        <w:t>Bayesian</w:t>
+      </w:r>
+      <w:r>
+        <w:rPr>
+          <w:lang w:val="en"/>
+        </w:rPr>
+        <w:t xml:space="preserve"> optimization</w:t>
+      </w:r>
+      <w:r>
+        <w:rPr>
+          <w:lang w:val="en"/>
+        </w:rPr>
+        <w:t xml:space="preserve"> </w:t>
+      </w:r>
+      <w:r>
+        <w:rPr>
+          <w:lang w:val="en"/>
+        </w:rPr>
+        <w:fldChar w:fldCharType="begin"/>
+      </w:r>
+      <w:r>
+        <w:rPr>
+          <w:lang w:val="en"/>
+        </w:rPr>
+        <w:instrText xml:space="preserve"> ADDIN ZOTERO_ITEM CSL_CITATION {"citationID":"tnmdlVZN","properties":{"formattedCitation":"[87]","plainCitation":"[87]","noteIndex":0},"citationItems":[{"id":800,"uris":["http://zotero.org/users/6749620/items/YS8IMQNU"],"itemData":{"id":800,"type":"chapter","container-title":"Advances in Neural Information Processing Systems 25","page":"2951–2959","publisher":"Curran Associates, Inc.","source":"Neural Information Processing Systems","title":"Practical Bayesian Optimization of Machine Learning Algorithms","author":[{"family":"Snoek","given":"Jasper"},{"family":"Larochelle","given":"Hugo"},{"family":"Adams","given":"Ryan P"}],"editor":[{"family":"Pereira","given":"F."},{"family":"Burges","given":"C. J. C."},{"family":"Bottou","given":"L."},{"family":"Weinberger","given":"K. Q."}],"accessed":{"date-parts":[["2020",9,26]]},"issued":{"date-parts":[["2012"]]},"citation-key":"snoekPracticalBayesianOptimization2012"}}],"schema":"https://github.com/citation-style-language/schema/raw/master/csl-citation.json"} </w:instrText>
+      </w:r>
+      <w:r>
+        <w:rPr>
+          <w:lang w:val="en"/>
+        </w:rPr>
+        <w:fldChar w:fldCharType="separate"/>
+      </w:r>
+      <w:r>
+        <w:rPr>
+          <w:noProof/>
+          <w:lang w:val="en"/>
+        </w:rPr>
+        <w:t>[87]</w:t>
+      </w:r>
+      <w:r>
+        <w:rPr>
+          <w:lang w:val="en"/>
+        </w:rPr>
+        <w:fldChar w:fldCharType="end"/>
+      </w:r>
+      <w:r>
+        <w:rPr>
+          <w:lang w:val="en"/>
+        </w:rPr>
+        <w:t>, meta-learning</w:t>
+      </w:r>
+      <w:r>
+        <w:rPr>
+          <w:lang w:val="en"/>
+        </w:rPr>
+        <w:t xml:space="preserve"> </w:t>
+      </w:r>
+      <w:r>
+        <w:rPr>
+          <w:lang w:val="en"/>
+        </w:rPr>
+        <w:fldChar w:fldCharType="begin"/>
+      </w:r>
+      <w:r>
+        <w:rPr>
+          <w:lang w:val="en"/>
+        </w:rPr>
+        <w:instrText xml:space="preserve"> ADDIN ZOTERO_ITEM CSL_CITATION {"citationID":"U1uW3KD2","properties":{"formattedCitation":"[88]","plainCitation":"[88]","noteIndex":0},"citationItems":[{"id":1986,"uris":["http://zotero.org/users/6749620/items/7VRJ7XM6"],"itemData":{"id":1986,"type":"article-journal","abstract":"Different researchers hold different views of what the term meta-learning exactlymeans. The first part of this paper provides our own perspective view in which the goal isto build self-adaptive learners (i.e. learning algorithms that improve their bias dynamicallythrough experience by accumulating meta-knowledge). The second part provides a survey ofmeta-learning as reported by the machine-learning literature. We find that, despite differentviews and research lines, a question remains constant: how can we exploit knowledge aboutlearning (i.e. meta-knowledge) to improve the performance of learning algorithms? Clearlythe answer to this question is key to the advancement of the field and continues being thesubject of intensive research.","container-title":"Artificial Intelligence Review","DOI":"10.1023/A:1019956318069","ISSN":"1573-7462","issue":"2","journalAbbreviation":"Artificial Intelligence Review","language":"en","page":"77-95","source":"Springer Link","title":"A Perspective View and Survey of Meta-Learning","volume":"18","author":[{"family":"Vilalta","given":"Ricardo"},{"family":"Drissi","given":"Youssef"}],"issued":{"date-parts":[["2002",6,1]]},"citation-key":"vilaltaPerspectiveViewSurvey2002"}}],"schema":"https://github.com/citation-style-language/schema/raw/master/csl-citation.json"} </w:instrText>
+      </w:r>
+      <w:r>
+        <w:rPr>
+          <w:lang w:val="en"/>
+        </w:rPr>
+        <w:fldChar w:fldCharType="separate"/>
+      </w:r>
+      <w:r>
+        <w:rPr>
+          <w:noProof/>
+          <w:lang w:val="en"/>
+        </w:rPr>
+        <w:t>[88]</w:t>
+      </w:r>
+      <w:r>
+        <w:rPr>
+          <w:lang w:val="en"/>
+        </w:rPr>
+        <w:fldChar w:fldCharType="end"/>
+      </w:r>
+      <w:r>
+        <w:rPr>
+          <w:lang w:val="en"/>
+        </w:rPr>
+        <w:t>, and ensemble construction</w:t>
+      </w:r>
+      <w:r>
+        <w:rPr>
+          <w:lang w:val="en"/>
+        </w:rPr>
+        <w:t xml:space="preserve"> </w:t>
+      </w:r>
+      <w:r>
+        <w:rPr>
+          <w:lang w:val="en"/>
+        </w:rPr>
+        <w:fldChar w:fldCharType="begin"/>
+      </w:r>
+      <w:r>
+        <w:rPr>
+          <w:lang w:val="en"/>
+        </w:rPr>
+        <w:instrText xml:space="preserve"> ADDIN ZOTERO_ITEM CSL_CITATION {"citationID":"nQvZjUXy","properties":{"formattedCitation":"[89]","plainCitation":"[89]","noteIndex":0},"citationItems":[{"id":1163,"uris":["http://zotero.org/users/6749620/items/D9TSECMD"],"itemData":{"id":1163,"type":"paper-conference","abstract":"We present a method for constructing ensembles from libraries of thousands of models. Model libraries are generated using different learning algorithms and parameter settings. Forward stepwise selection is used to add to the ensemble the models that maximize its performance. Ensemble selection allows ensembles to be optimized to performance metric such as accuracy, cross entropy, mean precision, or ROC Area. Experiments with seven test problems and ten metrics demonstrate the benefit of ensemble selection.","collection-title":"ICML '04","container-title":"Proceedings of the twenty-first international conference on Machine learning","DOI":"10.1145/1015330.1015432","event-place":"New York, NY, USA","ISBN":"978-1-58113-838-2","page":"18","publisher":"Association for Computing Machinery","publisher-place":"New York, NY, USA","source":"ACM Digital Library","title":"Ensemble selection from libraries of models","URL":"https://doi.org/10.1145/1015330.1015432","author":[{"family":"Caruana","given":"Rich"},{"family":"Niculescu-Mizil","given":"Alexandru"},{"family":"Crew","given":"Geoff"},{"family":"Ksikes","given":"Alex"}],"accessed":{"date-parts":[["2021",2,1]]},"issued":{"date-parts":[["2004",7,4]]},"citation-key":"caruanaEnsembleSelectionLibraries2004"}}],"schema":"https://github.com/citation-style-language/schema/raw/master/csl-citation.json"} </w:instrText>
+      </w:r>
+      <w:r>
+        <w:rPr>
+          <w:lang w:val="en"/>
+        </w:rPr>
+        <w:fldChar w:fldCharType="separate"/>
+      </w:r>
+      <w:r>
+        <w:rPr>
+          <w:noProof/>
+          <w:lang w:val="en"/>
+        </w:rPr>
+        <w:t>[89]</w:t>
+      </w:r>
+      <w:r>
+        <w:rPr>
+          <w:lang w:val="en"/>
+        </w:rPr>
+        <w:fldChar w:fldCharType="end"/>
+      </w:r>
+      <w:r>
+        <w:rPr>
+          <w:lang w:val="en"/>
+        </w:rPr>
+        <w:t xml:space="preserve"> to automatically select the best model from a test of several models and parameters</w:t>
+      </w:r>
+      <w:r>
+        <w:rPr>
+          <w:lang w:val="en"/>
+        </w:rPr>
+        <w:t xml:space="preserve"> </w:t>
+      </w:r>
+      <w:r>
+        <w:rPr>
+          <w:lang w:val="en"/>
+        </w:rPr>
+        <w:fldChar w:fldCharType="begin"/>
+      </w:r>
+      <w:r>
+        <w:rPr>
+          <w:lang w:val="en"/>
+        </w:rPr>
+        <w:instrText xml:space="preserve"> ADDIN ZOTERO_ITEM CSL_CITATION {"citationID":"TA6HuCNJ","properties":{"formattedCitation":"[90,91]","plainCitation":"[90,91]","noteIndex":0},"citationItems":[{"id":1838,"uris":["http://zotero.org/users/6749620/items/MPZ8F3N3"],"itemData":{"id":1838,"type":"article-journal","container-title":"Advances in neural information processing systems","source":"Google Scholar","title":"Efficient and robust automated machine learning","volume":"28","author":[{"family":"Feurer","given":"Matthias"},{"family":"Klein","given":"Aaron"},{"family":"Eggensperger","given":"Katharina"},{"family":"Springenberg","given":"Jost"},{"family":"Blum","given":"Manuel"},{"family":"Hutter","given":"Frank"}],"issued":{"date-parts":[["2015"]]},"citation-key":"feurerEfficientRobustAutomated2015"}},{"id":1180,"uris":["http://zotero.org/users/6749620/items/HHNIN4WU"],"itemData":{"id":1180,"type":"chapter","abstract":"The success of machine learning in a broad range of applications has led to an ever-growing demand for machine learning systems that can be used oﬀ the shelf by non-experts. To be eﬀective in practice, such systems need to automatically choose a good algorithm and feature preprocessing steps for a new dataset at hand, and also set their respective hyperparameters. Recent work has started to tackle this automated machine learning (AutoML) problem with the help of eﬃcient Bayesian optimization methods. Building on this, we introduce a robust new AutoML system based on the Python machine learning package scikit-learn (using 15 classiﬁers, 14 feature preprocessing methods, and 4 data preprocessing methods, giving rise to a structured hypothesis space with 110 hyperparameters). This system, which we dub Auto-sklearn, improves on existing AutoML methods by automatically taking into account past performance on similar datasets, and by constructing ensembles from the models evaluated during the optimization. Our system won six out of ten phases of the ﬁrst ChaLearn AutoML challenge, and our comprehensive analysis on over 100 diverse datasets shows that it substantially outperforms the previous state of the art in AutoML. We also demonstrate the performance gains due to each of our contributions and derive insights into the eﬀectiveness of the individual components of Auto-sklearn.","container-title":"Automated Machine Learning","event-place":"Cham","ISBN":"978-3-030-05317-8","language":"en","note":"collection-title: The Springer Series on Challenges in Machine Learning\nDOI: 10.1007/978-3-030-05318-5_6","page":"113-134","publisher":"Springer International Publishing","publisher-place":"Cham","source":"DOI.org (Crossref)","title":"Auto-sklearn: Efficient and Robust Automated Machine Learning","title-short":"Auto-sklearn","URL":"http://link.springer.com/10.1007/978-3-030-05318-5_6","editor":[{"family":"Hutter","given":"Frank"},{"family":"Kotthoff","given":"Lars"},{"family":"Vanschoren","given":"Joaquin"}],"author":[{"family":"Feurer","given":"Matthias"},{"family":"Klein","given":"Aaron"},{"family":"Eggensperger","given":"Katharina"},{"family":"Springenberg","given":"Jost Tobias"},{"family":"Blum","given":"Manuel"},{"family":"Hutter","given":"Frank"}],"accessed":{"date-parts":[["2021",2,7]]},"issued":{"date-parts":[["2019"]]},"citation-key":"feurerAutosklearnEfficientRobust2019"}}],"schema":"https://github.com/citation-style-language/schema/raw/master/csl-citation.json"} </w:instrText>
+      </w:r>
+      <w:r>
+        <w:rPr>
+          <w:lang w:val="en"/>
+        </w:rPr>
+        <w:fldChar w:fldCharType="separate"/>
+      </w:r>
+      <w:r>
+        <w:rPr>
+          <w:noProof/>
+          <w:lang w:val="en"/>
+        </w:rPr>
+        <w:t>[90,91]</w:t>
+      </w:r>
+      <w:r>
+        <w:rPr>
+          <w:lang w:val="en"/>
+        </w:rPr>
+        <w:fldChar w:fldCharType="end"/>
+      </w:r>
+      <w:r>
+        <w:rPr>
+          <w:lang w:val="en"/>
+        </w:rPr>
+        <w:t>.</w:t>
+      </w:r>
+      <w:r>
+        <w:rPr>
+          <w:lang w:val="en"/>
+        </w:rPr>
+        <w:t xml:space="preserve"> The package </w:t>
       </w:r>
       <w:r>
         <w:rPr>
@@ -18518,227 +18637,180 @@
           <w:iCs/>
           <w:lang w:val="en"/>
         </w:rPr>
-        <w:t>auto-</w:t>
-      </w:r>
-      <w:proofErr w:type="spellStart"/>
+        <w:t>tpot</w:t>
+      </w:r>
+      <w:r>
+        <w:rPr>
+          <w:lang w:val="en"/>
+        </w:rPr>
+        <w:t xml:space="preserve"> uses genetic </w:t>
+      </w:r>
+      <w:r>
+        <w:rPr>
+          <w:lang w:val="en"/>
+        </w:rPr>
+        <w:t>programming</w:t>
+      </w:r>
+      <w:r>
+        <w:rPr>
+          <w:lang w:val="en"/>
+        </w:rPr>
+        <w:t xml:space="preserve"> </w:t>
+      </w:r>
+      <w:r>
+        <w:rPr>
+          <w:lang w:val="en"/>
+        </w:rPr>
+        <w:fldChar w:fldCharType="begin"/>
+      </w:r>
+      <w:r>
+        <w:rPr>
+          <w:lang w:val="en"/>
+        </w:rPr>
+        <w:instrText xml:space="preserve"> ADDIN ZOTERO_ITEM CSL_CITATION {"citationID":"RGP9X19Z","properties":{"formattedCitation":"[92]","plainCitation":"[92]","noteIndex":0},"citationItems":[{"id":2292,"uris":["http://zotero.org/users/6749620/items/W7NQNMJL"],"itemData":{"id":2292,"type":"book","abstract":"Genetic programming (GP), one of the most advanced forms of evolutionary computation, has been highly successful as a technique for getting computers to automatically solve problems without having to tell them explicitly how. Since its inceptions more than ten years ago, GP has been used to solve practical problems in a variety of application fields. Along with this ad-hoc engineering approaches interest increased in how and why GP works. This book provides a coherent consolidation of recent work on the theoretical foundations of GP. A concise introduction to GP and genetic algorithms (GA) is followed by a discussion of fitness landscapes and other theoretical approaches to natural and artificial evolution. Having surveyed early approaches to GP theory it presents new exact schema analysis, showing that it applies to GP as well as to the simpler GAs. New results on the potentially infinite number of possible programs are followed by two chapters applying these new techniques.","ISBN":"978-3-662-04726-2","language":"en","note":"Google-Books-ID: zsaqCAAAQBAJ","number-of-pages":"265","publisher":"Springer Science &amp; Business Media","source":"Google Books","title":"Foundations of Genetic Programming","author":[{"family":"Langdon","given":"William B."},{"family":"Poli","given":"Riccardo"}],"issued":{"date-parts":[["2013",3,9]]},"citation-key":"langdonFoundationsGeneticProgramming2013"}}],"schema":"https://github.com/citation-style-language/schema/raw/master/csl-citation.json"} </w:instrText>
+      </w:r>
+      <w:r>
+        <w:rPr>
+          <w:lang w:val="en"/>
+        </w:rPr>
+        <w:fldChar w:fldCharType="separate"/>
+      </w:r>
+      <w:r>
+        <w:rPr>
+          <w:noProof/>
+          <w:lang w:val="en"/>
+        </w:rPr>
+        <w:t>[92]</w:t>
+      </w:r>
+      <w:r>
+        <w:rPr>
+          <w:lang w:val="en"/>
+        </w:rPr>
+        <w:fldChar w:fldCharType="end"/>
+      </w:r>
+      <w:r>
+        <w:rPr>
+          <w:lang w:val="en"/>
+        </w:rPr>
+        <w:t xml:space="preserve"> to automatically </w:t>
+      </w:r>
+      <w:r>
+        <w:rPr>
+          <w:lang w:val="en"/>
+        </w:rPr>
+        <w:t>optimize and design</w:t>
+      </w:r>
+      <w:r>
+        <w:rPr>
+          <w:lang w:val="en"/>
+        </w:rPr>
+        <w:t xml:space="preserve"> machine learning pipelines</w:t>
+      </w:r>
+      <w:r>
+        <w:rPr>
+          <w:lang w:val="en"/>
+        </w:rPr>
+        <w:t xml:space="preserve"> through pipeline operators</w:t>
+      </w:r>
+      <w:r>
+        <w:rPr>
+          <w:lang w:val="en"/>
+        </w:rPr>
+        <w:t xml:space="preserve">, including the </w:t>
+      </w:r>
+      <w:r>
+        <w:rPr>
+          <w:lang w:val="en"/>
+        </w:rPr>
+        <w:t>operations</w:t>
+      </w:r>
+      <w:r>
+        <w:rPr>
+          <w:lang w:val="en"/>
+        </w:rPr>
+        <w:t xml:space="preserve"> of feature engineering, model selection, and parameter tuning</w:t>
+      </w:r>
+      <w:r>
+        <w:rPr>
+          <w:lang w:val="en"/>
+        </w:rPr>
+        <w:t xml:space="preserve"> </w:t>
+      </w:r>
+      <w:r>
+        <w:rPr>
+          <w:lang w:val="en"/>
+        </w:rPr>
+        <w:fldChar w:fldCharType="begin"/>
+      </w:r>
+      <w:r>
+        <w:rPr>
+          <w:lang w:val="en"/>
+        </w:rPr>
+        <w:instrText xml:space="preserve"> ADDIN ZOTERO_ITEM CSL_CITATION {"citationID":"NKqpimaY","properties":{"formattedCitation":"[93,93]","plainCitation":"[93,93]","noteIndex":0},"citationItems":[{"id":1136,"uris":["http://zotero.org/users/6749620/items/87X5S4X6"],"itemData":{"id":1136,"type":"paper-conference","abstract":"As data science becomes more mainstream, there will be an ever-growing demand for data science tools that are more accessible, flexible, and scalable. In response to this demand, automated machine ...","container-title":"Workshop on Automatic Machine Learning","event-title":"Workshop on Automatic Machine Learning","language":"en","note":"ISSN: 1938-7228","page":"66-74","publisher":"PMLR","source":"proceedings.mlr.press","title":"TPOT: A Tree-based Pipeline Optimization Tool for Automating Machine Learning","title-short":"TPOT","URL":"http://proceedings.mlr.press/v64/olson_tpot_2016.html","author":[{"family":"Olson","given":"Randal S."},{"family":"Moore","given":"Jason H."}],"accessed":{"date-parts":[["2021",1,22]]},"issued":{"date-parts":[["2016",12,4]]},"citation-key":"olsonTPOTTreebasedPipeline2016"}},{"id":1136,"uris":["http://zotero.org/users/6749620/items/87X5S4X6"],"itemData":{"id":1136,"type":"paper-conference","abstract":"As data science becomes more mainstream, there will be an ever-growing demand for data science tools that are more accessible, flexible, and scalable. In response to this demand, automated machine ...","container-title":"Workshop on Automatic Machine Learning","event-title":"Workshop on Automatic Machine Learning","language":"en","note":"ISSN: 1938-7228","page":"66-74","publisher":"PMLR","source":"proceedings.mlr.press","title":"TPOT: A Tree-based Pipeline Optimization Tool for Automating Machine Learning","title-short":"TPOT","URL":"http://proceedings.mlr.press/v64/olson_tpot_2016.html","author":[{"family":"Olson","given":"Randal S."},{"family":"Moore","given":"Jason H."}],"accessed":{"date-parts":[["2021",1,22]]},"issued":{"date-parts":[["2016",12,4]]},"citation-key":"olsonTPOTTreebasedPipeline2016"}}],"schema":"https://github.com/citation-style-language/schema/raw/master/csl-citation.json"} </w:instrText>
+      </w:r>
+      <w:r>
+        <w:rPr>
+          <w:lang w:val="en"/>
+        </w:rPr>
+        <w:fldChar w:fldCharType="separate"/>
+      </w:r>
+      <w:r>
+        <w:rPr>
+          <w:noProof/>
+          <w:lang w:val="en"/>
+        </w:rPr>
+        <w:t>[93,93]</w:t>
+      </w:r>
+      <w:r>
+        <w:rPr>
+          <w:lang w:val="en"/>
+        </w:rPr>
+        <w:fldChar w:fldCharType="end"/>
+      </w:r>
+      <w:r>
+        <w:rPr>
+          <w:lang w:val="en"/>
+        </w:rPr>
+        <w:t>.</w:t>
+      </w:r>
+      <w:r>
+        <w:rPr>
+          <w:lang w:val="en"/>
+        </w:rPr>
+        <w:t xml:space="preserve"> For the variables sub-component, the output of the </w:t>
+      </w:r>
+      <w:r>
+        <w:rPr>
+          <w:lang w:val="en"/>
+        </w:rPr>
+        <w:t xml:space="preserve">spatial feature engineering </w:t>
+      </w:r>
+      <w:r>
+        <w:rPr>
+          <w:lang w:val="en"/>
+        </w:rPr>
+        <w:t>sub-component from the spatial data component was used</w:t>
+      </w:r>
+      <w:r>
+        <w:rPr>
+          <w:lang w:val="en"/>
+        </w:rPr>
+        <w:t xml:space="preserve">, while the models sub-component contained both </w:t>
+      </w:r>
       <w:r>
         <w:rPr>
           <w:i/>
           <w:iCs/>
           <w:lang w:val="en"/>
         </w:rPr>
-        <w:t>sklearn</w:t>
-      </w:r>
-      <w:proofErr w:type="spellEnd"/>
-      <w:r>
-        <w:rPr>
-          <w:lang w:val="en"/>
-        </w:rPr>
-        <w:t xml:space="preserve"> use</w:t>
-      </w:r>
-      <w:r>
-        <w:rPr>
-          <w:lang w:val="en"/>
-        </w:rPr>
-        <w:t>s</w:t>
-      </w:r>
-      <w:r>
-        <w:rPr>
-          <w:lang w:val="en"/>
-        </w:rPr>
-        <w:t xml:space="preserve"> </w:t>
-      </w:r>
-      <w:r>
-        <w:rPr>
-          <w:lang w:val="en"/>
-        </w:rPr>
-        <w:t>Bayesian</w:t>
-      </w:r>
-      <w:r>
-        <w:rPr>
-          <w:lang w:val="en"/>
-        </w:rPr>
-        <w:t xml:space="preserve"> optimization</w:t>
-      </w:r>
-      <w:r>
-        <w:rPr>
-          <w:lang w:val="en"/>
-        </w:rPr>
-        <w:t xml:space="preserve"> </w:t>
-      </w:r>
-      <w:r>
-        <w:rPr>
-          <w:lang w:val="en"/>
-        </w:rPr>
-        <w:fldChar w:fldCharType="begin"/>
-      </w:r>
-      <w:r>
-        <w:rPr>
-          <w:lang w:val="en"/>
-        </w:rPr>
-        <w:instrText xml:space="preserve"> ADDIN ZOTERO_ITEM CSL_CITATION {"citationID":"tnmdlVZN","properties":{"formattedCitation":"[87]","plainCitation":"[87]","noteIndex":0},"citationItems":[{"id":800,"uris":["http://zotero.org/users/6749620/items/YS8IMQNU"],"itemData":{"id":800,"type":"chapter","container-title":"Advances in Neural Information Processing Systems 25","page":"2951–2959","publisher":"Curran Associates, Inc.","source":"Neural Information Processing Systems","title":"Practical Bayesian Optimization of Machine Learning Algorithms","author":[{"family":"Snoek","given":"Jasper"},{"family":"Larochelle","given":"Hugo"},{"family":"Adams","given":"Ryan P"}],"editor":[{"family":"Pereira","given":"F."},{"family":"Burges","given":"C. J. C."},{"family":"Bottou","given":"L."},{"family":"Weinberger","given":"K. Q."}],"accessed":{"date-parts":[["2020",9,26]]},"issued":{"date-parts":[["2012"]]},"citation-key":"snoekPracticalBayesianOptimization2012"}}],"schema":"https://github.com/citation-style-language/schema/raw/master/csl-citation.json"} </w:instrText>
-      </w:r>
-      <w:r>
-        <w:rPr>
-          <w:lang w:val="en"/>
-        </w:rPr>
-        <w:fldChar w:fldCharType="separate"/>
-      </w:r>
-      <w:r>
-        <w:rPr>
-          <w:noProof/>
-          <w:lang w:val="en"/>
-        </w:rPr>
-        <w:t>[87]</w:t>
-      </w:r>
-      <w:r>
-        <w:rPr>
-          <w:lang w:val="en"/>
-        </w:rPr>
-        <w:fldChar w:fldCharType="end"/>
-      </w:r>
-      <w:r>
-        <w:rPr>
-          <w:lang w:val="en"/>
-        </w:rPr>
-        <w:t>, meta-learning</w:t>
-      </w:r>
-      <w:r>
-        <w:rPr>
-          <w:lang w:val="en"/>
-        </w:rPr>
-        <w:t xml:space="preserve"> </w:t>
-      </w:r>
-      <w:r>
-        <w:rPr>
-          <w:lang w:val="en"/>
-        </w:rPr>
-        <w:fldChar w:fldCharType="begin"/>
-      </w:r>
-      <w:r>
-        <w:rPr>
-          <w:lang w:val="en"/>
-        </w:rPr>
-        <w:instrText xml:space="preserve"> ADDIN ZOTERO_ITEM CSL_CITATION {"citationID":"U1uW3KD2","properties":{"formattedCitation":"[88]","plainCitation":"[88]","noteIndex":0},"citationItems":[{"id":1986,"uris":["http://zotero.org/users/6749620/items/7VRJ7XM6"],"itemData":{"id":1986,"type":"article-journal","abstract":"Different researchers hold different views of what the term meta-learning exactlymeans. The first part of this paper provides our own perspective view in which the goal isto build self-adaptive learners (i.e. learning algorithms that improve their bias dynamicallythrough experience by accumulating meta-knowledge). The second part provides a survey ofmeta-learning as reported by the machine-learning literature. We find that, despite differentviews and research lines, a question remains constant: how can we exploit knowledge aboutlearning (i.e. meta-knowledge) to improve the performance of learning algorithms? Clearlythe answer to this question is key to the advancement of the field and continues being thesubject of intensive research.","container-title":"Artificial Intelligence Review","DOI":"10.1023/A:1019956318069","ISSN":"1573-7462","issue":"2","journalAbbreviation":"Artificial Intelligence Review","language":"en","page":"77-95","source":"Springer Link","title":"A Perspective View and Survey of Meta-Learning","volume":"18","author":[{"family":"Vilalta","given":"Ricardo"},{"family":"Drissi","given":"Youssef"}],"issued":{"date-parts":[["2002",6,1]]},"citation-key":"vilaltaPerspectiveViewSurvey2002"}}],"schema":"https://github.com/citation-style-language/schema/raw/master/csl-citation.json"} </w:instrText>
-      </w:r>
-      <w:r>
-        <w:rPr>
-          <w:lang w:val="en"/>
-        </w:rPr>
-        <w:fldChar w:fldCharType="separate"/>
-      </w:r>
-      <w:r>
-        <w:rPr>
-          <w:noProof/>
-          <w:lang w:val="en"/>
-        </w:rPr>
-        <w:t>[88]</w:t>
-      </w:r>
-      <w:r>
-        <w:rPr>
-          <w:lang w:val="en"/>
-        </w:rPr>
-        <w:fldChar w:fldCharType="end"/>
-      </w:r>
-      <w:r>
-        <w:rPr>
-          <w:lang w:val="en"/>
-        </w:rPr>
-        <w:t>, and ensemble construction</w:t>
-      </w:r>
-      <w:r>
-        <w:rPr>
-          <w:lang w:val="en"/>
-        </w:rPr>
-        <w:t xml:space="preserve"> </w:t>
-      </w:r>
-      <w:r>
-        <w:rPr>
-          <w:lang w:val="en"/>
-        </w:rPr>
-        <w:fldChar w:fldCharType="begin"/>
-      </w:r>
-      <w:r>
-        <w:rPr>
-          <w:lang w:val="en"/>
-        </w:rPr>
-        <w:instrText xml:space="preserve"> ADDIN ZOTERO_ITEM CSL_CITATION {"citationID":"nQvZjUXy","properties":{"formattedCitation":"[89]","plainCitation":"[89]","noteIndex":0},"citationItems":[{"id":1163,"uris":["http://zotero.org/users/6749620/items/D9TSECMD"],"itemData":{"id":1163,"type":"paper-conference","abstract":"We present a method for constructing ensembles from libraries of thousands of models. Model libraries are generated using different learning algorithms and parameter settings. Forward stepwise selection is used to add to the ensemble the models that maximize its performance. Ensemble selection allows ensembles to be optimized to performance metric such as accuracy, cross entropy, mean precision, or ROC Area. Experiments with seven test problems and ten metrics demonstrate the benefit of ensemble selection.","collection-title":"ICML '04","container-title":"Proceedings of the twenty-first international conference on Machine learning","DOI":"10.1145/1015330.1015432","event-place":"New York, NY, USA","ISBN":"978-1-58113-838-2","page":"18","publisher":"Association for Computing Machinery","publisher-place":"New York, NY, USA","source":"ACM Digital Library","title":"Ensemble selection from libraries of models","URL":"https://doi.org/10.1145/1015330.1015432","author":[{"family":"Caruana","given":"Rich"},{"family":"Niculescu-Mizil","given":"Alexandru"},{"family":"Crew","given":"Geoff"},{"family":"Ksikes","given":"Alex"}],"accessed":{"date-parts":[["2021",2,1]]},"issued":{"date-parts":[["2004",7,4]]},"citation-key":"caruanaEnsembleSelectionLibraries2004"}}],"schema":"https://github.com/citation-style-language/schema/raw/master/csl-citation.json"} </w:instrText>
-      </w:r>
-      <w:r>
-        <w:rPr>
-          <w:lang w:val="en"/>
-        </w:rPr>
-        <w:fldChar w:fldCharType="separate"/>
-      </w:r>
-      <w:r>
-        <w:rPr>
-          <w:noProof/>
-          <w:lang w:val="en"/>
-        </w:rPr>
-        <w:t>[89]</w:t>
-      </w:r>
-      <w:r>
-        <w:rPr>
-          <w:lang w:val="en"/>
-        </w:rPr>
-        <w:fldChar w:fldCharType="end"/>
-      </w:r>
-      <w:r>
-        <w:rPr>
-          <w:lang w:val="en"/>
-        </w:rPr>
-        <w:t xml:space="preserve"> to automatically select the best model from a test of several models and parameters</w:t>
-      </w:r>
-      <w:r>
-        <w:rPr>
-          <w:lang w:val="en"/>
-        </w:rPr>
-        <w:t xml:space="preserve"> </w:t>
-      </w:r>
-      <w:r>
-        <w:rPr>
-          <w:lang w:val="en"/>
-        </w:rPr>
-        <w:fldChar w:fldCharType="begin"/>
-      </w:r>
-      <w:r>
-        <w:rPr>
-          <w:lang w:val="en"/>
-        </w:rPr>
-        <w:instrText xml:space="preserve"> ADDIN ZOTERO_ITEM CSL_CITATION {"citationID":"TA6HuCNJ","properties":{"formattedCitation":"[90,91]","plainCitation":"[90,91]","noteIndex":0},"citationItems":[{"id":1838,"uris":["http://zotero.org/users/6749620/items/MPZ8F3N3"],"itemData":{"id":1838,"type":"article-journal","container-title":"Advances in neural information processing systems","source":"Google Scholar","title":"Efficient and robust automated machine learning","volume":"28","author":[{"family":"Feurer","given":"Matthias"},{"family":"Klein","given":"Aaron"},{"family":"Eggensperger","given":"Katharina"},{"family":"Springenberg","given":"Jost"},{"family":"Blum","given":"Manuel"},{"family":"Hutter","given":"Frank"}],"issued":{"date-parts":[["2015"]]},"citation-key":"feurerEfficientRobustAutomated2015"}},{"id":1180,"uris":["http://zotero.org/users/6749620/items/HHNIN4WU"],"itemData":{"id":1180,"type":"chapter","abstract":"The success of machine learning in a broad range of applications has led to an ever-growing demand for machine learning systems that can be used oﬀ the shelf by non-experts. To be eﬀective in practice, such systems need to automatically choose a good algorithm and feature preprocessing steps for a new dataset at hand, and also set their respective hyperparameters. Recent work has started to tackle this automated machine learning (AutoML) problem with the help of eﬃcient Bayesian optimization methods. Building on this, we introduce a robust new AutoML system based on the Python machine learning package scikit-learn (using 15 classiﬁers, 14 feature preprocessing methods, and 4 data preprocessing methods, giving rise to a structured hypothesis space with 110 hyperparameters). This system, which we dub Auto-sklearn, improves on existing AutoML methods by automatically taking into account past performance on similar datasets, and by constructing ensembles from the models evaluated during the optimization. Our system won six out of ten phases of the ﬁrst ChaLearn AutoML challenge, and our comprehensive analysis on over 100 diverse datasets shows that it substantially outperforms the previous state of the art in AutoML. We also demonstrate the performance gains due to each of our contributions and derive insights into the eﬀectiveness of the individual components of Auto-sklearn.","container-title":"Automated Machine Learning","event-place":"Cham","ISBN":"978-3-030-05317-8","language":"en","note":"collection-title: The Springer Series on Challenges in Machine Learning\nDOI: 10.1007/978-3-030-05318-5_6","page":"113-134","publisher":"Springer International Publishing","publisher-place":"Cham","source":"DOI.org (Crossref)","title":"Auto-sklearn: Efficient and Robust Automated Machine Learning","title-short":"Auto-sklearn","URL":"http://link.springer.com/10.1007/978-3-030-05318-5_6","editor":[{"family":"Hutter","given":"Frank"},{"family":"Kotthoff","given":"Lars"},{"family":"Vanschoren","given":"Joaquin"}],"author":[{"family":"Feurer","given":"Matthias"},{"family":"Klein","given":"Aaron"},{"family":"Eggensperger","given":"Katharina"},{"family":"Springenberg","given":"Jost Tobias"},{"family":"Blum","given":"Manuel"},{"family":"Hutter","given":"Frank"}],"accessed":{"date-parts":[["2021",2,7]]},"issued":{"date-parts":[["2019"]]},"citation-key":"feurerAutosklearnEfficientRobust2019"}}],"schema":"https://github.com/citation-style-language/schema/raw/master/csl-citation.json"} </w:instrText>
-      </w:r>
-      <w:r>
-        <w:rPr>
-          <w:lang w:val="en"/>
-        </w:rPr>
-        <w:fldChar w:fldCharType="separate"/>
-      </w:r>
-      <w:r>
-        <w:rPr>
-          <w:noProof/>
-          <w:lang w:val="en"/>
-        </w:rPr>
-        <w:t>[90,91]</w:t>
-      </w:r>
-      <w:r>
-        <w:rPr>
-          <w:lang w:val="en"/>
-        </w:rPr>
-        <w:fldChar w:fldCharType="end"/>
-      </w:r>
-      <w:r>
-        <w:rPr>
-          <w:lang w:val="en"/>
-        </w:rPr>
-        <w:t>.</w:t>
-      </w:r>
-      <w:r>
-        <w:rPr>
-          <w:lang w:val="en"/>
-        </w:rPr>
-        <w:t xml:space="preserve"> The package </w:t>
-      </w:r>
-      <w:proofErr w:type="spellStart"/>
+        <w:t>auto-sklearn</w:t>
+      </w:r>
+      <w:r>
+        <w:rPr>
+          <w:lang w:val="en"/>
+        </w:rPr>
+        <w:t xml:space="preserve"> and </w:t>
+      </w:r>
       <w:r>
         <w:rPr>
           <w:i/>
@@ -18747,19 +18819,6 @@
         </w:rPr>
         <w:t>tpot</w:t>
       </w:r>
-      <w:proofErr w:type="spellEnd"/>
-      <w:r>
-        <w:rPr>
-          <w:lang w:val="en"/>
-        </w:rPr>
-        <w:t xml:space="preserve"> uses genetic </w:t>
-      </w:r>
-      <w:r>
-        <w:rPr>
-          <w:lang w:val="en"/>
-        </w:rPr>
-        <w:t>programming</w:t>
-      </w:r>
       <w:r>
         <w:rPr>
           <w:lang w:val="en"/>
@@ -18770,13 +18829,67 @@
         <w:rPr>
           <w:lang w:val="en"/>
         </w:rPr>
+        <w:t>models</w:t>
+      </w:r>
+      <w:r>
+        <w:rPr>
+          <w:lang w:val="en"/>
+        </w:rPr>
+        <w:t xml:space="preserve">, </w:t>
+      </w:r>
+      <w:r>
+        <w:rPr>
+          <w:lang w:val="en"/>
+        </w:rPr>
+        <w:t>which automated the parameters and model selection sub-components</w:t>
+      </w:r>
+      <w:r>
+        <w:rPr>
+          <w:lang w:val="en"/>
+        </w:rPr>
+        <w:t xml:space="preserve"> given a minute </w:t>
+      </w:r>
+      <w:r>
+        <w:rPr>
+          <w:lang w:val="en"/>
+        </w:rPr>
+        <w:t>to build models</w:t>
+      </w:r>
+      <w:r>
+        <w:rPr>
+          <w:lang w:val="en"/>
+        </w:rPr>
+        <w:t xml:space="preserve"> each</w:t>
+      </w:r>
+      <w:r>
+        <w:rPr>
+          <w:lang w:val="en"/>
+        </w:rPr>
+        <w:t>.</w:t>
+      </w:r>
+      <w:r>
+        <w:rPr>
+          <w:lang w:val="en"/>
+        </w:rPr>
+        <w:t xml:space="preserve"> For the metrics sub-component, we used Mean Absolute Error (MAE)</w:t>
+      </w:r>
+      <w:r>
+        <w:rPr>
+          <w:lang w:val="en"/>
+        </w:rPr>
+        <w:t xml:space="preserve"> </w:t>
+      </w:r>
+      <w:r>
+        <w:rPr>
+          <w:lang w:val="en"/>
+        </w:rPr>
         <w:fldChar w:fldCharType="begin"/>
       </w:r>
       <w:r>
         <w:rPr>
           <w:lang w:val="en"/>
         </w:rPr>
-        <w:instrText xml:space="preserve"> ADDIN ZOTERO_ITEM CSL_CITATION {"citationID":"RGP9X19Z","properties":{"formattedCitation":"[92]","plainCitation":"[92]","noteIndex":0},"citationItems":[{"id":2292,"uris":["http://zotero.org/users/6749620/items/W7NQNMJL"],"itemData":{"id":2292,"type":"book","abstract":"Genetic programming (GP), one of the most advanced forms of evolutionary computation, has been highly successful as a technique for getting computers to automatically solve problems without having to tell them explicitly how. Since its inceptions more than ten years ago, GP has been used to solve practical problems in a variety of application fields. Along with this ad-hoc engineering approaches interest increased in how and why GP works. This book provides a coherent consolidation of recent work on the theoretical foundations of GP. A concise introduction to GP and genetic algorithms (GA) is followed by a discussion of fitness landscapes and other theoretical approaches to natural and artificial evolution. Having surveyed early approaches to GP theory it presents new exact schema analysis, showing that it applies to GP as well as to the simpler GAs. New results on the potentially infinite number of possible programs are followed by two chapters applying these new techniques.","ISBN":"978-3-662-04726-2","language":"en","note":"Google-Books-ID: zsaqCAAAQBAJ","number-of-pages":"265","publisher":"Springer Science &amp; Business Media","source":"Google Books","title":"Foundations of Genetic Programming","author":[{"family":"Langdon","given":"William B."},{"family":"Poli","given":"Riccardo"}],"issued":{"date-parts":[["2013",3,9]]},"citation-key":"langdonFoundationsGeneticProgramming2013"}}],"schema":"https://github.com/citation-style-language/schema/raw/master/csl-citation.json"} </w:instrText>
+        <w:instrText xml:space="preserve"> ADDIN ZOTERO_ITEM CSL_CITATION {"citationID":"fgE8Qzq8","properties":{"formattedCitation":"[94]","plainCitation":"[94]","noteIndex":0},"citationItems":[{"id":2311,"uris":["http://zotero.org/users/6749620/items/6UJ3QDST"],"itemData":{"id":2311,"type":"article-journal","container-title":"Climate research","issue":"1","page":"79–82","source":"Google Scholar","title":"Advantages of the mean absolute error (MAE) over the root mean square error (RMSE) in assessing average model performance","volume":"30","author":[{"family":"Willmott","given":"Cort J."},{"family":"Matsuura","given":"Kenji"}],"issued":{"date-parts":[["2005"]]},"citation-key":"willmottAdvantagesMeanAbsolute2005"}}],"schema":"https://github.com/citation-style-language/schema/raw/master/csl-citation.json"} </w:instrText>
       </w:r>
       <w:r>
         <w:rPr>
@@ -18789,7 +18902,7 @@
           <w:noProof/>
           <w:lang w:val="en"/>
         </w:rPr>
-        <w:t>[92]</w:t>
+        <w:t>[94]</w:t>
       </w:r>
       <w:r>
         <w:rPr>
@@ -18801,80 +18914,25 @@
         <w:rPr>
           <w:lang w:val="en"/>
         </w:rPr>
-        <w:t xml:space="preserve"> to automatically </w:t>
-      </w:r>
-      <w:r>
-        <w:rPr>
-          <w:lang w:val="en"/>
-        </w:rPr>
-        <w:t>optimize and design</w:t>
-      </w:r>
-      <w:r>
-        <w:rPr>
-          <w:lang w:val="en"/>
-        </w:rPr>
-        <w:t xml:space="preserve"> machine learning pipelines</w:t>
-      </w:r>
-      <w:r>
-        <w:rPr>
-          <w:lang w:val="en"/>
-        </w:rPr>
-        <w:t xml:space="preserve"> through pipeline operators</w:t>
-      </w:r>
-      <w:r>
-        <w:rPr>
-          <w:lang w:val="en"/>
-        </w:rPr>
-        <w:t xml:space="preserve">, including the </w:t>
-      </w:r>
-      <w:r>
-        <w:rPr>
-          <w:lang w:val="en"/>
-        </w:rPr>
-        <w:t>operations</w:t>
-      </w:r>
-      <w:r>
-        <w:rPr>
-          <w:lang w:val="en"/>
-        </w:rPr>
-        <w:t xml:space="preserve"> of feature engineering, model selection, and parameter tuning</w:t>
-      </w:r>
-      <w:r>
-        <w:rPr>
-          <w:lang w:val="en"/>
-        </w:rPr>
-        <w:t xml:space="preserve"> </w:t>
-      </w:r>
-      <w:r>
-        <w:rPr>
-          <w:lang w:val="en"/>
-        </w:rPr>
-        <w:fldChar w:fldCharType="begin"/>
-      </w:r>
-      <w:r>
-        <w:rPr>
-          <w:lang w:val="en"/>
-        </w:rPr>
-        <w:instrText xml:space="preserve"> ADDIN ZOTERO_ITEM CSL_CITATION {"citationID":"NKqpimaY","properties":{"formattedCitation":"[93,93]","plainCitation":"[93,93]","noteIndex":0},"citationItems":[{"id":1136,"uris":["http://zotero.org/users/6749620/items/87X5S4X6"],"itemData":{"id":1136,"type":"paper-conference","abstract":"As data science becomes more mainstream, there will be an ever-growing demand for data science tools that are more accessible, flexible, and scalable. In response to this demand, automated machine ...","container-title":"Workshop on Automatic Machine Learning","event-title":"Workshop on Automatic Machine Learning","language":"en","note":"ISSN: 1938-7228","page":"66-74","publisher":"PMLR","source":"proceedings.mlr.press","title":"TPOT: A Tree-based Pipeline Optimization Tool for Automating Machine Learning","title-short":"TPOT","URL":"http://proceedings.mlr.press/v64/olson_tpot_2016.html","author":[{"family":"Olson","given":"Randal S."},{"family":"Moore","given":"Jason H."}],"accessed":{"date-parts":[["2021",1,22]]},"issued":{"date-parts":[["2016",12,4]]},"citation-key":"olsonTPOTTreebasedPipeline2016"}},{"id":1136,"uris":["http://zotero.org/users/6749620/items/87X5S4X6"],"itemData":{"id":1136,"type":"paper-conference","abstract":"As data science becomes more mainstream, there will be an ever-growing demand for data science tools that are more accessible, flexible, and scalable. In response to this demand, automated machine ...","container-title":"Workshop on Automatic Machine Learning","event-title":"Workshop on Automatic Machine Learning","language":"en","note":"ISSN: 1938-7228","page":"66-74","publisher":"PMLR","source":"proceedings.mlr.press","title":"TPOT: A Tree-based Pipeline Optimization Tool for Automating Machine Learning","title-short":"TPOT","URL":"http://proceedings.mlr.press/v64/olson_tpot_2016.html","author":[{"family":"Olson","given":"Randal S."},{"family":"Moore","given":"Jason H."}],"accessed":{"date-parts":[["2021",1,22]]},"issued":{"date-parts":[["2016",12,4]]},"citation-key":"olsonTPOTTreebasedPipeline2016"}}],"schema":"https://github.com/citation-style-language/schema/raw/master/csl-citation.json"} </w:instrText>
-      </w:r>
-      <w:r>
-        <w:rPr>
-          <w:lang w:val="en"/>
-        </w:rPr>
-        <w:fldChar w:fldCharType="separate"/>
-      </w:r>
-      <w:r>
-        <w:rPr>
-          <w:noProof/>
-          <w:lang w:val="en"/>
-        </w:rPr>
-        <w:t>[93,93]</w:t>
-      </w:r>
-      <w:r>
-        <w:rPr>
-          <w:lang w:val="en"/>
-        </w:rPr>
-        <w:fldChar w:fldCharType="end"/>
+        <w:t>, an aggregate measure of the errors between the actual and predicted</w:t>
+      </w:r>
+      <w:r>
+        <w:rPr>
+          <w:lang w:val="en"/>
+        </w:rPr>
+        <w:t xml:space="preserve"> outcomes, representing the</w:t>
+      </w:r>
+      <w:r>
+        <w:rPr>
+          <w:lang w:val="en"/>
+        </w:rPr>
+        <w:t xml:space="preserve"> MVC</w:t>
+      </w:r>
+      <w:r>
+        <w:rPr>
+          <w:lang w:val="en"/>
+        </w:rPr>
+        <w:t>s</w:t>
       </w:r>
       <w:r>
         <w:rPr>
@@ -18886,39 +18944,7 @@
         <w:rPr>
           <w:lang w:val="en"/>
         </w:rPr>
-        <w:t xml:space="preserve"> For the variables sub-component, the output of the </w:t>
-      </w:r>
-      <w:r>
-        <w:rPr>
-          <w:lang w:val="en"/>
-        </w:rPr>
-        <w:t xml:space="preserve">spatial feature engineering </w:t>
-      </w:r>
-      <w:r>
-        <w:rPr>
-          <w:lang w:val="en"/>
-        </w:rPr>
-        <w:t>sub-component from the spatial data component was used</w:t>
-      </w:r>
-      <w:r>
-        <w:rPr>
-          <w:lang w:val="en"/>
-        </w:rPr>
-        <w:t xml:space="preserve">, while the </w:t>
-      </w:r>
-      <w:proofErr w:type="gramStart"/>
-      <w:r>
-        <w:rPr>
-          <w:lang w:val="en"/>
-        </w:rPr>
-        <w:t>models</w:t>
-      </w:r>
-      <w:proofErr w:type="gramEnd"/>
-      <w:r>
-        <w:rPr>
-          <w:lang w:val="en"/>
-        </w:rPr>
-        <w:t xml:space="preserve"> sub-component contained both </w:t>
+        <w:t xml:space="preserve"> Thus, the best model sub-component was determined by the </w:t>
       </w:r>
       <w:r>
         <w:rPr>
@@ -18926,195 +18952,22 @@
           <w:iCs/>
           <w:lang w:val="en"/>
         </w:rPr>
-        <w:t>auto-</w:t>
-      </w:r>
-      <w:proofErr w:type="spellStart"/>
+        <w:t>auto-sklearn</w:t>
+      </w:r>
+      <w:r>
+        <w:rPr>
+          <w:lang w:val="en"/>
+        </w:rPr>
+        <w:t xml:space="preserve"> and </w:t>
+      </w:r>
       <w:r>
         <w:rPr>
           <w:i/>
           <w:iCs/>
           <w:lang w:val="en"/>
         </w:rPr>
-        <w:t>sklearn</w:t>
-      </w:r>
-      <w:proofErr w:type="spellEnd"/>
-      <w:r>
-        <w:rPr>
-          <w:lang w:val="en"/>
-        </w:rPr>
-        <w:t xml:space="preserve"> and </w:t>
-      </w:r>
-      <w:proofErr w:type="spellStart"/>
-      <w:r>
-        <w:rPr>
-          <w:i/>
-          <w:iCs/>
-          <w:lang w:val="en"/>
-        </w:rPr>
         <w:t>tpot</w:t>
       </w:r>
-      <w:proofErr w:type="spellEnd"/>
-      <w:r>
-        <w:rPr>
-          <w:lang w:val="en"/>
-        </w:rPr>
-        <w:t xml:space="preserve"> </w:t>
-      </w:r>
-      <w:r>
-        <w:rPr>
-          <w:lang w:val="en"/>
-        </w:rPr>
-        <w:t>models</w:t>
-      </w:r>
-      <w:r>
-        <w:rPr>
-          <w:lang w:val="en"/>
-        </w:rPr>
-        <w:t xml:space="preserve">, </w:t>
-      </w:r>
-      <w:r>
-        <w:rPr>
-          <w:lang w:val="en"/>
-        </w:rPr>
-        <w:t>which automated the parameters and model selection sub-components</w:t>
-      </w:r>
-      <w:r>
-        <w:rPr>
-          <w:lang w:val="en"/>
-        </w:rPr>
-        <w:t xml:space="preserve"> given a minute </w:t>
-      </w:r>
-      <w:r>
-        <w:rPr>
-          <w:lang w:val="en"/>
-        </w:rPr>
-        <w:t>to build models</w:t>
-      </w:r>
-      <w:r>
-        <w:rPr>
-          <w:lang w:val="en"/>
-        </w:rPr>
-        <w:t xml:space="preserve"> each</w:t>
-      </w:r>
-      <w:r>
-        <w:rPr>
-          <w:lang w:val="en"/>
-        </w:rPr>
-        <w:t>.</w:t>
-      </w:r>
-      <w:r>
-        <w:rPr>
-          <w:lang w:val="en"/>
-        </w:rPr>
-        <w:t xml:space="preserve"> For the metrics sub-component, we used Mean Absolute Error (MAE)</w:t>
-      </w:r>
-      <w:r>
-        <w:rPr>
-          <w:lang w:val="en"/>
-        </w:rPr>
-        <w:t xml:space="preserve"> </w:t>
-      </w:r>
-      <w:r>
-        <w:rPr>
-          <w:lang w:val="en"/>
-        </w:rPr>
-        <w:fldChar w:fldCharType="begin"/>
-      </w:r>
-      <w:r>
-        <w:rPr>
-          <w:lang w:val="en"/>
-        </w:rPr>
-        <w:instrText xml:space="preserve"> ADDIN ZOTERO_ITEM CSL_CITATION {"citationID":"fgE8Qzq8","properties":{"formattedCitation":"[94]","plainCitation":"[94]","noteIndex":0},"citationItems":[{"id":2311,"uris":["http://zotero.org/users/6749620/items/6UJ3QDST"],"itemData":{"id":2311,"type":"article-journal","container-title":"Climate research","issue":"1","page":"79–82","source":"Google Scholar","title":"Advantages of the mean absolute error (MAE) over the root mean square error (RMSE) in assessing average model performance","volume":"30","author":[{"family":"Willmott","given":"Cort J."},{"family":"Matsuura","given":"Kenji"}],"issued":{"date-parts":[["2005"]]},"citation-key":"willmottAdvantagesMeanAbsolute2005"}}],"schema":"https://github.com/citation-style-language/schema/raw/master/csl-citation.json"} </w:instrText>
-      </w:r>
-      <w:r>
-        <w:rPr>
-          <w:lang w:val="en"/>
-        </w:rPr>
-        <w:fldChar w:fldCharType="separate"/>
-      </w:r>
-      <w:r>
-        <w:rPr>
-          <w:noProof/>
-          <w:lang w:val="en"/>
-        </w:rPr>
-        <w:t>[94]</w:t>
-      </w:r>
-      <w:r>
-        <w:rPr>
-          <w:lang w:val="en"/>
-        </w:rPr>
-        <w:fldChar w:fldCharType="end"/>
-      </w:r>
-      <w:r>
-        <w:rPr>
-          <w:lang w:val="en"/>
-        </w:rPr>
-        <w:t>, an aggregate measure of the errors between the actual and predicted</w:t>
-      </w:r>
-      <w:r>
-        <w:rPr>
-          <w:lang w:val="en"/>
-        </w:rPr>
-        <w:t xml:space="preserve"> outcomes, representing the</w:t>
-      </w:r>
-      <w:r>
-        <w:rPr>
-          <w:lang w:val="en"/>
-        </w:rPr>
-        <w:t xml:space="preserve"> MVC</w:t>
-      </w:r>
-      <w:r>
-        <w:rPr>
-          <w:lang w:val="en"/>
-        </w:rPr>
-        <w:t>s</w:t>
-      </w:r>
-      <w:r>
-        <w:rPr>
-          <w:lang w:val="en"/>
-        </w:rPr>
-        <w:t>.</w:t>
-      </w:r>
-      <w:r>
-        <w:rPr>
-          <w:lang w:val="en"/>
-        </w:rPr>
-        <w:t xml:space="preserve"> Thus, the best model sub-component was determined by the </w:t>
-      </w:r>
-      <w:r>
-        <w:rPr>
-          <w:i/>
-          <w:iCs/>
-          <w:lang w:val="en"/>
-        </w:rPr>
-        <w:t>auto-</w:t>
-      </w:r>
-      <w:proofErr w:type="spellStart"/>
-      <w:r>
-        <w:rPr>
-          <w:i/>
-          <w:iCs/>
-          <w:lang w:val="en"/>
-        </w:rPr>
-        <w:t>sklearn</w:t>
-      </w:r>
-      <w:proofErr w:type="spellEnd"/>
-      <w:r>
-        <w:rPr>
-          <w:lang w:val="en"/>
-        </w:rPr>
-        <w:t xml:space="preserve"> and </w:t>
-      </w:r>
-      <w:proofErr w:type="spellStart"/>
-      <w:r>
-        <w:rPr>
-          <w:i/>
-          <w:iCs/>
-          <w:lang w:val="en"/>
-        </w:rPr>
-        <w:t>tpot</w:t>
-      </w:r>
-      <w:proofErr w:type="spellEnd"/>
       <w:r>
         <w:rPr>
           <w:lang w:val="en"/>
@@ -19358,7 +19211,37 @@
         <w:rPr>
           <w:lang w:val="en"/>
         </w:rPr>
-        <w:t xml:space="preserve"> number of optimization iterations to 100 and the </w:t>
+        <w:t xml:space="preserve"> number of optimization iterations to 1</w:t>
+      </w:r>
+      <w:r>
+        <w:rPr>
+          <w:lang w:val="en"/>
+        </w:rPr>
+        <w:t>000,</w:t>
+      </w:r>
+      <w:r>
+        <w:rPr>
+          <w:lang w:val="en"/>
+        </w:rPr>
+        <w:t xml:space="preserve"> along with 1 initial iteration containing the actual variable values from the data, and 100 random iterations to diversify the optimization search space, for a total of 1101 iterations.</w:t>
+      </w:r>
+      <w:r>
+        <w:rPr>
+          <w:lang w:val="en"/>
+        </w:rPr>
+        <w:t xml:space="preserve"> </w:t>
+      </w:r>
+      <w:r>
+        <w:rPr>
+          <w:lang w:val="en"/>
+        </w:rPr>
+        <w:t>We also limited t</w:t>
+      </w:r>
+      <w:r>
+        <w:rPr>
+          <w:lang w:val="en"/>
+        </w:rPr>
+        <w:t xml:space="preserve">he </w:t>
       </w:r>
       <w:r>
         <w:rPr>
@@ -19418,7 +19301,19 @@
         <w:rPr>
           <w:lang w:val="en"/>
         </w:rPr>
-        <w:t xml:space="preserve"> We also included location constraints for two scenarios: (1) </w:t>
+        <w:t xml:space="preserve"> </w:t>
+      </w:r>
+      <w:r>
+        <w:rPr>
+          <w:lang w:val="en"/>
+        </w:rPr>
+        <w:t>In addition, w</w:t>
+      </w:r>
+      <w:r>
+        <w:rPr>
+          <w:lang w:val="en"/>
+        </w:rPr>
+        <w:t xml:space="preserve">e also included location constraints for two scenarios: (1) </w:t>
       </w:r>
       <w:r>
         <w:rPr>
@@ -19542,7 +19437,11 @@
         <w:pStyle w:val="MDPI31text"/>
       </w:pPr>
       <w:r>
-        <w:t>After applying the three-step approach described in Section 2, we developed the geo-interventions modelling framework and conducted a case study to demonstrate the framework</w:t>
+        <w:t xml:space="preserve">After applying the three-step approach described in Section 2, we developed the geo-interventions modelling framework and conducted a case study to demonstrate the </w:t>
+      </w:r>
+      <w:r>
+        <w:lastRenderedPageBreak/>
+        <w:t>framework</w:t>
       </w:r>
       <w:r>
         <w:t>.</w:t>
@@ -19593,7 +19492,6 @@
         <w:rPr>
           <w:lang w:val="en"/>
         </w:rPr>
-        <w:lastRenderedPageBreak/>
         <w:t>interventions?</w:t>
       </w:r>
       <w:r>
@@ -20036,7 +19934,11 @@
         <w:t>).</w:t>
       </w:r>
       <w:r>
-        <w:t xml:space="preserve"> The vector data sub-components (points, lines, and polygons) then represent</w:t>
+        <w:t xml:space="preserve"> The vector data sub-components (points, lines, </w:t>
+      </w:r>
+      <w:r>
+        <w:lastRenderedPageBreak/>
+        <w:t>and polygons) then represent</w:t>
       </w:r>
       <w:r>
         <w:t>ed</w:t>
@@ -20051,11 +19953,7 @@
         <w:t xml:space="preserve"> geometries of spatial data, structured as ordered coordinates forming locations in the real-world</w:t>
       </w:r>
       <w:r>
-        <w:t xml:space="preserve">, while also containing several </w:t>
-      </w:r>
-      <w:r>
-        <w:lastRenderedPageBreak/>
-        <w:t xml:space="preserve">variables describing </w:t>
+        <w:t xml:space="preserve">, while also containing several variables describing </w:t>
       </w:r>
       <w:r>
         <w:t>phenomena, entities, and characteristics at these</w:t>
@@ -20147,7 +20045,6 @@
       <w:r>
         <w:t xml:space="preserve"> </w:t>
       </w:r>
-      <w:proofErr w:type="spellStart"/>
       <w:r>
         <w:t>Nearest</w:t>
       </w:r>
@@ -20157,7 +20054,6 @@
         </w:rPr>
         <w:t>i</w:t>
       </w:r>
-      <w:proofErr w:type="spellEnd"/>
       <w:r>
         <w:t>,</w:t>
       </w:r>
@@ -20213,15 +20109,7 @@
         <w:t>i,2</w:t>
       </w:r>
       <w:r>
-        <w:t xml:space="preserve">, the index </w:t>
-      </w:r>
-      <w:proofErr w:type="spellStart"/>
-      <w:r>
-        <w:t>i</w:t>
-      </w:r>
-      <w:proofErr w:type="spellEnd"/>
-      <w:r>
-        <w:t xml:space="preserve"> of the nearest location, the length of the location entity, and the type of the location entity respectively</w:t>
+        <w:t>, the index i of the nearest location, the length of the location entity, and the type of the location entity respectively</w:t>
       </w:r>
       <w:r>
         <w:t>.</w:t>
@@ -20352,7 +20240,6 @@
                 <w:snapToGrid/>
               </w:rPr>
             </w:pPr>
-            <w:proofErr w:type="spellStart"/>
             <w:r>
               <w:rPr>
                 <w:b/>
@@ -20360,7 +20247,6 @@
               </w:rPr>
               <w:t>i</w:t>
             </w:r>
-            <w:proofErr w:type="spellEnd"/>
           </w:p>
         </w:tc>
         <w:tc>
@@ -20528,7 +20414,6 @@
                 <w:snapToGrid/>
               </w:rPr>
             </w:pPr>
-            <w:proofErr w:type="spellStart"/>
             <w:r>
               <w:rPr>
                 <w:b/>
@@ -20544,7 +20429,6 @@
               </w:rPr>
               <w:t>i</w:t>
             </w:r>
-            <w:proofErr w:type="spellEnd"/>
           </w:p>
         </w:tc>
         <w:tc>
@@ -20563,21 +20447,12 @@
                 <w:snapToGrid/>
               </w:rPr>
             </w:pPr>
-            <w:proofErr w:type="gramStart"/>
             <w:r>
               <w:rPr>
                 <w:b/>
                 <w:snapToGrid/>
               </w:rPr>
-              <w:t>Length(</w:t>
-            </w:r>
-            <w:proofErr w:type="gramEnd"/>
-            <w:r>
-              <w:rPr>
-                <w:b/>
-                <w:snapToGrid/>
-              </w:rPr>
-              <w:t>L</w:t>
+              <w:t>Length(L</w:t>
             </w:r>
             <w:r>
               <w:rPr>
@@ -20613,21 +20488,12 @@
                 <w:snapToGrid/>
               </w:rPr>
             </w:pPr>
-            <w:proofErr w:type="gramStart"/>
             <w:r>
               <w:rPr>
                 <w:b/>
                 <w:snapToGrid/>
               </w:rPr>
-              <w:t>Type(</w:t>
-            </w:r>
-            <w:proofErr w:type="gramEnd"/>
-            <w:r>
-              <w:rPr>
-                <w:b/>
-                <w:snapToGrid/>
-              </w:rPr>
-              <w:t>L</w:t>
+              <w:t>Type(L</w:t>
             </w:r>
             <w:r>
               <w:rPr>
@@ -21415,21 +21281,7 @@
         <w:rPr>
           <w:lang w:val="en"/>
         </w:rPr>
-        <w:t xml:space="preserve"> For the </w:t>
-      </w:r>
-      <w:proofErr w:type="gramStart"/>
-      <w:r>
-        <w:rPr>
-          <w:lang w:val="en"/>
-        </w:rPr>
-        <w:t>models</w:t>
-      </w:r>
-      <w:proofErr w:type="gramEnd"/>
-      <w:r>
-        <w:rPr>
-          <w:lang w:val="en"/>
-        </w:rPr>
-        <w:t xml:space="preserve"> sub-component</w:t>
+        <w:t xml:space="preserve"> For the models sub-component</w:t>
       </w:r>
       <w:r>
         <w:rPr>
@@ -21489,21 +21341,7 @@
         <w:rPr>
           <w:lang w:val="en"/>
         </w:rPr>
-        <w:t xml:space="preserve"> The </w:t>
-      </w:r>
-      <w:proofErr w:type="gramStart"/>
-      <w:r>
-        <w:rPr>
-          <w:lang w:val="en"/>
-        </w:rPr>
-        <w:t>models</w:t>
-      </w:r>
-      <w:proofErr w:type="gramEnd"/>
-      <w:r>
-        <w:rPr>
-          <w:lang w:val="en"/>
-        </w:rPr>
-        <w:t xml:space="preserve"> sub-component’s objective </w:t>
+        <w:t xml:space="preserve"> The models sub-component’s objective </w:t>
       </w:r>
       <w:r>
         <w:rPr>
@@ -21730,14 +21568,7 @@
         <w:rPr>
           <w:snapToGrid/>
         </w:rPr>
-        <w:t xml:space="preserve">, </w:t>
-      </w:r>
-      <w:proofErr w:type="spellStart"/>
-      <w:r>
-        <w:rPr>
-          <w:snapToGrid/>
-        </w:rPr>
-        <w:t>Nearest</w:t>
+        <w:t>, Nearest</w:t>
       </w:r>
       <w:r>
         <w:rPr>
@@ -21746,26 +21577,11 @@
         </w:rPr>
         <w:t>i</w:t>
       </w:r>
-      <w:proofErr w:type="spellEnd"/>
       <w:r>
         <w:rPr>
           <w:snapToGrid/>
         </w:rPr>
-        <w:t xml:space="preserve">, </w:t>
-      </w:r>
-      <w:proofErr w:type="gramStart"/>
-      <w:r>
-        <w:rPr>
-          <w:snapToGrid/>
-        </w:rPr>
-        <w:t>Length(</w:t>
-      </w:r>
-      <w:proofErr w:type="gramEnd"/>
-      <w:r>
-        <w:rPr>
-          <w:snapToGrid/>
-        </w:rPr>
-        <w:t>L</w:t>
+        <w:t>, Length(L</w:t>
       </w:r>
       <w:r>
         <w:rPr>
@@ -21867,7 +21683,6 @@
         </w:rPr>
         <w:t xml:space="preserve">with errors </w:t>
       </w:r>
-      <w:proofErr w:type="spellStart"/>
       <w:r>
         <w:rPr>
           <w:bCs/>
@@ -21883,7 +21698,6 @@
         </w:rPr>
         <w:t>i</w:t>
       </w:r>
-      <w:proofErr w:type="spellEnd"/>
       <w:r>
         <w:rPr>
           <w:bCs/>
@@ -21896,23 +21710,7 @@
           <w:bCs/>
           <w:snapToGrid/>
         </w:rPr>
-        <w:t xml:space="preserve"> Here, the predicted outcomes </w:t>
-      </w:r>
-      <w:proofErr w:type="gramStart"/>
-      <w:r>
-        <w:rPr>
-          <w:bCs/>
-          <w:snapToGrid/>
-        </w:rPr>
-        <w:t>was</w:t>
-      </w:r>
-      <w:proofErr w:type="gramEnd"/>
-      <w:r>
-        <w:rPr>
-          <w:bCs/>
-          <w:snapToGrid/>
-        </w:rPr>
-        <w:t xml:space="preserve"> selected as variable X</w:t>
+        <w:t xml:space="preserve"> Here, the predicted outcomes was selected as variable X</w:t>
       </w:r>
       <w:r>
         <w:rPr>
@@ -22105,7 +21903,6 @@
                 <w:szCs w:val="16"/>
               </w:rPr>
             </w:pPr>
-            <w:proofErr w:type="spellStart"/>
             <w:r>
               <w:rPr>
                 <w:b/>
@@ -22115,7 +21912,6 @@
               </w:rPr>
               <w:t>i</w:t>
             </w:r>
-            <w:proofErr w:type="spellEnd"/>
           </w:p>
         </w:tc>
         <w:tc>
@@ -22274,7 +22070,6 @@
                 <w:szCs w:val="16"/>
               </w:rPr>
             </w:pPr>
-            <w:proofErr w:type="spellStart"/>
             <w:r>
               <w:rPr>
                 <w:b/>
@@ -22294,7 +22089,6 @@
               </w:rPr>
               <w:t>i</w:t>
             </w:r>
-            <w:proofErr w:type="spellEnd"/>
           </w:p>
         </w:tc>
         <w:tc>
@@ -22315,7 +22109,6 @@
                 <w:szCs w:val="16"/>
               </w:rPr>
             </w:pPr>
-            <w:proofErr w:type="gramStart"/>
             <w:r>
               <w:rPr>
                 <w:b/>
@@ -22323,17 +22116,7 @@
                 <w:sz w:val="16"/>
                 <w:szCs w:val="16"/>
               </w:rPr>
-              <w:t>Length(</w:t>
-            </w:r>
-            <w:proofErr w:type="gramEnd"/>
-            <w:r>
-              <w:rPr>
-                <w:b/>
-                <w:snapToGrid/>
-                <w:sz w:val="16"/>
-                <w:szCs w:val="16"/>
-              </w:rPr>
-              <w:t>L</w:t>
+              <w:t>Length(L</w:t>
             </w:r>
             <w:r>
               <w:rPr>
@@ -22374,7 +22157,6 @@
                 <w:szCs w:val="16"/>
               </w:rPr>
             </w:pPr>
-            <w:proofErr w:type="gramStart"/>
             <w:r>
               <w:rPr>
                 <w:b/>
@@ -22382,17 +22164,7 @@
                 <w:sz w:val="16"/>
                 <w:szCs w:val="16"/>
               </w:rPr>
-              <w:t>Type(</w:t>
-            </w:r>
-            <w:proofErr w:type="gramEnd"/>
-            <w:r>
-              <w:rPr>
-                <w:b/>
-                <w:snapToGrid/>
-                <w:sz w:val="16"/>
-                <w:szCs w:val="16"/>
-              </w:rPr>
-              <w:t>L</w:t>
+              <w:t>Type(L</w:t>
             </w:r>
             <w:r>
               <w:rPr>
@@ -22560,7 +22332,6 @@
               </w:rPr>
               <w:t xml:space="preserve">= </w:t>
             </w:r>
-            <w:proofErr w:type="gramStart"/>
             <w:r>
               <w:rPr>
                 <w:b/>
@@ -22579,17 +22350,7 @@
                 <w:sz w:val="16"/>
                 <w:szCs w:val="16"/>
               </w:rPr>
-              <w:t>(</w:t>
-            </w:r>
-            <w:proofErr w:type="gramEnd"/>
-            <w:r>
-              <w:rPr>
-                <w:b/>
-                <w:snapToGrid/>
-                <w:sz w:val="16"/>
-                <w:szCs w:val="16"/>
-              </w:rPr>
-              <w:t>X</w:t>
+              <w:t>(X</w:t>
             </w:r>
             <w:r>
               <w:rPr>
@@ -22658,7 +22419,6 @@
                 <w:szCs w:val="16"/>
               </w:rPr>
             </w:pPr>
-            <w:proofErr w:type="spellStart"/>
             <w:r>
               <w:rPr>
                 <w:b/>
@@ -22676,18 +22436,7 @@
                 <w:szCs w:val="16"/>
                 <w:vertAlign w:val="subscript"/>
               </w:rPr>
-              <w:t>i</w:t>
-            </w:r>
-            <w:proofErr w:type="spellEnd"/>
-            <w:r>
-              <w:rPr>
-                <w:b/>
-                <w:snapToGrid/>
-                <w:sz w:val="16"/>
-                <w:szCs w:val="16"/>
-                <w:vertAlign w:val="subscript"/>
-              </w:rPr>
-              <w:t xml:space="preserve"> </w:t>
+              <w:t xml:space="preserve">i </w:t>
             </w:r>
             <w:r>
               <w:rPr>
@@ -23514,7 +23263,14 @@
         <w:rPr>
           <w:lang w:val="en"/>
         </w:rPr>
-        <w:t xml:space="preserve"> The actions sub-component contain</w:t>
+        <w:t xml:space="preserve"> The actions sub-</w:t>
+      </w:r>
+      <w:r>
+        <w:rPr>
+          <w:lang w:val="en"/>
+        </w:rPr>
+        <w:lastRenderedPageBreak/>
+        <w:t>component contain</w:t>
       </w:r>
       <w:r>
         <w:rPr>
@@ -23544,14 +23300,7 @@
         <w:rPr>
           <w:lang w:val="en"/>
         </w:rPr>
-        <w:t xml:space="preserve"> </w:t>
-      </w:r>
-      <w:r>
-        <w:rPr>
-          <w:lang w:val="en"/>
-        </w:rPr>
-        <w:lastRenderedPageBreak/>
-        <w:t>limitations on the possible actions to optimize for based on prior knowledge.</w:t>
+        <w:t xml:space="preserve"> limitations on the possible actions to optimize for based on prior knowledge.</w:t>
       </w:r>
       <w:r>
         <w:rPr>
@@ -23734,21 +23483,12 @@
         </w:rPr>
         <w:t xml:space="preserve"> and </w:t>
       </w:r>
-      <w:proofErr w:type="gramStart"/>
       <w:r>
         <w:rPr>
           <w:bCs/>
           <w:snapToGrid/>
         </w:rPr>
-        <w:t>Length(</w:t>
-      </w:r>
-      <w:proofErr w:type="gramEnd"/>
-      <w:r>
-        <w:rPr>
-          <w:bCs/>
-          <w:snapToGrid/>
-        </w:rPr>
-        <w:t>L</w:t>
+        <w:t>Length(L</w:t>
       </w:r>
       <w:r>
         <w:rPr>
@@ -23979,21 +23719,12 @@
         </w:rPr>
         <w:t xml:space="preserve">and </w:t>
       </w:r>
-      <w:proofErr w:type="gramStart"/>
       <w:r>
         <w:rPr>
           <w:bCs/>
           <w:snapToGrid/>
         </w:rPr>
-        <w:t>Length(</w:t>
-      </w:r>
-      <w:proofErr w:type="gramEnd"/>
-      <w:r>
-        <w:rPr>
-          <w:bCs/>
-          <w:snapToGrid/>
-        </w:rPr>
-        <w:t>L</w:t>
+        <w:t>Length(L</w:t>
       </w:r>
       <w:r>
         <w:rPr>
@@ -24808,7 +24539,6 @@
                 <w:szCs w:val="16"/>
               </w:rPr>
             </w:pPr>
-            <w:proofErr w:type="spellStart"/>
             <w:r>
               <w:rPr>
                 <w:b/>
@@ -24818,7 +24548,6 @@
               </w:rPr>
               <w:t>i</w:t>
             </w:r>
-            <w:proofErr w:type="spellEnd"/>
           </w:p>
         </w:tc>
         <w:tc>
@@ -24897,7 +24626,6 @@
                 <w:szCs w:val="16"/>
               </w:rPr>
             </w:pPr>
-            <w:proofErr w:type="gramStart"/>
             <w:r>
               <w:rPr>
                 <w:b/>
@@ -24905,17 +24633,7 @@
                 <w:sz w:val="16"/>
                 <w:szCs w:val="16"/>
               </w:rPr>
-              <w:t>Length(</w:t>
-            </w:r>
-            <w:proofErr w:type="gramEnd"/>
-            <w:r>
-              <w:rPr>
-                <w:b/>
-                <w:snapToGrid/>
-                <w:sz w:val="16"/>
-                <w:szCs w:val="16"/>
-              </w:rPr>
-              <w:t>L</w:t>
+              <w:t>Length(L</w:t>
             </w:r>
             <w:r>
               <w:rPr>
@@ -25310,7 +25028,6 @@
               </w:rPr>
               <w:t xml:space="preserve">= </w:t>
             </w:r>
-            <w:proofErr w:type="gramStart"/>
             <w:r>
               <w:rPr>
                 <w:b/>
@@ -25318,17 +25035,7 @@
                 <w:sz w:val="16"/>
                 <w:szCs w:val="16"/>
               </w:rPr>
-              <w:t>Length(</w:t>
-            </w:r>
-            <w:proofErr w:type="gramEnd"/>
-            <w:r>
-              <w:rPr>
-                <w:b/>
-                <w:snapToGrid/>
-                <w:sz w:val="16"/>
-                <w:szCs w:val="16"/>
-              </w:rPr>
-              <w:t>L</w:t>
+              <w:t>Length(L</w:t>
             </w:r>
             <w:r>
               <w:rPr>
@@ -25457,7 +25164,6 @@
               </w:rPr>
               <w:t xml:space="preserve"> = </w:t>
             </w:r>
-            <w:proofErr w:type="gramStart"/>
             <w:r>
               <w:rPr>
                 <w:b/>
@@ -25478,7 +25184,6 @@
               </w:rPr>
               <w:t>(</w:t>
             </w:r>
-            <w:proofErr w:type="gramEnd"/>
             <m:oMath>
               <m:sSub>
                 <m:sSubPr>
@@ -26050,15 +25755,7 @@
         <w:t xml:space="preserve"> grids of data were </w:t>
       </w:r>
       <w:r>
-        <w:t xml:space="preserve">used for outcome modelling, in which two </w:t>
-      </w:r>
-      <w:proofErr w:type="spellStart"/>
-      <w:r>
-        <w:t>AutoML</w:t>
-      </w:r>
-      <w:proofErr w:type="spellEnd"/>
-      <w:r>
-        <w:t xml:space="preserve"> regression models were built to predict the number of MVCs in each grid cell.</w:t>
+        <w:t>used for outcome modelling, in which two AutoML regression models were built to predict the number of MVCs in each grid cell.</w:t>
       </w:r>
       <w:r>
         <w:t xml:space="preserve"> </w:t>
@@ -26099,9 +25796,9 @@
         </w:rPr>
         <w:lastRenderedPageBreak/>
         <w:drawing>
-          <wp:inline distT="0" distB="0" distL="0" distR="0" wp14:anchorId="17F7A8F7" wp14:editId="780539F7">
-            <wp:extent cx="5108954" cy="6195017"/>
-            <wp:effectExtent l="0" t="0" r="0" b="3175"/>
+          <wp:inline distT="0" distB="0" distL="0" distR="0" wp14:anchorId="17F7A8F7" wp14:editId="2EED05D2">
+            <wp:extent cx="4972953" cy="6415545"/>
+            <wp:effectExtent l="0" t="0" r="5715" b="0"/>
             <wp:docPr id="482265357" name="Picture 6"/>
             <wp:cNvGraphicFramePr>
               <a:graphicFrameLocks xmlns:a="http://schemas.openxmlformats.org/drawingml/2006/main" noChangeAspect="1"/>
@@ -26122,7 +25819,7 @@
                   <pic:spPr>
                     <a:xfrm>
                       <a:off x="0" y="0"/>
-                      <a:ext cx="5108954" cy="6195017"/>
+                      <a:ext cx="4972953" cy="6415545"/>
                     </a:xfrm>
                     <a:prstGeom prst="rect">
                       <a:avLst/>
@@ -26345,116 +26042,179 @@
         <w:pStyle w:val="MDPI31text"/>
       </w:pPr>
       <w:r>
-        <w:t xml:space="preserve">Regression-based </w:t>
-      </w:r>
-      <w:proofErr w:type="spellStart"/>
-      <w:r>
-        <w:t>AutoML</w:t>
-      </w:r>
-      <w:proofErr w:type="spellEnd"/>
-      <w:r>
-        <w:t xml:space="preserve"> models </w:t>
+        <w:lastRenderedPageBreak/>
+        <w:t xml:space="preserve">Regression-based AutoML models </w:t>
       </w:r>
       <w:r>
         <w:rPr>
           <w:i/>
           <w:iCs/>
         </w:rPr>
-        <w:t>auto-</w:t>
-      </w:r>
-      <w:proofErr w:type="spellStart"/>
+        <w:t>auto-sklearn</w:t>
+      </w:r>
+      <w:r>
+        <w:t xml:space="preserve"> and </w:t>
+      </w:r>
       <w:r>
         <w:rPr>
           <w:i/>
           <w:iCs/>
         </w:rPr>
-        <w:t>sklearn</w:t>
-      </w:r>
-      <w:proofErr w:type="spellEnd"/>
-      <w:r>
-        <w:t xml:space="preserve"> and </w:t>
-      </w:r>
-      <w:proofErr w:type="spellStart"/>
+        <w:t>tpot</w:t>
+      </w:r>
+      <w:r>
+        <w:t xml:space="preserve"> were built for each of the three set of standardized grids, which produced six models (two for each 10 by 10, 40 by 40, and 80 by 80 grid).</w:t>
+      </w:r>
+      <w:r>
+        <w:t xml:space="preserve"> Out of the six models, the </w:t>
+      </w:r>
+      <w:r>
+        <w:t>8</w:t>
+      </w:r>
+      <w:r>
+        <w:t xml:space="preserve">0 by </w:t>
+      </w:r>
+      <w:r>
+        <w:t>8</w:t>
+      </w:r>
+      <w:r>
+        <w:t xml:space="preserve">0 </w:t>
+      </w:r>
+      <w:r>
+        <w:t>grid</w:t>
+      </w:r>
+      <w:r>
+        <w:t xml:space="preserve"> </w:t>
+      </w:r>
       <w:r>
         <w:rPr>
           <w:i/>
           <w:iCs/>
         </w:rPr>
-        <w:t>tpot</w:t>
-      </w:r>
-      <w:proofErr w:type="spellEnd"/>
-      <w:r>
-        <w:t xml:space="preserve"> were built for each of the three set of standardized grids, which produced six models (two for each 10 by 10, 40 by </w:t>
-      </w:r>
-      <w:r>
-        <w:lastRenderedPageBreak/>
-        <w:t>40, and 80 by 80 grid).</w:t>
-      </w:r>
-      <w:r>
-        <w:t xml:space="preserve"> Out of the six models, the </w:t>
-      </w:r>
-      <w:r>
-        <w:t>8</w:t>
-      </w:r>
-      <w:r>
-        <w:t xml:space="preserve">0 by </w:t>
-      </w:r>
-      <w:r>
-        <w:t>8</w:t>
-      </w:r>
-      <w:r>
-        <w:t xml:space="preserve">0 </w:t>
-      </w:r>
-      <w:r>
-        <w:t>grid</w:t>
-      </w:r>
-      <w:r>
-        <w:t xml:space="preserve"> </w:t>
-      </w:r>
-      <w:proofErr w:type="spellStart"/>
+        <w:t>autosklearn</w:t>
+      </w:r>
       <w:r>
         <w:rPr>
           <w:i/>
           <w:iCs/>
         </w:rPr>
-        <w:t>autosklearn</w:t>
-      </w:r>
-      <w:proofErr w:type="spellEnd"/>
+        <w:t xml:space="preserve"> </w:t>
+      </w:r>
+      <w:r>
+        <w:t xml:space="preserve">model had the best performance </w:t>
+      </w:r>
+      <w:r>
+        <w:t>(</w:t>
+      </w:r>
+      <w:r>
+        <w:t xml:space="preserve">lowest </w:t>
+      </w:r>
+      <w:r>
+        <w:t>MAE=</w:t>
+      </w:r>
+      <w:r>
+        <w:t>82.95</w:t>
+      </w:r>
+      <w:r>
+        <w:t xml:space="preserve">), </w:t>
+      </w:r>
+      <w:r>
+        <w:t xml:space="preserve">while the 10 by 10 </w:t>
+      </w:r>
+      <w:r>
+        <w:t>grid</w:t>
+      </w:r>
+      <w:r>
+        <w:t xml:space="preserve"> </w:t>
+      </w:r>
       <w:r>
         <w:rPr>
           <w:i/>
           <w:iCs/>
         </w:rPr>
+        <w:t>autosklearn</w:t>
+      </w:r>
+      <w:r>
+        <w:t xml:space="preserve"> model had the worst performance </w:t>
+      </w:r>
+      <w:r>
+        <w:t>(</w:t>
+      </w:r>
+      <w:r>
+        <w:t xml:space="preserve">highest </w:t>
+      </w:r>
+      <w:r>
+        <w:t>MAE</w:t>
+      </w:r>
+      <w:r>
+        <w:t>=</w:t>
+      </w:r>
+      <w:r>
+        <w:t>1</w:t>
+      </w:r>
+      <w:r>
+        <w:t>241.93</w:t>
+      </w:r>
+      <w:r>
+        <w:t>)</w:t>
+      </w:r>
+      <w:r>
+        <w:t>.</w:t>
+      </w:r>
+      <w:r>
         <w:t xml:space="preserve"> </w:t>
       </w:r>
       <w:r>
-        <w:t xml:space="preserve">model had the best performance </w:t>
-      </w:r>
-      <w:r>
-        <w:t>(</w:t>
-      </w:r>
-      <w:r>
-        <w:t xml:space="preserve">lowest </w:t>
-      </w:r>
-      <w:r>
-        <w:t>MAE=</w:t>
-      </w:r>
-      <w:r>
-        <w:t>82.95</w:t>
-      </w:r>
-      <w:r>
-        <w:t xml:space="preserve">), </w:t>
-      </w:r>
-      <w:r>
-        <w:t xml:space="preserve">while the 10 by 10 </w:t>
-      </w:r>
-      <w:r>
-        <w:t>grid</w:t>
-      </w:r>
-      <w:r>
-        <w:t xml:space="preserve"> </w:t>
-      </w:r>
-      <w:proofErr w:type="spellStart"/>
+        <w:t xml:space="preserve">The performances improved with higher </w:t>
+      </w:r>
+      <w:r>
+        <w:t xml:space="preserve">cell counts </w:t>
+      </w:r>
+      <w:r>
+        <w:t>from 40</w:t>
+      </w:r>
+      <w:r>
+        <w:t xml:space="preserve"> by 40</w:t>
+      </w:r>
+      <w:r>
+        <w:t xml:space="preserve"> to 80</w:t>
+      </w:r>
+      <w:r>
+        <w:t xml:space="preserve"> by 80</w:t>
+      </w:r>
+      <w:r>
+        <w:t xml:space="preserve"> grids, with the greatest improvement </w:t>
+      </w:r>
+      <w:r>
+        <w:t>seen in</w:t>
+      </w:r>
+      <w:r>
+        <w:t xml:space="preserve"> 10</w:t>
+      </w:r>
+      <w:r>
+        <w:t xml:space="preserve"> by 10</w:t>
+      </w:r>
+      <w:r>
+        <w:t xml:space="preserve"> to 40</w:t>
+      </w:r>
+      <w:r>
+        <w:t xml:space="preserve"> by 40</w:t>
+      </w:r>
+      <w:r>
+        <w:t xml:space="preserve"> grid models</w:t>
+      </w:r>
+      <w:r>
+        <w:t xml:space="preserve"> (</w:t>
+      </w:r>
+      <w:r>
+        <w:t>-1039 and -951</w:t>
+      </w:r>
+      <w:r>
+        <w:t xml:space="preserve"> MAE</w:t>
+      </w:r>
+      <w:r>
+        <w:t xml:space="preserve"> for </w:t>
+      </w:r>
       <w:r>
         <w:rPr>
           <w:i/>
@@ -26462,130 +26222,35 @@
         </w:rPr>
         <w:t>autosklearn</w:t>
       </w:r>
-      <w:proofErr w:type="spellEnd"/>
-      <w:r>
-        <w:t xml:space="preserve"> model had the worst performance </w:t>
-      </w:r>
-      <w:r>
-        <w:t>(</w:t>
-      </w:r>
-      <w:r>
-        <w:t xml:space="preserve">highest </w:t>
-      </w:r>
-      <w:r>
-        <w:t>MAE</w:t>
-      </w:r>
-      <w:r>
-        <w:t>=</w:t>
-      </w:r>
-      <w:r>
-        <w:t>1</w:t>
-      </w:r>
-      <w:r>
-        <w:t>241.93</w:t>
-      </w:r>
-      <w:r>
-        <w:t>)</w:t>
-      </w:r>
-      <w:r>
-        <w:t>.</w:t>
-      </w:r>
-      <w:r>
-        <w:t xml:space="preserve"> </w:t>
-      </w:r>
-      <w:r>
-        <w:t xml:space="preserve">The performances improved with higher </w:t>
-      </w:r>
-      <w:r>
-        <w:t xml:space="preserve">cell counts </w:t>
-      </w:r>
-      <w:r>
-        <w:t>from 40</w:t>
-      </w:r>
-      <w:r>
-        <w:t xml:space="preserve"> by 40</w:t>
-      </w:r>
-      <w:r>
-        <w:t xml:space="preserve"> to 80</w:t>
-      </w:r>
-      <w:r>
-        <w:t xml:space="preserve"> by 80</w:t>
-      </w:r>
-      <w:r>
-        <w:t xml:space="preserve"> grids, with the greatest improvement </w:t>
-      </w:r>
-      <w:r>
-        <w:t>seen in</w:t>
-      </w:r>
-      <w:r>
-        <w:t xml:space="preserve"> 10</w:t>
-      </w:r>
-      <w:r>
-        <w:t xml:space="preserve"> by 10</w:t>
-      </w:r>
-      <w:r>
-        <w:t xml:space="preserve"> to 40</w:t>
-      </w:r>
-      <w:r>
-        <w:t xml:space="preserve"> by 40</w:t>
-      </w:r>
-      <w:r>
-        <w:t xml:space="preserve"> grid models</w:t>
-      </w:r>
-      <w:r>
-        <w:t xml:space="preserve"> (</w:t>
-      </w:r>
-      <w:r>
-        <w:t>-1039 and -951</w:t>
-      </w:r>
-      <w:r>
-        <w:t xml:space="preserve"> MAE</w:t>
-      </w:r>
-      <w:r>
-        <w:t xml:space="preserve"> for </w:t>
-      </w:r>
-      <w:proofErr w:type="spellStart"/>
+      <w:r>
+        <w:t xml:space="preserve"> and </w:t>
+      </w:r>
       <w:r>
         <w:rPr>
           <w:i/>
           <w:iCs/>
         </w:rPr>
-        <w:t>autosklearn</w:t>
-      </w:r>
-      <w:proofErr w:type="spellEnd"/>
-      <w:r>
-        <w:t xml:space="preserve"> and </w:t>
-      </w:r>
-      <w:proofErr w:type="spellStart"/>
+        <w:t>tpot</w:t>
+      </w:r>
+      <w:r>
+        <w:t xml:space="preserve"> respectively</w:t>
+      </w:r>
+      <w:r>
+        <w:t>)</w:t>
+      </w:r>
+      <w:r>
+        <w:t>.</w:t>
+      </w:r>
+      <w:r>
+        <w:t xml:space="preserve"> The 80 by 80 grid </w:t>
+      </w:r>
       <w:r>
         <w:rPr>
           <w:i/>
           <w:iCs/>
         </w:rPr>
-        <w:t>tpot</w:t>
-      </w:r>
-      <w:proofErr w:type="spellEnd"/>
-      <w:r>
-        <w:t xml:space="preserve"> respectively</w:t>
-      </w:r>
-      <w:r>
-        <w:t>)</w:t>
-      </w:r>
-      <w:r>
-        <w:t>.</w:t>
-      </w:r>
-      <w:r>
-        <w:t xml:space="preserve"> The 80 by 80 grid </w:t>
-      </w:r>
-      <w:proofErr w:type="spellStart"/>
-      <w:r>
-        <w:rPr>
-          <w:i/>
-          <w:iCs/>
-        </w:rPr>
         <w:t>autosklearn</w:t>
       </w:r>
-      <w:proofErr w:type="spellEnd"/>
       <w:r>
         <w:t xml:space="preserve"> model was selected as the best model for the geo-intervention generation component.</w:t>
       </w:r>
@@ -26756,7 +26421,6 @@
         </w:rPr>
         <w:t xml:space="preserve">With the 80 by 80 grid </w:t>
       </w:r>
-      <w:proofErr w:type="spellStart"/>
       <w:r>
         <w:rPr>
           <w:i/>
@@ -26765,7 +26429,6 @@
         </w:rPr>
         <w:t>autosklearn</w:t>
       </w:r>
-      <w:proofErr w:type="spellEnd"/>
       <w:r>
         <w:rPr>
           <w:lang w:val="en"/>
@@ -26864,21 +26527,7 @@
         <w:rPr>
           <w:lang w:val="en"/>
         </w:rPr>
-        <w:t xml:space="preserve"> The most important variable was the number of arterial roads, followed by the number of </w:t>
-      </w:r>
-      <w:proofErr w:type="gramStart"/>
-      <w:r>
-        <w:rPr>
-          <w:lang w:val="en"/>
-        </w:rPr>
-        <w:t>red light</w:t>
-      </w:r>
-      <w:proofErr w:type="gramEnd"/>
-      <w:r>
-        <w:rPr>
-          <w:lang w:val="en"/>
-        </w:rPr>
-        <w:t xml:space="preserve"> cameras</w:t>
+        <w:t xml:space="preserve"> The most important variable was the number of arterial roads, followed by the number of red light cameras</w:t>
       </w:r>
       <w:r>
         <w:rPr>
@@ -26890,21 +26539,39 @@
         <w:rPr>
           <w:lang w:val="en"/>
         </w:rPr>
-        <w:t xml:space="preserve"> The rest of the variables with variable importance lower than 0.005 were mostly related to traffic volumes and crime occurrences, with a few related to infrastructure (wayfinding, fire hydrants, public art locations, litter receptacles), and one related to the curvature (sinuosity) of road </w:t>
-      </w:r>
-      <w:proofErr w:type="spellStart"/>
-      <w:r>
-        <w:rPr>
-          <w:lang w:val="en"/>
-        </w:rPr>
-        <w:t>centrelines</w:t>
-      </w:r>
-      <w:proofErr w:type="spellEnd"/>
-      <w:r>
-        <w:rPr>
-          <w:lang w:val="en"/>
-        </w:rPr>
-        <w:t>.</w:t>
+        <w:t xml:space="preserve"> The rest of the variables with variable importance lower than 0.005 were mostly related to traffic volumes and crime occurrences, with a few related to infrastructure (wayfinding, fire hydrants, public art locations, litter receptacles), and one related to the curvature (sinuosity) of road centrelines.</w:t>
+      </w:r>
+      <w:r>
+        <w:rPr>
+          <w:lang w:val="en"/>
+        </w:rPr>
+        <w:t xml:space="preserve"> The most important traffic volume related variable was </w:t>
+      </w:r>
+      <w:r>
+        <w:rPr>
+          <w:i/>
+          <w:iCs/>
+          <w:lang w:val="en"/>
+        </w:rPr>
+        <w:t>traffic_eb_cars_l_sum</w:t>
+      </w:r>
+      <w:r>
+        <w:rPr>
+          <w:lang w:val="en"/>
+        </w:rPr>
+        <w:t xml:space="preserve">, the total volume of left-turning eastbound cars. This variable was selected for defining the </w:t>
+      </w:r>
+      <w:r>
+        <w:rPr>
+          <w:lang w:val="en"/>
+        </w:rPr>
+        <w:t xml:space="preserve">higher than average traffic areas constraint </w:t>
+      </w:r>
+      <w:r>
+        <w:rPr>
+          <w:lang w:val="en"/>
+        </w:rPr>
+        <w:t>for scenario one.</w:t>
       </w:r>
     </w:p>
     <w:p>
@@ -26924,6 +26591,7 @@
         <w:rPr>
           <w:noProof/>
         </w:rPr>
+        <w:lastRenderedPageBreak/>
         <w:drawing>
           <wp:inline distT="0" distB="0" distL="0" distR="0" wp14:anchorId="48E99B9E" wp14:editId="66A05A03">
             <wp:extent cx="4569073" cy="2206977"/>
@@ -27027,11 +26695,9 @@
       <w:r>
         <w:t xml:space="preserve">Top 25 most important variables for 80 by 80 grid </w:t>
       </w:r>
-      <w:proofErr w:type="spellStart"/>
       <w:r>
         <w:t>autosklearn</w:t>
       </w:r>
-      <w:proofErr w:type="spellEnd"/>
       <w:r>
         <w:rPr>
           <w:i/>
@@ -27054,36 +26720,19 @@
         <w:rPr>
           <w:lang w:val="en"/>
         </w:rPr>
-        <w:lastRenderedPageBreak/>
-        <w:t xml:space="preserve">The top 25 most important infrastructure-related variables are shown in Figure 7. Asides from the number of </w:t>
-      </w:r>
-      <w:proofErr w:type="gramStart"/>
-      <w:r>
-        <w:rPr>
-          <w:lang w:val="en"/>
-        </w:rPr>
-        <w:t>red light</w:t>
-      </w:r>
-      <w:proofErr w:type="gramEnd"/>
-      <w:r>
-        <w:rPr>
-          <w:lang w:val="en"/>
-        </w:rPr>
-        <w:t xml:space="preserve"> cameras and transit shelters being the top variables, the number of wayfinding structures, fire hydrants, public art locations, and litter receptacles were among the top most important infrastructure-related variables. Other variables with variable importance less than 0.002 were related to bicycle, Watch Your Speed (WYS) program, school, and cultural hotspot infrastructure. The top three infrastructure variables selected as the actions were the number of </w:t>
-      </w:r>
-      <w:proofErr w:type="gramStart"/>
-      <w:r>
-        <w:rPr>
-          <w:lang w:val="en"/>
-        </w:rPr>
-        <w:t>red light</w:t>
-      </w:r>
-      <w:proofErr w:type="gramEnd"/>
-      <w:r>
-        <w:rPr>
-          <w:lang w:val="en"/>
-        </w:rPr>
-        <w:t xml:space="preserve"> cameras, the number of transit shelters, and the number of wayfinding structures according to their variable importance.</w:t>
+        <w:t>The top 25 most important infrastructure-related variables are shown in Figure 7. Asides from the number of red light cameras and transit shelters being the top variables, the number of wayfinding structures, fire hydrants, public art locations, and litter receptacles were among the top most important infrastructure-related variables. Other variables with variable importance less than 0.002 were related to bicycle, Watch Your Speed (WYS) program, school, and cultural hotspot infrastructure. The top three infrastructure variables selected as the actions</w:t>
+      </w:r>
+      <w:r>
+        <w:rPr>
+          <w:lang w:val="en"/>
+        </w:rPr>
+        <w:t xml:space="preserve"> for scenarios one and two</w:t>
+      </w:r>
+      <w:r>
+        <w:rPr>
+          <w:lang w:val="en"/>
+        </w:rPr>
+        <w:t xml:space="preserve"> were the number of red light cameras, the number of transit shelters, and the number of wayfinding structures according to their variable importance.</w:t>
       </w:r>
     </w:p>
     <w:p>
@@ -27204,11 +26853,9 @@
       <w:r>
         <w:t xml:space="preserve">variables for 80 by 80 grid </w:t>
       </w:r>
-      <w:proofErr w:type="spellStart"/>
       <w:r>
         <w:t>autosklearn</w:t>
       </w:r>
-      <w:proofErr w:type="spellEnd"/>
       <w:r>
         <w:rPr>
           <w:i/>
@@ -27225,23 +26872,119 @@
         <w:pStyle w:val="MDPI31text"/>
       </w:pPr>
       <w:r>
-        <w:t>x.</w:t>
+        <w:t>Geo</w:t>
+      </w:r>
+      <w:r>
+        <w:t>-interventions were generated</w:t>
+      </w:r>
+      <w:r>
+        <w:t xml:space="preserve"> </w:t>
+      </w:r>
+      <w:r>
+        <w:t>using</w:t>
+      </w:r>
+      <w:r>
+        <w:t xml:space="preserve"> the 80 by 80 grid autosklearn model</w:t>
+      </w:r>
+      <w:r>
+        <w:t>,</w:t>
+      </w:r>
+      <w:r>
+        <w:t xml:space="preserve"> </w:t>
+      </w:r>
+      <w:r>
+        <w:t>1</w:t>
+      </w:r>
+      <w:r>
+        <w:t>1</w:t>
+      </w:r>
+      <w:r>
+        <w:t>0</w:t>
+      </w:r>
+      <w:r>
+        <w:t>1</w:t>
+      </w:r>
+      <w:r>
+        <w:t xml:space="preserve"> iterations of Bayesian Optimization</w:t>
+      </w:r>
+      <w:r>
+        <w:t xml:space="preserve">, and </w:t>
+      </w:r>
+      <w:r>
+        <w:t>the top three most important infrastructure variables, namely the red light camera, transit shelter, and wayfinding structure counts</w:t>
+      </w:r>
+      <w:r>
+        <w:t>.</w:t>
+      </w:r>
+      <w:r>
+        <w:t xml:space="preserve"> Recall that in scenario one, Bayesian Optimization was constrained to grid cells with higher than average traffic, while in scenario two, optimization was constrained to grid cells with lower than average red light camera, transit shelter, and wayfinding structure counts.</w:t>
+      </w:r>
+      <w:r>
+        <w:t xml:space="preserve"> In scenario one,</w:t>
+      </w:r>
+      <w:r>
+        <w:t xml:space="preserve"> the best geo-intervention occurred in iteration 983</w:t>
+      </w:r>
+      <w:r>
+        <w:t xml:space="preserve"> (Figure 8)</w:t>
+      </w:r>
+      <w:r>
+        <w:t xml:space="preserve"> with a predicted 554,584 MVC, a reduction of 33,606 (5.7%)</w:t>
+      </w:r>
+      <w:r>
+        <w:t xml:space="preserve"> </w:t>
+      </w:r>
+      <w:r>
+        <w:t>compared to the initial 588,190 MVC</w:t>
+      </w:r>
+      <w:r>
+        <w:t xml:space="preserve">, </w:t>
+      </w:r>
+      <w:r>
+        <w:lastRenderedPageBreak/>
+        <w:t>while in scenario two, none of the iterations resulted in a reduction in predicted MVC over the initial iteration</w:t>
+      </w:r>
+      <w:r>
+        <w:t xml:space="preserve"> (Figure 9)</w:t>
+      </w:r>
+      <w:r>
+        <w:t>.</w:t>
+      </w:r>
+      <w:r>
+        <w:t xml:space="preserve"> In scenario one, changes in red light cameras were spread out away from the downtown Toronto area, changes in transit shelters were more concentrated in the downtown area, and changes in wayfinding structures were mostly concentrated in the downtown area and </w:t>
+      </w:r>
+      <w:r>
+        <w:t xml:space="preserve">along the center and </w:t>
+      </w:r>
+      <w:r>
+        <w:t>lower</w:t>
+      </w:r>
+      <w:r>
+        <w:t xml:space="preserve"> </w:t>
+      </w:r>
+      <w:r>
+        <w:t>portions</w:t>
+      </w:r>
+      <w:r>
+        <w:t xml:space="preserve"> (Figure 10).</w:t>
+      </w:r>
+      <w:r>
+        <w:t xml:space="preserve"> Similarly, the changes in predicted MVC were more concentrated in the downtown area and more spread out away from the downtown core.</w:t>
       </w:r>
     </w:p>
     <w:p>
       <w:pPr>
         <w:pStyle w:val="MDPI52figure"/>
-        <w:jc w:val="right"/>
       </w:pPr>
       <w:r>
         <w:rPr>
           <w:noProof/>
         </w:rPr>
         <w:drawing>
-          <wp:inline distT="0" distB="0" distL="0" distR="0" wp14:anchorId="142D5E5E" wp14:editId="3D99D567">
-            <wp:extent cx="4965468" cy="2921413"/>
-            <wp:effectExtent l="0" t="0" r="635" b="0"/>
-            <wp:docPr id="539038463" name="Picture 539038463" descr="A graph with text and numbers&#10;&#10;AI-generated content may be incorrect."/>
+          <wp:inline distT="0" distB="0" distL="0" distR="0" wp14:anchorId="5D764B19" wp14:editId="5021D6DD">
+            <wp:extent cx="3395303" cy="2668904"/>
+            <wp:effectExtent l="0" t="0" r="0" b="0"/>
+            <wp:docPr id="553591460" name="Picture 553591460"/>
             <wp:cNvGraphicFramePr>
               <a:graphicFrameLocks xmlns:a="http://schemas.openxmlformats.org/drawingml/2006/main" noChangeAspect="1"/>
             </wp:cNvGraphicFramePr>
@@ -27249,13 +26992,13 @@
               <a:graphicData uri="http://schemas.openxmlformats.org/drawingml/2006/picture">
                 <pic:pic xmlns:pic="http://schemas.openxmlformats.org/drawingml/2006/picture">
                   <pic:nvPicPr>
-                    <pic:cNvPr id="539038463" name="Picture 539038463" descr="A graph with text and numbers&#10;&#10;AI-generated content may be incorrect."/>
+                    <pic:cNvPr id="553591460" name="Picture 553591460"/>
                     <pic:cNvPicPr>
                       <a:picLocks/>
                     </pic:cNvPicPr>
                   </pic:nvPicPr>
                   <pic:blipFill>
-                    <a:blip r:embed="rId15"/>
+                    <a:blip r:embed="rId16"/>
                     <a:stretch>
                       <a:fillRect/>
                     </a:stretch>
@@ -27263,7 +27006,7 @@
                   <pic:spPr bwMode="auto">
                     <a:xfrm>
                       <a:off x="0" y="0"/>
-                      <a:ext cx="5176899" cy="3045808"/>
+                      <a:ext cx="3395303" cy="2668904"/>
                     </a:xfrm>
                     <a:prstGeom prst="rect">
                       <a:avLst/>
@@ -27335,19 +27078,14 @@
         <w:t>.</w:t>
       </w:r>
       <w:r>
-        <w:t xml:space="preserve"> </w:t>
-      </w:r>
-      <w:r>
-        <w:t>Scenario 1 using</w:t>
-      </w:r>
-      <w:r>
-        <w:t xml:space="preserve"> 80 by 80 grid </w:t>
-      </w:r>
-      <w:proofErr w:type="spellStart"/>
-      <w:r>
-        <w:t>autosklearn</w:t>
-      </w:r>
-      <w:proofErr w:type="spellEnd"/>
+        <w:t xml:space="preserve"> Bayesian optimization</w:t>
+      </w:r>
+      <w:r>
+        <w:t xml:space="preserve"> iterations</w:t>
+      </w:r>
+      <w:r>
+        <w:t xml:space="preserve"> for scenario 1 using 80 by 80 grid autosklearn</w:t>
+      </w:r>
       <w:r>
         <w:rPr>
           <w:i/>
@@ -27362,18 +27100,16 @@
     <w:p>
       <w:pPr>
         <w:pStyle w:val="MDPI52figure"/>
-        <w:jc w:val="right"/>
       </w:pPr>
       <w:r>
         <w:rPr>
           <w:noProof/>
         </w:rPr>
-        <w:lastRenderedPageBreak/>
         <w:drawing>
-          <wp:inline distT="0" distB="0" distL="0" distR="0" wp14:anchorId="7FD00207" wp14:editId="1D0C04D9">
-            <wp:extent cx="4965468" cy="2921413"/>
+          <wp:inline distT="0" distB="0" distL="0" distR="0" wp14:anchorId="7A0819DC" wp14:editId="54878D54">
+            <wp:extent cx="3453881" cy="2873839"/>
             <wp:effectExtent l="0" t="0" r="635" b="0"/>
-            <wp:docPr id="1833426649" name="Picture 1833426649" descr="A graph with text and numbers&#10;&#10;AI-generated content may be incorrect."/>
+            <wp:docPr id="1261308475" name="Picture 1261308475"/>
             <wp:cNvGraphicFramePr>
               <a:graphicFrameLocks xmlns:a="http://schemas.openxmlformats.org/drawingml/2006/main" noChangeAspect="1"/>
             </wp:cNvGraphicFramePr>
@@ -27381,13 +27117,13 @@
               <a:graphicData uri="http://schemas.openxmlformats.org/drawingml/2006/picture">
                 <pic:pic xmlns:pic="http://schemas.openxmlformats.org/drawingml/2006/picture">
                   <pic:nvPicPr>
-                    <pic:cNvPr id="1833426649" name="Picture 1833426649" descr="A graph with text and numbers&#10;&#10;AI-generated content may be incorrect."/>
+                    <pic:cNvPr id="1261308475" name="Picture 1261308475"/>
                     <pic:cNvPicPr>
                       <a:picLocks/>
                     </pic:cNvPicPr>
                   </pic:nvPicPr>
                   <pic:blipFill>
-                    <a:blip r:embed="rId15"/>
+                    <a:blip r:embed="rId17"/>
                     <a:stretch>
                       <a:fillRect/>
                     </a:stretch>
@@ -27395,7 +27131,7 @@
                   <pic:spPr bwMode="auto">
                     <a:xfrm>
                       <a:off x="0" y="0"/>
-                      <a:ext cx="5176899" cy="3045808"/>
+                      <a:ext cx="3453881" cy="2873839"/>
                     </a:xfrm>
                     <a:prstGeom prst="rect">
                       <a:avLst/>
@@ -27467,19 +27203,141 @@
         <w:t>.</w:t>
       </w:r>
       <w:r>
+        <w:t xml:space="preserve"> Bayesian optimization</w:t>
+      </w:r>
+      <w:r>
+        <w:t xml:space="preserve"> iterations</w:t>
+      </w:r>
+      <w:r>
+        <w:t xml:space="preserve"> for scenario 2 using 80 by 80 grid autosklearn</w:t>
+      </w:r>
+      <w:r>
+        <w:rPr>
+          <w:i/>
+          <w:iCs/>
+        </w:rPr>
         <w:t xml:space="preserve"> </w:t>
       </w:r>
       <w:r>
-        <w:t>Scenario 2 using</w:t>
-      </w:r>
-      <w:r>
-        <w:t xml:space="preserve"> 80 by 80 grid </w:t>
-      </w:r>
-      <w:proofErr w:type="spellStart"/>
-      <w:r>
-        <w:t>autosklearn</w:t>
-      </w:r>
-      <w:proofErr w:type="spellEnd"/>
+        <w:t>model.</w:t>
+      </w:r>
+    </w:p>
+    <w:p>
+      <w:pPr>
+        <w:pStyle w:val="MDPI52figure"/>
+        <w:jc w:val="right"/>
+      </w:pPr>
+      <w:r>
+        <w:rPr>
+          <w:noProof/>
+        </w:rPr>
+        <w:lastRenderedPageBreak/>
+        <w:drawing>
+          <wp:inline distT="0" distB="0" distL="0" distR="0" wp14:anchorId="142D5E5E" wp14:editId="67B1EC64">
+            <wp:extent cx="4967323" cy="3095217"/>
+            <wp:effectExtent l="0" t="0" r="0" b="3810"/>
+            <wp:docPr id="539038463" name="Picture 539038463"/>
+            <wp:cNvGraphicFramePr>
+              <a:graphicFrameLocks xmlns:a="http://schemas.openxmlformats.org/drawingml/2006/main" noChangeAspect="1"/>
+            </wp:cNvGraphicFramePr>
+            <a:graphic xmlns:a="http://schemas.openxmlformats.org/drawingml/2006/main">
+              <a:graphicData uri="http://schemas.openxmlformats.org/drawingml/2006/picture">
+                <pic:pic xmlns:pic="http://schemas.openxmlformats.org/drawingml/2006/picture">
+                  <pic:nvPicPr>
+                    <pic:cNvPr id="539038463" name="Picture 539038463"/>
+                    <pic:cNvPicPr>
+                      <a:picLocks/>
+                    </pic:cNvPicPr>
+                  </pic:nvPicPr>
+                  <pic:blipFill>
+                    <a:blip r:embed="rId18"/>
+                    <a:stretch>
+                      <a:fillRect/>
+                    </a:stretch>
+                  </pic:blipFill>
+                  <pic:spPr bwMode="auto">
+                    <a:xfrm>
+                      <a:off x="0" y="0"/>
+                      <a:ext cx="5005267" cy="3118861"/>
+                    </a:xfrm>
+                    <a:prstGeom prst="rect">
+                      <a:avLst/>
+                    </a:prstGeom>
+                    <a:noFill/>
+                    <a:ln>
+                      <a:noFill/>
+                    </a:ln>
+                  </pic:spPr>
+                </pic:pic>
+              </a:graphicData>
+            </a:graphic>
+          </wp:inline>
+        </w:drawing>
+      </w:r>
+    </w:p>
+    <w:p>
+      <w:pPr>
+        <w:pStyle w:val="MDPI51figurecaption"/>
+      </w:pPr>
+      <w:r>
+        <w:rPr>
+          <w:b/>
+          <w:bCs/>
+        </w:rPr>
+        <w:t xml:space="preserve">Figure </w:t>
+      </w:r>
+      <w:r>
+        <w:rPr>
+          <w:b/>
+          <w:bCs/>
+        </w:rPr>
+        <w:fldChar w:fldCharType="begin"/>
+      </w:r>
+      <w:r>
+        <w:rPr>
+          <w:b/>
+          <w:bCs/>
+        </w:rPr>
+        <w:instrText xml:space="preserve"> SEQ Figure \* ARABIC </w:instrText>
+      </w:r>
+      <w:r>
+        <w:rPr>
+          <w:b/>
+          <w:bCs/>
+        </w:rPr>
+        <w:fldChar w:fldCharType="separate"/>
+      </w:r>
+      <w:r>
+        <w:rPr>
+          <w:b/>
+          <w:bCs/>
+          <w:noProof/>
+        </w:rPr>
+        <w:t>10</w:t>
+      </w:r>
+      <w:r>
+        <w:rPr>
+          <w:b/>
+          <w:bCs/>
+        </w:rPr>
+        <w:fldChar w:fldCharType="end"/>
+      </w:r>
+      <w:r>
+        <w:rPr>
+          <w:b/>
+          <w:bCs/>
+        </w:rPr>
+        <w:t>.</w:t>
+      </w:r>
+      <w:r>
+        <w:t xml:space="preserve"> </w:t>
+      </w:r>
+      <w:r>
+        <w:t>Scenario 1 using</w:t>
+      </w:r>
+      <w:r>
+        <w:t xml:space="preserve"> 80 by 80 grid autosklearn</w:t>
+      </w:r>
       <w:r>
         <w:rPr>
           <w:i/>
@@ -27731,15 +27589,7 @@
         <w:t xml:space="preserve">s: </w:t>
       </w:r>
       <w:r>
-        <w:t xml:space="preserve">Conceptualization, Richard Wen; methodology, Richard Wen, </w:t>
-      </w:r>
-      <w:proofErr w:type="spellStart"/>
-      <w:r>
-        <w:t>Songnian</w:t>
-      </w:r>
-      <w:proofErr w:type="spellEnd"/>
-      <w:r>
-        <w:t xml:space="preserve"> Li; </w:t>
+        <w:t xml:space="preserve">Conceptualization, Richard Wen; methodology, Richard Wen, Songnian Li; </w:t>
       </w:r>
       <w:r>
         <w:t>i</w:t>
@@ -27751,29 +27601,13 @@
         <w:t>i</w:t>
       </w:r>
       <w:r>
-        <w:t xml:space="preserve">sion, funding acquisition, resources, project administration, </w:t>
-      </w:r>
-      <w:proofErr w:type="spellStart"/>
-      <w:r>
-        <w:t>Songnian</w:t>
-      </w:r>
-      <w:proofErr w:type="spellEnd"/>
-      <w:r>
-        <w:t xml:space="preserve"> Li; writing—review and e</w:t>
+        <w:t>sion, funding acquisition, resources, project administration, Songnian Li; writing—review and e</w:t>
       </w:r>
       <w:r>
         <w:t>d</w:t>
       </w:r>
       <w:r>
-        <w:t xml:space="preserve">iting, Richard Wen, </w:t>
-      </w:r>
-      <w:proofErr w:type="spellStart"/>
-      <w:r>
-        <w:t>Songnian</w:t>
-      </w:r>
-      <w:proofErr w:type="spellEnd"/>
-      <w:r>
-        <w:t xml:space="preserve"> Li. All authors have read and agreed to the published version of the manuscript.</w:t>
+        <w:t>iting, Richard Wen, Songnian Li. All authors have read and agreed to the published version of the manuscript.</w:t>
       </w:r>
     </w:p>
     <w:p>
@@ -27804,6 +27638,7 @@
         <w:rPr>
           <w:b/>
         </w:rPr>
+        <w:lastRenderedPageBreak/>
         <w:t>Data Availability Statement:</w:t>
       </w:r>
       <w:r>
@@ -27848,7 +27683,6 @@
         <w:rPr>
           <w:b/>
         </w:rPr>
-        <w:lastRenderedPageBreak/>
         <w:t>Conflicts of Interest:</w:t>
       </w:r>
       <w:r>
@@ -28830,6 +28664,7 @@
         <w:rPr>
           <w:color w:val="auto"/>
         </w:rPr>
+        <w:lastRenderedPageBreak/>
         <w:t xml:space="preserve">18. </w:t>
       </w:r>
       <w:r>
@@ -28956,7 +28791,6 @@
         <w:rPr>
           <w:color w:val="auto"/>
         </w:rPr>
-        <w:lastRenderedPageBreak/>
         <w:t xml:space="preserve">20. </w:t>
       </w:r>
       <w:r>
@@ -29797,6 +29631,7 @@
         <w:rPr>
           <w:color w:val="auto"/>
         </w:rPr>
+        <w:lastRenderedPageBreak/>
         <w:t xml:space="preserve">36. </w:t>
       </w:r>
       <w:r>
@@ -29881,7 +29716,6 @@
         <w:rPr>
           <w:color w:val="auto"/>
         </w:rPr>
-        <w:lastRenderedPageBreak/>
         <w:t xml:space="preserve">38. </w:t>
       </w:r>
       <w:r>
@@ -30827,6 +30661,7 @@
         <w:rPr>
           <w:color w:val="auto"/>
         </w:rPr>
+        <w:lastRenderedPageBreak/>
         <w:t xml:space="preserve">55. </w:t>
       </w:r>
       <w:r>
@@ -30953,7 +30788,6 @@
         <w:rPr>
           <w:color w:val="auto"/>
         </w:rPr>
-        <w:lastRenderedPageBreak/>
         <w:t xml:space="preserve">57. </w:t>
       </w:r>
       <w:r>
@@ -31416,6 +31250,7 @@
         <w:rPr>
           <w:color w:val="auto"/>
         </w:rPr>
+        <w:lastRenderedPageBreak/>
         <w:t xml:space="preserve">75. </w:t>
       </w:r>
       <w:r>
@@ -31458,7 +31293,6 @@
         <w:rPr>
           <w:color w:val="auto"/>
         </w:rPr>
-        <w:lastRenderedPageBreak/>
         <w:t xml:space="preserve">77. </w:t>
       </w:r>
       <w:r>
@@ -31935,6 +31769,7 @@
         <w:rPr>
           <w:color w:val="auto"/>
         </w:rPr>
+        <w:lastRenderedPageBreak/>
         <w:t xml:space="preserve">93. </w:t>
       </w:r>
       <w:r>
@@ -32019,7 +31854,6 @@
         <w:rPr>
           <w:color w:val="auto"/>
         </w:rPr>
-        <w:lastRenderedPageBreak/>
         <w:t xml:space="preserve">95. </w:t>
       </w:r>
       <w:r>
@@ -32120,11 +31954,11 @@
       </w:r>
     </w:p>
     <w:sectPr>
-      <w:headerReference w:type="even" r:id="rId16"/>
-      <w:headerReference w:type="default" r:id="rId17"/>
-      <w:footerReference w:type="default" r:id="rId18"/>
-      <w:headerReference w:type="first" r:id="rId19"/>
-      <w:footerReference w:type="first" r:id="rId20"/>
+      <w:headerReference w:type="even" r:id="rId19"/>
+      <w:headerReference w:type="default" r:id="rId20"/>
+      <w:footerReference w:type="default" r:id="rId21"/>
+      <w:headerReference w:type="first" r:id="rId22"/>
+      <w:footerReference w:type="first" r:id="rId23"/>
       <w:type w:val="continuous"/>
       <w:pgSz w:w="11906" w:h="16838" w:code="9"/>
       <w:pgMar w:top="1417" w:right="720" w:bottom="1077" w:left="720" w:header="1020" w:footer="340" w:gutter="0"/>
@@ -32290,7 +32124,6 @@
       </w:rPr>
       <w:t>www.mdpi.com/journal/</w:t>
     </w:r>
-    <w:proofErr w:type="spellStart"/>
     <w:r>
       <w:rPr>
         <w:sz w:val="16"/>
@@ -32298,7 +32131,6 @@
       </w:rPr>
       <w:t>ijgi</w:t>
     </w:r>
-    <w:proofErr w:type="spellEnd"/>
   </w:p>
 </w:ftr>
 </file>

</xml_diff>